<commit_message>
Formatting changes to "Key Parameters"
I structured the document a little
</commit_message>
<xml_diff>
--- a/Key Parameters.docx
+++ b/Key Parameters.docx
@@ -4,50 +4,36 @@
   <w:body>
     <w:p>
       <w:pPr>
-        <w:pStyle w:val="ListParagraph"/>
-        <w:numPr>
-          <w:ilvl w:val="0"/>
-          <w:numId w:val="1"/>
-        </w:numPr>
+        <w:pStyle w:val="berschrift2"/>
         <w:bidi w:val="0"/>
-        <w:rPr>
-          <w:rFonts w:ascii="Times New Roman" w:hAnsi="Times New Roman" w:cs="Times New Roman"/>
-          <w:b/>
-          <w:bCs/>
-          <w:sz w:val="28"/>
-          <w:szCs w:val="28"/>
-        </w:rPr>
       </w:pPr>
       <w:r>
-        <w:rPr>
-          <w:rFonts w:ascii="Times New Roman" w:hAnsi="Times New Roman" w:cs="Times New Roman"/>
-          <w:b/>
-          <w:bCs/>
-          <w:sz w:val="28"/>
-          <w:szCs w:val="28"/>
-        </w:rPr>
         <w:t>Key Parameters &amp; Inputs</w:t>
       </w:r>
     </w:p>
     <w:p>
       <w:pPr>
         <w:bidi w:val="0"/>
-        <w:rPr>
-          <w:rFonts w:ascii="Times New Roman" w:hAnsi="Times New Roman" w:cs="Times New Roman"/>
+        <w:jc w:val="both"/>
+        <w:rPr>
+          <w:rFonts w:ascii="Calibri" w:hAnsi="Calibri" w:cs="Calibri"/>
+          <w:sz w:val="24"/>
+          <w:szCs w:val="24"/>
         </w:rPr>
       </w:pPr>
     </w:p>
     <w:tbl>
       <w:tblPr>
-        <w:tblStyle w:val="TableGrid"/>
-        <w:tblW w:w="9305" w:type="dxa"/>
+        <w:tblStyle w:val="Tabellenraster"/>
+        <w:tblW w:w="9209" w:type="dxa"/>
         <w:jc w:val="center"/>
+        <w:tblLayout w:type="fixed"/>
         <w:tblLook w:val="04A0" w:firstRow="1" w:lastRow="0" w:firstColumn="1" w:lastColumn="0" w:noHBand="0" w:noVBand="1"/>
       </w:tblPr>
       <w:tblGrid>
         <w:gridCol w:w="1678"/>
         <w:gridCol w:w="1054"/>
-        <w:gridCol w:w="7607"/>
+        <w:gridCol w:w="6477"/>
       </w:tblGrid>
       <w:tr>
         <w:trPr>
@@ -55,15 +41,15 @@
         </w:trPr>
         <w:tc>
           <w:tcPr>
-            <w:tcW w:w="1767" w:type="dxa"/>
+            <w:tcW w:w="1678" w:type="dxa"/>
             <w:vAlign w:val="center"/>
           </w:tcPr>
           <w:p>
             <w:pPr>
               <w:bidi w:val="0"/>
-              <w:jc w:val="center"/>
-              <w:rPr>
-                <w:rFonts w:ascii="Times New Roman" w:hAnsi="Times New Roman" w:cs="Times New Roman"/>
+              <w:jc w:val="both"/>
+              <w:rPr>
+                <w:rFonts w:ascii="Calibri" w:hAnsi="Calibri" w:cs="Calibri"/>
                 <w:b/>
                 <w:bCs/>
                 <w:sz w:val="24"/>
@@ -72,7 +58,7 @@
             </w:pPr>
             <w:r>
               <w:rPr>
-                <w:rFonts w:ascii="Times New Roman" w:hAnsi="Times New Roman" w:cs="Times New Roman"/>
+                <w:rFonts w:ascii="Calibri" w:hAnsi="Calibri" w:cs="Calibri"/>
                 <w:b/>
                 <w:bCs/>
                 <w:sz w:val="24"/>
@@ -84,15 +70,15 @@
         </w:tc>
         <w:tc>
           <w:tcPr>
-            <w:tcW w:w="940" w:type="dxa"/>
+            <w:tcW w:w="1054" w:type="dxa"/>
             <w:vAlign w:val="center"/>
           </w:tcPr>
           <w:p>
             <w:pPr>
               <w:bidi w:val="0"/>
-              <w:jc w:val="center"/>
-              <w:rPr>
-                <w:rFonts w:ascii="Times New Roman" w:hAnsi="Times New Roman" w:cs="Times New Roman"/>
+              <w:jc w:val="both"/>
+              <w:rPr>
+                <w:rFonts w:ascii="Calibri" w:hAnsi="Calibri" w:cs="Calibri"/>
                 <w:b/>
                 <w:bCs/>
                 <w:sz w:val="24"/>
@@ -101,7 +87,7 @@
             </w:pPr>
             <w:r>
               <w:rPr>
-                <w:rFonts w:ascii="Times New Roman" w:hAnsi="Times New Roman" w:cs="Times New Roman"/>
+                <w:rFonts w:ascii="Calibri" w:hAnsi="Calibri" w:cs="Calibri"/>
                 <w:b/>
                 <w:bCs/>
                 <w:sz w:val="24"/>
@@ -113,15 +99,15 @@
         </w:tc>
         <w:tc>
           <w:tcPr>
-            <w:tcW w:w="6598" w:type="dxa"/>
+            <w:tcW w:w="6477" w:type="dxa"/>
             <w:vAlign w:val="center"/>
           </w:tcPr>
           <w:p>
             <w:pPr>
               <w:bidi w:val="0"/>
-              <w:jc w:val="center"/>
-              <w:rPr>
-                <w:rFonts w:ascii="Times New Roman" w:hAnsi="Times New Roman" w:cs="Times New Roman"/>
+              <w:jc w:val="both"/>
+              <w:rPr>
+                <w:rFonts w:ascii="Calibri" w:hAnsi="Calibri" w:cs="Calibri"/>
                 <w:b/>
                 <w:bCs/>
                 <w:sz w:val="24"/>
@@ -130,7 +116,7 @@
             </w:pPr>
             <w:r>
               <w:rPr>
-                <w:rFonts w:ascii="Times New Roman" w:hAnsi="Times New Roman" w:cs="Times New Roman"/>
+                <w:rFonts w:ascii="Calibri" w:hAnsi="Calibri" w:cs="Calibri"/>
                 <w:b/>
                 <w:bCs/>
                 <w:sz w:val="24"/>
@@ -148,21 +134,25 @@
         </w:trPr>
         <w:tc>
           <w:tcPr>
-            <w:tcW w:w="1767" w:type="dxa"/>
+            <w:tcW w:w="1678" w:type="dxa"/>
             <w:vAlign w:val="center"/>
           </w:tcPr>
           <w:p>
             <w:pPr>
               <w:bidi w:val="0"/>
-              <w:jc w:val="center"/>
-              <w:rPr>
-                <w:rFonts w:ascii="Times New Roman" w:hAnsi="Times New Roman" w:cs="Times New Roman"/>
+              <w:jc w:val="both"/>
+              <w:rPr>
+                <w:rFonts w:ascii="Calibri" w:hAnsi="Calibri" w:cs="Calibri"/>
+                <w:sz w:val="24"/>
+                <w:szCs w:val="24"/>
               </w:rPr>
             </w:pPr>
             <w:proofErr w:type="spellStart"/>
             <w:r>
               <w:rPr>
-                <w:rFonts w:ascii="Times New Roman" w:hAnsi="Times New Roman" w:cs="Times New Roman"/>
+                <w:rFonts w:ascii="Calibri" w:hAnsi="Calibri" w:cs="Calibri"/>
+                <w:sz w:val="24"/>
+                <w:szCs w:val="24"/>
               </w:rPr>
               <w:t>P_Electrolyzer</w:t>
             </w:r>
@@ -171,20 +161,24 @@
         </w:tc>
         <w:tc>
           <w:tcPr>
-            <w:tcW w:w="940" w:type="dxa"/>
+            <w:tcW w:w="1054" w:type="dxa"/>
             <w:vAlign w:val="center"/>
           </w:tcPr>
           <w:p>
             <w:pPr>
               <w:bidi w:val="0"/>
-              <w:jc w:val="center"/>
-              <w:rPr>
-                <w:rFonts w:ascii="Times New Roman" w:hAnsi="Times New Roman" w:cs="Times New Roman"/>
+              <w:jc w:val="both"/>
+              <w:rPr>
+                <w:rFonts w:ascii="Calibri" w:hAnsi="Calibri" w:cs="Calibri"/>
+                <w:sz w:val="24"/>
+                <w:szCs w:val="24"/>
               </w:rPr>
             </w:pPr>
             <w:r>
               <w:rPr>
-                <w:rFonts w:ascii="Times New Roman" w:hAnsi="Times New Roman" w:cs="Times New Roman"/>
+                <w:rFonts w:ascii="Calibri" w:hAnsi="Calibri" w:cs="Calibri"/>
+                <w:sz w:val="24"/>
+                <w:szCs w:val="24"/>
               </w:rPr>
               <w:t xml:space="preserve">2500 </w:t>
             </w:r>
@@ -192,14 +186,18 @@
           <w:p>
             <w:pPr>
               <w:bidi w:val="0"/>
-              <w:jc w:val="center"/>
-              <w:rPr>
-                <w:rFonts w:ascii="Times New Roman" w:hAnsi="Times New Roman" w:cs="Times New Roman"/>
+              <w:jc w:val="both"/>
+              <w:rPr>
+                <w:rFonts w:ascii="Calibri" w:hAnsi="Calibri" w:cs="Calibri"/>
+                <w:sz w:val="24"/>
+                <w:szCs w:val="24"/>
               </w:rPr>
             </w:pPr>
             <w:r>
               <w:rPr>
-                <w:rFonts w:ascii="Times New Roman" w:hAnsi="Times New Roman" w:cs="Times New Roman"/>
+                <w:rFonts w:ascii="Calibri" w:hAnsi="Calibri" w:cs="Calibri"/>
+                <w:sz w:val="24"/>
+                <w:szCs w:val="24"/>
               </w:rPr>
               <w:t>J/s</w:t>
             </w:r>
@@ -207,19 +205,24 @@
         </w:tc>
         <w:tc>
           <w:tcPr>
-            <w:tcW w:w="6598" w:type="dxa"/>
+            <w:tcW w:w="6477" w:type="dxa"/>
             <w:vAlign w:val="center"/>
           </w:tcPr>
           <w:p>
             <w:pPr>
               <w:bidi w:val="0"/>
-              <w:rPr>
-                <w:rFonts w:ascii="Times New Roman" w:hAnsi="Times New Roman" w:cs="Times New Roman"/>
+              <w:jc w:val="both"/>
+              <w:rPr>
+                <w:rFonts w:ascii="Calibri" w:hAnsi="Calibri" w:cs="Calibri"/>
+                <w:sz w:val="24"/>
+                <w:szCs w:val="24"/>
               </w:rPr>
             </w:pPr>
             <w:r>
               <w:rPr>
-                <w:rFonts w:ascii="Times New Roman" w:hAnsi="Times New Roman" w:cs="Times New Roman"/>
+                <w:rFonts w:ascii="Calibri" w:hAnsi="Calibri" w:cs="Calibri"/>
+                <w:sz w:val="24"/>
+                <w:szCs w:val="24"/>
               </w:rPr>
               <w:t>This represents a 2.5 MW industrial pilot scale, suitable for providing enough heat and oxygen for commercial-sized greenhouses and fish tanks.</w:t>
             </w:r>
@@ -233,21 +236,25 @@
         </w:trPr>
         <w:tc>
           <w:tcPr>
-            <w:tcW w:w="1767" w:type="dxa"/>
+            <w:tcW w:w="1678" w:type="dxa"/>
             <w:vAlign w:val="center"/>
           </w:tcPr>
           <w:p>
             <w:pPr>
               <w:bidi w:val="0"/>
-              <w:jc w:val="center"/>
-              <w:rPr>
-                <w:rFonts w:ascii="Times New Roman" w:hAnsi="Times New Roman" w:cs="Times New Roman"/>
+              <w:jc w:val="both"/>
+              <w:rPr>
+                <w:rFonts w:ascii="Calibri" w:hAnsi="Calibri" w:cs="Calibri"/>
+                <w:sz w:val="24"/>
+                <w:szCs w:val="24"/>
               </w:rPr>
             </w:pPr>
             <w:proofErr w:type="spellStart"/>
             <w:r>
               <w:rPr>
-                <w:rFonts w:ascii="Times New Roman" w:hAnsi="Times New Roman" w:cs="Times New Roman"/>
+                <w:rFonts w:ascii="Calibri" w:hAnsi="Calibri" w:cs="Calibri"/>
+                <w:sz w:val="24"/>
+                <w:szCs w:val="24"/>
               </w:rPr>
               <w:t>Eff_Electrolyzer</w:t>
             </w:r>
@@ -256,20 +263,24 @@
         </w:tc>
         <w:tc>
           <w:tcPr>
-            <w:tcW w:w="940" w:type="dxa"/>
+            <w:tcW w:w="1054" w:type="dxa"/>
             <w:vAlign w:val="center"/>
           </w:tcPr>
           <w:p>
             <w:pPr>
               <w:bidi w:val="0"/>
-              <w:jc w:val="center"/>
-              <w:rPr>
-                <w:rFonts w:ascii="Times New Roman" w:hAnsi="Times New Roman" w:cs="Times New Roman"/>
+              <w:jc w:val="both"/>
+              <w:rPr>
+                <w:rFonts w:ascii="Calibri" w:hAnsi="Calibri" w:cs="Calibri"/>
+                <w:sz w:val="24"/>
+                <w:szCs w:val="24"/>
               </w:rPr>
             </w:pPr>
             <w:r>
               <w:rPr>
-                <w:rFonts w:ascii="Times New Roman" w:hAnsi="Times New Roman" w:cs="Times New Roman"/>
+                <w:rFonts w:ascii="Calibri" w:hAnsi="Calibri" w:cs="Calibri"/>
+                <w:sz w:val="24"/>
+                <w:szCs w:val="24"/>
               </w:rPr>
               <w:t>0.7 (70%)</w:t>
             </w:r>
@@ -277,33 +288,42 @@
         </w:tc>
         <w:tc>
           <w:tcPr>
-            <w:tcW w:w="6598" w:type="dxa"/>
+            <w:tcW w:w="6477" w:type="dxa"/>
             <w:vAlign w:val="center"/>
           </w:tcPr>
           <w:p>
             <w:pPr>
               <w:bidi w:val="0"/>
-              <w:rPr>
-                <w:rFonts w:ascii="Times New Roman" w:hAnsi="Times New Roman" w:cs="Times New Roman"/>
+              <w:jc w:val="both"/>
+              <w:rPr>
+                <w:rFonts w:ascii="Calibri" w:hAnsi="Calibri" w:cs="Calibri"/>
+                <w:sz w:val="24"/>
+                <w:szCs w:val="24"/>
               </w:rPr>
             </w:pPr>
             <w:r>
               <w:rPr>
-                <w:rFonts w:ascii="Times New Roman" w:hAnsi="Times New Roman" w:cs="Times New Roman"/>
+                <w:rFonts w:ascii="Calibri" w:hAnsi="Calibri" w:cs="Calibri"/>
+                <w:sz w:val="24"/>
+                <w:szCs w:val="24"/>
               </w:rPr>
               <w:t xml:space="preserve">Standard efficiency for modern alkaline or PEM </w:t>
             </w:r>
             <w:proofErr w:type="spellStart"/>
             <w:r>
               <w:rPr>
-                <w:rFonts w:ascii="Times New Roman" w:hAnsi="Times New Roman" w:cs="Times New Roman"/>
+                <w:rFonts w:ascii="Calibri" w:hAnsi="Calibri" w:cs="Calibri"/>
+                <w:sz w:val="24"/>
+                <w:szCs w:val="24"/>
               </w:rPr>
               <w:t>electrolyzers</w:t>
             </w:r>
             <w:proofErr w:type="spellEnd"/>
             <w:r>
               <w:rPr>
-                <w:rFonts w:ascii="Times New Roman" w:hAnsi="Times New Roman" w:cs="Times New Roman"/>
+                <w:rFonts w:ascii="Calibri" w:hAnsi="Calibri" w:cs="Calibri"/>
+                <w:sz w:val="24"/>
+                <w:szCs w:val="24"/>
               </w:rPr>
               <w:t>. The remaining 30% is lost as heat, which we capture.</w:t>
             </w:r>
@@ -317,21 +337,25 @@
         </w:trPr>
         <w:tc>
           <w:tcPr>
-            <w:tcW w:w="1767" w:type="dxa"/>
+            <w:tcW w:w="1678" w:type="dxa"/>
             <w:vAlign w:val="center"/>
           </w:tcPr>
           <w:p>
             <w:pPr>
               <w:bidi w:val="0"/>
-              <w:jc w:val="center"/>
-              <w:rPr>
-                <w:rFonts w:ascii="Times New Roman" w:hAnsi="Times New Roman" w:cs="Times New Roman"/>
+              <w:jc w:val="both"/>
+              <w:rPr>
+                <w:rFonts w:ascii="Calibri" w:hAnsi="Calibri" w:cs="Calibri"/>
+                <w:sz w:val="24"/>
+                <w:szCs w:val="24"/>
               </w:rPr>
             </w:pPr>
             <w:proofErr w:type="spellStart"/>
             <w:r>
               <w:rPr>
-                <w:rFonts w:ascii="Times New Roman" w:hAnsi="Times New Roman" w:cs="Times New Roman"/>
+                <w:rFonts w:ascii="Calibri" w:hAnsi="Calibri" w:cs="Calibri"/>
+                <w:sz w:val="24"/>
+                <w:szCs w:val="24"/>
               </w:rPr>
               <w:t>Delta_h</w:t>
             </w:r>
@@ -340,35 +364,43 @@
         </w:tc>
         <w:tc>
           <w:tcPr>
-            <w:tcW w:w="940" w:type="dxa"/>
+            <w:tcW w:w="1054" w:type="dxa"/>
             <w:vAlign w:val="center"/>
           </w:tcPr>
           <w:p>
             <w:pPr>
               <w:bidi w:val="0"/>
-              <w:jc w:val="center"/>
-              <w:rPr>
-                <w:rFonts w:ascii="Times New Roman" w:hAnsi="Times New Roman" w:cs="Times New Roman"/>
+              <w:jc w:val="both"/>
+              <w:rPr>
+                <w:rFonts w:ascii="Calibri" w:hAnsi="Calibri" w:cs="Calibri"/>
+                <w:sz w:val="24"/>
+                <w:szCs w:val="24"/>
                 <w:lang w:val="de-DE"/>
               </w:rPr>
             </w:pPr>
             <w:r>
               <w:rPr>
-                <w:rFonts w:ascii="Times New Roman" w:hAnsi="Times New Roman" w:cs="Times New Roman"/>
+                <w:rFonts w:ascii="Calibri" w:hAnsi="Calibri" w:cs="Calibri"/>
+                <w:sz w:val="24"/>
+                <w:szCs w:val="24"/>
                 <w:lang w:val="de-DE"/>
               </w:rPr>
               <w:t>2858</w:t>
             </w:r>
             <w:r>
               <w:rPr>
-                <w:rFonts w:ascii="Times New Roman" w:hAnsi="Times New Roman" w:cs="Times New Roman"/>
+                <w:rFonts w:ascii="Calibri" w:hAnsi="Calibri" w:cs="Calibri"/>
+                <w:sz w:val="24"/>
+                <w:szCs w:val="24"/>
                 <w:lang w:val="de-DE"/>
               </w:rPr>
               <w:t>4</w:t>
             </w:r>
             <w:r>
               <w:rPr>
-                <w:rFonts w:ascii="Times New Roman" w:hAnsi="Times New Roman" w:cs="Times New Roman"/>
+                <w:rFonts w:ascii="Calibri" w:hAnsi="Calibri" w:cs="Calibri"/>
+                <w:sz w:val="24"/>
+                <w:szCs w:val="24"/>
                 <w:lang w:val="de-DE"/>
               </w:rPr>
               <w:t>0</w:t>
@@ -377,14 +409,18 @@
           <w:p>
             <w:pPr>
               <w:bidi w:val="0"/>
-              <w:jc w:val="center"/>
-              <w:rPr>
-                <w:rFonts w:ascii="Times New Roman" w:hAnsi="Times New Roman" w:cs="Times New Roman"/>
+              <w:jc w:val="both"/>
+              <w:rPr>
+                <w:rFonts w:ascii="Calibri" w:hAnsi="Calibri" w:cs="Calibri"/>
+                <w:sz w:val="24"/>
+                <w:szCs w:val="24"/>
               </w:rPr>
             </w:pPr>
             <w:r>
               <w:rPr>
-                <w:rFonts w:ascii="Times New Roman" w:hAnsi="Times New Roman" w:cs="Times New Roman"/>
+                <w:rFonts w:ascii="Calibri" w:hAnsi="Calibri" w:cs="Calibri"/>
+                <w:sz w:val="24"/>
+                <w:szCs w:val="24"/>
               </w:rPr>
               <w:t>J/mol</w:t>
             </w:r>
@@ -392,19 +428,24 @@
         </w:tc>
         <w:tc>
           <w:tcPr>
-            <w:tcW w:w="6598" w:type="dxa"/>
+            <w:tcW w:w="6477" w:type="dxa"/>
             <w:vAlign w:val="center"/>
           </w:tcPr>
           <w:p>
             <w:pPr>
               <w:bidi w:val="0"/>
-              <w:rPr>
-                <w:rFonts w:ascii="Times New Roman" w:hAnsi="Times New Roman" w:cs="Times New Roman"/>
+              <w:jc w:val="both"/>
+              <w:rPr>
+                <w:rFonts w:ascii="Calibri" w:hAnsi="Calibri" w:cs="Calibri"/>
+                <w:sz w:val="24"/>
+                <w:szCs w:val="24"/>
               </w:rPr>
             </w:pPr>
             <w:r>
               <w:rPr>
-                <w:rFonts w:ascii="Times New Roman" w:hAnsi="Times New Roman" w:cs="Times New Roman"/>
+                <w:rFonts w:ascii="Calibri" w:hAnsi="Calibri" w:cs="Calibri"/>
+                <w:sz w:val="24"/>
+                <w:szCs w:val="24"/>
               </w:rPr>
               <w:t xml:space="preserve">Formation enthalpy (energy required to form 1 mol of H_2). </w:t>
             </w:r>
@@ -412,22 +453,29 @@
           <w:p>
             <w:pPr>
               <w:bidi w:val="0"/>
-              <w:rPr>
-                <w:rFonts w:ascii="Times New Roman" w:hAnsi="Times New Roman" w:cs="Times New Roman"/>
+              <w:jc w:val="both"/>
+              <w:rPr>
+                <w:rFonts w:ascii="Calibri" w:hAnsi="Calibri" w:cs="Calibri"/>
+                <w:sz w:val="24"/>
+                <w:szCs w:val="24"/>
               </w:rPr>
             </w:pPr>
             <w:hyperlink r:id="rId5" w:history="1">
               <w:r>
                 <w:rPr>
                   <w:rStyle w:val="Hyperlink"/>
-                  <w:rFonts w:ascii="Times New Roman" w:hAnsi="Times New Roman" w:cs="Times New Roman"/>
+                  <w:rFonts w:ascii="Calibri" w:hAnsi="Calibri" w:cs="Calibri"/>
+                  <w:sz w:val="24"/>
+                  <w:szCs w:val="24"/>
                 </w:rPr>
                 <w:t>https://www.arch-goebel.ch/app/download/5817870042/Hydrogen+Production+%28Electrolysis%29-+Fundamentals+of+Water+Electrolysis%3B+Millet%3B+2015.pdf</w:t>
               </w:r>
             </w:hyperlink>
             <w:r>
               <w:rPr>
-                <w:rFonts w:ascii="Times New Roman" w:hAnsi="Times New Roman" w:cs="Times New Roman"/>
+                <w:rFonts w:ascii="Calibri" w:hAnsi="Calibri" w:cs="Calibri"/>
+                <w:sz w:val="24"/>
+                <w:szCs w:val="24"/>
               </w:rPr>
               <w:t xml:space="preserve"> </w:t>
             </w:r>
@@ -441,21 +489,25 @@
         </w:trPr>
         <w:tc>
           <w:tcPr>
-            <w:tcW w:w="1767" w:type="dxa"/>
+            <w:tcW w:w="1678" w:type="dxa"/>
             <w:vAlign w:val="center"/>
           </w:tcPr>
           <w:p>
             <w:pPr>
               <w:bidi w:val="0"/>
-              <w:jc w:val="center"/>
-              <w:rPr>
-                <w:rFonts w:ascii="Times New Roman" w:hAnsi="Times New Roman" w:cs="Times New Roman"/>
+              <w:jc w:val="both"/>
+              <w:rPr>
+                <w:rFonts w:ascii="Calibri" w:hAnsi="Calibri" w:cs="Calibri"/>
+                <w:sz w:val="24"/>
+                <w:szCs w:val="24"/>
               </w:rPr>
             </w:pPr>
             <w:proofErr w:type="spellStart"/>
             <w:r>
               <w:rPr>
-                <w:rFonts w:ascii="Times New Roman" w:hAnsi="Times New Roman" w:cs="Times New Roman"/>
+                <w:rFonts w:ascii="Calibri" w:hAnsi="Calibri" w:cs="Calibri"/>
+                <w:sz w:val="24"/>
+                <w:szCs w:val="24"/>
               </w:rPr>
               <w:t>M_Storage</w:t>
             </w:r>
@@ -464,20 +516,24 @@
         </w:tc>
         <w:tc>
           <w:tcPr>
-            <w:tcW w:w="940" w:type="dxa"/>
+            <w:tcW w:w="1054" w:type="dxa"/>
             <w:vAlign w:val="center"/>
           </w:tcPr>
           <w:p>
             <w:pPr>
               <w:bidi w:val="0"/>
-              <w:jc w:val="center"/>
-              <w:rPr>
-                <w:rFonts w:ascii="Times New Roman" w:hAnsi="Times New Roman" w:cs="Times New Roman"/>
+              <w:jc w:val="both"/>
+              <w:rPr>
+                <w:rFonts w:ascii="Calibri" w:hAnsi="Calibri" w:cs="Calibri"/>
+                <w:sz w:val="24"/>
+                <w:szCs w:val="24"/>
               </w:rPr>
             </w:pPr>
             <w:r>
               <w:rPr>
-                <w:rFonts w:ascii="Times New Roman" w:hAnsi="Times New Roman" w:cs="Times New Roman"/>
+                <w:rFonts w:ascii="Calibri" w:hAnsi="Calibri" w:cs="Calibri"/>
+                <w:sz w:val="24"/>
+                <w:szCs w:val="24"/>
               </w:rPr>
               <w:t xml:space="preserve">15000 </w:t>
             </w:r>
@@ -485,14 +541,18 @@
           <w:p>
             <w:pPr>
               <w:bidi w:val="0"/>
-              <w:jc w:val="center"/>
-              <w:rPr>
-                <w:rFonts w:ascii="Times New Roman" w:hAnsi="Times New Roman" w:cs="Times New Roman"/>
+              <w:jc w:val="both"/>
+              <w:rPr>
+                <w:rFonts w:ascii="Calibri" w:hAnsi="Calibri" w:cs="Calibri"/>
+                <w:sz w:val="24"/>
+                <w:szCs w:val="24"/>
               </w:rPr>
             </w:pPr>
             <w:r>
               <w:rPr>
-                <w:rFonts w:ascii="Times New Roman" w:hAnsi="Times New Roman" w:cs="Times New Roman"/>
+                <w:rFonts w:ascii="Calibri" w:hAnsi="Calibri" w:cs="Calibri"/>
+                <w:sz w:val="24"/>
+                <w:szCs w:val="24"/>
               </w:rPr>
               <w:t>kg</w:t>
             </w:r>
@@ -500,19 +560,24 @@
         </w:tc>
         <w:tc>
           <w:tcPr>
-            <w:tcW w:w="6598" w:type="dxa"/>
+            <w:tcW w:w="6477" w:type="dxa"/>
             <w:vAlign w:val="center"/>
           </w:tcPr>
           <w:p>
             <w:pPr>
               <w:bidi w:val="0"/>
-              <w:rPr>
-                <w:rFonts w:ascii="Times New Roman" w:hAnsi="Times New Roman" w:cs="Times New Roman"/>
+              <w:jc w:val="both"/>
+              <w:rPr>
+                <w:rFonts w:ascii="Calibri" w:hAnsi="Calibri" w:cs="Calibri"/>
+                <w:sz w:val="24"/>
+                <w:szCs w:val="24"/>
               </w:rPr>
             </w:pPr>
             <w:r>
               <w:rPr>
-                <w:rFonts w:ascii="Times New Roman" w:hAnsi="Times New Roman" w:cs="Times New Roman"/>
+                <w:rFonts w:ascii="Calibri" w:hAnsi="Calibri" w:cs="Calibri"/>
+                <w:sz w:val="24"/>
+                <w:szCs w:val="24"/>
               </w:rPr>
               <w:t>15 tons of water. This large mass is necessary to absorb 750 kW of waste heat without causing a dangerous or rapid temperature spike</w:t>
             </w:r>
@@ -526,21 +591,25 @@
         </w:trPr>
         <w:tc>
           <w:tcPr>
-            <w:tcW w:w="1767" w:type="dxa"/>
+            <w:tcW w:w="1678" w:type="dxa"/>
             <w:vAlign w:val="center"/>
           </w:tcPr>
           <w:p>
             <w:pPr>
               <w:bidi w:val="0"/>
-              <w:jc w:val="center"/>
-              <w:rPr>
-                <w:rFonts w:ascii="Times New Roman" w:hAnsi="Times New Roman" w:cs="Times New Roman"/>
+              <w:jc w:val="both"/>
+              <w:rPr>
+                <w:rFonts w:ascii="Calibri" w:hAnsi="Calibri" w:cs="Calibri"/>
+                <w:sz w:val="24"/>
+                <w:szCs w:val="24"/>
               </w:rPr>
             </w:pPr>
             <w:proofErr w:type="spellStart"/>
             <w:r>
               <w:rPr>
-                <w:rFonts w:ascii="Times New Roman" w:hAnsi="Times New Roman" w:cs="Times New Roman"/>
+                <w:rFonts w:ascii="Calibri" w:hAnsi="Calibri" w:cs="Calibri"/>
+                <w:sz w:val="24"/>
+                <w:szCs w:val="24"/>
               </w:rPr>
               <w:t>CP_Water</w:t>
             </w:r>
@@ -549,20 +618,24 @@
         </w:tc>
         <w:tc>
           <w:tcPr>
-            <w:tcW w:w="940" w:type="dxa"/>
+            <w:tcW w:w="1054" w:type="dxa"/>
             <w:vAlign w:val="center"/>
           </w:tcPr>
           <w:p>
             <w:pPr>
               <w:bidi w:val="0"/>
-              <w:jc w:val="center"/>
-              <w:rPr>
-                <w:rFonts w:ascii="Times New Roman" w:hAnsi="Times New Roman" w:cs="Times New Roman"/>
+              <w:jc w:val="both"/>
+              <w:rPr>
+                <w:rFonts w:ascii="Calibri" w:hAnsi="Calibri" w:cs="Calibri"/>
+                <w:sz w:val="24"/>
+                <w:szCs w:val="24"/>
               </w:rPr>
             </w:pPr>
             <w:r>
               <w:rPr>
-                <w:rFonts w:ascii="Times New Roman" w:hAnsi="Times New Roman" w:cs="Times New Roman"/>
+                <w:rFonts w:ascii="Calibri" w:hAnsi="Calibri" w:cs="Calibri"/>
+                <w:sz w:val="24"/>
+                <w:szCs w:val="24"/>
               </w:rPr>
               <w:t xml:space="preserve">4.18 </w:t>
             </w:r>
@@ -570,14 +643,18 @@
           <w:p>
             <w:pPr>
               <w:bidi w:val="0"/>
-              <w:jc w:val="center"/>
-              <w:rPr>
-                <w:rFonts w:ascii="Times New Roman" w:hAnsi="Times New Roman" w:cs="Times New Roman"/>
+              <w:jc w:val="both"/>
+              <w:rPr>
+                <w:rFonts w:ascii="Calibri" w:hAnsi="Calibri" w:cs="Calibri"/>
+                <w:sz w:val="24"/>
+                <w:szCs w:val="24"/>
               </w:rPr>
             </w:pPr>
             <w:r>
               <w:rPr>
-                <w:rFonts w:ascii="Times New Roman" w:hAnsi="Times New Roman" w:cs="Times New Roman"/>
+                <w:rFonts w:ascii="Calibri" w:hAnsi="Calibri" w:cs="Calibri"/>
+                <w:sz w:val="24"/>
+                <w:szCs w:val="24"/>
               </w:rPr>
               <w:t>kJ/(</w:t>
             </w:r>
@@ -585,7 +662,9 @@
             <w:proofErr w:type="gramStart"/>
             <w:r>
               <w:rPr>
-                <w:rFonts w:ascii="Times New Roman" w:hAnsi="Times New Roman" w:cs="Times New Roman"/>
+                <w:rFonts w:ascii="Calibri" w:hAnsi="Calibri" w:cs="Calibri"/>
+                <w:sz w:val="24"/>
+                <w:szCs w:val="24"/>
               </w:rPr>
               <w:t>kg.K</w:t>
             </w:r>
@@ -593,7 +672,9 @@
             <w:proofErr w:type="gramEnd"/>
             <w:r>
               <w:rPr>
-                <w:rFonts w:ascii="Times New Roman" w:hAnsi="Times New Roman" w:cs="Times New Roman"/>
+                <w:rFonts w:ascii="Calibri" w:hAnsi="Calibri" w:cs="Calibri"/>
+                <w:sz w:val="24"/>
+                <w:szCs w:val="24"/>
               </w:rPr>
               <w:t>)</w:t>
             </w:r>
@@ -601,19 +682,24 @@
         </w:tc>
         <w:tc>
           <w:tcPr>
-            <w:tcW w:w="6598" w:type="dxa"/>
+            <w:tcW w:w="6477" w:type="dxa"/>
             <w:vAlign w:val="center"/>
           </w:tcPr>
           <w:p>
             <w:pPr>
               <w:bidi w:val="0"/>
-              <w:rPr>
-                <w:rFonts w:ascii="Times New Roman" w:hAnsi="Times New Roman" w:cs="Times New Roman"/>
+              <w:jc w:val="both"/>
+              <w:rPr>
+                <w:rFonts w:ascii="Calibri" w:hAnsi="Calibri" w:cs="Calibri"/>
+                <w:sz w:val="24"/>
+                <w:szCs w:val="24"/>
               </w:rPr>
             </w:pPr>
             <w:r>
               <w:rPr>
-                <w:rFonts w:ascii="Times New Roman" w:hAnsi="Times New Roman" w:cs="Times New Roman"/>
+                <w:rFonts w:ascii="Calibri" w:hAnsi="Calibri" w:cs="Calibri"/>
+                <w:sz w:val="24"/>
+                <w:szCs w:val="24"/>
               </w:rPr>
               <w:t>The specific heat capacity of water; used to calculate how much the temperature rises per unit of heat added.</w:t>
             </w:r>
@@ -624,59 +710,285 @@
     <w:p>
       <w:pPr>
         <w:bidi w:val="0"/>
-        <w:rPr>
-          <w:rFonts w:ascii="Times New Roman" w:hAnsi="Times New Roman" w:cs="Times New Roman"/>
+        <w:jc w:val="both"/>
+        <w:rPr>
+          <w:rFonts w:ascii="Calibri" w:hAnsi="Calibri" w:cs="Calibri"/>
+          <w:sz w:val="24"/>
+          <w:szCs w:val="24"/>
         </w:rPr>
       </w:pPr>
     </w:p>
     <w:p>
       <w:pPr>
-        <w:pStyle w:val="ListParagraph"/>
-        <w:numPr>
-          <w:ilvl w:val="0"/>
-          <w:numId w:val="1"/>
-        </w:numPr>
+        <w:pStyle w:val="berschrift2"/>
         <w:bidi w:val="0"/>
-        <w:rPr>
-          <w:rFonts w:ascii="Times New Roman" w:hAnsi="Times New Roman" w:cs="Times New Roman"/>
-          <w:b/>
-          <w:bCs/>
-          <w:sz w:val="28"/>
-          <w:szCs w:val="28"/>
-        </w:rPr>
       </w:pPr>
       <w:r>
-        <w:rPr>
-          <w:rFonts w:ascii="Times New Roman" w:hAnsi="Times New Roman" w:cs="Times New Roman"/>
-          <w:b/>
-          <w:bCs/>
-          <w:sz w:val="28"/>
-          <w:szCs w:val="28"/>
-        </w:rPr>
-        <w:t>Core Formulas</w:t>
+        <w:t>Equations</w:t>
       </w:r>
     </w:p>
     <w:p>
       <w:pPr>
-        <w:pStyle w:val="ListParagraph"/>
         <w:bidi w:val="0"/>
         <w:rPr>
-          <w:rFonts w:ascii="Times New Roman" w:hAnsi="Times New Roman" w:cs="Times New Roman"/>
+          <w:b/>
+          <w:bCs/>
+        </w:rPr>
+      </w:pPr>
+      <w:r>
+        <w:rPr>
+          <w:b/>
+          <w:bCs/>
+        </w:rPr>
+        <w:t>Variables</w:t>
+      </w:r>
+    </w:p>
+    <w:p>
+      <w:pPr>
+        <w:bidi w:val="0"/>
+        <w:jc w:val="both"/>
+        <w:rPr>
+          <w:rFonts w:ascii="Calibri" w:eastAsiaTheme="minorEastAsia" w:hAnsi="Calibri" w:cs="Calibri"/>
           <w:sz w:val="24"/>
           <w:szCs w:val="24"/>
         </w:rPr>
       </w:pPr>
+      <w:r>
+        <w:rPr>
+          <w:rFonts w:ascii="Calibri" w:hAnsi="Calibri" w:cs="Calibri"/>
+          <w:sz w:val="24"/>
+          <w:szCs w:val="24"/>
+        </w:rPr>
+        <w:t xml:space="preserve">Input Power = </w:t>
+      </w:r>
+      <m:oMath>
+        <m:sSub>
+          <m:sSubPr>
+            <m:ctrlPr>
+              <w:rPr>
+                <w:rFonts w:ascii="Cambria Math" w:hAnsi="Cambria Math" w:cs="Calibri"/>
+                <w:i/>
+                <w:sz w:val="24"/>
+                <w:szCs w:val="24"/>
+              </w:rPr>
+            </m:ctrlPr>
+          </m:sSubPr>
+          <m:e>
+            <m:r>
+              <w:rPr>
+                <w:rFonts w:ascii="Cambria Math" w:hAnsi="Cambria Math" w:cs="Calibri"/>
+                <w:sz w:val="24"/>
+                <w:szCs w:val="24"/>
+              </w:rPr>
+              <m:t>P</m:t>
+            </m:r>
+          </m:e>
+          <m:sub>
+            <m:r>
+              <w:rPr>
+                <w:rFonts w:ascii="Cambria Math" w:hAnsi="Cambria Math" w:cs="Calibri"/>
+                <w:sz w:val="24"/>
+                <w:szCs w:val="24"/>
+              </w:rPr>
+              <m:t>Electrolyzer</m:t>
+            </m:r>
+          </m:sub>
+        </m:sSub>
+      </m:oMath>
     </w:p>
     <w:p>
       <w:pPr>
-        <w:pStyle w:val="ListParagraph"/>
-        <w:numPr>
-          <w:ilvl w:val="0"/>
-          <w:numId w:val="3"/>
-        </w:numPr>
         <w:bidi w:val="0"/>
-        <w:rPr>
-          <w:rFonts w:ascii="Times New Roman" w:hAnsi="Times New Roman" w:cs="Times New Roman"/>
+        <w:jc w:val="both"/>
+        <w:rPr>
+          <w:rFonts w:ascii="Calibri" w:hAnsi="Calibri" w:cs="Calibri"/>
+          <w:sz w:val="24"/>
+          <w:szCs w:val="24"/>
+        </w:rPr>
+      </w:pPr>
+      <w:r>
+        <w:rPr>
+          <w:rFonts w:ascii="Calibri" w:hAnsi="Calibri" w:cs="Calibri"/>
+          <w:sz w:val="24"/>
+          <w:szCs w:val="24"/>
+        </w:rPr>
+        <w:t xml:space="preserve">Efficiency = </w:t>
+      </w:r>
+      <m:oMath>
+        <m:r>
+          <w:rPr>
+            <w:rFonts w:ascii="Cambria Math" w:hAnsi="Cambria Math" w:cs="Calibri"/>
+            <w:sz w:val="24"/>
+            <w:szCs w:val="24"/>
+          </w:rPr>
+          <m:t>Ef</m:t>
+        </m:r>
+        <m:sSub>
+          <m:sSubPr>
+            <m:ctrlPr>
+              <w:rPr>
+                <w:rFonts w:ascii="Cambria Math" w:hAnsi="Cambria Math" w:cs="Calibri"/>
+                <w:i/>
+                <w:sz w:val="24"/>
+                <w:szCs w:val="24"/>
+              </w:rPr>
+            </m:ctrlPr>
+          </m:sSubPr>
+          <m:e>
+            <m:r>
+              <w:rPr>
+                <w:rFonts w:ascii="Cambria Math" w:hAnsi="Cambria Math" w:cs="Calibri"/>
+                <w:sz w:val="24"/>
+                <w:szCs w:val="24"/>
+              </w:rPr>
+              <m:t>f</m:t>
+            </m:r>
+          </m:e>
+          <m:sub>
+            <m:r>
+              <w:rPr>
+                <w:rFonts w:ascii="Cambria Math" w:hAnsi="Cambria Math" w:cs="Calibri"/>
+                <w:sz w:val="24"/>
+                <w:szCs w:val="24"/>
+              </w:rPr>
+              <m:t>Electrolyzer</m:t>
+            </m:r>
+          </m:sub>
+        </m:sSub>
+        <m:r>
+          <w:rPr>
+            <w:rFonts w:ascii="Cambria Math" w:hAnsi="Cambria Math" w:cs="Calibri"/>
+            <w:sz w:val="24"/>
+            <w:szCs w:val="24"/>
+          </w:rPr>
+          <m:t>=</m:t>
+        </m:r>
+        <m:r>
+          <w:rPr>
+            <w:rFonts w:ascii="Cambria Math" w:hAnsi="Cambria Math" w:cs="Calibri"/>
+            <w:sz w:val="24"/>
+            <w:szCs w:val="24"/>
+          </w:rPr>
+          <m:t>0.7</m:t>
+        </m:r>
+      </m:oMath>
+    </w:p>
+    <w:p>
+      <w:pPr>
+        <w:bidi w:val="0"/>
+        <w:jc w:val="both"/>
+        <w:rPr>
+          <w:rFonts w:ascii="Calibri" w:hAnsi="Calibri" w:cs="Calibri"/>
+          <w:sz w:val="24"/>
+          <w:szCs w:val="24"/>
+          <w:lang w:val="de-DE"/>
+        </w:rPr>
+      </w:pPr>
+      <w:r>
+        <w:rPr>
+          <w:rFonts w:ascii="Calibri" w:hAnsi="Calibri" w:cs="Calibri"/>
+          <w:sz w:val="24"/>
+          <w:szCs w:val="24"/>
+          <w:lang w:val="de-DE"/>
+        </w:rPr>
+        <w:t xml:space="preserve">Formation </w:t>
+      </w:r>
+      <w:r>
+        <w:rPr>
+          <w:rFonts w:ascii="Calibri" w:hAnsi="Calibri" w:cs="Calibri"/>
+          <w:sz w:val="24"/>
+          <w:szCs w:val="24"/>
+          <w:lang w:val="en-AU"/>
+        </w:rPr>
+        <w:t>Enthalpy</w:t>
+      </w:r>
+      <w:r>
+        <w:rPr>
+          <w:rFonts w:ascii="Calibri" w:hAnsi="Calibri" w:cs="Calibri"/>
+          <w:sz w:val="24"/>
+          <w:szCs w:val="24"/>
+          <w:lang w:val="de-DE"/>
+        </w:rPr>
+        <w:t xml:space="preserve"> =</w:t>
+      </w:r>
+      <w:r>
+        <w:rPr>
+          <w:rFonts w:ascii="Calibri" w:hAnsi="Calibri" w:cs="Calibri"/>
+          <w:sz w:val="24"/>
+          <w:szCs w:val="24"/>
+          <w:lang w:val="de-DE"/>
+        </w:rPr>
+        <w:t xml:space="preserve"> </w:t>
+      </w:r>
+      <m:oMath>
+        <m:r>
+          <w:rPr>
+            <w:rFonts w:ascii="Cambria Math" w:hAnsi="Cambria Math" w:cs="Calibri"/>
+            <w:sz w:val="24"/>
+            <w:szCs w:val="24"/>
+            <w:lang w:val="de-DE"/>
+          </w:rPr>
+          <m:t>∆</m:t>
+        </m:r>
+        <m:r>
+          <w:rPr>
+            <w:rFonts w:ascii="Cambria Math" w:hAnsi="Cambria Math" w:cs="Calibri"/>
+            <w:sz w:val="24"/>
+            <w:szCs w:val="24"/>
+          </w:rPr>
+          <m:t>H</m:t>
+        </m:r>
+        <m:r>
+          <w:rPr>
+            <w:rFonts w:ascii="Cambria Math" w:eastAsiaTheme="minorEastAsia" w:hAnsi="Cambria Math" w:cs="Calibri"/>
+            <w:sz w:val="24"/>
+            <w:szCs w:val="24"/>
+            <w:lang w:val="de-DE"/>
+          </w:rPr>
+          <m:t>=</m:t>
+        </m:r>
+        <m:r>
+          <w:rPr>
+            <w:rFonts w:ascii="Cambria Math" w:hAnsi="Cambria Math" w:cs="Calibri"/>
+            <w:sz w:val="24"/>
+            <w:szCs w:val="24"/>
+            <w:lang w:val="de-DE"/>
+          </w:rPr>
+          <m:t xml:space="preserve">285 840 </m:t>
+        </m:r>
+        <m:r>
+          <w:rPr>
+            <w:rFonts w:ascii="Cambria Math" w:hAnsi="Cambria Math" w:cs="Calibri"/>
+            <w:sz w:val="24"/>
+            <w:szCs w:val="24"/>
+          </w:rPr>
+          <m:t>J</m:t>
+        </m:r>
+        <m:r>
+          <w:rPr>
+            <w:rFonts w:ascii="Cambria Math" w:hAnsi="Cambria Math" w:cs="Calibri"/>
+            <w:sz w:val="24"/>
+            <w:szCs w:val="24"/>
+            <w:lang w:val="de-DE"/>
+          </w:rPr>
+          <m:t>/</m:t>
+        </m:r>
+        <m:r>
+          <w:rPr>
+            <w:rFonts w:ascii="Cambria Math" w:hAnsi="Cambria Math" w:cs="Calibri"/>
+            <w:sz w:val="24"/>
+            <w:szCs w:val="24"/>
+          </w:rPr>
+          <m:t>mol</m:t>
+        </m:r>
+      </m:oMath>
+    </w:p>
+    <w:p>
+      <w:pPr>
+        <w:bidi w:val="0"/>
+        <w:jc w:val="both"/>
+        <w:rPr>
+          <w:rFonts w:ascii="Calibri" w:hAnsi="Calibri" w:cs="Calibri"/>
           <w:b/>
           <w:bCs/>
           <w:sz w:val="24"/>
@@ -685,7 +997,7 @@
       </w:pPr>
       <w:r>
         <w:rPr>
-          <w:rFonts w:ascii="Times New Roman" w:hAnsi="Times New Roman" w:cs="Times New Roman"/>
+          <w:rFonts w:ascii="Calibri" w:hAnsi="Calibri" w:cs="Calibri"/>
           <w:b/>
           <w:bCs/>
           <w:sz w:val="24"/>
@@ -696,10 +1008,44 @@
     </w:p>
     <w:p>
       <w:pPr>
-        <w:pStyle w:val="ListParagraph"/>
         <w:bidi w:val="0"/>
-        <w:rPr>
-          <w:rFonts w:ascii="Times New Roman" w:hAnsi="Times New Roman" w:cs="Times New Roman"/>
+        <w:jc w:val="both"/>
+        <w:rPr>
+          <w:rFonts w:ascii="Calibri" w:hAnsi="Calibri" w:cs="Calibri"/>
+          <w:sz w:val="24"/>
+          <w:szCs w:val="24"/>
+        </w:rPr>
+      </w:pPr>
+      <w:r>
+        <w:rPr>
+          <w:rFonts w:ascii="Calibri" w:hAnsi="Calibri" w:cs="Calibri"/>
+          <w:sz w:val="24"/>
+          <w:szCs w:val="24"/>
+        </w:rPr>
+        <w:t>Description: Converts the active electrical power (kW) into the mass flow of Hydrogen (mol/s).</w:t>
+      </w:r>
+    </w:p>
+    <w:p>
+      <w:pPr>
+        <w:bidi w:val="0"/>
+        <w:jc w:val="both"/>
+        <w:rPr>
+          <w:rFonts w:ascii="Calibri" w:hAnsi="Calibri" w:cs="Calibri"/>
+          <w:b/>
+          <w:bCs/>
+          <w:sz w:val="24"/>
+          <w:szCs w:val="24"/>
+        </w:rPr>
+      </w:pPr>
+    </w:p>
+    <w:p>
+      <w:pPr>
+        <w:bidi w:val="0"/>
+        <w:jc w:val="both"/>
+        <w:rPr>
+          <w:rFonts w:ascii="Calibri" w:hAnsi="Calibri" w:cs="Calibri"/>
+          <w:b/>
+          <w:bCs/>
           <w:sz w:val="24"/>
           <w:szCs w:val="24"/>
         </w:rPr>
@@ -710,7 +1056,7 @@
             <m:sSubPr>
               <m:ctrlPr>
                 <w:rPr>
-                  <w:rFonts w:ascii="Cambria Math" w:hAnsi="Cambria Math" w:cs="Times New Roman"/>
+                  <w:rFonts w:ascii="Cambria Math" w:hAnsi="Cambria Math" w:cs="Calibri"/>
                   <w:i/>
                   <w:sz w:val="24"/>
                   <w:szCs w:val="24"/>
@@ -720,7 +1066,7 @@
             <m:e>
               <m:r>
                 <w:rPr>
-                  <w:rFonts w:ascii="Cambria Math" w:hAnsi="Cambria Math" w:cs="Times New Roman"/>
+                  <w:rFonts w:ascii="Cambria Math" w:hAnsi="Cambria Math" w:cs="Calibri"/>
                   <w:sz w:val="24"/>
                   <w:szCs w:val="24"/>
                 </w:rPr>
@@ -730,7 +1076,7 @@
             <m:sub>
               <m:r>
                 <w:rPr>
-                  <w:rFonts w:ascii="Cambria Math" w:hAnsi="Cambria Math" w:cs="Times New Roman"/>
+                  <w:rFonts w:ascii="Cambria Math" w:hAnsi="Cambria Math" w:cs="Calibri"/>
                   <w:sz w:val="24"/>
                   <w:szCs w:val="24"/>
                 </w:rPr>
@@ -740,7 +1086,7 @@
           </m:sSub>
           <m:r>
             <w:rPr>
-              <w:rFonts w:ascii="Cambria Math" w:hAnsi="Cambria Math" w:cs="Times New Roman"/>
+              <w:rFonts w:ascii="Cambria Math" w:hAnsi="Cambria Math" w:cs="Calibri"/>
               <w:sz w:val="24"/>
               <w:szCs w:val="24"/>
             </w:rPr>
@@ -750,7 +1096,7 @@
             <m:fPr>
               <m:ctrlPr>
                 <w:rPr>
-                  <w:rFonts w:ascii="Cambria Math" w:hAnsi="Cambria Math" w:cs="Times New Roman"/>
+                  <w:rFonts w:ascii="Cambria Math" w:hAnsi="Cambria Math" w:cs="Calibri"/>
                   <w:i/>
                   <w:sz w:val="24"/>
                   <w:szCs w:val="24"/>
@@ -762,7 +1108,7 @@
                 <m:sSubPr>
                   <m:ctrlPr>
                     <w:rPr>
-                      <w:rFonts w:ascii="Cambria Math" w:hAnsi="Cambria Math" w:cs="Times New Roman"/>
+                      <w:rFonts w:ascii="Cambria Math" w:hAnsi="Cambria Math" w:cs="Calibri"/>
                       <w:i/>
                       <w:sz w:val="24"/>
                       <w:szCs w:val="24"/>
@@ -772,7 +1118,7 @@
                 <m:e>
                   <m:r>
                     <w:rPr>
-                      <w:rFonts w:ascii="Cambria Math" w:hAnsi="Cambria Math" w:cs="Times New Roman"/>
+                      <w:rFonts w:ascii="Cambria Math" w:hAnsi="Cambria Math" w:cs="Calibri"/>
                       <w:sz w:val="24"/>
                       <w:szCs w:val="24"/>
                     </w:rPr>
@@ -782,7 +1128,7 @@
                 <m:sub>
                   <m:r>
                     <w:rPr>
-                      <w:rFonts w:ascii="Cambria Math" w:hAnsi="Cambria Math" w:cs="Times New Roman"/>
+                      <w:rFonts w:ascii="Cambria Math" w:hAnsi="Cambria Math" w:cs="Calibri"/>
                       <w:sz w:val="24"/>
                       <w:szCs w:val="24"/>
                     </w:rPr>
@@ -792,7 +1138,7 @@
               </m:sSub>
               <m:r>
                 <w:rPr>
-                  <w:rFonts w:ascii="Cambria Math" w:hAnsi="Cambria Math" w:cs="Times New Roman"/>
+                  <w:rFonts w:ascii="Cambria Math" w:hAnsi="Cambria Math" w:cs="Calibri"/>
                   <w:sz w:val="24"/>
                   <w:szCs w:val="24"/>
                 </w:rPr>
@@ -802,7 +1148,7 @@
                 <m:sSubPr>
                   <m:ctrlPr>
                     <w:rPr>
-                      <w:rFonts w:ascii="Cambria Math" w:hAnsi="Cambria Math" w:cs="Times New Roman"/>
+                      <w:rFonts w:ascii="Cambria Math" w:hAnsi="Cambria Math" w:cs="Calibri"/>
                       <w:i/>
                       <w:sz w:val="24"/>
                       <w:szCs w:val="24"/>
@@ -812,7 +1158,7 @@
                 <m:e>
                   <m:r>
                     <w:rPr>
-                      <w:rFonts w:ascii="Cambria Math" w:hAnsi="Cambria Math" w:cs="Times New Roman"/>
+                      <w:rFonts w:ascii="Cambria Math" w:hAnsi="Cambria Math" w:cs="Calibri"/>
                       <w:sz w:val="24"/>
                       <w:szCs w:val="24"/>
                     </w:rPr>
@@ -822,7 +1168,7 @@
                 <m:sub>
                   <m:r>
                     <w:rPr>
-                      <w:rFonts w:ascii="Cambria Math" w:hAnsi="Cambria Math" w:cs="Times New Roman"/>
+                      <w:rFonts w:ascii="Cambria Math" w:hAnsi="Cambria Math" w:cs="Calibri"/>
                       <w:sz w:val="24"/>
                       <w:szCs w:val="24"/>
                     </w:rPr>
@@ -836,7 +1182,7 @@
                 <m:sSubPr>
                   <m:ctrlPr>
                     <w:rPr>
-                      <w:rFonts w:ascii="Cambria Math" w:hAnsi="Cambria Math" w:cs="Times New Roman"/>
+                      <w:rFonts w:ascii="Cambria Math" w:hAnsi="Cambria Math" w:cs="Calibri"/>
                       <w:i/>
                       <w:sz w:val="24"/>
                       <w:szCs w:val="24"/>
@@ -846,7 +1192,7 @@
                 <m:e>
                   <m:r>
                     <w:rPr>
-                      <w:rFonts w:ascii="Cambria Math" w:hAnsi="Cambria Math" w:cs="Times New Roman"/>
+                      <w:rFonts w:ascii="Cambria Math" w:hAnsi="Cambria Math" w:cs="Calibri"/>
                       <w:sz w:val="24"/>
                       <w:szCs w:val="24"/>
                     </w:rPr>
@@ -858,7 +1204,7 @@
                     <m:sSubPr>
                       <m:ctrlPr>
                         <w:rPr>
-                          <w:rFonts w:ascii="Cambria Math" w:hAnsi="Cambria Math" w:cs="Times New Roman"/>
+                          <w:rFonts w:ascii="Cambria Math" w:hAnsi="Cambria Math" w:cs="Calibri"/>
                           <w:i/>
                           <w:sz w:val="24"/>
                           <w:szCs w:val="24"/>
@@ -868,7 +1214,7 @@
                     <m:e>
                       <m:r>
                         <w:rPr>
-                          <w:rFonts w:ascii="Cambria Math" w:hAnsi="Cambria Math" w:cs="Times New Roman"/>
+                          <w:rFonts w:ascii="Cambria Math" w:hAnsi="Cambria Math" w:cs="Calibri"/>
                           <w:sz w:val="24"/>
                           <w:szCs w:val="24"/>
                         </w:rPr>
@@ -878,7 +1224,7 @@
                     <m:sub>
                       <m:r>
                         <w:rPr>
-                          <w:rFonts w:ascii="Cambria Math" w:hAnsi="Cambria Math" w:cs="Times New Roman"/>
+                          <w:rFonts w:ascii="Cambria Math" w:hAnsi="Cambria Math" w:cs="Calibri"/>
                           <w:sz w:val="24"/>
                           <w:szCs w:val="24"/>
                         </w:rPr>
@@ -895,10 +1241,11 @@
     </w:p>
     <w:p>
       <w:pPr>
-        <w:pStyle w:val="ListParagraph"/>
+        <w:pStyle w:val="Listenabsatz"/>
         <w:bidi w:val="0"/>
-        <w:rPr>
-          <w:rFonts w:ascii="Times New Roman" w:hAnsi="Times New Roman" w:cs="Times New Roman"/>
+        <w:jc w:val="both"/>
+        <w:rPr>
+          <w:rFonts w:ascii="Calibri" w:hAnsi="Calibri" w:cs="Calibri"/>
           <w:sz w:val="24"/>
           <w:szCs w:val="24"/>
         </w:rPr>
@@ -906,89 +1253,10 @@
     </w:p>
     <w:p>
       <w:pPr>
-        <w:pStyle w:val="ListParagraph"/>
-        <w:numPr>
-          <w:ilvl w:val="0"/>
-          <w:numId w:val="4"/>
-        </w:numPr>
         <w:bidi w:val="0"/>
-        <w:ind w:left="1843"/>
-        <w:rPr>
-          <w:rFonts w:ascii="Times New Roman" w:hAnsi="Times New Roman" w:cs="Times New Roman"/>
-          <w:sz w:val="24"/>
-          <w:szCs w:val="24"/>
-        </w:rPr>
-      </w:pPr>
-      <w:r>
-        <w:rPr>
-          <w:rFonts w:ascii="Times New Roman" w:hAnsi="Times New Roman" w:cs="Times New Roman"/>
-          <w:sz w:val="24"/>
-          <w:szCs w:val="24"/>
-        </w:rPr>
-        <w:t xml:space="preserve">Description: </w:t>
-      </w:r>
-      <w:r>
-        <w:rPr>
-          <w:rFonts w:ascii="Times New Roman" w:hAnsi="Times New Roman" w:cs="Times New Roman"/>
-          <w:sz w:val="24"/>
-          <w:szCs w:val="24"/>
-        </w:rPr>
-        <w:t>Converts the active electrical power (kW) into the mass flow of Hydrogen (</w:t>
-      </w:r>
-      <w:r>
-        <w:rPr>
-          <w:rFonts w:ascii="Times New Roman" w:hAnsi="Times New Roman" w:cs="Times New Roman"/>
-          <w:sz w:val="24"/>
-          <w:szCs w:val="24"/>
-        </w:rPr>
-        <w:t>mol</w:t>
-      </w:r>
-      <w:r>
-        <w:rPr>
-          <w:rFonts w:ascii="Times New Roman" w:hAnsi="Times New Roman" w:cs="Times New Roman"/>
-          <w:sz w:val="24"/>
-          <w:szCs w:val="24"/>
-        </w:rPr>
-        <w:t>/</w:t>
-      </w:r>
-      <w:r>
-        <w:rPr>
-          <w:rFonts w:ascii="Times New Roman" w:hAnsi="Times New Roman" w:cs="Times New Roman"/>
-          <w:sz w:val="24"/>
-          <w:szCs w:val="24"/>
-        </w:rPr>
-        <w:t>s</w:t>
-      </w:r>
-      <w:r>
-        <w:rPr>
-          <w:rFonts w:ascii="Times New Roman" w:hAnsi="Times New Roman" w:cs="Times New Roman"/>
-          <w:sz w:val="24"/>
-          <w:szCs w:val="24"/>
-        </w:rPr>
-        <w:t>).</w:t>
-      </w:r>
-    </w:p>
-    <w:p>
-      <w:pPr>
-        <w:pStyle w:val="ListParagraph"/>
-        <w:bidi w:val="0"/>
-        <w:rPr>
-          <w:rFonts w:ascii="Times New Roman" w:hAnsi="Times New Roman" w:cs="Times New Roman"/>
-          <w:sz w:val="24"/>
-          <w:szCs w:val="24"/>
-        </w:rPr>
-      </w:pPr>
-    </w:p>
-    <w:p>
-      <w:pPr>
-        <w:pStyle w:val="ListParagraph"/>
-        <w:numPr>
-          <w:ilvl w:val="0"/>
-          <w:numId w:val="3"/>
-        </w:numPr>
-        <w:bidi w:val="0"/>
-        <w:rPr>
-          <w:rFonts w:ascii="Times New Roman" w:hAnsi="Times New Roman" w:cs="Times New Roman"/>
+        <w:jc w:val="both"/>
+        <w:rPr>
+          <w:rFonts w:ascii="Calibri" w:hAnsi="Calibri" w:cs="Calibri"/>
           <w:b/>
           <w:bCs/>
           <w:sz w:val="24"/>
@@ -997,7 +1265,7 @@
       </w:pPr>
       <w:r>
         <w:rPr>
-          <w:rFonts w:ascii="Times New Roman" w:hAnsi="Times New Roman" w:cs="Times New Roman"/>
+          <w:rFonts w:ascii="Calibri" w:hAnsi="Calibri" w:cs="Calibri"/>
           <w:b/>
           <w:bCs/>
           <w:sz w:val="24"/>
@@ -1008,11 +1276,145 @@
     </w:p>
     <w:p>
       <w:pPr>
-        <w:pStyle w:val="ListParagraph"/>
+        <w:bidi w:val="0"/>
+        <w:jc w:val="both"/>
+        <w:rPr>
+          <w:rFonts w:ascii="Calibri" w:hAnsi="Calibri" w:cs="Calibri"/>
+          <w:sz w:val="24"/>
+          <w:szCs w:val="24"/>
+        </w:rPr>
+      </w:pPr>
+      <w:r>
+        <w:rPr>
+          <w:rFonts w:ascii="Calibri" w:hAnsi="Calibri" w:cs="Calibri"/>
+          <w:sz w:val="24"/>
+          <w:szCs w:val="24"/>
+        </w:rPr>
+        <w:t xml:space="preserve">Description: Based on the molar ratio of </w:t>
+      </w:r>
+      <m:oMath>
+        <m:sSub>
+          <m:sSubPr>
+            <m:ctrlPr>
+              <w:rPr>
+                <w:rFonts w:ascii="Cambria Math" w:hAnsi="Cambria Math" w:cs="Calibri"/>
+                <w:i/>
+                <w:sz w:val="24"/>
+                <w:szCs w:val="24"/>
+              </w:rPr>
+            </m:ctrlPr>
+          </m:sSubPr>
+          <m:e>
+            <m:r>
+              <w:rPr>
+                <w:rFonts w:ascii="Cambria Math" w:hAnsi="Cambria Math" w:cs="Calibri"/>
+                <w:sz w:val="24"/>
+                <w:szCs w:val="24"/>
+              </w:rPr>
+              <m:t>H</m:t>
+            </m:r>
+          </m:e>
+          <m:sub>
+            <m:r>
+              <w:rPr>
+                <w:rFonts w:ascii="Cambria Math" w:hAnsi="Cambria Math" w:cs="Calibri"/>
+                <w:sz w:val="24"/>
+                <w:szCs w:val="24"/>
+              </w:rPr>
+              <m:t>2</m:t>
+            </m:r>
+          </m:sub>
+        </m:sSub>
+      </m:oMath>
+      <w:r>
+        <w:rPr>
+          <w:rFonts w:ascii="Calibri" w:eastAsiaTheme="minorEastAsia" w:hAnsi="Calibri" w:cs="Calibri"/>
+          <w:sz w:val="24"/>
+          <w:szCs w:val="24"/>
+        </w:rPr>
+        <w:t xml:space="preserve"> to </w:t>
+      </w:r>
+      <m:oMath>
+        <m:sSub>
+          <m:sSubPr>
+            <m:ctrlPr>
+              <w:rPr>
+                <w:rFonts w:ascii="Cambria Math" w:hAnsi="Cambria Math" w:cs="Calibri"/>
+                <w:i/>
+                <w:sz w:val="24"/>
+                <w:szCs w:val="24"/>
+              </w:rPr>
+            </m:ctrlPr>
+          </m:sSubPr>
+          <m:e>
+            <m:r>
+              <w:rPr>
+                <w:rFonts w:ascii="Cambria Math" w:hAnsi="Cambria Math" w:cs="Calibri"/>
+                <w:sz w:val="24"/>
+                <w:szCs w:val="24"/>
+              </w:rPr>
+              <m:t>O</m:t>
+            </m:r>
+          </m:e>
+          <m:sub>
+            <m:r>
+              <w:rPr>
+                <w:rFonts w:ascii="Cambria Math" w:hAnsi="Cambria Math" w:cs="Calibri"/>
+                <w:sz w:val="24"/>
+                <w:szCs w:val="24"/>
+              </w:rPr>
+              <m:t>2</m:t>
+            </m:r>
+          </m:sub>
+        </m:sSub>
+      </m:oMath>
+      <w:r>
+        <w:rPr>
+          <w:rFonts w:ascii="Calibri" w:hAnsi="Calibri" w:cs="Calibri"/>
+          <w:sz w:val="24"/>
+          <w:szCs w:val="24"/>
+        </w:rPr>
+        <w:t xml:space="preserve"> in H</w:t>
+      </w:r>
+      <w:r>
+        <w:rPr>
+          <w:rFonts w:ascii="Calibri" w:hAnsi="Calibri" w:cs="Calibri"/>
+          <w:sz w:val="24"/>
+          <w:szCs w:val="24"/>
+          <w:vertAlign w:val="subscript"/>
+        </w:rPr>
+        <w:t>2</w:t>
+      </w:r>
+      <w:r>
+        <w:rPr>
+          <w:rFonts w:ascii="Calibri" w:hAnsi="Calibri" w:cs="Calibri"/>
+          <w:sz w:val="24"/>
+          <w:szCs w:val="24"/>
+        </w:rPr>
+        <w:t>O</w:t>
+      </w:r>
+    </w:p>
+    <w:p>
+      <w:pPr>
+        <w:bidi w:val="0"/>
+        <w:jc w:val="both"/>
+        <w:rPr>
+          <w:rFonts w:ascii="Calibri" w:hAnsi="Calibri" w:cs="Calibri"/>
+          <w:b/>
+          <w:bCs/>
+          <w:sz w:val="24"/>
+          <w:szCs w:val="24"/>
+        </w:rPr>
+      </w:pPr>
+    </w:p>
+    <w:p>
+      <w:pPr>
+        <w:pStyle w:val="Listenabsatz"/>
         <w:bidi w:val="0"/>
         <w:ind w:left="1440"/>
-        <w:rPr>
-          <w:rFonts w:ascii="Times New Roman" w:hAnsi="Times New Roman" w:cs="Times New Roman"/>
+        <w:jc w:val="both"/>
+        <w:rPr>
+          <w:rFonts w:ascii="Calibri" w:hAnsi="Calibri" w:cs="Calibri"/>
           <w:sz w:val="24"/>
           <w:szCs w:val="24"/>
         </w:rPr>
@@ -1023,7 +1425,7 @@
             <m:sSubPr>
               <m:ctrlPr>
                 <w:rPr>
-                  <w:rFonts w:ascii="Cambria Math" w:hAnsi="Cambria Math" w:cs="Times New Roman"/>
+                  <w:rFonts w:ascii="Cambria Math" w:hAnsi="Cambria Math" w:cs="Calibri"/>
                   <w:i/>
                   <w:sz w:val="24"/>
                   <w:szCs w:val="24"/>
@@ -1033,7 +1435,7 @@
             <m:e>
               <m:r>
                 <w:rPr>
-                  <w:rFonts w:ascii="Cambria Math" w:hAnsi="Cambria Math" w:cs="Times New Roman"/>
+                  <w:rFonts w:ascii="Cambria Math" w:hAnsi="Cambria Math" w:cs="Calibri"/>
                   <w:sz w:val="24"/>
                   <w:szCs w:val="24"/>
                 </w:rPr>
@@ -1045,7 +1447,7 @@
                 <m:sSubPr>
                   <m:ctrlPr>
                     <w:rPr>
-                      <w:rFonts w:ascii="Cambria Math" w:hAnsi="Cambria Math" w:cs="Times New Roman"/>
+                      <w:rFonts w:ascii="Cambria Math" w:hAnsi="Cambria Math" w:cs="Calibri"/>
                       <w:i/>
                       <w:sz w:val="24"/>
                       <w:szCs w:val="24"/>
@@ -1055,7 +1457,7 @@
                 <m:e>
                   <m:r>
                     <w:rPr>
-                      <w:rFonts w:ascii="Cambria Math" w:hAnsi="Cambria Math" w:cs="Times New Roman"/>
+                      <w:rFonts w:ascii="Cambria Math" w:hAnsi="Cambria Math" w:cs="Calibri"/>
                       <w:sz w:val="24"/>
                       <w:szCs w:val="24"/>
                     </w:rPr>
@@ -1065,7 +1467,7 @@
                 <m:sub>
                   <m:r>
                     <w:rPr>
-                      <w:rFonts w:ascii="Cambria Math" w:hAnsi="Cambria Math" w:cs="Times New Roman"/>
+                      <w:rFonts w:ascii="Cambria Math" w:hAnsi="Cambria Math" w:cs="Calibri"/>
                       <w:sz w:val="24"/>
                       <w:szCs w:val="24"/>
                     </w:rPr>
@@ -1077,7 +1479,7 @@
           </m:sSub>
           <m:r>
             <w:rPr>
-              <w:rFonts w:ascii="Cambria Math" w:hAnsi="Cambria Math" w:cs="Times New Roman"/>
+              <w:rFonts w:ascii="Cambria Math" w:hAnsi="Cambria Math" w:cs="Calibri"/>
               <w:sz w:val="24"/>
               <w:szCs w:val="24"/>
             </w:rPr>
@@ -1087,7 +1489,7 @@
             <m:sSubPr>
               <m:ctrlPr>
                 <w:rPr>
-                  <w:rFonts w:ascii="Cambria Math" w:hAnsi="Cambria Math" w:cs="Times New Roman"/>
+                  <w:rFonts w:ascii="Cambria Math" w:hAnsi="Cambria Math" w:cs="Calibri"/>
                   <w:i/>
                   <w:sz w:val="24"/>
                   <w:szCs w:val="24"/>
@@ -1097,7 +1499,7 @@
             <m:e>
               <m:r>
                 <w:rPr>
-                  <w:rFonts w:ascii="Cambria Math" w:hAnsi="Cambria Math" w:cs="Times New Roman"/>
+                  <w:rFonts w:ascii="Cambria Math" w:hAnsi="Cambria Math" w:cs="Calibri"/>
                   <w:sz w:val="24"/>
                   <w:szCs w:val="24"/>
                 </w:rPr>
@@ -1109,7 +1511,7 @@
                 <m:sSubPr>
                   <m:ctrlPr>
                     <w:rPr>
-                      <w:rFonts w:ascii="Cambria Math" w:hAnsi="Cambria Math" w:cs="Times New Roman"/>
+                      <w:rFonts w:ascii="Cambria Math" w:hAnsi="Cambria Math" w:cs="Calibri"/>
                       <w:i/>
                       <w:sz w:val="24"/>
                       <w:szCs w:val="24"/>
@@ -1119,7 +1521,7 @@
                 <m:e>
                   <m:r>
                     <w:rPr>
-                      <w:rFonts w:ascii="Cambria Math" w:hAnsi="Cambria Math" w:cs="Times New Roman"/>
+                      <w:rFonts w:ascii="Cambria Math" w:hAnsi="Cambria Math" w:cs="Calibri"/>
                       <w:sz w:val="24"/>
                       <w:szCs w:val="24"/>
                     </w:rPr>
@@ -1129,7 +1531,7 @@
                 <m:sub>
                   <m:r>
                     <w:rPr>
-                      <w:rFonts w:ascii="Cambria Math" w:hAnsi="Cambria Math" w:cs="Times New Roman"/>
+                      <w:rFonts w:ascii="Cambria Math" w:hAnsi="Cambria Math" w:cs="Calibri"/>
                       <w:sz w:val="24"/>
                       <w:szCs w:val="24"/>
                     </w:rPr>
@@ -1141,215 +1543,21 @@
           </m:sSub>
           <m:r>
             <w:rPr>
-              <w:rFonts w:ascii="Cambria Math" w:hAnsi="Cambria Math" w:cs="Times New Roman"/>
+              <w:rFonts w:ascii="Cambria Math" w:hAnsi="Cambria Math" w:cs="Calibri"/>
               <w:sz w:val="24"/>
               <w:szCs w:val="24"/>
             </w:rPr>
-            <m:t>×</m:t>
-          </m:r>
-          <m:r>
-            <w:rPr>
-              <w:rFonts w:ascii="Cambria Math" w:hAnsi="Cambria Math" w:cs="Times New Roman"/>
-              <w:sz w:val="24"/>
-              <w:szCs w:val="24"/>
-            </w:rPr>
-            <m:t>0.5</m:t>
+            <m:t>×0.5</m:t>
           </m:r>
         </m:oMath>
       </m:oMathPara>
     </w:p>
     <w:p>
       <w:pPr>
-        <w:pStyle w:val="ListParagraph"/>
         <w:bidi w:val="0"/>
-        <w:ind w:left="1440"/>
-        <w:rPr>
-          <w:rFonts w:ascii="Times New Roman" w:hAnsi="Times New Roman" w:cs="Times New Roman"/>
-          <w:sz w:val="24"/>
-          <w:szCs w:val="24"/>
-        </w:rPr>
-      </w:pPr>
-    </w:p>
-    <w:p>
-      <w:pPr>
-        <w:pStyle w:val="ListParagraph"/>
-        <w:numPr>
-          <w:ilvl w:val="0"/>
-          <w:numId w:val="4"/>
-        </w:numPr>
-        <w:bidi w:val="0"/>
-        <w:ind w:left="1843"/>
-        <w:rPr>
-          <w:rFonts w:ascii="Times New Roman" w:hAnsi="Times New Roman" w:cs="Times New Roman"/>
-          <w:sz w:val="24"/>
-          <w:szCs w:val="24"/>
-        </w:rPr>
-      </w:pPr>
-      <w:r>
-        <w:rPr>
-          <w:rFonts w:ascii="Times New Roman" w:hAnsi="Times New Roman" w:cs="Times New Roman"/>
-          <w:sz w:val="24"/>
-          <w:szCs w:val="24"/>
-        </w:rPr>
-        <w:t xml:space="preserve">Description: </w:t>
-      </w:r>
-      <w:r>
-        <w:rPr>
-          <w:rFonts w:ascii="Times New Roman" w:hAnsi="Times New Roman" w:cs="Times New Roman"/>
-          <w:sz w:val="24"/>
-          <w:szCs w:val="24"/>
-        </w:rPr>
-        <w:t xml:space="preserve">Based on the </w:t>
-      </w:r>
-      <w:r>
-        <w:rPr>
-          <w:rFonts w:ascii="Times New Roman" w:hAnsi="Times New Roman" w:cs="Times New Roman"/>
-          <w:sz w:val="24"/>
-          <w:szCs w:val="24"/>
-        </w:rPr>
-        <w:t xml:space="preserve">molar ratio of </w:t>
-      </w:r>
-      <m:oMath>
-        <m:sSub>
-          <m:sSubPr>
-            <m:ctrlPr>
-              <w:rPr>
-                <w:rFonts w:ascii="Cambria Math" w:hAnsi="Cambria Math" w:cs="Times New Roman"/>
-                <w:i/>
-                <w:sz w:val="24"/>
-                <w:szCs w:val="24"/>
-              </w:rPr>
-            </m:ctrlPr>
-          </m:sSubPr>
-          <m:e>
-            <m:r>
-              <w:rPr>
-                <w:rFonts w:ascii="Cambria Math" w:hAnsi="Cambria Math" w:cs="Times New Roman"/>
-                <w:sz w:val="24"/>
-                <w:szCs w:val="24"/>
-              </w:rPr>
-              <m:t>H</m:t>
-            </m:r>
-          </m:e>
-          <m:sub>
-            <m:r>
-              <w:rPr>
-                <w:rFonts w:ascii="Cambria Math" w:hAnsi="Cambria Math" w:cs="Times New Roman"/>
-                <w:sz w:val="24"/>
-                <w:szCs w:val="24"/>
-              </w:rPr>
-              <m:t>2</m:t>
-            </m:r>
-          </m:sub>
-        </m:sSub>
-      </m:oMath>
-      <w:r>
-        <w:rPr>
-          <w:rFonts w:ascii="Times New Roman" w:eastAsiaTheme="minorEastAsia" w:hAnsi="Times New Roman" w:cs="Times New Roman"/>
-          <w:sz w:val="24"/>
-          <w:szCs w:val="24"/>
-        </w:rPr>
-        <w:t xml:space="preserve"> to </w:t>
-      </w:r>
-      <m:oMath>
-        <m:sSub>
-          <m:sSubPr>
-            <m:ctrlPr>
-              <w:rPr>
-                <w:rFonts w:ascii="Cambria Math" w:hAnsi="Cambria Math" w:cs="Times New Roman"/>
-                <w:i/>
-                <w:sz w:val="24"/>
-                <w:szCs w:val="24"/>
-              </w:rPr>
-            </m:ctrlPr>
-          </m:sSubPr>
-          <m:e>
-            <m:r>
-              <w:rPr>
-                <w:rFonts w:ascii="Cambria Math" w:hAnsi="Cambria Math" w:cs="Times New Roman"/>
-                <w:sz w:val="24"/>
-                <w:szCs w:val="24"/>
-              </w:rPr>
-              <m:t>O</m:t>
-            </m:r>
-          </m:e>
-          <m:sub>
-            <m:r>
-              <w:rPr>
-                <w:rFonts w:ascii="Cambria Math" w:hAnsi="Cambria Math" w:cs="Times New Roman"/>
-                <w:sz w:val="24"/>
-                <w:szCs w:val="24"/>
-              </w:rPr>
-              <m:t>2</m:t>
-            </m:r>
-          </m:sub>
-        </m:sSub>
-      </m:oMath>
-      <w:r>
-        <w:rPr>
-          <w:rFonts w:ascii="Times New Roman" w:hAnsi="Times New Roman" w:cs="Times New Roman"/>
-          <w:sz w:val="24"/>
-          <w:szCs w:val="24"/>
-        </w:rPr>
-        <w:t xml:space="preserve"> </w:t>
-      </w:r>
-      <w:r>
-        <w:rPr>
-          <w:rFonts w:ascii="Times New Roman" w:hAnsi="Times New Roman" w:cs="Times New Roman"/>
-          <w:sz w:val="24"/>
-          <w:szCs w:val="24"/>
-        </w:rPr>
-        <w:t xml:space="preserve">in </w:t>
-      </w:r>
-      <w:r>
-        <w:rPr>
-          <w:rFonts w:ascii="Times New Roman" w:hAnsi="Times New Roman" w:cs="Times New Roman"/>
-          <w:sz w:val="24"/>
-          <w:szCs w:val="24"/>
-        </w:rPr>
-        <w:t>H</w:t>
-      </w:r>
-      <w:r>
-        <w:rPr>
-          <w:rFonts w:ascii="Times New Roman" w:hAnsi="Times New Roman" w:cs="Times New Roman"/>
-          <w:sz w:val="24"/>
-          <w:szCs w:val="24"/>
-          <w:vertAlign w:val="subscript"/>
-        </w:rPr>
-        <w:t>2</w:t>
-      </w:r>
-      <w:r>
-        <w:rPr>
-          <w:rFonts w:ascii="Times New Roman" w:hAnsi="Times New Roman" w:cs="Times New Roman"/>
-          <w:sz w:val="24"/>
-          <w:szCs w:val="24"/>
-        </w:rPr>
-        <w:t>O</w:t>
-      </w:r>
-    </w:p>
-    <w:p>
-      <w:pPr>
-        <w:pStyle w:val="ListParagraph"/>
-        <w:bidi w:val="0"/>
-        <w:ind w:left="1843"/>
-        <w:rPr>
-          <w:rFonts w:ascii="Times New Roman" w:hAnsi="Times New Roman" w:cs="Times New Roman"/>
-          <w:sz w:val="24"/>
-          <w:szCs w:val="24"/>
-        </w:rPr>
-      </w:pPr>
-    </w:p>
-    <w:p>
-      <w:pPr>
-        <w:pStyle w:val="ListParagraph"/>
-        <w:numPr>
-          <w:ilvl w:val="0"/>
-          <w:numId w:val="4"/>
-        </w:numPr>
-        <w:bidi w:val="0"/>
-        <w:ind w:left="1843"/>
-        <w:rPr>
-          <w:rFonts w:ascii="Times New Roman" w:hAnsi="Times New Roman" w:cs="Times New Roman"/>
+        <w:jc w:val="both"/>
+        <w:rPr>
+          <w:rFonts w:ascii="Calibri" w:hAnsi="Calibri" w:cs="Calibri"/>
           <w:b/>
           <w:bCs/>
           <w:sz w:val="24"/>
@@ -1358,1088 +1566,66 @@
       </w:pPr>
       <w:r>
         <w:rPr>
-          <w:rFonts w:ascii="Times New Roman" w:hAnsi="Times New Roman" w:cs="Times New Roman"/>
+          <w:rFonts w:ascii="Calibri" w:hAnsi="Calibri" w:cs="Calibri"/>
           <w:b/>
           <w:bCs/>
           <w:sz w:val="24"/>
           <w:szCs w:val="24"/>
         </w:rPr>
-        <w:t>Numerical Justification:</w:t>
+        <w:lastRenderedPageBreak/>
+        <w:t>Greenhouse Temperature</w:t>
+      </w:r>
+      <w:r>
+        <w:rPr>
+          <w:rFonts w:ascii="Calibri" w:hAnsi="Calibri" w:cs="Calibri"/>
+          <w:b/>
+          <w:bCs/>
+          <w:sz w:val="24"/>
+          <w:szCs w:val="24"/>
+        </w:rPr>
+        <w:t>:</w:t>
       </w:r>
     </w:p>
     <w:p>
       <w:pPr>
         <w:bidi w:val="0"/>
-        <w:ind w:left="1483"/>
-        <w:rPr>
-          <w:rFonts w:ascii="Times New Roman" w:hAnsi="Times New Roman" w:cs="Times New Roman"/>
+        <w:jc w:val="both"/>
+        <w:rPr>
+          <w:rFonts w:ascii="Calibri" w:hAnsi="Calibri" w:cs="Calibri"/>
           <w:sz w:val="24"/>
           <w:szCs w:val="24"/>
         </w:rPr>
       </w:pPr>
       <w:r>
         <w:rPr>
-          <w:rFonts w:ascii="Times New Roman" w:hAnsi="Times New Roman" w:cs="Times New Roman"/>
+          <w:rFonts w:ascii="Calibri" w:hAnsi="Calibri" w:cs="Calibri"/>
           <w:sz w:val="24"/>
           <w:szCs w:val="24"/>
         </w:rPr>
-        <w:t>Molar Production Rate Calculation:</w:t>
-      </w:r>
-    </w:p>
-    <w:p>
-      <w:pPr>
-        <w:pStyle w:val="ListParagraph"/>
-        <w:numPr>
-          <w:ilvl w:val="0"/>
-          <w:numId w:val="5"/>
-        </w:numPr>
-        <w:bidi w:val="0"/>
-        <w:rPr>
-          <w:rFonts w:ascii="Times New Roman" w:hAnsi="Times New Roman" w:cs="Times New Roman"/>
-          <w:sz w:val="24"/>
-          <w:szCs w:val="24"/>
-        </w:rPr>
-      </w:pPr>
-      <w:r>
-        <w:rPr>
-          <w:rFonts w:ascii="Times New Roman" w:hAnsi="Times New Roman" w:cs="Times New Roman"/>
-          <w:sz w:val="24"/>
-          <w:szCs w:val="24"/>
-        </w:rPr>
-        <w:t>Input Power = 2500J/s</w:t>
-      </w:r>
-    </w:p>
-    <w:p>
-      <w:pPr>
-        <w:pStyle w:val="ListParagraph"/>
-        <w:numPr>
-          <w:ilvl w:val="0"/>
-          <w:numId w:val="5"/>
-        </w:numPr>
-        <w:bidi w:val="0"/>
-        <w:rPr>
-          <w:rFonts w:ascii="Times New Roman" w:hAnsi="Times New Roman" w:cs="Times New Roman"/>
-          <w:sz w:val="24"/>
-          <w:szCs w:val="24"/>
-        </w:rPr>
-      </w:pPr>
-      <w:r>
-        <w:rPr>
-          <w:rFonts w:ascii="Times New Roman" w:hAnsi="Times New Roman" w:cs="Times New Roman"/>
-          <w:sz w:val="24"/>
-          <w:szCs w:val="24"/>
-        </w:rPr>
-        <w:t>Efficiency= 0.7</w:t>
-      </w:r>
-    </w:p>
-    <w:p>
-      <w:pPr>
-        <w:pStyle w:val="ListParagraph"/>
-        <w:numPr>
-          <w:ilvl w:val="0"/>
-          <w:numId w:val="5"/>
-        </w:numPr>
-        <w:bidi w:val="0"/>
-        <w:rPr>
-          <w:rFonts w:ascii="Times New Roman" w:hAnsi="Times New Roman" w:cs="Times New Roman"/>
-          <w:sz w:val="24"/>
-          <w:szCs w:val="24"/>
-        </w:rPr>
-      </w:pPr>
-      <w:r>
-        <w:rPr>
-          <w:rFonts w:ascii="Times New Roman" w:hAnsi="Times New Roman" w:cs="Times New Roman"/>
-          <w:sz w:val="24"/>
-          <w:szCs w:val="24"/>
-        </w:rPr>
-        <w:t>Formation Enthalpy</w:t>
-      </w:r>
-      <w:r>
-        <w:rPr>
-          <w:rFonts w:ascii="Times New Roman" w:hAnsi="Times New Roman" w:cs="Times New Roman"/>
-          <w:sz w:val="24"/>
-          <w:szCs w:val="24"/>
-        </w:rPr>
-        <w:t xml:space="preserve"> (</w:t>
+        <w:t>Description: It determines the temperature change in the greenhouse (</w:t>
       </w:r>
       <m:oMath>
         <m:r>
           <w:rPr>
-            <w:rFonts w:ascii="Cambria Math" w:hAnsi="Cambria Math" w:cs="Times New Roman"/>
+            <w:rFonts w:ascii="Cambria Math" w:hAnsi="Cambria Math" w:cs="Calibri"/>
             <w:sz w:val="24"/>
             <w:szCs w:val="24"/>
           </w:rPr>
-          <m:t>∆H</m:t>
+          <m:t>∆T</m:t>
         </m:r>
       </m:oMath>
       <w:r>
         <w:rPr>
-          <w:rFonts w:ascii="Times New Roman" w:eastAsiaTheme="minorEastAsia" w:hAnsi="Times New Roman" w:cs="Times New Roman"/>
+          <w:rFonts w:ascii="Calibri" w:hAnsi="Calibri" w:cs="Calibri"/>
           <w:sz w:val="24"/>
           <w:szCs w:val="24"/>
         </w:rPr>
-        <w:t>)</w:t>
-      </w:r>
-      <w:r>
-        <w:rPr>
-          <w:rFonts w:ascii="Times New Roman" w:hAnsi="Times New Roman" w:cs="Times New Roman"/>
-          <w:sz w:val="24"/>
-          <w:szCs w:val="24"/>
-        </w:rPr>
-        <w:t>= 285,840</w:t>
-      </w:r>
-      <w:r>
-        <w:rPr>
-          <w:rFonts w:ascii="Times New Roman" w:hAnsi="Times New Roman" w:cs="Times New Roman"/>
-          <w:sz w:val="24"/>
-          <w:szCs w:val="24"/>
-        </w:rPr>
-        <w:t xml:space="preserve"> </w:t>
-      </w:r>
-      <w:r>
-        <w:rPr>
-          <w:rFonts w:ascii="Times New Roman" w:hAnsi="Times New Roman" w:cs="Times New Roman"/>
-          <w:sz w:val="24"/>
-          <w:szCs w:val="24"/>
-        </w:rPr>
-        <w:t>J/mol</w:t>
-      </w:r>
-    </w:p>
-    <w:p>
-      <w:pPr>
-        <w:pStyle w:val="ListParagraph"/>
-        <w:bidi w:val="0"/>
-        <w:ind w:left="1843"/>
-        <w:rPr>
-          <w:rFonts w:ascii="Times New Roman" w:hAnsi="Times New Roman" w:cs="Times New Roman"/>
-          <w:sz w:val="24"/>
-          <w:szCs w:val="24"/>
-        </w:rPr>
-      </w:pPr>
-    </w:p>
-    <w:p>
-      <w:pPr>
-        <w:pStyle w:val="ListParagraph"/>
-        <w:bidi w:val="0"/>
-        <w:ind w:left="1843"/>
-        <w:jc w:val="center"/>
-        <w:rPr>
-          <w:rFonts w:ascii="Times New Roman" w:hAnsi="Times New Roman" w:cs="Times New Roman"/>
-          <w:sz w:val="24"/>
-          <w:szCs w:val="24"/>
-        </w:rPr>
-      </w:pPr>
-      <m:oMathPara>
-        <m:oMath>
-          <m:sSub>
-            <m:sSubPr>
-              <m:ctrlPr>
-                <w:rPr>
-                  <w:rFonts w:ascii="Cambria Math" w:hAnsi="Cambria Math" w:cs="Times New Roman"/>
-                  <w:i/>
-                  <w:sz w:val="24"/>
-                  <w:szCs w:val="24"/>
-                </w:rPr>
-              </m:ctrlPr>
-            </m:sSubPr>
-            <m:e>
-              <m:r>
-                <w:rPr>
-                  <w:rFonts w:ascii="Cambria Math" w:hAnsi="Cambria Math" w:cs="Times New Roman"/>
-                  <w:sz w:val="24"/>
-                  <w:szCs w:val="24"/>
-                </w:rPr>
-                <m:t>H</m:t>
-              </m:r>
-            </m:e>
-            <m:sub>
-              <m:r>
-                <w:rPr>
-                  <w:rFonts w:ascii="Cambria Math" w:hAnsi="Cambria Math" w:cs="Times New Roman"/>
-                  <w:sz w:val="24"/>
-                  <w:szCs w:val="24"/>
-                </w:rPr>
-                <m:t>2, prod</m:t>
-              </m:r>
-            </m:sub>
-          </m:sSub>
-          <m:r>
-            <w:rPr>
-              <w:rFonts w:ascii="Cambria Math" w:hAnsi="Cambria Math" w:cs="Times New Roman"/>
-              <w:sz w:val="24"/>
-              <w:szCs w:val="24"/>
-            </w:rPr>
-            <m:t>=</m:t>
-          </m:r>
-          <m:f>
-            <m:fPr>
-              <m:ctrlPr>
-                <w:rPr>
-                  <w:rFonts w:ascii="Cambria Math" w:hAnsi="Cambria Math" w:cs="Times New Roman"/>
-                  <w:i/>
-                  <w:sz w:val="24"/>
-                  <w:szCs w:val="24"/>
-                </w:rPr>
-              </m:ctrlPr>
-            </m:fPr>
-            <m:num>
-              <m:r>
-                <w:rPr>
-                  <w:rFonts w:ascii="Cambria Math" w:hAnsi="Cambria Math" w:cs="Times New Roman"/>
-                  <w:sz w:val="24"/>
-                  <w:szCs w:val="24"/>
-                </w:rPr>
-                <m:t>2500</m:t>
-              </m:r>
-              <m:r>
-                <w:rPr>
-                  <w:rFonts w:ascii="Cambria Math" w:hAnsi="Cambria Math" w:cs="Times New Roman"/>
-                  <w:sz w:val="24"/>
-                  <w:szCs w:val="24"/>
-                </w:rPr>
-                <m:t>×</m:t>
-              </m:r>
-              <m:r>
-                <w:rPr>
-                  <w:rFonts w:ascii="Cambria Math" w:hAnsi="Cambria Math" w:cs="Times New Roman"/>
-                  <w:sz w:val="24"/>
-                  <w:szCs w:val="24"/>
-                </w:rPr>
-                <m:t>0.7</m:t>
-              </m:r>
-            </m:num>
-            <m:den>
-              <m:r>
-                <w:rPr>
-                  <w:rFonts w:ascii="Cambria Math" w:hAnsi="Cambria Math" w:cs="Times New Roman"/>
-                  <w:sz w:val="24"/>
-                  <w:szCs w:val="24"/>
-                </w:rPr>
-                <m:t>285840</m:t>
-              </m:r>
-            </m:den>
-          </m:f>
-          <m:r>
-            <w:rPr>
-              <w:rFonts w:ascii="Cambria Math" w:hAnsi="Cambria Math" w:cs="Times New Roman"/>
-              <w:sz w:val="24"/>
-              <w:szCs w:val="24"/>
-            </w:rPr>
-            <m:t>=0.0061 mol/s</m:t>
-          </m:r>
-        </m:oMath>
-      </m:oMathPara>
-    </w:p>
-    <w:p>
-      <w:pPr>
-        <w:pStyle w:val="ListParagraph"/>
-        <w:bidi w:val="0"/>
-        <w:ind w:left="1843"/>
-        <w:jc w:val="center"/>
-        <w:rPr>
-          <w:rFonts w:ascii="Times New Roman" w:hAnsi="Times New Roman" w:cs="Times New Roman"/>
-          <w:sz w:val="24"/>
-          <w:szCs w:val="24"/>
-        </w:rPr>
-      </w:pPr>
-    </w:p>
-    <w:p>
-      <w:pPr>
-        <w:pStyle w:val="ListParagraph"/>
-        <w:bidi w:val="0"/>
-        <w:ind w:left="1843"/>
-        <w:jc w:val="center"/>
-        <w:rPr>
-          <w:rFonts w:ascii="Times New Roman" w:hAnsi="Times New Roman" w:cs="Times New Roman"/>
-          <w:sz w:val="24"/>
-          <w:szCs w:val="24"/>
-        </w:rPr>
-      </w:pPr>
-      <m:oMathPara>
-        <m:oMath>
-          <m:sSub>
-            <m:sSubPr>
-              <m:ctrlPr>
-                <w:rPr>
-                  <w:rFonts w:ascii="Cambria Math" w:hAnsi="Cambria Math" w:cs="Times New Roman"/>
-                  <w:i/>
-                  <w:sz w:val="24"/>
-                  <w:szCs w:val="24"/>
-                </w:rPr>
-              </m:ctrlPr>
-            </m:sSubPr>
-            <m:e>
-              <m:r>
-                <w:rPr>
-                  <w:rFonts w:ascii="Cambria Math" w:hAnsi="Cambria Math" w:cs="Times New Roman"/>
-                  <w:sz w:val="24"/>
-                  <w:szCs w:val="24"/>
-                </w:rPr>
-                <m:t>Rate</m:t>
-              </m:r>
-            </m:e>
-            <m:sub>
-              <m:sSub>
-                <m:sSubPr>
-                  <m:ctrlPr>
-                    <w:rPr>
-                      <w:rFonts w:ascii="Cambria Math" w:hAnsi="Cambria Math" w:cs="Times New Roman"/>
-                      <w:i/>
-                      <w:sz w:val="24"/>
-                      <w:szCs w:val="24"/>
-                    </w:rPr>
-                  </m:ctrlPr>
-                </m:sSubPr>
-                <m:e>
-                  <m:r>
-                    <w:rPr>
-                      <w:rFonts w:ascii="Cambria Math" w:hAnsi="Cambria Math" w:cs="Times New Roman"/>
-                      <w:sz w:val="24"/>
-                      <w:szCs w:val="24"/>
-                    </w:rPr>
-                    <m:t>O</m:t>
-                  </m:r>
-                </m:e>
-                <m:sub>
-                  <m:r>
-                    <w:rPr>
-                      <w:rFonts w:ascii="Cambria Math" w:hAnsi="Cambria Math" w:cs="Times New Roman"/>
-                      <w:sz w:val="24"/>
-                      <w:szCs w:val="24"/>
-                    </w:rPr>
-                    <m:t>2</m:t>
-                  </m:r>
-                </m:sub>
-              </m:sSub>
-            </m:sub>
-          </m:sSub>
-          <m:r>
-            <w:rPr>
-              <w:rFonts w:ascii="Cambria Math" w:hAnsi="Cambria Math" w:cs="Times New Roman"/>
-              <w:sz w:val="24"/>
-              <w:szCs w:val="24"/>
-            </w:rPr>
-            <m:t>=</m:t>
-          </m:r>
-          <m:r>
-            <w:rPr>
-              <w:rFonts w:ascii="Cambria Math" w:hAnsi="Cambria Math" w:cs="Times New Roman"/>
-              <w:sz w:val="24"/>
-              <w:szCs w:val="24"/>
-            </w:rPr>
-            <m:t>0.0061</m:t>
-          </m:r>
-          <m:r>
-            <w:rPr>
-              <w:rFonts w:ascii="Cambria Math" w:hAnsi="Cambria Math" w:cs="Times New Roman"/>
-              <w:sz w:val="24"/>
-              <w:szCs w:val="24"/>
-            </w:rPr>
-            <m:t>×0.5</m:t>
-          </m:r>
-          <m:r>
-            <w:rPr>
-              <w:rFonts w:ascii="Cambria Math" w:hAnsi="Cambria Math" w:cs="Times New Roman"/>
-              <w:sz w:val="24"/>
-              <w:szCs w:val="24"/>
-            </w:rPr>
-            <m:t>=0.00305</m:t>
-          </m:r>
-        </m:oMath>
-      </m:oMathPara>
-    </w:p>
-    <w:p>
-      <w:pPr>
-        <w:pStyle w:val="ListParagraph"/>
-        <w:bidi w:val="0"/>
-        <w:ind w:left="1843"/>
-        <w:rPr>
-          <w:rFonts w:ascii="Times New Roman" w:hAnsi="Times New Roman" w:cs="Times New Roman"/>
-          <w:sz w:val="24"/>
-          <w:szCs w:val="24"/>
-        </w:rPr>
-      </w:pPr>
-    </w:p>
-    <w:p>
-      <w:pPr>
-        <w:bidi w:val="0"/>
-        <w:ind w:left="1560"/>
-        <w:rPr>
-          <w:rFonts w:ascii="Times New Roman" w:hAnsi="Times New Roman" w:cs="Times New Roman"/>
-          <w:sz w:val="24"/>
-          <w:szCs w:val="24"/>
-        </w:rPr>
-      </w:pPr>
-      <w:r>
-        <w:rPr>
-          <w:rFonts w:ascii="Times New Roman" w:hAnsi="Times New Roman" w:cs="Times New Roman"/>
-          <w:sz w:val="24"/>
-          <w:szCs w:val="24"/>
-        </w:rPr>
-        <w:lastRenderedPageBreak/>
-        <w:t xml:space="preserve">Inconsistency in </w:t>
-      </w:r>
-      <w:proofErr w:type="spellStart"/>
-      <w:r>
-        <w:rPr>
-          <w:rFonts w:ascii="Times New Roman" w:hAnsi="Times New Roman" w:cs="Times New Roman"/>
-          <w:sz w:val="24"/>
-          <w:szCs w:val="24"/>
-        </w:rPr>
-        <w:t>ox_out</w:t>
-      </w:r>
-      <w:proofErr w:type="spellEnd"/>
-      <w:r>
-        <w:rPr>
-          <w:rFonts w:ascii="Times New Roman" w:hAnsi="Times New Roman" w:cs="Times New Roman"/>
-          <w:sz w:val="24"/>
-          <w:szCs w:val="24"/>
-        </w:rPr>
-        <w:t>:</w:t>
-      </w:r>
-      <w:r>
-        <w:rPr>
-          <w:rFonts w:ascii="Times New Roman" w:hAnsi="Times New Roman" w:cs="Times New Roman"/>
-          <w:sz w:val="24"/>
-          <w:szCs w:val="24"/>
-        </w:rPr>
-        <w:t xml:space="preserve"> </w:t>
-      </w:r>
-      <w:r>
-        <w:rPr>
-          <w:rFonts w:ascii="Times New Roman" w:hAnsi="Times New Roman" w:cs="Times New Roman"/>
-          <w:sz w:val="24"/>
-          <w:szCs w:val="24"/>
-        </w:rPr>
-        <w:t xml:space="preserve">The current value for </w:t>
-      </w:r>
-      <w:proofErr w:type="spellStart"/>
-      <w:r>
-        <w:rPr>
-          <w:rFonts w:ascii="Times New Roman" w:hAnsi="Times New Roman" w:cs="Times New Roman"/>
-          <w:sz w:val="24"/>
-          <w:szCs w:val="24"/>
-        </w:rPr>
-        <w:t>ox_out</w:t>
-      </w:r>
-      <w:proofErr w:type="spellEnd"/>
-      <w:r>
-        <w:rPr>
-          <w:rFonts w:ascii="Times New Roman" w:hAnsi="Times New Roman" w:cs="Times New Roman"/>
-          <w:sz w:val="24"/>
-          <w:szCs w:val="24"/>
-        </w:rPr>
-        <w:t xml:space="preserve"> is set to 0.02</w:t>
-      </w:r>
-      <w:r>
-        <w:rPr>
-          <w:rFonts w:ascii="Times New Roman" w:hAnsi="Times New Roman" w:cs="Times New Roman"/>
-          <w:sz w:val="24"/>
-          <w:szCs w:val="24"/>
-        </w:rPr>
-        <w:t xml:space="preserve"> </w:t>
-      </w:r>
-      <w:r>
-        <w:rPr>
-          <w:rFonts w:ascii="Times New Roman" w:hAnsi="Times New Roman" w:cs="Times New Roman"/>
-          <w:sz w:val="24"/>
-          <w:szCs w:val="24"/>
-        </w:rPr>
-        <w:t>mol/s.</w:t>
-      </w:r>
-    </w:p>
-    <w:p>
-      <w:pPr>
-        <w:pStyle w:val="ListParagraph"/>
-        <w:numPr>
-          <w:ilvl w:val="0"/>
-          <w:numId w:val="5"/>
-        </w:numPr>
-        <w:bidi w:val="0"/>
-        <w:rPr>
-          <w:rFonts w:ascii="Times New Roman" w:hAnsi="Times New Roman" w:cs="Times New Roman"/>
-          <w:sz w:val="24"/>
-          <w:szCs w:val="24"/>
-        </w:rPr>
-      </w:pPr>
-      <w:r>
-        <w:rPr>
-          <w:rFonts w:ascii="Times New Roman" w:hAnsi="Times New Roman" w:cs="Times New Roman"/>
-          <w:sz w:val="24"/>
-          <w:szCs w:val="24"/>
-        </w:rPr>
-        <w:t>Conflict: The outflow (0.02) is ~6.5 times higher than the maximum possible production (0.00305). The buffer cannot sustain this rate.</w:t>
-      </w:r>
-    </w:p>
-    <w:p>
-      <w:pPr>
-        <w:pStyle w:val="ListParagraph"/>
-        <w:bidi w:val="0"/>
-        <w:ind w:left="1843"/>
-        <w:rPr>
-          <w:rFonts w:ascii="Times New Roman" w:hAnsi="Times New Roman" w:cs="Times New Roman"/>
-          <w:sz w:val="24"/>
-          <w:szCs w:val="24"/>
-        </w:rPr>
-      </w:pPr>
-    </w:p>
-    <w:p>
-      <w:pPr>
-        <w:pStyle w:val="ListParagraph"/>
-        <w:numPr>
-          <w:ilvl w:val="0"/>
-          <w:numId w:val="5"/>
-        </w:numPr>
-        <w:bidi w:val="0"/>
-        <w:rPr>
-          <w:rFonts w:ascii="Times New Roman" w:hAnsi="Times New Roman" w:cs="Times New Roman"/>
-          <w:sz w:val="24"/>
-          <w:szCs w:val="24"/>
-        </w:rPr>
-      </w:pPr>
-      <w:r>
-        <w:rPr>
-          <w:rFonts w:ascii="Times New Roman" w:hAnsi="Times New Roman" w:cs="Times New Roman"/>
-          <w:sz w:val="24"/>
-          <w:szCs w:val="24"/>
-        </w:rPr>
-        <w:t xml:space="preserve">Critical Scale Error in </w:t>
-      </w:r>
-      <w:proofErr w:type="spellStart"/>
-      <w:r>
-        <w:rPr>
-          <w:rFonts w:ascii="Times New Roman" w:hAnsi="Times New Roman" w:cs="Times New Roman"/>
-          <w:sz w:val="24"/>
-          <w:szCs w:val="24"/>
-        </w:rPr>
-        <w:t>ox_consum_fish</w:t>
-      </w:r>
-      <w:proofErr w:type="spellEnd"/>
-      <w:r>
-        <w:rPr>
-          <w:rFonts w:ascii="Times New Roman" w:hAnsi="Times New Roman" w:cs="Times New Roman"/>
-          <w:sz w:val="24"/>
-          <w:szCs w:val="24"/>
-        </w:rPr>
-        <w:t>:</w:t>
-      </w:r>
-      <w:r>
-        <w:rPr>
-          <w:rFonts w:ascii="Times New Roman" w:hAnsi="Times New Roman" w:cs="Times New Roman"/>
-          <w:sz w:val="24"/>
-          <w:szCs w:val="24"/>
-        </w:rPr>
-        <w:t xml:space="preserve"> </w:t>
-      </w:r>
-      <w:r>
-        <w:rPr>
-          <w:rFonts w:ascii="Times New Roman" w:hAnsi="Times New Roman" w:cs="Times New Roman"/>
-          <w:sz w:val="24"/>
-          <w:szCs w:val="24"/>
-        </w:rPr>
-        <w:t>The current value is set to 400</w:t>
-      </w:r>
-      <w:r>
-        <w:rPr>
-          <w:rFonts w:ascii="Times New Roman" w:hAnsi="Times New Roman" w:cs="Times New Roman"/>
-          <w:sz w:val="24"/>
-          <w:szCs w:val="24"/>
-        </w:rPr>
-        <w:t xml:space="preserve"> </w:t>
-      </w:r>
-      <w:r>
-        <w:rPr>
-          <w:rFonts w:ascii="Times New Roman" w:hAnsi="Times New Roman" w:cs="Times New Roman"/>
-          <w:sz w:val="24"/>
-          <w:szCs w:val="24"/>
-        </w:rPr>
-        <w:t>mol/s.</w:t>
-      </w:r>
-    </w:p>
-    <w:p>
-      <w:pPr>
-        <w:pStyle w:val="ListParagraph"/>
-        <w:rPr>
-          <w:rFonts w:ascii="Times New Roman" w:hAnsi="Times New Roman" w:cs="Times New Roman"/>
-          <w:sz w:val="24"/>
-          <w:szCs w:val="24"/>
-        </w:rPr>
-      </w:pPr>
-    </w:p>
-    <w:p>
-      <w:pPr>
-        <w:pStyle w:val="ListParagraph"/>
-        <w:numPr>
-          <w:ilvl w:val="0"/>
-          <w:numId w:val="5"/>
-        </w:numPr>
-        <w:bidi w:val="0"/>
-        <w:rPr>
-          <w:rFonts w:ascii="Times New Roman" w:hAnsi="Times New Roman" w:cs="Times New Roman"/>
-          <w:sz w:val="24"/>
-          <w:szCs w:val="24"/>
-        </w:rPr>
-      </w:pPr>
-      <w:r>
-        <w:rPr>
-          <w:rFonts w:ascii="Times New Roman" w:hAnsi="Times New Roman" w:cs="Times New Roman"/>
-          <w:sz w:val="24"/>
-          <w:szCs w:val="24"/>
-        </w:rPr>
-        <w:t>Conflict: This consumption rate is nearly 131,000 times higher than the production rate. In a system of this scale (2</w:t>
-      </w:r>
-      <w:r>
-        <w:rPr>
-          <w:rFonts w:ascii="Times New Roman" w:hAnsi="Times New Roman" w:cs="Times New Roman"/>
-          <w:sz w:val="24"/>
-          <w:szCs w:val="24"/>
-        </w:rPr>
-        <w:t>500 J/s</w:t>
-      </w:r>
-      <w:r>
-        <w:rPr>
-          <w:rFonts w:ascii="Times New Roman" w:hAnsi="Times New Roman" w:cs="Times New Roman"/>
-          <w:sz w:val="24"/>
-          <w:szCs w:val="24"/>
-        </w:rPr>
-        <w:t xml:space="preserve">), oxygen consumption should be in the range of millimoles </w:t>
-      </w:r>
-      <w:r>
-        <w:rPr>
-          <w:rFonts w:ascii="Times New Roman" w:hAnsi="Times New Roman" w:cs="Times New Roman"/>
-          <w:sz w:val="24"/>
-          <w:szCs w:val="24"/>
-        </w:rPr>
-        <w:t>(</w:t>
-      </w:r>
-      <m:oMath>
-        <m:sSup>
-          <m:sSupPr>
-            <m:ctrlPr>
-              <w:rPr>
-                <w:rFonts w:ascii="Cambria Math" w:hAnsi="Cambria Math" w:cs="Times New Roman"/>
-                <w:i/>
-                <w:sz w:val="24"/>
-                <w:szCs w:val="24"/>
-              </w:rPr>
-            </m:ctrlPr>
-          </m:sSupPr>
-          <m:e>
-            <m:r>
-              <w:rPr>
-                <w:rFonts w:ascii="Cambria Math" w:hAnsi="Cambria Math" w:cs="Times New Roman"/>
-                <w:sz w:val="24"/>
-                <w:szCs w:val="24"/>
-              </w:rPr>
-              <m:t>10</m:t>
-            </m:r>
-          </m:e>
-          <m:sup>
-            <m:r>
-              <w:rPr>
-                <w:rFonts w:ascii="Cambria Math" w:hAnsi="Cambria Math" w:cs="Times New Roman"/>
-                <w:sz w:val="24"/>
-                <w:szCs w:val="24"/>
-              </w:rPr>
-              <m:t>-3</m:t>
-            </m:r>
-          </m:sup>
-        </m:sSup>
-      </m:oMath>
-      <w:r>
-        <w:rPr>
-          <w:rFonts w:ascii="Times New Roman" w:eastAsiaTheme="minorEastAsia" w:hAnsi="Times New Roman" w:cs="Times New Roman"/>
-          <w:sz w:val="24"/>
-          <w:szCs w:val="24"/>
-        </w:rPr>
-        <w:t xml:space="preserve">) </w:t>
-      </w:r>
-      <w:r>
-        <w:rPr>
-          <w:rFonts w:ascii="Times New Roman" w:hAnsi="Times New Roman" w:cs="Times New Roman"/>
-          <w:sz w:val="24"/>
-          <w:szCs w:val="24"/>
-        </w:rPr>
-        <w:t>to remain stable within the 10,000</w:t>
-      </w:r>
-      <w:r>
-        <w:rPr>
-          <w:rFonts w:ascii="Times New Roman" w:hAnsi="Times New Roman" w:cs="Times New Roman"/>
-          <w:sz w:val="24"/>
-          <w:szCs w:val="24"/>
-        </w:rPr>
-        <w:t xml:space="preserve"> </w:t>
-      </w:r>
-      <w:r>
-        <w:rPr>
-          <w:rFonts w:ascii="Times New Roman" w:hAnsi="Times New Roman" w:cs="Times New Roman"/>
-          <w:sz w:val="24"/>
-          <w:szCs w:val="24"/>
-        </w:rPr>
-        <w:t>L tank.</w:t>
-      </w:r>
-    </w:p>
-    <w:p>
-      <w:pPr>
-        <w:pStyle w:val="ListParagraph"/>
-        <w:rPr>
-          <w:rFonts w:ascii="Times New Roman" w:hAnsi="Times New Roman" w:cs="Times New Roman"/>
-          <w:sz w:val="24"/>
-          <w:szCs w:val="24"/>
-        </w:rPr>
-      </w:pPr>
-    </w:p>
-    <w:p>
-      <w:pPr>
-        <w:pStyle w:val="ListParagraph"/>
-        <w:numPr>
-          <w:ilvl w:val="0"/>
-          <w:numId w:val="5"/>
-        </w:numPr>
-        <w:bidi w:val="0"/>
-        <w:rPr>
-          <w:rFonts w:ascii="Times New Roman" w:hAnsi="Times New Roman" w:cs="Times New Roman"/>
-          <w:sz w:val="24"/>
-          <w:szCs w:val="24"/>
-        </w:rPr>
-      </w:pPr>
-      <w:r>
-        <w:rPr>
-          <w:rFonts w:ascii="Times New Roman" w:hAnsi="Times New Roman" w:cs="Times New Roman"/>
-          <w:sz w:val="24"/>
-          <w:szCs w:val="24"/>
-        </w:rPr>
-        <w:t>Proposed Solution:</w:t>
-      </w:r>
-      <w:r>
-        <w:rPr>
-          <w:rFonts w:ascii="Times New Roman" w:hAnsi="Times New Roman" w:cs="Times New Roman"/>
-          <w:sz w:val="24"/>
-          <w:szCs w:val="24"/>
-        </w:rPr>
-        <w:t xml:space="preserve"> </w:t>
-      </w:r>
-      <w:r>
-        <w:rPr>
-          <w:rFonts w:ascii="Times New Roman" w:hAnsi="Times New Roman" w:cs="Times New Roman"/>
-          <w:sz w:val="24"/>
-          <w:szCs w:val="24"/>
-        </w:rPr>
-        <w:t>To maintain a Steady-State Equilibrium, we must recalibrate the scales:</w:t>
-      </w:r>
-      <w:r>
-        <w:rPr>
-          <w:rFonts w:ascii="Times New Roman" w:hAnsi="Times New Roman" w:cs="Times New Roman"/>
-          <w:sz w:val="24"/>
-          <w:szCs w:val="24"/>
-        </w:rPr>
-        <w:t xml:space="preserve"> </w:t>
-      </w:r>
-    </w:p>
-    <w:p>
-      <w:pPr>
-        <w:pStyle w:val="ListParagraph"/>
-        <w:rPr>
-          <w:rFonts w:ascii="Times New Roman" w:hAnsi="Times New Roman" w:cs="Times New Roman"/>
-          <w:sz w:val="24"/>
-          <w:szCs w:val="24"/>
-        </w:rPr>
-      </w:pPr>
-    </w:p>
-    <w:p>
-      <w:pPr>
-        <w:pStyle w:val="ListParagraph"/>
-        <w:numPr>
-          <w:ilvl w:val="0"/>
-          <w:numId w:val="6"/>
-        </w:numPr>
-        <w:bidi w:val="0"/>
-        <w:rPr>
-          <w:rFonts w:ascii="Times New Roman" w:hAnsi="Times New Roman" w:cs="Times New Roman"/>
-          <w:sz w:val="24"/>
-          <w:szCs w:val="24"/>
-        </w:rPr>
-      </w:pPr>
-      <w:r>
-        <w:rPr>
-          <w:rFonts w:ascii="Times New Roman" w:hAnsi="Times New Roman" w:cs="Times New Roman"/>
-          <w:sz w:val="24"/>
-          <w:szCs w:val="24"/>
-        </w:rPr>
-        <w:t xml:space="preserve">Set </w:t>
-      </w:r>
-      <w:proofErr w:type="spellStart"/>
-      <w:r>
-        <w:rPr>
-          <w:rFonts w:ascii="Times New Roman" w:hAnsi="Times New Roman" w:cs="Times New Roman"/>
-          <w:sz w:val="24"/>
-          <w:szCs w:val="24"/>
-        </w:rPr>
-        <w:t>ox_out</w:t>
-      </w:r>
-      <w:proofErr w:type="spellEnd"/>
-      <w:r>
-        <w:rPr>
-          <w:rFonts w:ascii="Times New Roman" w:hAnsi="Times New Roman" w:cs="Times New Roman"/>
-          <w:sz w:val="24"/>
-          <w:szCs w:val="24"/>
-        </w:rPr>
-        <w:t xml:space="preserve"> to a value </w:t>
+        <w:t xml:space="preserve">) per simulation interval. </w:t>
       </w:r>
       <m:oMath>
         <m:r>
           <w:rPr>
-            <w:rFonts w:ascii="Cambria Math" w:hAnsi="Cambria Math" w:cs="Times New Roman"/>
-            <w:sz w:val="24"/>
-            <w:szCs w:val="24"/>
-          </w:rPr>
-          <m:t>≤0.003 mol/s</m:t>
-        </m:r>
-      </m:oMath>
-      <w:r>
-        <w:rPr>
-          <w:rFonts w:ascii="Times New Roman" w:eastAsiaTheme="minorEastAsia" w:hAnsi="Times New Roman" w:cs="Times New Roman"/>
-          <w:sz w:val="24"/>
-          <w:szCs w:val="24"/>
-        </w:rPr>
-        <w:t xml:space="preserve"> </w:t>
-      </w:r>
-      <w:r>
-        <w:rPr>
-          <w:rFonts w:ascii="Times New Roman" w:hAnsi="Times New Roman" w:cs="Times New Roman"/>
-          <w:sz w:val="24"/>
-          <w:szCs w:val="24"/>
-        </w:rPr>
-        <w:t>(e.g., 0.0025</w:t>
-      </w:r>
-      <w:r>
-        <w:rPr>
-          <w:rFonts w:ascii="Times New Roman" w:hAnsi="Times New Roman" w:cs="Times New Roman"/>
-          <w:sz w:val="24"/>
-          <w:szCs w:val="24"/>
-        </w:rPr>
-        <w:t xml:space="preserve"> </w:t>
-      </w:r>
-      <w:r>
-        <w:rPr>
-          <w:rFonts w:ascii="Times New Roman" w:hAnsi="Times New Roman" w:cs="Times New Roman"/>
-          <w:sz w:val="24"/>
-          <w:szCs w:val="24"/>
-        </w:rPr>
-        <w:t>mol/s).</w:t>
-      </w:r>
-      <w:r>
-        <w:rPr>
-          <w:rFonts w:ascii="Times New Roman" w:hAnsi="Times New Roman" w:cs="Times New Roman"/>
-          <w:sz w:val="24"/>
-          <w:szCs w:val="24"/>
-        </w:rPr>
-        <w:t xml:space="preserve"> </w:t>
-      </w:r>
-    </w:p>
-    <w:p>
-      <w:pPr>
-        <w:pStyle w:val="ListParagraph"/>
-        <w:numPr>
-          <w:ilvl w:val="0"/>
-          <w:numId w:val="6"/>
-        </w:numPr>
-        <w:bidi w:val="0"/>
-        <w:rPr>
-          <w:rFonts w:ascii="Times New Roman" w:hAnsi="Times New Roman" w:cs="Times New Roman"/>
-          <w:sz w:val="24"/>
-          <w:szCs w:val="24"/>
-        </w:rPr>
-      </w:pPr>
-      <w:r>
-        <w:rPr>
-          <w:rFonts w:ascii="Times New Roman" w:hAnsi="Times New Roman" w:cs="Times New Roman"/>
-          <w:sz w:val="24"/>
-          <w:szCs w:val="24"/>
-        </w:rPr>
-        <w:t xml:space="preserve">Set </w:t>
-      </w:r>
-      <w:proofErr w:type="spellStart"/>
-      <w:r>
-        <w:rPr>
-          <w:rFonts w:ascii="Times New Roman" w:hAnsi="Times New Roman" w:cs="Times New Roman"/>
-          <w:sz w:val="24"/>
-          <w:szCs w:val="24"/>
-        </w:rPr>
-        <w:t>ox_consum_fish</w:t>
-      </w:r>
-      <w:proofErr w:type="spellEnd"/>
-      <w:r>
-        <w:rPr>
-          <w:rFonts w:ascii="Times New Roman" w:hAnsi="Times New Roman" w:cs="Times New Roman"/>
-          <w:sz w:val="24"/>
-          <w:szCs w:val="24"/>
-        </w:rPr>
-        <w:t xml:space="preserve"> to a biologically realistic value for this scale, such as 0.002</w:t>
-      </w:r>
-      <w:r>
-        <w:rPr>
-          <w:rFonts w:ascii="Times New Roman" w:hAnsi="Times New Roman" w:cs="Times New Roman"/>
-          <w:sz w:val="24"/>
-          <w:szCs w:val="24"/>
-        </w:rPr>
-        <w:t xml:space="preserve"> </w:t>
-      </w:r>
-      <w:r>
-        <w:rPr>
-          <w:rFonts w:ascii="Times New Roman" w:hAnsi="Times New Roman" w:cs="Times New Roman"/>
-          <w:sz w:val="24"/>
-          <w:szCs w:val="24"/>
-        </w:rPr>
-        <w:t>mol/s.</w:t>
-      </w:r>
-      <w:r>
-        <w:rPr>
-          <w:rFonts w:ascii="Times New Roman" w:hAnsi="Times New Roman" w:cs="Times New Roman"/>
-          <w:sz w:val="24"/>
-          <w:szCs w:val="24"/>
-        </w:rPr>
-        <w:t xml:space="preserve"> </w:t>
-      </w:r>
-    </w:p>
-    <w:p>
-      <w:pPr>
-        <w:pStyle w:val="ListParagraph"/>
-        <w:numPr>
-          <w:ilvl w:val="0"/>
-          <w:numId w:val="6"/>
-        </w:numPr>
-        <w:bidi w:val="0"/>
-        <w:rPr>
-          <w:rFonts w:ascii="Times New Roman" w:hAnsi="Times New Roman" w:cs="Times New Roman"/>
-          <w:sz w:val="24"/>
-          <w:szCs w:val="24"/>
-        </w:rPr>
-      </w:pPr>
-      <w:r>
-        <w:rPr>
-          <w:rFonts w:ascii="Times New Roman" w:hAnsi="Times New Roman" w:cs="Times New Roman"/>
-          <w:sz w:val="24"/>
-          <w:szCs w:val="24"/>
-        </w:rPr>
-        <w:t>This ensures the concentration d(</w:t>
-      </w:r>
-      <w:proofErr w:type="spellStart"/>
-      <w:r>
-        <w:rPr>
-          <w:rFonts w:ascii="Times New Roman" w:hAnsi="Times New Roman" w:cs="Times New Roman"/>
-          <w:sz w:val="24"/>
-          <w:szCs w:val="24"/>
-        </w:rPr>
-        <w:t>Fish_Tank_Oxygen</w:t>
-      </w:r>
-      <w:proofErr w:type="spellEnd"/>
-      <w:r>
-        <w:rPr>
-          <w:rFonts w:ascii="Times New Roman" w:hAnsi="Times New Roman" w:cs="Times New Roman"/>
-          <w:sz w:val="24"/>
-          <w:szCs w:val="24"/>
-        </w:rPr>
-        <w:t>)/dt remains positive and realistic within the 10,000</w:t>
-      </w:r>
-      <w:r>
-        <w:rPr>
-          <w:rFonts w:ascii="Times New Roman" w:hAnsi="Times New Roman" w:cs="Times New Roman"/>
-          <w:sz w:val="24"/>
-          <w:szCs w:val="24"/>
-        </w:rPr>
-        <w:t xml:space="preserve"> </w:t>
-      </w:r>
-      <w:r>
-        <w:rPr>
-          <w:rFonts w:ascii="Times New Roman" w:hAnsi="Times New Roman" w:cs="Times New Roman"/>
-          <w:sz w:val="24"/>
-          <w:szCs w:val="24"/>
-        </w:rPr>
-        <w:t>L volume.</w:t>
-      </w:r>
-    </w:p>
-    <w:p>
-      <w:pPr>
-        <w:pStyle w:val="ListParagraph"/>
-        <w:bidi w:val="0"/>
-        <w:ind w:left="1843"/>
-        <w:rPr>
-          <w:rFonts w:ascii="Times New Roman" w:hAnsi="Times New Roman" w:cs="Times New Roman"/>
-          <w:sz w:val="24"/>
-          <w:szCs w:val="24"/>
-        </w:rPr>
-      </w:pPr>
-    </w:p>
-    <w:p>
-      <w:pPr>
-        <w:pStyle w:val="ListParagraph"/>
-        <w:numPr>
-          <w:ilvl w:val="0"/>
-          <w:numId w:val="3"/>
-        </w:numPr>
-        <w:bidi w:val="0"/>
-        <w:rPr>
-          <w:rFonts w:ascii="Times New Roman" w:hAnsi="Times New Roman" w:cs="Times New Roman"/>
-          <w:b/>
-          <w:bCs/>
-          <w:sz w:val="24"/>
-          <w:szCs w:val="24"/>
-        </w:rPr>
-      </w:pPr>
-      <w:r>
-        <w:rPr>
-          <w:rFonts w:ascii="Times New Roman" w:hAnsi="Times New Roman" w:cs="Times New Roman"/>
-          <w:b/>
-          <w:bCs/>
-          <w:sz w:val="24"/>
-          <w:szCs w:val="24"/>
-        </w:rPr>
-        <w:t>Greenhouse Temperature</w:t>
-      </w:r>
-      <w:r>
-        <w:rPr>
-          <w:rFonts w:ascii="Times New Roman" w:hAnsi="Times New Roman" w:cs="Times New Roman"/>
-          <w:b/>
-          <w:bCs/>
-          <w:sz w:val="24"/>
-          <w:szCs w:val="24"/>
-        </w:rPr>
-        <w:t>:</w:t>
-      </w:r>
-    </w:p>
-    <w:p>
-      <w:pPr>
-        <w:pStyle w:val="ListParagraph"/>
-        <w:bidi w:val="0"/>
-        <w:ind w:left="1440"/>
-        <w:rPr>
-          <w:rFonts w:ascii="Times New Roman" w:hAnsi="Times New Roman" w:cs="Times New Roman"/>
-          <w:b/>
-          <w:bCs/>
-          <w:sz w:val="24"/>
-          <w:szCs w:val="24"/>
-        </w:rPr>
-      </w:pPr>
-    </w:p>
-    <w:p>
-      <w:pPr>
-        <w:pStyle w:val="ListParagraph"/>
-        <w:bidi w:val="0"/>
-        <w:ind w:left="1440"/>
-        <w:jc w:val="center"/>
-        <w:rPr>
-          <w:rFonts w:ascii="Times New Roman" w:eastAsiaTheme="minorEastAsia" w:hAnsi="Times New Roman" w:cs="Times New Roman"/>
-          <w:bCs/>
-          <w:sz w:val="24"/>
-          <w:szCs w:val="24"/>
-          <w:lang w:val="en-GB"/>
-        </w:rPr>
-      </w:pPr>
-      <m:oMath>
-        <m:r>
-          <w:rPr>
-            <w:rFonts w:ascii="Cambria Math" w:hAnsi="Cambria Math" w:cs="Times New Roman"/>
+            <w:rFonts w:ascii="Cambria Math" w:hAnsi="Cambria Math" w:cs="Calibri"/>
             <w:sz w:val="24"/>
             <w:szCs w:val="24"/>
           </w:rPr>
@@ -2447,7 +1633,7 @@
         </m:r>
         <m:r>
           <w:rPr>
-            <w:rFonts w:ascii="Cambria Math" w:hAnsi="Cambria Math" w:cs="Times New Roman"/>
+            <w:rFonts w:ascii="Cambria Math" w:hAnsi="Cambria Math" w:cs="Calibri"/>
             <w:sz w:val="24"/>
             <w:szCs w:val="24"/>
             <w:lang w:val="en-GB"/>
@@ -2456,7 +1642,7 @@
         </m:r>
         <m:r>
           <w:rPr>
-            <w:rFonts w:ascii="Cambria Math" w:hAnsi="Cambria Math" w:cs="Times New Roman"/>
+            <w:rFonts w:ascii="Cambria Math" w:hAnsi="Cambria Math" w:cs="Calibri"/>
             <w:sz w:val="24"/>
             <w:szCs w:val="24"/>
           </w:rPr>
@@ -2464,7 +1650,7 @@
         </m:r>
         <m:r>
           <w:rPr>
-            <w:rFonts w:ascii="Cambria Math" w:hAnsi="Cambria Math" w:cs="Times New Roman"/>
+            <w:rFonts w:ascii="Cambria Math" w:hAnsi="Cambria Math" w:cs="Calibri"/>
             <w:sz w:val="24"/>
             <w:szCs w:val="24"/>
             <w:lang w:val="en-GB"/>
@@ -2475,7 +1661,7 @@
           <m:sSubPr>
             <m:ctrlPr>
               <w:rPr>
-                <w:rFonts w:ascii="Cambria Math" w:hAnsi="Cambria Math" w:cs="Times New Roman"/>
+                <w:rFonts w:ascii="Cambria Math" w:hAnsi="Cambria Math" w:cs="Calibri"/>
                 <w:bCs/>
                 <w:i/>
                 <w:sz w:val="24"/>
@@ -2486,7 +1672,7 @@
           <m:e>
             <m:r>
               <w:rPr>
-                <w:rFonts w:ascii="Cambria Math" w:hAnsi="Cambria Math" w:cs="Times New Roman"/>
+                <w:rFonts w:ascii="Cambria Math" w:hAnsi="Cambria Math" w:cs="Calibri"/>
                 <w:sz w:val="24"/>
                 <w:szCs w:val="24"/>
               </w:rPr>
@@ -2496,7 +1682,7 @@
           <m:sub>
             <m:r>
               <w:rPr>
-                <w:rFonts w:ascii="Cambria Math" w:hAnsi="Cambria Math" w:cs="Times New Roman"/>
+                <w:rFonts w:ascii="Cambria Math" w:hAnsi="Cambria Math" w:cs="Calibri"/>
                 <w:sz w:val="24"/>
                 <w:szCs w:val="24"/>
               </w:rPr>
@@ -2506,7 +1692,7 @@
         </m:sSub>
         <m:r>
           <w:rPr>
-            <w:rFonts w:ascii="Cambria Math" w:hAnsi="Cambria Math" w:cs="Times New Roman"/>
+            <w:rFonts w:ascii="Cambria Math" w:hAnsi="Cambria Math" w:cs="Calibri"/>
             <w:sz w:val="24"/>
             <w:szCs w:val="24"/>
             <w:lang w:val="en-GB"/>
@@ -2515,7 +1701,7 @@
         </m:r>
         <m:r>
           <w:rPr>
-            <w:rFonts w:ascii="Cambria Math" w:hAnsi="Cambria Math" w:cs="Times New Roman"/>
+            <w:rFonts w:ascii="Cambria Math" w:hAnsi="Cambria Math" w:cs="Calibri"/>
             <w:sz w:val="24"/>
             <w:szCs w:val="24"/>
           </w:rPr>
@@ -2526,7 +1712,7 @@
             <m:sty m:val="bi"/>
           </m:rPr>
           <w:rPr>
-            <w:rFonts w:ascii="Cambria Math" w:hAnsi="Cambria Math" w:cs="Times New Roman"/>
+            <w:rFonts w:ascii="Cambria Math" w:hAnsi="Cambria Math" w:cs="Calibri"/>
             <w:sz w:val="24"/>
             <w:szCs w:val="24"/>
             <w:lang w:val="en-GB"/>
@@ -2536,46 +1722,37 @@
       </m:oMath>
       <w:r>
         <w:rPr>
-          <w:rFonts w:ascii="Times New Roman" w:eastAsiaTheme="minorEastAsia" w:hAnsi="Times New Roman" w:cs="Times New Roman"/>
+          <w:rFonts w:ascii="Calibri" w:eastAsiaTheme="minorEastAsia" w:hAnsi="Calibri" w:cs="Calibri"/>
           <w:bCs/>
           <w:sz w:val="24"/>
           <w:szCs w:val="24"/>
           <w:lang w:val="en-GB"/>
         </w:rPr>
-        <w:t xml:space="preserve">provides the basis </w:t>
+        <w:t>provides the basis temperature change in greenhouse</w:t>
       </w:r>
-      <w:r>
-        <w:rPr>
-          <w:rFonts w:ascii="Times New Roman" w:eastAsiaTheme="minorEastAsia" w:hAnsi="Times New Roman" w:cs="Times New Roman"/>
+    </w:p>
+    <w:p>
+      <w:pPr>
+        <w:pStyle w:val="Listenabsatz"/>
+        <w:bidi w:val="0"/>
+        <w:ind w:left="1440"/>
+        <w:jc w:val="both"/>
+        <w:rPr>
+          <w:rFonts w:ascii="Calibri" w:eastAsiaTheme="minorEastAsia" w:hAnsi="Calibri" w:cs="Calibri"/>
           <w:bCs/>
           <w:sz w:val="24"/>
           <w:szCs w:val="24"/>
           <w:lang w:val="en-GB"/>
         </w:rPr>
-        <w:t>temperature change in greenhouse</w:t>
-      </w:r>
+      </w:pPr>
     </w:p>
     <w:p>
       <w:pPr>
-        <w:pStyle w:val="ListParagraph"/>
-        <w:bidi w:val="0"/>
+        <w:pStyle w:val="Listenabsatz"/>
         <w:ind w:left="1440"/>
-        <w:jc w:val="center"/>
-        <w:rPr>
-          <w:rFonts w:ascii="Times New Roman" w:eastAsiaTheme="minorEastAsia" w:hAnsi="Times New Roman" w:cs="Times New Roman"/>
-          <w:bCs/>
-          <w:sz w:val="24"/>
-          <w:szCs w:val="24"/>
-          <w:lang w:val="en-GB"/>
-        </w:rPr>
-      </w:pPr>
-    </w:p>
-    <w:p>
-      <w:pPr>
-        <w:pStyle w:val="ListParagraph"/>
-        <w:ind w:left="1440"/>
-        <w:rPr>
-          <w:rFonts w:ascii="Times New Roman" w:eastAsiaTheme="minorEastAsia" w:hAnsi="Times New Roman" w:cs="Times New Roman"/>
+        <w:jc w:val="both"/>
+        <w:rPr>
+          <w:rFonts w:ascii="Calibri" w:eastAsiaTheme="minorEastAsia" w:hAnsi="Calibri" w:cs="Calibri"/>
           <w:b/>
           <w:sz w:val="24"/>
           <w:szCs w:val="24"/>
@@ -2588,7 +1765,7 @@
             <m:fPr>
               <m:ctrlPr>
                 <w:rPr>
-                  <w:rFonts w:ascii="Cambria Math" w:eastAsiaTheme="minorEastAsia" w:hAnsi="Cambria Math" w:cs="Times New Roman"/>
+                  <w:rFonts w:ascii="Cambria Math" w:eastAsiaTheme="minorEastAsia" w:hAnsi="Cambria Math" w:cs="Calibri"/>
                   <w:b/>
                   <w:i/>
                   <w:sz w:val="24"/>
@@ -2603,7 +1780,7 @@
                   <m:sty m:val="bi"/>
                 </m:rPr>
                 <w:rPr>
-                  <w:rFonts w:ascii="Cambria Math" w:eastAsiaTheme="minorEastAsia" w:hAnsi="Cambria Math" w:cs="Times New Roman"/>
+                  <w:rFonts w:ascii="Cambria Math" w:eastAsiaTheme="minorEastAsia" w:hAnsi="Cambria Math" w:cs="Calibri"/>
                   <w:sz w:val="24"/>
                   <w:szCs w:val="24"/>
                   <w:lang w:val="en-GB"/>
@@ -2614,7 +1791,7 @@
                 <m:sSubPr>
                   <m:ctrlPr>
                     <w:rPr>
-                      <w:rFonts w:ascii="Cambria Math" w:eastAsiaTheme="minorEastAsia" w:hAnsi="Cambria Math" w:cs="Times New Roman"/>
+                      <w:rFonts w:ascii="Cambria Math" w:eastAsiaTheme="minorEastAsia" w:hAnsi="Cambria Math" w:cs="Calibri"/>
                       <w:b/>
                       <w:i/>
                       <w:sz w:val="24"/>
@@ -2629,7 +1806,7 @@
                       <m:sty m:val="bi"/>
                     </m:rPr>
                     <w:rPr>
-                      <w:rFonts w:ascii="Cambria Math" w:eastAsiaTheme="minorEastAsia" w:hAnsi="Cambria Math" w:cs="Times New Roman"/>
+                      <w:rFonts w:ascii="Cambria Math" w:eastAsiaTheme="minorEastAsia" w:hAnsi="Cambria Math" w:cs="Calibri"/>
                       <w:sz w:val="24"/>
                       <w:szCs w:val="24"/>
                       <w:lang w:val="en-GB"/>
@@ -2643,7 +1820,7 @@
                       <m:sty m:val="bi"/>
                     </m:rPr>
                     <w:rPr>
-                      <w:rFonts w:ascii="Cambria Math" w:eastAsiaTheme="minorEastAsia" w:hAnsi="Cambria Math" w:cs="Times New Roman"/>
+                      <w:rFonts w:ascii="Cambria Math" w:eastAsiaTheme="minorEastAsia" w:hAnsi="Cambria Math" w:cs="Calibri"/>
                       <w:sz w:val="24"/>
                       <w:szCs w:val="24"/>
                       <w:lang w:val="en-GB"/>
@@ -2657,7 +1834,7 @@
                   <m:sty m:val="bi"/>
                 </m:rPr>
                 <w:rPr>
-                  <w:rFonts w:ascii="Cambria Math" w:eastAsiaTheme="minorEastAsia" w:hAnsi="Cambria Math" w:cs="Times New Roman"/>
+                  <w:rFonts w:ascii="Cambria Math" w:eastAsiaTheme="minorEastAsia" w:hAnsi="Cambria Math" w:cs="Calibri"/>
                   <w:sz w:val="24"/>
                   <w:szCs w:val="24"/>
                   <w:lang w:val="en-GB"/>
@@ -2668,7 +1845,7 @@
                 <m:sSubPr>
                   <m:ctrlPr>
                     <w:rPr>
-                      <w:rFonts w:ascii="Cambria Math" w:eastAsiaTheme="minorEastAsia" w:hAnsi="Cambria Math" w:cs="Times New Roman"/>
+                      <w:rFonts w:ascii="Cambria Math" w:eastAsiaTheme="minorEastAsia" w:hAnsi="Cambria Math" w:cs="Calibri"/>
                       <w:b/>
                       <w:i/>
                       <w:sz w:val="24"/>
@@ -2683,7 +1860,7 @@
                       <m:sty m:val="bi"/>
                     </m:rPr>
                     <w:rPr>
-                      <w:rFonts w:ascii="Cambria Math" w:eastAsiaTheme="minorEastAsia" w:hAnsi="Cambria Math" w:cs="Times New Roman"/>
+                      <w:rFonts w:ascii="Cambria Math" w:eastAsiaTheme="minorEastAsia" w:hAnsi="Cambria Math" w:cs="Calibri"/>
                       <w:sz w:val="24"/>
                       <w:szCs w:val="24"/>
                       <w:lang w:val="en-GB"/>
@@ -2697,7 +1874,7 @@
                       <m:sty m:val="bi"/>
                     </m:rPr>
                     <w:rPr>
-                      <w:rFonts w:ascii="Cambria Math" w:eastAsiaTheme="minorEastAsia" w:hAnsi="Cambria Math" w:cs="Times New Roman"/>
+                      <w:rFonts w:ascii="Cambria Math" w:eastAsiaTheme="minorEastAsia" w:hAnsi="Cambria Math" w:cs="Calibri"/>
                       <w:sz w:val="24"/>
                       <w:szCs w:val="24"/>
                       <w:lang w:val="en-GB"/>
@@ -2712,7 +1889,7 @@
                 <m:sSubPr>
                   <m:ctrlPr>
                     <w:rPr>
-                      <w:rFonts w:ascii="Cambria Math" w:eastAsiaTheme="minorEastAsia" w:hAnsi="Cambria Math" w:cs="Times New Roman"/>
+                      <w:rFonts w:ascii="Cambria Math" w:eastAsiaTheme="minorEastAsia" w:hAnsi="Cambria Math" w:cs="Calibri"/>
                       <w:b/>
                       <w:i/>
                       <w:sz w:val="24"/>
@@ -2727,7 +1904,7 @@
                       <m:sty m:val="bi"/>
                     </m:rPr>
                     <w:rPr>
-                      <w:rFonts w:ascii="Cambria Math" w:eastAsiaTheme="minorEastAsia" w:hAnsi="Cambria Math" w:cs="Times New Roman"/>
+                      <w:rFonts w:ascii="Cambria Math" w:eastAsiaTheme="minorEastAsia" w:hAnsi="Cambria Math" w:cs="Calibri"/>
                       <w:sz w:val="24"/>
                       <w:szCs w:val="24"/>
                       <w:lang w:val="en-GB"/>
@@ -2741,7 +1918,7 @@
                       <m:sty m:val="bi"/>
                     </m:rPr>
                     <w:rPr>
-                      <w:rFonts w:ascii="Cambria Math" w:eastAsiaTheme="minorEastAsia" w:hAnsi="Cambria Math" w:cs="Times New Roman"/>
+                      <w:rFonts w:ascii="Cambria Math" w:eastAsiaTheme="minorEastAsia" w:hAnsi="Cambria Math" w:cs="Calibri"/>
                       <w:sz w:val="24"/>
                       <w:szCs w:val="24"/>
                       <w:lang w:val="en-GB"/>
@@ -2755,7 +1932,7 @@
                   <m:sty m:val="bi"/>
                 </m:rPr>
                 <w:rPr>
-                  <w:rFonts w:ascii="Cambria Math" w:eastAsiaTheme="minorEastAsia" w:hAnsi="Cambria Math" w:cs="Times New Roman"/>
+                  <w:rFonts w:ascii="Cambria Math" w:eastAsiaTheme="minorEastAsia" w:hAnsi="Cambria Math" w:cs="Calibri"/>
                   <w:sz w:val="24"/>
                   <w:szCs w:val="24"/>
                   <w:lang w:val="en-GB"/>
@@ -2766,7 +1943,7 @@
                 <m:sSubPr>
                   <m:ctrlPr>
                     <w:rPr>
-                      <w:rFonts w:ascii="Cambria Math" w:eastAsiaTheme="minorEastAsia" w:hAnsi="Cambria Math" w:cs="Times New Roman"/>
+                      <w:rFonts w:ascii="Cambria Math" w:eastAsiaTheme="minorEastAsia" w:hAnsi="Cambria Math" w:cs="Calibri"/>
                       <w:b/>
                       <w:i/>
                       <w:sz w:val="24"/>
@@ -2781,7 +1958,7 @@
                       <m:sty m:val="bi"/>
                     </m:rPr>
                     <w:rPr>
-                      <w:rFonts w:ascii="Cambria Math" w:eastAsiaTheme="minorEastAsia" w:hAnsi="Cambria Math" w:cs="Times New Roman"/>
+                      <w:rFonts w:ascii="Cambria Math" w:eastAsiaTheme="minorEastAsia" w:hAnsi="Cambria Math" w:cs="Calibri"/>
                       <w:sz w:val="24"/>
                       <w:szCs w:val="24"/>
                       <w:lang w:val="en-GB"/>
@@ -2795,7 +1972,7 @@
                       <m:sty m:val="bi"/>
                     </m:rPr>
                     <w:rPr>
-                      <w:rFonts w:ascii="Cambria Math" w:eastAsiaTheme="minorEastAsia" w:hAnsi="Cambria Math" w:cs="Times New Roman"/>
+                      <w:rFonts w:ascii="Cambria Math" w:eastAsiaTheme="minorEastAsia" w:hAnsi="Cambria Math" w:cs="Calibri"/>
                       <w:sz w:val="24"/>
                       <w:szCs w:val="24"/>
                       <w:lang w:val="en-GB"/>
@@ -2811,169 +1988,10 @@
     </w:p>
     <w:p>
       <w:pPr>
-        <w:pStyle w:val="ListParagraph"/>
-        <w:ind w:left="1440"/>
-        <w:rPr>
-          <w:rFonts w:ascii="Times New Roman" w:eastAsiaTheme="minorEastAsia" w:hAnsi="Times New Roman" w:cs="Times New Roman"/>
-          <w:b/>
-          <w:sz w:val="24"/>
-          <w:szCs w:val="24"/>
-          <w:lang w:val="en-GB"/>
-        </w:rPr>
-      </w:pPr>
-    </w:p>
-    <w:p>
-      <w:pPr>
-        <w:pStyle w:val="ListParagraph"/>
-        <w:numPr>
-          <w:ilvl w:val="0"/>
-          <w:numId w:val="4"/>
-        </w:numPr>
         <w:bidi w:val="0"/>
-        <w:ind w:left="1843"/>
-        <w:rPr>
-          <w:rFonts w:ascii="Times New Roman" w:hAnsi="Times New Roman" w:cs="Times New Roman"/>
-          <w:sz w:val="24"/>
-          <w:szCs w:val="24"/>
-        </w:rPr>
-      </w:pPr>
-      <w:r>
-        <w:rPr>
-          <w:rFonts w:ascii="Times New Roman" w:hAnsi="Times New Roman" w:cs="Times New Roman"/>
-          <w:sz w:val="24"/>
-          <w:szCs w:val="24"/>
-        </w:rPr>
-        <w:t xml:space="preserve">Description: </w:t>
-      </w:r>
-      <w:r>
-        <w:rPr>
-          <w:rFonts w:ascii="Times New Roman" w:hAnsi="Times New Roman" w:cs="Times New Roman"/>
-          <w:sz w:val="24"/>
-          <w:szCs w:val="24"/>
-        </w:rPr>
-        <w:t xml:space="preserve">It determines the temperature </w:t>
-      </w:r>
-      <w:r>
-        <w:rPr>
-          <w:rFonts w:ascii="Times New Roman" w:hAnsi="Times New Roman" w:cs="Times New Roman"/>
-          <w:sz w:val="24"/>
-          <w:szCs w:val="24"/>
-        </w:rPr>
-        <w:t>change</w:t>
-      </w:r>
-      <w:r>
-        <w:rPr>
-          <w:rFonts w:ascii="Times New Roman" w:hAnsi="Times New Roman" w:cs="Times New Roman"/>
-          <w:sz w:val="24"/>
-          <w:szCs w:val="24"/>
-        </w:rPr>
-        <w:t xml:space="preserve"> in the greenhouse </w:t>
-      </w:r>
-      <w:r>
-        <w:rPr>
-          <w:rFonts w:ascii="Times New Roman" w:hAnsi="Times New Roman" w:cs="Times New Roman"/>
-          <w:sz w:val="24"/>
-          <w:szCs w:val="24"/>
-        </w:rPr>
-        <w:t>(</w:t>
-      </w:r>
-      <m:oMath>
-        <m:r>
-          <w:rPr>
-            <w:rFonts w:ascii="Cambria Math" w:hAnsi="Cambria Math" w:cs="Times New Roman"/>
-            <w:sz w:val="24"/>
-            <w:szCs w:val="24"/>
-          </w:rPr>
-          <m:t>∆T</m:t>
-        </m:r>
-      </m:oMath>
-      <w:r>
-        <w:rPr>
-          <w:rFonts w:ascii="Times New Roman" w:hAnsi="Times New Roman" w:cs="Times New Roman"/>
-          <w:sz w:val="24"/>
-          <w:szCs w:val="24"/>
-        </w:rPr>
-        <w:t xml:space="preserve">) </w:t>
-      </w:r>
-      <w:r>
-        <w:rPr>
-          <w:rFonts w:ascii="Times New Roman" w:hAnsi="Times New Roman" w:cs="Times New Roman"/>
-          <w:sz w:val="24"/>
-          <w:szCs w:val="24"/>
-        </w:rPr>
-        <w:t>per simulation interval</w:t>
-      </w:r>
-      <w:r>
-        <w:rPr>
-          <w:rFonts w:ascii="Times New Roman" w:hAnsi="Times New Roman" w:cs="Times New Roman"/>
-          <w:sz w:val="24"/>
-          <w:szCs w:val="24"/>
-        </w:rPr>
-        <w:t xml:space="preserve">. </w:t>
-      </w:r>
-    </w:p>
-    <w:p>
-      <w:pPr>
-        <w:pStyle w:val="ListParagraph"/>
-        <w:bidi w:val="0"/>
-        <w:ind w:left="1843"/>
-        <w:rPr>
-          <w:rFonts w:ascii="Times New Roman" w:hAnsi="Times New Roman" w:cs="Times New Roman"/>
-          <w:sz w:val="24"/>
-          <w:szCs w:val="24"/>
-        </w:rPr>
-      </w:pPr>
-    </w:p>
-    <w:p>
-      <w:pPr>
-        <w:pStyle w:val="ListParagraph"/>
-        <w:numPr>
-          <w:ilvl w:val="0"/>
-          <w:numId w:val="1"/>
-        </w:numPr>
-        <w:bidi w:val="0"/>
-        <w:rPr>
-          <w:rFonts w:ascii="Times New Roman" w:hAnsi="Times New Roman" w:cs="Times New Roman"/>
-          <w:b/>
-          <w:bCs/>
-          <w:sz w:val="28"/>
-          <w:szCs w:val="28"/>
-        </w:rPr>
-      </w:pPr>
-      <w:r>
-        <w:rPr>
-          <w:rFonts w:ascii="Times New Roman" w:hAnsi="Times New Roman" w:cs="Times New Roman"/>
-          <w:b/>
-          <w:bCs/>
-          <w:sz w:val="28"/>
-          <w:szCs w:val="28"/>
-        </w:rPr>
-        <w:t>Biological Feedback</w:t>
-      </w:r>
-    </w:p>
-    <w:p>
-      <w:pPr>
-        <w:pStyle w:val="ListParagraph"/>
-        <w:bidi w:val="0"/>
-        <w:rPr>
-          <w:rFonts w:ascii="Times New Roman" w:hAnsi="Times New Roman" w:cs="Times New Roman"/>
-          <w:b/>
-          <w:bCs/>
-          <w:sz w:val="28"/>
-          <w:szCs w:val="28"/>
-        </w:rPr>
-      </w:pPr>
-    </w:p>
-    <w:p>
-      <w:pPr>
-        <w:pStyle w:val="ListParagraph"/>
-        <w:numPr>
-          <w:ilvl w:val="0"/>
-          <w:numId w:val="3"/>
-        </w:numPr>
-        <w:bidi w:val="0"/>
-        <w:rPr>
-          <w:rFonts w:ascii="Times New Roman" w:hAnsi="Times New Roman" w:cs="Times New Roman"/>
+        <w:jc w:val="both"/>
+        <w:rPr>
+          <w:rFonts w:ascii="Calibri" w:hAnsi="Calibri" w:cs="Calibri"/>
           <w:b/>
           <w:bCs/>
           <w:sz w:val="24"/>
@@ -2982,302 +2000,10 @@
       </w:pPr>
       <w:r>
         <w:rPr>
-          <w:rFonts w:ascii="Times New Roman" w:hAnsi="Times New Roman" w:cs="Times New Roman"/>
           <w:b/>
           <w:bCs/>
-          <w:sz w:val="24"/>
-          <w:szCs w:val="24"/>
-        </w:rPr>
-        <w:t>Plant Growth Rate:</w:t>
-      </w:r>
-    </w:p>
-    <w:p>
-      <w:pPr>
-        <w:pStyle w:val="ListParagraph"/>
-        <w:bidi w:val="0"/>
-        <w:ind w:left="1440"/>
-        <w:jc w:val="center"/>
-        <w:rPr>
-          <w:rFonts w:ascii="Times New Roman" w:eastAsiaTheme="minorEastAsia" w:hAnsi="Times New Roman" w:cs="Times New Roman"/>
-          <w:sz w:val="24"/>
-          <w:szCs w:val="24"/>
-        </w:rPr>
-      </w:pPr>
-      <m:oMathPara>
-        <m:oMath>
-          <m:r>
-            <m:rPr>
-              <m:sty m:val="p"/>
-            </m:rPr>
-            <w:rPr>
-              <w:rFonts w:ascii="Cambria Math" w:hAnsi="Cambria Math" w:cs="Times New Roman"/>
-              <w:sz w:val="24"/>
-              <w:szCs w:val="24"/>
-            </w:rPr>
-            <m:t xml:space="preserve">Greenhouse_Temp </m:t>
-          </m:r>
-          <m:r>
-            <w:rPr>
-              <w:rFonts w:ascii="Cambria Math" w:hAnsi="Cambria Math" w:cs="Times New Roman"/>
-              <w:sz w:val="24"/>
-              <w:szCs w:val="24"/>
-            </w:rPr>
-            <m:t>×0.1</m:t>
-          </m:r>
-        </m:oMath>
-      </m:oMathPara>
-    </w:p>
-    <w:p>
-      <w:pPr>
-        <w:pStyle w:val="ListParagraph"/>
-        <w:bidi w:val="0"/>
-        <w:ind w:left="1440"/>
-        <w:jc w:val="center"/>
-        <w:rPr>
-          <w:rFonts w:ascii="Times New Roman" w:eastAsiaTheme="minorEastAsia" w:hAnsi="Times New Roman" w:cs="Times New Roman"/>
-          <w:sz w:val="24"/>
-          <w:szCs w:val="24"/>
-        </w:rPr>
-      </w:pPr>
-    </w:p>
-    <w:p>
-      <w:pPr>
-        <w:pStyle w:val="ListParagraph"/>
-        <w:numPr>
-          <w:ilvl w:val="0"/>
-          <w:numId w:val="4"/>
-        </w:numPr>
-        <w:bidi w:val="0"/>
-        <w:ind w:left="1843"/>
-        <w:rPr>
-          <w:rFonts w:ascii="Times New Roman" w:hAnsi="Times New Roman" w:cs="Times New Roman"/>
-          <w:sz w:val="24"/>
-          <w:szCs w:val="24"/>
-        </w:rPr>
-      </w:pPr>
-      <w:r>
-        <w:rPr>
-          <w:rFonts w:ascii="Times New Roman" w:hAnsi="Times New Roman" w:cs="Times New Roman"/>
-          <w:sz w:val="24"/>
-          <w:szCs w:val="24"/>
-        </w:rPr>
-        <w:t xml:space="preserve">Description: </w:t>
-      </w:r>
-      <w:r>
-        <w:rPr>
-          <w:rFonts w:ascii="Times New Roman" w:hAnsi="Times New Roman" w:cs="Times New Roman"/>
-          <w:sz w:val="24"/>
-          <w:szCs w:val="24"/>
-        </w:rPr>
-        <w:t xml:space="preserve">Biology is </w:t>
-      </w:r>
-      <w:proofErr w:type="gramStart"/>
-      <w:r>
-        <w:rPr>
-          <w:rFonts w:ascii="Times New Roman" w:hAnsi="Times New Roman" w:cs="Times New Roman"/>
-          <w:sz w:val="24"/>
-          <w:szCs w:val="24"/>
-        </w:rPr>
-        <w:t>temperature-dependent</w:t>
-      </w:r>
-      <w:proofErr w:type="gramEnd"/>
-      <w:r>
-        <w:rPr>
-          <w:rFonts w:ascii="Times New Roman" w:hAnsi="Times New Roman" w:cs="Times New Roman"/>
-          <w:sz w:val="24"/>
-          <w:szCs w:val="24"/>
-        </w:rPr>
-        <w:t>. Higher (but controlled) temperatures accelerate photosynthesis and growth in a vertical farm</w:t>
-      </w:r>
-      <w:r>
-        <w:rPr>
-          <w:rFonts w:ascii="Times New Roman" w:hAnsi="Times New Roman" w:cs="Times New Roman"/>
-          <w:sz w:val="24"/>
-          <w:szCs w:val="24"/>
-        </w:rPr>
-        <w:t>.</w:t>
-      </w:r>
-    </w:p>
-    <w:p>
-      <w:pPr>
-        <w:pStyle w:val="ListParagraph"/>
-        <w:bidi w:val="0"/>
-        <w:ind w:left="1843"/>
-        <w:rPr>
-          <w:rFonts w:ascii="Times New Roman" w:hAnsi="Times New Roman" w:cs="Times New Roman"/>
-          <w:sz w:val="24"/>
-          <w:szCs w:val="24"/>
-        </w:rPr>
-      </w:pPr>
-    </w:p>
-    <w:p>
-      <w:pPr>
-        <w:pStyle w:val="ListParagraph"/>
-        <w:numPr>
-          <w:ilvl w:val="0"/>
-          <w:numId w:val="3"/>
-        </w:numPr>
-        <w:bidi w:val="0"/>
-        <w:rPr>
-          <w:rFonts w:ascii="Times New Roman" w:hAnsi="Times New Roman" w:cs="Times New Roman"/>
-          <w:b/>
-          <w:bCs/>
-          <w:sz w:val="24"/>
-          <w:szCs w:val="24"/>
-        </w:rPr>
-      </w:pPr>
-      <w:r>
-        <w:rPr>
-          <w:rFonts w:ascii="Times New Roman" w:hAnsi="Times New Roman" w:cs="Times New Roman"/>
-          <w:b/>
-          <w:bCs/>
-          <w:sz w:val="24"/>
-          <w:szCs w:val="24"/>
-        </w:rPr>
-        <w:t>Heat Consumption (Energy Loop):</w:t>
-      </w:r>
-    </w:p>
-    <w:p>
-      <w:pPr>
-        <w:pStyle w:val="ListParagraph"/>
-        <w:bidi w:val="0"/>
-        <w:ind w:left="1440"/>
-        <w:rPr>
-          <w:rFonts w:ascii="Times New Roman" w:hAnsi="Times New Roman" w:cs="Times New Roman"/>
-          <w:b/>
-          <w:bCs/>
-          <w:sz w:val="24"/>
-          <w:szCs w:val="24"/>
-        </w:rPr>
-      </w:pPr>
-    </w:p>
-    <w:p>
-      <w:pPr>
-        <w:pStyle w:val="ListParagraph"/>
-        <w:bidi w:val="0"/>
-        <w:ind w:left="1440"/>
-        <w:jc w:val="center"/>
-        <w:rPr>
-          <w:rFonts w:ascii="Times New Roman" w:hAnsi="Times New Roman" w:cs="Times New Roman"/>
-          <w:sz w:val="24"/>
-          <w:szCs w:val="24"/>
-        </w:rPr>
-      </w:pPr>
-      <m:oMathPara>
-        <m:oMath>
-          <m:r>
-            <m:rPr>
-              <m:sty m:val="p"/>
-            </m:rPr>
-            <w:rPr>
-              <w:rFonts w:ascii="Cambria Math" w:hAnsi="Cambria Math" w:cs="Times New Roman"/>
-              <w:sz w:val="24"/>
-              <w:szCs w:val="24"/>
-            </w:rPr>
-            <m:t>Plant_Growth_Rate</m:t>
-          </m:r>
-          <m:r>
-            <w:rPr>
-              <w:rFonts w:ascii="Cambria Math" w:hAnsi="Cambria Math" w:cs="Times New Roman"/>
-              <w:sz w:val="24"/>
-              <w:szCs w:val="24"/>
-            </w:rPr>
-            <m:t>×0.5</m:t>
-          </m:r>
-        </m:oMath>
-      </m:oMathPara>
-    </w:p>
-    <w:p>
-      <w:pPr>
-        <w:pStyle w:val="ListParagraph"/>
-        <w:bidi w:val="0"/>
-        <w:ind w:left="1440"/>
-        <w:jc w:val="center"/>
-        <w:rPr>
-          <w:rFonts w:ascii="Times New Roman" w:hAnsi="Times New Roman" w:cs="Times New Roman"/>
-          <w:sz w:val="24"/>
-          <w:szCs w:val="24"/>
-        </w:rPr>
-      </w:pPr>
-    </w:p>
-    <w:p>
-      <w:pPr>
-        <w:pStyle w:val="ListParagraph"/>
-        <w:numPr>
-          <w:ilvl w:val="0"/>
-          <w:numId w:val="4"/>
-        </w:numPr>
-        <w:bidi w:val="0"/>
-        <w:ind w:left="1843"/>
-        <w:rPr>
-          <w:rFonts w:ascii="Times New Roman" w:hAnsi="Times New Roman" w:cs="Times New Roman"/>
-          <w:sz w:val="24"/>
-          <w:szCs w:val="24"/>
-        </w:rPr>
-      </w:pPr>
-      <w:r>
-        <w:rPr>
-          <w:rFonts w:ascii="Times New Roman" w:hAnsi="Times New Roman" w:cs="Times New Roman"/>
-          <w:sz w:val="24"/>
-          <w:szCs w:val="24"/>
-        </w:rPr>
-        <w:lastRenderedPageBreak/>
-        <w:t xml:space="preserve">Description: </w:t>
-      </w:r>
-      <w:r>
-        <w:rPr>
-          <w:rFonts w:ascii="Times New Roman" w:hAnsi="Times New Roman" w:cs="Times New Roman"/>
-          <w:sz w:val="24"/>
-          <w:szCs w:val="24"/>
-        </w:rPr>
-        <w:t>As plants grow and the greenhouse operates, energy is "consumed" or dissipated, which prevents the system from overheating and creates a stable equilibrium</w:t>
-      </w:r>
-      <w:r>
-        <w:rPr>
-          <w:rFonts w:ascii="Times New Roman" w:hAnsi="Times New Roman" w:cs="Times New Roman"/>
-          <w:sz w:val="24"/>
-          <w:szCs w:val="24"/>
-        </w:rPr>
-        <w:t>.</w:t>
-      </w:r>
-    </w:p>
-    <w:p>
-      <w:pPr>
-        <w:pStyle w:val="ListParagraph"/>
-        <w:bidi w:val="0"/>
-        <w:ind w:left="1843"/>
-        <w:rPr>
-          <w:rFonts w:ascii="Times New Roman" w:hAnsi="Times New Roman" w:cs="Times New Roman"/>
-          <w:sz w:val="24"/>
-          <w:szCs w:val="24"/>
-        </w:rPr>
-      </w:pPr>
-    </w:p>
-    <w:p>
-      <w:pPr>
-        <w:pStyle w:val="ListParagraph"/>
-        <w:numPr>
-          <w:ilvl w:val="0"/>
-          <w:numId w:val="1"/>
-        </w:numPr>
-        <w:bidi w:val="0"/>
-        <w:rPr>
-          <w:rFonts w:ascii="Times New Roman" w:hAnsi="Times New Roman" w:cs="Times New Roman"/>
-          <w:b/>
-          <w:bCs/>
-          <w:sz w:val="28"/>
-          <w:szCs w:val="28"/>
-        </w:rPr>
-      </w:pPr>
-      <w:r>
-        <w:rPr>
-          <w:rFonts w:ascii="Times New Roman" w:hAnsi="Times New Roman" w:cs="Times New Roman"/>
-          <w:b/>
-          <w:bCs/>
-          <w:sz w:val="28"/>
-          <w:szCs w:val="28"/>
-        </w:rPr>
-        <w:t>System Success Metric</w:t>
+        </w:rPr>
+        <w:tab/>
       </w:r>
     </w:p>
     <w:sectPr>
@@ -3304,7 +2030,7 @@
       <w:lvlText w:val="%1-"/>
       <w:lvlJc w:val="left"/>
       <w:pPr>
-        <w:ind w:left="720" w:hanging="360"/>
+        <w:ind w:left="360" w:hanging="360"/>
       </w:pPr>
       <w:rPr>
         <w:rFonts w:hint="default"/>
@@ -3316,7 +2042,7 @@
       <w:lvlText w:val="%2."/>
       <w:lvlJc w:val="left"/>
       <w:pPr>
-        <w:ind w:left="1440" w:hanging="360"/>
+        <w:ind w:left="1080" w:hanging="360"/>
       </w:pPr>
     </w:lvl>
     <w:lvl w:ilvl="2" w:tplc="0409001B" w:tentative="1">
@@ -3325,7 +2051,7 @@
       <w:lvlText w:val="%3."/>
       <w:lvlJc w:val="right"/>
       <w:pPr>
-        <w:ind w:left="2160" w:hanging="180"/>
+        <w:ind w:left="1800" w:hanging="180"/>
       </w:pPr>
     </w:lvl>
     <w:lvl w:ilvl="3" w:tplc="0409000F" w:tentative="1">
@@ -3334,7 +2060,7 @@
       <w:lvlText w:val="%4."/>
       <w:lvlJc w:val="left"/>
       <w:pPr>
-        <w:ind w:left="2880" w:hanging="360"/>
+        <w:ind w:left="2520" w:hanging="360"/>
       </w:pPr>
     </w:lvl>
     <w:lvl w:ilvl="4" w:tplc="04090019" w:tentative="1">
@@ -3343,7 +2069,7 @@
       <w:lvlText w:val="%5."/>
       <w:lvlJc w:val="left"/>
       <w:pPr>
-        <w:ind w:left="3600" w:hanging="360"/>
+        <w:ind w:left="3240" w:hanging="360"/>
       </w:pPr>
     </w:lvl>
     <w:lvl w:ilvl="5" w:tplc="0409001B" w:tentative="1">
@@ -3352,7 +2078,7 @@
       <w:lvlText w:val="%6."/>
       <w:lvlJc w:val="right"/>
       <w:pPr>
-        <w:ind w:left="4320" w:hanging="180"/>
+        <w:ind w:left="3960" w:hanging="180"/>
       </w:pPr>
     </w:lvl>
     <w:lvl w:ilvl="6" w:tplc="0409000F" w:tentative="1">
@@ -3361,7 +2087,7 @@
       <w:lvlText w:val="%7."/>
       <w:lvlJc w:val="left"/>
       <w:pPr>
-        <w:ind w:left="5040" w:hanging="360"/>
+        <w:ind w:left="4680" w:hanging="360"/>
       </w:pPr>
     </w:lvl>
     <w:lvl w:ilvl="7" w:tplc="04090019" w:tentative="1">
@@ -3370,7 +2096,7 @@
       <w:lvlText w:val="%8."/>
       <w:lvlJc w:val="left"/>
       <w:pPr>
-        <w:ind w:left="5760" w:hanging="360"/>
+        <w:ind w:left="5400" w:hanging="360"/>
       </w:pPr>
     </w:lvl>
     <w:lvl w:ilvl="8" w:tplc="0409001B" w:tentative="1">
@@ -3379,7 +2105,7 @@
       <w:lvlText w:val="%9."/>
       <w:lvlJc w:val="right"/>
       <w:pPr>
-        <w:ind w:left="6480" w:hanging="180"/>
+        <w:ind w:left="6120" w:hanging="180"/>
       </w:pPr>
     </w:lvl>
   </w:abstractNum>
@@ -4365,18 +3091,18 @@
     <w:lsdException w:name="Unresolved Mention" w:semiHidden="1" w:unhideWhenUsed="1"/>
     <w:lsdException w:name="Smart Link" w:semiHidden="1" w:unhideWhenUsed="1"/>
   </w:latentStyles>
-  <w:style w:type="paragraph" w:default="1" w:styleId="Normal">
+  <w:style w:type="paragraph" w:default="1" w:styleId="Standard">
     <w:name w:val="Normal"/>
     <w:qFormat/>
     <w:pPr>
       <w:bidi/>
     </w:pPr>
   </w:style>
-  <w:style w:type="paragraph" w:styleId="Heading1">
+  <w:style w:type="paragraph" w:styleId="berschrift1">
     <w:name w:val="heading 1"/>
-    <w:basedOn w:val="Normal"/>
-    <w:next w:val="Normal"/>
-    <w:link w:val="Heading1Char"/>
+    <w:basedOn w:val="Standard"/>
+    <w:next w:val="Standard"/>
+    <w:link w:val="berschrift1Zchn"/>
     <w:uiPriority w:val="9"/>
     <w:qFormat/>
     <w:rsid w:val="00035159"/>
@@ -4393,13 +3119,12 @@
       <w:szCs w:val="40"/>
     </w:rPr>
   </w:style>
-  <w:style w:type="paragraph" w:styleId="Heading2">
+  <w:style w:type="paragraph" w:styleId="berschrift2">
     <w:name w:val="heading 2"/>
-    <w:basedOn w:val="Normal"/>
-    <w:next w:val="Normal"/>
-    <w:link w:val="Heading2Char"/>
+    <w:basedOn w:val="Standard"/>
+    <w:next w:val="Standard"/>
+    <w:link w:val="berschrift2Zchn"/>
     <w:uiPriority w:val="9"/>
-    <w:semiHidden/>
     <w:unhideWhenUsed/>
     <w:qFormat/>
     <w:rsid w:val="00035159"/>
@@ -4416,11 +3141,11 @@
       <w:szCs w:val="32"/>
     </w:rPr>
   </w:style>
-  <w:style w:type="paragraph" w:styleId="Heading3">
+  <w:style w:type="paragraph" w:styleId="berschrift3">
     <w:name w:val="heading 3"/>
-    <w:basedOn w:val="Normal"/>
-    <w:next w:val="Normal"/>
-    <w:link w:val="Heading3Char"/>
+    <w:basedOn w:val="Standard"/>
+    <w:next w:val="Standard"/>
+    <w:link w:val="berschrift3Zchn"/>
     <w:uiPriority w:val="9"/>
     <w:semiHidden/>
     <w:unhideWhenUsed/>
@@ -4439,11 +3164,11 @@
       <w:szCs w:val="28"/>
     </w:rPr>
   </w:style>
-  <w:style w:type="paragraph" w:styleId="Heading4">
+  <w:style w:type="paragraph" w:styleId="berschrift4">
     <w:name w:val="heading 4"/>
-    <w:basedOn w:val="Normal"/>
-    <w:next w:val="Normal"/>
-    <w:link w:val="Heading4Char"/>
+    <w:basedOn w:val="Standard"/>
+    <w:next w:val="Standard"/>
+    <w:link w:val="berschrift4Zchn"/>
     <w:uiPriority w:val="9"/>
     <w:semiHidden/>
     <w:unhideWhenUsed/>
@@ -4462,11 +3187,11 @@
       <w:color w:val="0F4761" w:themeColor="accent1" w:themeShade="BF"/>
     </w:rPr>
   </w:style>
-  <w:style w:type="paragraph" w:styleId="Heading5">
+  <w:style w:type="paragraph" w:styleId="berschrift5">
     <w:name w:val="heading 5"/>
-    <w:basedOn w:val="Normal"/>
-    <w:next w:val="Normal"/>
-    <w:link w:val="Heading5Char"/>
+    <w:basedOn w:val="Standard"/>
+    <w:next w:val="Standard"/>
+    <w:link w:val="berschrift5Zchn"/>
     <w:uiPriority w:val="9"/>
     <w:semiHidden/>
     <w:unhideWhenUsed/>
@@ -4483,11 +3208,11 @@
       <w:color w:val="0F4761" w:themeColor="accent1" w:themeShade="BF"/>
     </w:rPr>
   </w:style>
-  <w:style w:type="paragraph" w:styleId="Heading6">
+  <w:style w:type="paragraph" w:styleId="berschrift6">
     <w:name w:val="heading 6"/>
-    <w:basedOn w:val="Normal"/>
-    <w:next w:val="Normal"/>
-    <w:link w:val="Heading6Char"/>
+    <w:basedOn w:val="Standard"/>
+    <w:next w:val="Standard"/>
+    <w:link w:val="berschrift6Zchn"/>
     <w:uiPriority w:val="9"/>
     <w:semiHidden/>
     <w:unhideWhenUsed/>
@@ -4506,11 +3231,11 @@
       <w:color w:val="595959" w:themeColor="text1" w:themeTint="A6"/>
     </w:rPr>
   </w:style>
-  <w:style w:type="paragraph" w:styleId="Heading7">
+  <w:style w:type="paragraph" w:styleId="berschrift7">
     <w:name w:val="heading 7"/>
-    <w:basedOn w:val="Normal"/>
-    <w:next w:val="Normal"/>
-    <w:link w:val="Heading7Char"/>
+    <w:basedOn w:val="Standard"/>
+    <w:next w:val="Standard"/>
+    <w:link w:val="berschrift7Zchn"/>
     <w:uiPriority w:val="9"/>
     <w:semiHidden/>
     <w:unhideWhenUsed/>
@@ -4527,11 +3252,11 @@
       <w:color w:val="595959" w:themeColor="text1" w:themeTint="A6"/>
     </w:rPr>
   </w:style>
-  <w:style w:type="paragraph" w:styleId="Heading8">
+  <w:style w:type="paragraph" w:styleId="berschrift8">
     <w:name w:val="heading 8"/>
-    <w:basedOn w:val="Normal"/>
-    <w:next w:val="Normal"/>
-    <w:link w:val="Heading8Char"/>
+    <w:basedOn w:val="Standard"/>
+    <w:next w:val="Standard"/>
+    <w:link w:val="berschrift8Zchn"/>
     <w:uiPriority w:val="9"/>
     <w:semiHidden/>
     <w:unhideWhenUsed/>
@@ -4550,11 +3275,11 @@
       <w:color w:val="272727" w:themeColor="text1" w:themeTint="D8"/>
     </w:rPr>
   </w:style>
-  <w:style w:type="paragraph" w:styleId="Heading9">
+  <w:style w:type="paragraph" w:styleId="berschrift9">
     <w:name w:val="heading 9"/>
-    <w:basedOn w:val="Normal"/>
-    <w:next w:val="Normal"/>
-    <w:link w:val="Heading9Char"/>
+    <w:basedOn w:val="Standard"/>
+    <w:next w:val="Standard"/>
+    <w:link w:val="berschrift9Zchn"/>
     <w:uiPriority w:val="9"/>
     <w:semiHidden/>
     <w:unhideWhenUsed/>
@@ -4571,12 +3296,13 @@
       <w:color w:val="272727" w:themeColor="text1" w:themeTint="D8"/>
     </w:rPr>
   </w:style>
-  <w:style w:type="character" w:default="1" w:styleId="DefaultParagraphFont">
+  <w:style w:type="character" w:default="1" w:styleId="Absatz-Standardschriftart">
     <w:name w:val="Default Paragraph Font"/>
     <w:uiPriority w:val="1"/>
+    <w:semiHidden/>
     <w:unhideWhenUsed/>
   </w:style>
-  <w:style w:type="table" w:default="1" w:styleId="TableNormal">
+  <w:style w:type="table" w:default="1" w:styleId="NormaleTabelle">
     <w:name w:val="Normal Table"/>
     <w:uiPriority w:val="99"/>
     <w:semiHidden/>
@@ -4591,16 +3317,16 @@
       </w:tblCellMar>
     </w:tblPr>
   </w:style>
-  <w:style w:type="numbering" w:default="1" w:styleId="NoList">
+  <w:style w:type="numbering" w:default="1" w:styleId="KeineListe">
     <w:name w:val="No List"/>
     <w:uiPriority w:val="99"/>
     <w:semiHidden/>
     <w:unhideWhenUsed/>
   </w:style>
-  <w:style w:type="paragraph" w:styleId="TOC1">
+  <w:style w:type="paragraph" w:styleId="Verzeichnis1">
     <w:name w:val="toc 1"/>
-    <w:basedOn w:val="Normal"/>
-    <w:next w:val="Normal"/>
+    <w:basedOn w:val="Standard"/>
+    <w:next w:val="Standard"/>
     <w:autoRedefine/>
     <w:uiPriority w:val="39"/>
     <w:rsid w:val="00520EF4"/>
@@ -4623,10 +3349,10 @@
       <w14:ligatures w14:val="none"/>
     </w:rPr>
   </w:style>
-  <w:style w:type="character" w:customStyle="1" w:styleId="Heading1Char">
-    <w:name w:val="Heading 1 Char"/>
-    <w:basedOn w:val="DefaultParagraphFont"/>
-    <w:link w:val="Heading1"/>
+  <w:style w:type="character" w:customStyle="1" w:styleId="berschrift1Zchn">
+    <w:name w:val="Überschrift 1 Zchn"/>
+    <w:basedOn w:val="Absatz-Standardschriftart"/>
+    <w:link w:val="berschrift1"/>
     <w:uiPriority w:val="9"/>
     <w:rsid w:val="00035159"/>
     <w:rPr>
@@ -4636,12 +3362,11 @@
       <w:szCs w:val="40"/>
     </w:rPr>
   </w:style>
-  <w:style w:type="character" w:customStyle="1" w:styleId="Heading2Char">
-    <w:name w:val="Heading 2 Char"/>
-    <w:basedOn w:val="DefaultParagraphFont"/>
-    <w:link w:val="Heading2"/>
+  <w:style w:type="character" w:customStyle="1" w:styleId="berschrift2Zchn">
+    <w:name w:val="Überschrift 2 Zchn"/>
+    <w:basedOn w:val="Absatz-Standardschriftart"/>
+    <w:link w:val="berschrift2"/>
     <w:uiPriority w:val="9"/>
-    <w:semiHidden/>
     <w:rsid w:val="00035159"/>
     <w:rPr>
       <w:rFonts w:asciiTheme="majorHAnsi" w:eastAsiaTheme="majorEastAsia" w:hAnsiTheme="majorHAnsi" w:cstheme="majorBidi"/>
@@ -4650,10 +3375,10 @@
       <w:szCs w:val="32"/>
     </w:rPr>
   </w:style>
-  <w:style w:type="character" w:customStyle="1" w:styleId="Heading3Char">
-    <w:name w:val="Heading 3 Char"/>
-    <w:basedOn w:val="DefaultParagraphFont"/>
-    <w:link w:val="Heading3"/>
+  <w:style w:type="character" w:customStyle="1" w:styleId="berschrift3Zchn">
+    <w:name w:val="Überschrift 3 Zchn"/>
+    <w:basedOn w:val="Absatz-Standardschriftart"/>
+    <w:link w:val="berschrift3"/>
     <w:uiPriority w:val="9"/>
     <w:semiHidden/>
     <w:rsid w:val="00035159"/>
@@ -4664,10 +3389,10 @@
       <w:szCs w:val="28"/>
     </w:rPr>
   </w:style>
-  <w:style w:type="character" w:customStyle="1" w:styleId="Heading4Char">
-    <w:name w:val="Heading 4 Char"/>
-    <w:basedOn w:val="DefaultParagraphFont"/>
-    <w:link w:val="Heading4"/>
+  <w:style w:type="character" w:customStyle="1" w:styleId="berschrift4Zchn">
+    <w:name w:val="Überschrift 4 Zchn"/>
+    <w:basedOn w:val="Absatz-Standardschriftart"/>
+    <w:link w:val="berschrift4"/>
     <w:uiPriority w:val="9"/>
     <w:semiHidden/>
     <w:rsid w:val="00035159"/>
@@ -4678,10 +3403,10 @@
       <w:color w:val="0F4761" w:themeColor="accent1" w:themeShade="BF"/>
     </w:rPr>
   </w:style>
-  <w:style w:type="character" w:customStyle="1" w:styleId="Heading5Char">
-    <w:name w:val="Heading 5 Char"/>
-    <w:basedOn w:val="DefaultParagraphFont"/>
-    <w:link w:val="Heading5"/>
+  <w:style w:type="character" w:customStyle="1" w:styleId="berschrift5Zchn">
+    <w:name w:val="Überschrift 5 Zchn"/>
+    <w:basedOn w:val="Absatz-Standardschriftart"/>
+    <w:link w:val="berschrift5"/>
     <w:uiPriority w:val="9"/>
     <w:semiHidden/>
     <w:rsid w:val="00035159"/>
@@ -4690,10 +3415,10 @@
       <w:color w:val="0F4761" w:themeColor="accent1" w:themeShade="BF"/>
     </w:rPr>
   </w:style>
-  <w:style w:type="character" w:customStyle="1" w:styleId="Heading6Char">
-    <w:name w:val="Heading 6 Char"/>
-    <w:basedOn w:val="DefaultParagraphFont"/>
-    <w:link w:val="Heading6"/>
+  <w:style w:type="character" w:customStyle="1" w:styleId="berschrift6Zchn">
+    <w:name w:val="Überschrift 6 Zchn"/>
+    <w:basedOn w:val="Absatz-Standardschriftart"/>
+    <w:link w:val="berschrift6"/>
     <w:uiPriority w:val="9"/>
     <w:semiHidden/>
     <w:rsid w:val="00035159"/>
@@ -4704,10 +3429,10 @@
       <w:color w:val="595959" w:themeColor="text1" w:themeTint="A6"/>
     </w:rPr>
   </w:style>
-  <w:style w:type="character" w:customStyle="1" w:styleId="Heading7Char">
-    <w:name w:val="Heading 7 Char"/>
-    <w:basedOn w:val="DefaultParagraphFont"/>
-    <w:link w:val="Heading7"/>
+  <w:style w:type="character" w:customStyle="1" w:styleId="berschrift7Zchn">
+    <w:name w:val="Überschrift 7 Zchn"/>
+    <w:basedOn w:val="Absatz-Standardschriftart"/>
+    <w:link w:val="berschrift7"/>
     <w:uiPriority w:val="9"/>
     <w:semiHidden/>
     <w:rsid w:val="00035159"/>
@@ -4716,10 +3441,10 @@
       <w:color w:val="595959" w:themeColor="text1" w:themeTint="A6"/>
     </w:rPr>
   </w:style>
-  <w:style w:type="character" w:customStyle="1" w:styleId="Heading8Char">
-    <w:name w:val="Heading 8 Char"/>
-    <w:basedOn w:val="DefaultParagraphFont"/>
-    <w:link w:val="Heading8"/>
+  <w:style w:type="character" w:customStyle="1" w:styleId="berschrift8Zchn">
+    <w:name w:val="Überschrift 8 Zchn"/>
+    <w:basedOn w:val="Absatz-Standardschriftart"/>
+    <w:link w:val="berschrift8"/>
     <w:uiPriority w:val="9"/>
     <w:semiHidden/>
     <w:rsid w:val="00035159"/>
@@ -4730,10 +3455,10 @@
       <w:color w:val="272727" w:themeColor="text1" w:themeTint="D8"/>
     </w:rPr>
   </w:style>
-  <w:style w:type="character" w:customStyle="1" w:styleId="Heading9Char">
-    <w:name w:val="Heading 9 Char"/>
-    <w:basedOn w:val="DefaultParagraphFont"/>
-    <w:link w:val="Heading9"/>
+  <w:style w:type="character" w:customStyle="1" w:styleId="berschrift9Zchn">
+    <w:name w:val="Überschrift 9 Zchn"/>
+    <w:basedOn w:val="Absatz-Standardschriftart"/>
+    <w:link w:val="berschrift9"/>
     <w:uiPriority w:val="9"/>
     <w:semiHidden/>
     <w:rsid w:val="00035159"/>
@@ -4742,11 +3467,11 @@
       <w:color w:val="272727" w:themeColor="text1" w:themeTint="D8"/>
     </w:rPr>
   </w:style>
-  <w:style w:type="paragraph" w:styleId="Title">
+  <w:style w:type="paragraph" w:styleId="Titel">
     <w:name w:val="Title"/>
-    <w:basedOn w:val="Normal"/>
-    <w:next w:val="Normal"/>
-    <w:link w:val="TitleChar"/>
+    <w:basedOn w:val="Standard"/>
+    <w:next w:val="Standard"/>
+    <w:link w:val="TitelZchn"/>
     <w:uiPriority w:val="10"/>
     <w:qFormat/>
     <w:rsid w:val="00035159"/>
@@ -4762,10 +3487,10 @@
       <w:szCs w:val="56"/>
     </w:rPr>
   </w:style>
-  <w:style w:type="character" w:customStyle="1" w:styleId="TitleChar">
-    <w:name w:val="Title Char"/>
-    <w:basedOn w:val="DefaultParagraphFont"/>
-    <w:link w:val="Title"/>
+  <w:style w:type="character" w:customStyle="1" w:styleId="TitelZchn">
+    <w:name w:val="Titel Zchn"/>
+    <w:basedOn w:val="Absatz-Standardschriftart"/>
+    <w:link w:val="Titel"/>
     <w:uiPriority w:val="10"/>
     <w:rsid w:val="00035159"/>
     <w:rPr>
@@ -4776,11 +3501,11 @@
       <w:szCs w:val="56"/>
     </w:rPr>
   </w:style>
-  <w:style w:type="paragraph" w:styleId="Subtitle">
+  <w:style w:type="paragraph" w:styleId="Untertitel">
     <w:name w:val="Subtitle"/>
-    <w:basedOn w:val="Normal"/>
-    <w:next w:val="Normal"/>
-    <w:link w:val="SubtitleChar"/>
+    <w:basedOn w:val="Standard"/>
+    <w:next w:val="Standard"/>
+    <w:link w:val="UntertitelZchn"/>
     <w:uiPriority w:val="11"/>
     <w:qFormat/>
     <w:rsid w:val="00035159"/>
@@ -4797,10 +3522,10 @@
       <w:szCs w:val="28"/>
     </w:rPr>
   </w:style>
-  <w:style w:type="character" w:customStyle="1" w:styleId="SubtitleChar">
-    <w:name w:val="Subtitle Char"/>
-    <w:basedOn w:val="DefaultParagraphFont"/>
-    <w:link w:val="Subtitle"/>
+  <w:style w:type="character" w:customStyle="1" w:styleId="UntertitelZchn">
+    <w:name w:val="Untertitel Zchn"/>
+    <w:basedOn w:val="Absatz-Standardschriftart"/>
+    <w:link w:val="Untertitel"/>
     <w:uiPriority w:val="11"/>
     <w:rsid w:val="00035159"/>
     <w:rPr>
@@ -4811,11 +3536,11 @@
       <w:szCs w:val="28"/>
     </w:rPr>
   </w:style>
-  <w:style w:type="paragraph" w:styleId="Quote">
+  <w:style w:type="paragraph" w:styleId="Zitat">
     <w:name w:val="Quote"/>
-    <w:basedOn w:val="Normal"/>
-    <w:next w:val="Normal"/>
-    <w:link w:val="QuoteChar"/>
+    <w:basedOn w:val="Standard"/>
+    <w:next w:val="Standard"/>
+    <w:link w:val="ZitatZchn"/>
     <w:uiPriority w:val="29"/>
     <w:qFormat/>
     <w:rsid w:val="00035159"/>
@@ -4829,10 +3554,10 @@
       <w:color w:val="404040" w:themeColor="text1" w:themeTint="BF"/>
     </w:rPr>
   </w:style>
-  <w:style w:type="character" w:customStyle="1" w:styleId="QuoteChar">
-    <w:name w:val="Quote Char"/>
-    <w:basedOn w:val="DefaultParagraphFont"/>
-    <w:link w:val="Quote"/>
+  <w:style w:type="character" w:customStyle="1" w:styleId="ZitatZchn">
+    <w:name w:val="Zitat Zchn"/>
+    <w:basedOn w:val="Absatz-Standardschriftart"/>
+    <w:link w:val="Zitat"/>
     <w:uiPriority w:val="29"/>
     <w:rsid w:val="00035159"/>
     <w:rPr>
@@ -4841,9 +3566,9 @@
       <w:color w:val="404040" w:themeColor="text1" w:themeTint="BF"/>
     </w:rPr>
   </w:style>
-  <w:style w:type="paragraph" w:styleId="ListParagraph">
+  <w:style w:type="paragraph" w:styleId="Listenabsatz">
     <w:name w:val="List Paragraph"/>
-    <w:basedOn w:val="Normal"/>
+    <w:basedOn w:val="Standard"/>
     <w:uiPriority w:val="34"/>
     <w:qFormat/>
     <w:rsid w:val="00035159"/>
@@ -4852,9 +3577,9 @@
       <w:contextualSpacing/>
     </w:pPr>
   </w:style>
-  <w:style w:type="character" w:styleId="IntenseEmphasis">
+  <w:style w:type="character" w:styleId="IntensiveHervorhebung">
     <w:name w:val="Intense Emphasis"/>
-    <w:basedOn w:val="DefaultParagraphFont"/>
+    <w:basedOn w:val="Absatz-Standardschriftart"/>
     <w:uiPriority w:val="21"/>
     <w:qFormat/>
     <w:rsid w:val="00035159"/>
@@ -4864,11 +3589,11 @@
       <w:color w:val="0F4761" w:themeColor="accent1" w:themeShade="BF"/>
     </w:rPr>
   </w:style>
-  <w:style w:type="paragraph" w:styleId="IntenseQuote">
+  <w:style w:type="paragraph" w:styleId="IntensivesZitat">
     <w:name w:val="Intense Quote"/>
-    <w:basedOn w:val="Normal"/>
-    <w:next w:val="Normal"/>
-    <w:link w:val="IntenseQuoteChar"/>
+    <w:basedOn w:val="Standard"/>
+    <w:next w:val="Standard"/>
+    <w:link w:val="IntensivesZitatZchn"/>
     <w:uiPriority w:val="30"/>
     <w:qFormat/>
     <w:rsid w:val="00035159"/>
@@ -4887,10 +3612,10 @@
       <w:color w:val="0F4761" w:themeColor="accent1" w:themeShade="BF"/>
     </w:rPr>
   </w:style>
-  <w:style w:type="character" w:customStyle="1" w:styleId="IntenseQuoteChar">
-    <w:name w:val="Intense Quote Char"/>
-    <w:basedOn w:val="DefaultParagraphFont"/>
-    <w:link w:val="IntenseQuote"/>
+  <w:style w:type="character" w:customStyle="1" w:styleId="IntensivesZitatZchn">
+    <w:name w:val="Intensives Zitat Zchn"/>
+    <w:basedOn w:val="Absatz-Standardschriftart"/>
+    <w:link w:val="IntensivesZitat"/>
     <w:uiPriority w:val="30"/>
     <w:rsid w:val="00035159"/>
     <w:rPr>
@@ -4899,9 +3624,9 @@
       <w:color w:val="0F4761" w:themeColor="accent1" w:themeShade="BF"/>
     </w:rPr>
   </w:style>
-  <w:style w:type="character" w:styleId="IntenseReference">
+  <w:style w:type="character" w:styleId="IntensiverVerweis">
     <w:name w:val="Intense Reference"/>
-    <w:basedOn w:val="DefaultParagraphFont"/>
+    <w:basedOn w:val="Absatz-Standardschriftart"/>
     <w:uiPriority w:val="32"/>
     <w:qFormat/>
     <w:rsid w:val="00035159"/>
@@ -4913,9 +3638,9 @@
       <w:spacing w:val="5"/>
     </w:rPr>
   </w:style>
-  <w:style w:type="table" w:styleId="TableGrid">
+  <w:style w:type="table" w:styleId="Tabellenraster">
     <w:name w:val="Table Grid"/>
-    <w:basedOn w:val="TableNormal"/>
+    <w:basedOn w:val="NormaleTabelle"/>
     <w:uiPriority w:val="39"/>
     <w:rsid w:val="00035159"/>
     <w:pPr>
@@ -4932,9 +3657,9 @@
       </w:tblBorders>
     </w:tblPr>
   </w:style>
-  <w:style w:type="character" w:styleId="PlaceholderText">
+  <w:style w:type="character" w:styleId="Platzhaltertext">
     <w:name w:val="Placeholder Text"/>
-    <w:basedOn w:val="DefaultParagraphFont"/>
+    <w:basedOn w:val="Absatz-Standardschriftart"/>
     <w:uiPriority w:val="99"/>
     <w:semiHidden/>
     <w:rsid w:val="00035159"/>
@@ -4944,7 +3669,7 @@
   </w:style>
   <w:style w:type="character" w:styleId="Hyperlink">
     <w:name w:val="Hyperlink"/>
-    <w:basedOn w:val="DefaultParagraphFont"/>
+    <w:basedOn w:val="Absatz-Standardschriftart"/>
     <w:uiPriority w:val="99"/>
     <w:unhideWhenUsed/>
     <w:rsid w:val="00844024"/>
@@ -4953,9 +3678,9 @@
       <w:u w:val="single"/>
     </w:rPr>
   </w:style>
-  <w:style w:type="character" w:styleId="UnresolvedMention">
+  <w:style w:type="character" w:styleId="NichtaufgelsteErwhnung">
     <w:name w:val="Unresolved Mention"/>
-    <w:basedOn w:val="DefaultParagraphFont"/>
+    <w:basedOn w:val="Absatz-Standardschriftart"/>
     <w:uiPriority w:val="99"/>
     <w:semiHidden/>
     <w:unhideWhenUsed/>

</xml_diff>

<commit_message>
Started on Model description
</commit_message>
<xml_diff>
--- a/Key Parameters.docx
+++ b/Key Parameters.docx
@@ -6,21 +6,225 @@
       <w:pPr>
         <w:pStyle w:val="berschrift2"/>
         <w:bidi w:val="0"/>
-      </w:pPr>
-      <w:r>
-        <w:t>Key Parameters &amp; Inputs</w:t>
+        <w:jc w:val="both"/>
+      </w:pPr>
+      <w:r>
+        <w:t>Model Assumptions</w:t>
       </w:r>
     </w:p>
     <w:p>
       <w:pPr>
         <w:bidi w:val="0"/>
         <w:jc w:val="both"/>
+      </w:pPr>
+      <w:r>
+        <w:t xml:space="preserve">The model is of a hypothetical hydrogen plant with PEM </w:t>
+      </w:r>
+      <w:proofErr w:type="spellStart"/>
+      <w:r>
+        <w:t>electrolyzers</w:t>
+      </w:r>
+      <w:proofErr w:type="spellEnd"/>
+      <w:r>
+        <w:t xml:space="preserve">. The power for plant operation comes from an islanded wind farm with a similar capacity. It is assumed that the heat output of the </w:t>
+      </w:r>
+      <w:proofErr w:type="spellStart"/>
+      <w:r>
+        <w:t>electrolyzer</w:t>
+      </w:r>
+      <w:proofErr w:type="spellEnd"/>
+      <w:r>
+        <w:t xml:space="preserve"> is very large compared with the oxygen output. Therefore, the fish farm is sized first, based on the oxygen output, and the greenhouse is sized based on the heat remaining after the fish farm demand has been calculated.  </w:t>
+      </w:r>
+    </w:p>
+    <w:p>
+      <w:pPr>
+        <w:pStyle w:val="Listenabsatz"/>
+        <w:numPr>
+          <w:ilvl w:val="0"/>
+          <w:numId w:val="7"/>
+        </w:numPr>
+        <w:bidi w:val="0"/>
+      </w:pPr>
+      <w:r>
+        <w:t xml:space="preserve">The </w:t>
+      </w:r>
+      <w:proofErr w:type="spellStart"/>
+      <w:r>
+        <w:t>electrolyzer</w:t>
+      </w:r>
+      <w:proofErr w:type="spellEnd"/>
+      <w:r>
+        <w:t xml:space="preserve"> plant has a capacity of </w:t>
+      </w:r>
+      <w:r>
+        <w:t>2.5</w:t>
+      </w:r>
+      <w:r>
+        <w:t xml:space="preserve"> </w:t>
+      </w:r>
+      <w:r>
+        <w:t xml:space="preserve">MW </w:t>
+      </w:r>
+    </w:p>
+    <w:p>
+      <w:pPr>
+        <w:pStyle w:val="Listenabsatz"/>
+        <w:numPr>
+          <w:ilvl w:val="0"/>
+          <w:numId w:val="7"/>
+        </w:numPr>
+        <w:bidi w:val="0"/>
+      </w:pPr>
+      <w:r>
+        <w:t xml:space="preserve">The wind farm has a </w:t>
+      </w:r>
+      <w:r>
+        <w:t>capacity</w:t>
+      </w:r>
+      <w:r>
+        <w:t xml:space="preserve"> of 2.9 MW (scaled from the 175 MW </w:t>
+      </w:r>
+      <w:proofErr w:type="spellStart"/>
+      <w:r>
+        <w:t>electrolyzer</w:t>
+      </w:r>
+      <w:proofErr w:type="spellEnd"/>
+      <w:r>
+        <w:t xml:space="preserve"> project in </w:t>
+      </w:r>
+      <w:r>
+        <w:fldChar w:fldCharType="begin"/>
+      </w:r>
+      <w:r>
+        <w:instrText xml:space="preserve"> ADDIN ZOTERO_ITEM CSL_CITATION {"citationID":"h8ABuPI3","properties":{"formattedCitation":"[1]","plainCitation":"[1]","noteIndex":0},"citationItems":[{"id":345,"uris":["http://zotero.org/groups/6447497/items/QHKRSVM4"],"itemData":{"id":345,"type":"document","title":"PowerPoint Presentation","URL":"https://www.hydrogen.no/files/documents/medlemsmoter/h2carrier.pdf","accessed":{"date-parts":[["2026",3,6]]}}}],"schema":"https://github.com/citation-style-language/schema/raw/master/csl-citation.json"} </w:instrText>
+      </w:r>
+      <w:r>
+        <w:fldChar w:fldCharType="separate"/>
+      </w:r>
+      <w:r>
         <w:rPr>
-          <w:rFonts w:ascii="Calibri" w:hAnsi="Calibri" w:cs="Calibri"/>
-          <w:sz w:val="24"/>
-          <w:szCs w:val="24"/>
+          <w:rFonts w:ascii="Aptos" w:hAnsi="Aptos"/>
         </w:rPr>
-      </w:pPr>
+        <w:t>[1]</w:t>
+      </w:r>
+      <w:r>
+        <w:fldChar w:fldCharType="end"/>
+      </w:r>
+      <w:r>
+        <w:t>)</w:t>
+      </w:r>
+    </w:p>
+    <w:p>
+      <w:pPr>
+        <w:pStyle w:val="Listenabsatz"/>
+        <w:numPr>
+          <w:ilvl w:val="0"/>
+          <w:numId w:val="7"/>
+        </w:numPr>
+        <w:bidi w:val="0"/>
+      </w:pPr>
+      <w:r>
+        <w:t xml:space="preserve">The wind farm has a capacity factor of 40% (this is rounded down from the 45% listed in </w:t>
+      </w:r>
+      <w:r>
+        <w:fldChar w:fldCharType="begin"/>
+      </w:r>
+      <w:r>
+        <w:instrText xml:space="preserve"> ADDIN ZOTERO_ITEM CSL_CITATION {"citationID":"iMCWyHp0","properties":{"formattedCitation":"[1]","plainCitation":"[1]","noteIndex":0},"citationItems":[{"id":345,"uris":["http://zotero.org/groups/6447497/items/QHKRSVM4"],"itemData":{"id":345,"type":"document","title":"PowerPoint Presentation","URL":"https://www.hydrogen.no/files/documents/medlemsmoter/h2carrier.pdf","accessed":{"date-parts":[["2026",3,6]]}}}],"schema":"https://github.com/citation-style-language/schema/raw/master/csl-citation.json"} </w:instrText>
+      </w:r>
+      <w:r>
+        <w:fldChar w:fldCharType="separate"/>
+      </w:r>
+      <w:r>
+        <w:rPr>
+          <w:rFonts w:ascii="Aptos" w:hAnsi="Aptos"/>
+        </w:rPr>
+        <w:t>[1]</w:t>
+      </w:r>
+      <w:r>
+        <w:fldChar w:fldCharType="end"/>
+      </w:r>
+      <w:r>
+        <w:t xml:space="preserve">, due to the reliance of both the fishtank and the greenhouse on the </w:t>
+      </w:r>
+      <w:proofErr w:type="spellStart"/>
+      <w:r>
+        <w:t>electrolyzer</w:t>
+      </w:r>
+      <w:proofErr w:type="spellEnd"/>
+      <w:r>
+        <w:t>)</w:t>
+      </w:r>
+    </w:p>
+    <w:p>
+      <w:pPr>
+        <w:pStyle w:val="Listenabsatz"/>
+        <w:numPr>
+          <w:ilvl w:val="0"/>
+          <w:numId w:val="7"/>
+        </w:numPr>
+        <w:bidi w:val="0"/>
+      </w:pPr>
+      <w:r>
+        <w:t>Fish are assumed to consume 350 mg O_2/kg/</w:t>
+      </w:r>
+      <w:proofErr w:type="spellStart"/>
+      <w:r>
+        <w:t>hr</w:t>
+      </w:r>
+      <w:proofErr w:type="spellEnd"/>
+      <w:r>
+        <w:t xml:space="preserve"> </w:t>
+      </w:r>
+      <w:r>
+        <w:fldChar w:fldCharType="begin"/>
+      </w:r>
+      <w:r>
+        <w:instrText xml:space="preserve"> ADDIN ZOTERO_ITEM CSL_CITATION {"citationID":"BHx8jqpG","properties":{"formattedCitation":"[2]","plainCitation":"[2]","noteIndex":0},"citationItems":[{"id":346,"uris":["http://zotero.org/groups/6447497/items/FZ4WD9MC"],"itemData":{"id":346,"type":"post-weblog","abstract":"In aquatic animals, blood hemo-globin unloads oxygen to the tissue fluids. Coldwater species have higher dissolved-oxygen concentration requirements than warmwater species do.","container-title":"Global Seafood Alliance","language":"en-US","title":"Dissolved oxygen requirements in aquatic animal respiration - Responsible Seafood Advocate","URL":"https://www.globalseafood.org/advocate/dissolved-oxygen-requirements-in-aquatic-animal-respiration/","accessed":{"date-parts":[["2026",3,6]]},"issued":{"date-parts":[["2011",11,1]]}}}],"schema":"https://github.com/citation-style-language/schema/raw/master/csl-citation.json"} </w:instrText>
+      </w:r>
+      <w:r>
+        <w:fldChar w:fldCharType="separate"/>
+      </w:r>
+      <w:r>
+        <w:rPr>
+          <w:rFonts w:ascii="Aptos" w:hAnsi="Aptos"/>
+        </w:rPr>
+        <w:t>[2]</w:t>
+      </w:r>
+      <w:r>
+        <w:fldChar w:fldCharType="end"/>
+      </w:r>
+      <w:r>
+        <w:t>, variable oxygen consumption based on feeding times is not considered (this value depends on the type of fish)</w:t>
+      </w:r>
+    </w:p>
+    <w:p>
+      <w:pPr>
+        <w:pStyle w:val="Listenabsatz"/>
+        <w:numPr>
+          <w:ilvl w:val="0"/>
+          <w:numId w:val="7"/>
+        </w:numPr>
+        <w:bidi w:val="0"/>
+      </w:pPr>
+    </w:p>
+    <w:p>
+      <w:pPr>
+        <w:bidi w:val="0"/>
+      </w:pPr>
+    </w:p>
+    <w:p>
+      <w:pPr>
+        <w:pStyle w:val="berschrift2"/>
+        <w:bidi w:val="0"/>
+      </w:pPr>
+      <w:r>
+        <w:t>Parameters</w:t>
+      </w:r>
+      <w:r>
+        <w:t>, Stocks, Flows</w:t>
+      </w:r>
     </w:p>
     <w:tbl>
       <w:tblPr>
@@ -31,9 +235,9 @@
         <w:tblLook w:val="04A0" w:firstRow="1" w:lastRow="0" w:firstColumn="1" w:lastColumn="0" w:noHBand="0" w:noVBand="1"/>
       </w:tblPr>
       <w:tblGrid>
-        <w:gridCol w:w="1678"/>
-        <w:gridCol w:w="1054"/>
-        <w:gridCol w:w="6477"/>
+        <w:gridCol w:w="1696"/>
+        <w:gridCol w:w="1418"/>
+        <w:gridCol w:w="6095"/>
       </w:tblGrid>
       <w:tr>
         <w:trPr>
@@ -41,7 +245,7 @@
         </w:trPr>
         <w:tc>
           <w:tcPr>
-            <w:tcW w:w="1678" w:type="dxa"/>
+            <w:tcW w:w="1696" w:type="dxa"/>
             <w:vAlign w:val="center"/>
           </w:tcPr>
           <w:p>
@@ -70,7 +274,7 @@
         </w:tc>
         <w:tc>
           <w:tcPr>
-            <w:tcW w:w="1054" w:type="dxa"/>
+            <w:tcW w:w="1418" w:type="dxa"/>
             <w:vAlign w:val="center"/>
           </w:tcPr>
           <w:p>
@@ -85,6 +289,16 @@
                 <w:szCs w:val="24"/>
               </w:rPr>
             </w:pPr>
+            <w:r>
+              <w:rPr>
+                <w:rFonts w:ascii="Calibri" w:hAnsi="Calibri" w:cs="Calibri"/>
+                <w:b/>
+                <w:bCs/>
+                <w:sz w:val="24"/>
+                <w:szCs w:val="24"/>
+              </w:rPr>
+              <w:t>Unit/</w:t>
+            </w:r>
             <w:r>
               <w:rPr>
                 <w:rFonts w:ascii="Calibri" w:hAnsi="Calibri" w:cs="Calibri"/>
@@ -99,7 +313,7 @@
         </w:tc>
         <w:tc>
           <w:tcPr>
-            <w:tcW w:w="6477" w:type="dxa"/>
+            <w:tcW w:w="6095" w:type="dxa"/>
             <w:vAlign w:val="center"/>
           </w:tcPr>
           <w:p>
@@ -134,13 +348,12 @@
         </w:trPr>
         <w:tc>
           <w:tcPr>
-            <w:tcW w:w="1678" w:type="dxa"/>
+            <w:tcW w:w="1696" w:type="dxa"/>
             <w:vAlign w:val="center"/>
           </w:tcPr>
           <w:p>
             <w:pPr>
               <w:bidi w:val="0"/>
-              <w:jc w:val="both"/>
               <w:rPr>
                 <w:rFonts w:ascii="Calibri" w:hAnsi="Calibri" w:cs="Calibri"/>
                 <w:sz w:val="24"/>
@@ -161,70 +374,138 @@
         </w:tc>
         <w:tc>
           <w:tcPr>
-            <w:tcW w:w="1054" w:type="dxa"/>
+            <w:tcW w:w="1418" w:type="dxa"/>
             <w:vAlign w:val="center"/>
           </w:tcPr>
           <w:p>
             <w:pPr>
               <w:bidi w:val="0"/>
-              <w:jc w:val="both"/>
-              <w:rPr>
-                <w:rFonts w:ascii="Calibri" w:hAnsi="Calibri" w:cs="Calibri"/>
-                <w:sz w:val="24"/>
-                <w:szCs w:val="24"/>
-              </w:rPr>
-            </w:pPr>
-            <w:r>
-              <w:rPr>
-                <w:rFonts w:ascii="Calibri" w:hAnsi="Calibri" w:cs="Calibri"/>
-                <w:sz w:val="24"/>
-                <w:szCs w:val="24"/>
-              </w:rPr>
-              <w:t xml:space="preserve">2500 </w:t>
-            </w:r>
-          </w:p>
-          <w:p>
-            <w:pPr>
-              <w:bidi w:val="0"/>
-              <w:jc w:val="both"/>
-              <w:rPr>
-                <w:rFonts w:ascii="Calibri" w:hAnsi="Calibri" w:cs="Calibri"/>
-                <w:sz w:val="24"/>
-                <w:szCs w:val="24"/>
-              </w:rPr>
-            </w:pPr>
-            <w:r>
-              <w:rPr>
-                <w:rFonts w:ascii="Calibri" w:hAnsi="Calibri" w:cs="Calibri"/>
-                <w:sz w:val="24"/>
-                <w:szCs w:val="24"/>
-              </w:rPr>
-              <w:t>J/s</w:t>
+              <w:rPr>
+                <w:rFonts w:ascii="Calibri" w:hAnsi="Calibri" w:cs="Calibri"/>
+                <w:sz w:val="24"/>
+                <w:szCs w:val="24"/>
+              </w:rPr>
+            </w:pPr>
+            <w:r>
+              <w:rPr>
+                <w:rFonts w:ascii="Calibri" w:hAnsi="Calibri" w:cs="Calibri"/>
+                <w:sz w:val="24"/>
+                <w:szCs w:val="24"/>
+              </w:rPr>
+              <w:t>variable</w:t>
             </w:r>
           </w:p>
         </w:tc>
         <w:tc>
           <w:tcPr>
-            <w:tcW w:w="6477" w:type="dxa"/>
+            <w:tcW w:w="6095" w:type="dxa"/>
             <w:vAlign w:val="center"/>
           </w:tcPr>
           <w:p>
             <w:pPr>
               <w:bidi w:val="0"/>
-              <w:jc w:val="both"/>
-              <w:rPr>
-                <w:rFonts w:ascii="Calibri" w:hAnsi="Calibri" w:cs="Calibri"/>
-                <w:sz w:val="24"/>
-                <w:szCs w:val="24"/>
-              </w:rPr>
-            </w:pPr>
-            <w:r>
-              <w:rPr>
-                <w:rFonts w:ascii="Calibri" w:hAnsi="Calibri" w:cs="Calibri"/>
-                <w:sz w:val="24"/>
-                <w:szCs w:val="24"/>
-              </w:rPr>
-              <w:t>This represents a 2.5 MW industrial pilot scale, suitable for providing enough heat and oxygen for commercial-sized greenhouses and fish tanks.</w:t>
+              <w:rPr>
+                <w:rFonts w:ascii="Calibri" w:hAnsi="Calibri" w:cs="Calibri"/>
+                <w:sz w:val="24"/>
+                <w:szCs w:val="24"/>
+              </w:rPr>
+            </w:pPr>
+            <w:r>
+              <w:rPr>
+                <w:rFonts w:ascii="Calibri" w:hAnsi="Calibri" w:cs="Calibri"/>
+                <w:sz w:val="24"/>
+                <w:szCs w:val="24"/>
+              </w:rPr>
+              <w:t>R</w:t>
+            </w:r>
+            <w:r>
+              <w:rPr>
+                <w:rFonts w:ascii="Calibri" w:hAnsi="Calibri" w:cs="Calibri"/>
+                <w:sz w:val="24"/>
+                <w:szCs w:val="24"/>
+              </w:rPr>
+              <w:t xml:space="preserve">epresents </w:t>
+            </w:r>
+            <w:r>
+              <w:rPr>
+                <w:rFonts w:ascii="Calibri" w:hAnsi="Calibri" w:cs="Calibri"/>
+                <w:sz w:val="24"/>
+                <w:szCs w:val="24"/>
+              </w:rPr>
+              <w:t>the power uptake of a</w:t>
+            </w:r>
+            <w:r>
+              <w:rPr>
+                <w:rFonts w:ascii="Calibri" w:hAnsi="Calibri" w:cs="Calibri"/>
+                <w:sz w:val="24"/>
+                <w:szCs w:val="24"/>
+              </w:rPr>
+              <w:t xml:space="preserve"> 2.5 MW industrial pilot scale</w:t>
+            </w:r>
+            <w:r>
+              <w:rPr>
+                <w:rFonts w:ascii="Calibri" w:hAnsi="Calibri" w:cs="Calibri"/>
+                <w:sz w:val="24"/>
+                <w:szCs w:val="24"/>
+              </w:rPr>
+              <w:t xml:space="preserve"> PEM </w:t>
+            </w:r>
+            <w:proofErr w:type="spellStart"/>
+            <w:r>
+              <w:rPr>
+                <w:rFonts w:ascii="Calibri" w:hAnsi="Calibri" w:cs="Calibri"/>
+                <w:sz w:val="24"/>
+                <w:szCs w:val="24"/>
+              </w:rPr>
+              <w:t>electrolyzer</w:t>
+            </w:r>
+            <w:proofErr w:type="spellEnd"/>
+            <w:r>
+              <w:rPr>
+                <w:rFonts w:ascii="Calibri" w:hAnsi="Calibri" w:cs="Calibri"/>
+                <w:sz w:val="24"/>
+                <w:szCs w:val="24"/>
+              </w:rPr>
+              <w:t xml:space="preserve"> plant. </w:t>
+            </w:r>
+            <w:r>
+              <w:rPr>
+                <w:rFonts w:ascii="Calibri" w:hAnsi="Calibri" w:cs="Calibri"/>
+                <w:sz w:val="24"/>
+                <w:szCs w:val="24"/>
+              </w:rPr>
+              <w:fldChar w:fldCharType="begin"/>
+            </w:r>
+            <w:r>
+              <w:rPr>
+                <w:rFonts w:ascii="Calibri" w:hAnsi="Calibri" w:cs="Calibri"/>
+                <w:sz w:val="24"/>
+                <w:szCs w:val="24"/>
+              </w:rPr>
+              <w:instrText xml:space="preserve"> ADDIN ZOTERO_ITEM CSL_CITATION {"citationID":"DSsI2lzZ","properties":{"formattedCitation":"[3]","plainCitation":"[3]","noteIndex":0},"citationItems":[{"id":343,"uris":["http://zotero.org/groups/6447497/items/SRB46M8K"],"itemData":{"id":343,"type":"post-weblog","language":"en-GB","title":"Haeolus – Hydrogen-Aeolic Energy with Optimised eLectrolysers Upstream of Substation","URL":"https://haeolus.eu/","accessed":{"date-parts":[["2026",3,6]]},"issued":{"date-parts":[["2024",1,8]]}}}],"schema":"https://github.com/citation-style-language/schema/raw/master/csl-citation.json"} </w:instrText>
+            </w:r>
+            <w:r>
+              <w:rPr>
+                <w:rFonts w:ascii="Calibri" w:hAnsi="Calibri" w:cs="Calibri"/>
+                <w:sz w:val="24"/>
+                <w:szCs w:val="24"/>
+              </w:rPr>
+              <w:fldChar w:fldCharType="separate"/>
+            </w:r>
+            <w:r>
+              <w:rPr>
+                <w:rFonts w:ascii="Calibri" w:hAnsi="Calibri" w:cs="Calibri"/>
+                <w:sz w:val="24"/>
+              </w:rPr>
+              <w:t>[3]</w:t>
+            </w:r>
+            <w:r>
+              <w:rPr>
+                <w:rFonts w:ascii="Calibri" w:hAnsi="Calibri" w:cs="Calibri"/>
+                <w:sz w:val="24"/>
+                <w:szCs w:val="24"/>
+              </w:rPr>
+              <w:fldChar w:fldCharType="end"/>
             </w:r>
           </w:p>
         </w:tc>
@@ -236,13 +517,12 @@
         </w:trPr>
         <w:tc>
           <w:tcPr>
-            <w:tcW w:w="1678" w:type="dxa"/>
+            <w:tcW w:w="1696" w:type="dxa"/>
             <w:vAlign w:val="center"/>
           </w:tcPr>
           <w:p>
             <w:pPr>
               <w:bidi w:val="0"/>
-              <w:jc w:val="both"/>
               <w:rPr>
                 <w:rFonts w:ascii="Calibri" w:hAnsi="Calibri" w:cs="Calibri"/>
                 <w:sz w:val="24"/>
@@ -263,13 +543,12 @@
         </w:tc>
         <w:tc>
           <w:tcPr>
-            <w:tcW w:w="1054" w:type="dxa"/>
+            <w:tcW w:w="1418" w:type="dxa"/>
             <w:vAlign w:val="center"/>
           </w:tcPr>
           <w:p>
             <w:pPr>
               <w:bidi w:val="0"/>
-              <w:jc w:val="both"/>
               <w:rPr>
                 <w:rFonts w:ascii="Calibri" w:hAnsi="Calibri" w:cs="Calibri"/>
                 <w:sz w:val="24"/>
@@ -288,13 +567,12 @@
         </w:tc>
         <w:tc>
           <w:tcPr>
-            <w:tcW w:w="6477" w:type="dxa"/>
+            <w:tcW w:w="6095" w:type="dxa"/>
             <w:vAlign w:val="center"/>
           </w:tcPr>
           <w:p>
             <w:pPr>
               <w:bidi w:val="0"/>
-              <w:jc w:val="both"/>
               <w:rPr>
                 <w:rFonts w:ascii="Calibri" w:hAnsi="Calibri" w:cs="Calibri"/>
                 <w:sz w:val="24"/>
@@ -337,13 +615,12 @@
         </w:trPr>
         <w:tc>
           <w:tcPr>
-            <w:tcW w:w="1678" w:type="dxa"/>
+            <w:tcW w:w="1696" w:type="dxa"/>
             <w:vAlign w:val="center"/>
           </w:tcPr>
           <w:p>
             <w:pPr>
               <w:bidi w:val="0"/>
-              <w:jc w:val="both"/>
               <w:rPr>
                 <w:rFonts w:ascii="Calibri" w:hAnsi="Calibri" w:cs="Calibri"/>
                 <w:sz w:val="24"/>
@@ -364,13 +641,12 @@
         </w:tc>
         <w:tc>
           <w:tcPr>
-            <w:tcW w:w="1054" w:type="dxa"/>
+            <w:tcW w:w="1418" w:type="dxa"/>
             <w:vAlign w:val="center"/>
           </w:tcPr>
           <w:p>
             <w:pPr>
               <w:bidi w:val="0"/>
-              <w:jc w:val="both"/>
               <w:rPr>
                 <w:rFonts w:ascii="Calibri" w:hAnsi="Calibri" w:cs="Calibri"/>
                 <w:sz w:val="24"/>
@@ -409,7 +685,6 @@
           <w:p>
             <w:pPr>
               <w:bidi w:val="0"/>
-              <w:jc w:val="both"/>
               <w:rPr>
                 <w:rFonts w:ascii="Calibri" w:hAnsi="Calibri" w:cs="Calibri"/>
                 <w:sz w:val="24"/>
@@ -428,13 +703,12 @@
         </w:tc>
         <w:tc>
           <w:tcPr>
-            <w:tcW w:w="6477" w:type="dxa"/>
+            <w:tcW w:w="6095" w:type="dxa"/>
             <w:vAlign w:val="center"/>
           </w:tcPr>
           <w:p>
             <w:pPr>
               <w:bidi w:val="0"/>
-              <w:jc w:val="both"/>
               <w:rPr>
                 <w:rFonts w:ascii="Calibri" w:hAnsi="Calibri" w:cs="Calibri"/>
                 <w:sz w:val="24"/>
@@ -453,7 +727,6 @@
           <w:p>
             <w:pPr>
               <w:bidi w:val="0"/>
-              <w:jc w:val="both"/>
               <w:rPr>
                 <w:rFonts w:ascii="Calibri" w:hAnsi="Calibri" w:cs="Calibri"/>
                 <w:sz w:val="24"/>
@@ -489,13 +762,12 @@
         </w:trPr>
         <w:tc>
           <w:tcPr>
-            <w:tcW w:w="1678" w:type="dxa"/>
+            <w:tcW w:w="1696" w:type="dxa"/>
             <w:vAlign w:val="center"/>
           </w:tcPr>
           <w:p>
             <w:pPr>
               <w:bidi w:val="0"/>
-              <w:jc w:val="both"/>
               <w:rPr>
                 <w:rFonts w:ascii="Calibri" w:hAnsi="Calibri" w:cs="Calibri"/>
                 <w:sz w:val="24"/>
@@ -516,13 +788,12 @@
         </w:tc>
         <w:tc>
           <w:tcPr>
-            <w:tcW w:w="1054" w:type="dxa"/>
+            <w:tcW w:w="1418" w:type="dxa"/>
             <w:vAlign w:val="center"/>
           </w:tcPr>
           <w:p>
             <w:pPr>
               <w:bidi w:val="0"/>
-              <w:jc w:val="both"/>
               <w:rPr>
                 <w:rFonts w:ascii="Calibri" w:hAnsi="Calibri" w:cs="Calibri"/>
                 <w:sz w:val="24"/>
@@ -541,7 +812,6 @@
           <w:p>
             <w:pPr>
               <w:bidi w:val="0"/>
-              <w:jc w:val="both"/>
               <w:rPr>
                 <w:rFonts w:ascii="Calibri" w:hAnsi="Calibri" w:cs="Calibri"/>
                 <w:sz w:val="24"/>
@@ -560,13 +830,12 @@
         </w:tc>
         <w:tc>
           <w:tcPr>
-            <w:tcW w:w="6477" w:type="dxa"/>
+            <w:tcW w:w="6095" w:type="dxa"/>
             <w:vAlign w:val="center"/>
           </w:tcPr>
           <w:p>
             <w:pPr>
               <w:bidi w:val="0"/>
-              <w:jc w:val="both"/>
               <w:rPr>
                 <w:rFonts w:ascii="Calibri" w:hAnsi="Calibri" w:cs="Calibri"/>
                 <w:sz w:val="24"/>
@@ -591,13 +860,12 @@
         </w:trPr>
         <w:tc>
           <w:tcPr>
-            <w:tcW w:w="1678" w:type="dxa"/>
+            <w:tcW w:w="1696" w:type="dxa"/>
             <w:vAlign w:val="center"/>
           </w:tcPr>
           <w:p>
             <w:pPr>
               <w:bidi w:val="0"/>
-              <w:jc w:val="both"/>
               <w:rPr>
                 <w:rFonts w:ascii="Calibri" w:hAnsi="Calibri" w:cs="Calibri"/>
                 <w:sz w:val="24"/>
@@ -618,13 +886,12 @@
         </w:tc>
         <w:tc>
           <w:tcPr>
-            <w:tcW w:w="1054" w:type="dxa"/>
+            <w:tcW w:w="1418" w:type="dxa"/>
             <w:vAlign w:val="center"/>
           </w:tcPr>
           <w:p>
             <w:pPr>
               <w:bidi w:val="0"/>
-              <w:jc w:val="both"/>
               <w:rPr>
                 <w:rFonts w:ascii="Calibri" w:hAnsi="Calibri" w:cs="Calibri"/>
                 <w:sz w:val="24"/>
@@ -643,7 +910,6 @@
           <w:p>
             <w:pPr>
               <w:bidi w:val="0"/>
-              <w:jc w:val="both"/>
               <w:rPr>
                 <w:rFonts w:ascii="Calibri" w:hAnsi="Calibri" w:cs="Calibri"/>
                 <w:sz w:val="24"/>
@@ -659,7 +925,6 @@
               <w:t>kJ/(</w:t>
             </w:r>
             <w:proofErr w:type="spellStart"/>
-            <w:proofErr w:type="gramStart"/>
             <w:r>
               <w:rPr>
                 <w:rFonts w:ascii="Calibri" w:hAnsi="Calibri" w:cs="Calibri"/>
@@ -669,7 +934,6 @@
               <w:t>kg.K</w:t>
             </w:r>
             <w:proofErr w:type="spellEnd"/>
-            <w:proofErr w:type="gramEnd"/>
             <w:r>
               <w:rPr>
                 <w:rFonts w:ascii="Calibri" w:hAnsi="Calibri" w:cs="Calibri"/>
@@ -682,27 +946,999 @@
         </w:tc>
         <w:tc>
           <w:tcPr>
-            <w:tcW w:w="6477" w:type="dxa"/>
+            <w:tcW w:w="6095" w:type="dxa"/>
             <w:vAlign w:val="center"/>
           </w:tcPr>
           <w:p>
             <w:pPr>
               <w:bidi w:val="0"/>
+              <w:rPr>
+                <w:rFonts w:ascii="Calibri" w:hAnsi="Calibri" w:cs="Calibri"/>
+                <w:sz w:val="24"/>
+                <w:szCs w:val="24"/>
+              </w:rPr>
+            </w:pPr>
+            <w:r>
+              <w:rPr>
+                <w:rFonts w:ascii="Calibri" w:hAnsi="Calibri" w:cs="Calibri"/>
+                <w:sz w:val="24"/>
+                <w:szCs w:val="24"/>
+              </w:rPr>
+              <w:t>The specific heat capacity of water; used to calculate how much the temperature rises per unit of heat added.</w:t>
+            </w:r>
+          </w:p>
+        </w:tc>
+      </w:tr>
+    </w:tbl>
+    <w:p>
+      <w:pPr>
+        <w:bidi w:val="0"/>
+        <w:jc w:val="both"/>
+        <w:rPr>
+          <w:rFonts w:ascii="Calibri" w:hAnsi="Calibri" w:cs="Calibri"/>
+          <w:sz w:val="24"/>
+          <w:szCs w:val="24"/>
+        </w:rPr>
+      </w:pPr>
+    </w:p>
+    <w:tbl>
+      <w:tblPr>
+        <w:tblStyle w:val="Tabellenraster"/>
+        <w:tblW w:w="9209" w:type="dxa"/>
+        <w:jc w:val="center"/>
+        <w:tblLayout w:type="fixed"/>
+        <w:tblLook w:val="04A0" w:firstRow="1" w:lastRow="0" w:firstColumn="1" w:lastColumn="0" w:noHBand="0" w:noVBand="1"/>
+      </w:tblPr>
+      <w:tblGrid>
+        <w:gridCol w:w="1696"/>
+        <w:gridCol w:w="1418"/>
+        <w:gridCol w:w="6095"/>
+      </w:tblGrid>
+      <w:tr>
+        <w:trPr>
+          <w:jc w:val="center"/>
+        </w:trPr>
+        <w:tc>
+          <w:tcPr>
+            <w:tcW w:w="1696" w:type="dxa"/>
+            <w:vAlign w:val="center"/>
+          </w:tcPr>
+          <w:p>
+            <w:pPr>
+              <w:bidi w:val="0"/>
               <w:jc w:val="both"/>
               <w:rPr>
                 <w:rFonts w:ascii="Calibri" w:hAnsi="Calibri" w:cs="Calibri"/>
-                <w:sz w:val="24"/>
-                <w:szCs w:val="24"/>
-              </w:rPr>
-            </w:pPr>
-            <w:r>
-              <w:rPr>
-                <w:rFonts w:ascii="Calibri" w:hAnsi="Calibri" w:cs="Calibri"/>
-                <w:sz w:val="24"/>
-                <w:szCs w:val="24"/>
-              </w:rPr>
-              <w:t>The specific heat capacity of water; used to calculate how much the temperature rises per unit of heat added.</w:t>
-            </w:r>
+                <w:b/>
+                <w:bCs/>
+                <w:sz w:val="24"/>
+                <w:szCs w:val="24"/>
+              </w:rPr>
+            </w:pPr>
+            <w:r>
+              <w:rPr>
+                <w:rFonts w:ascii="Calibri" w:hAnsi="Calibri" w:cs="Calibri"/>
+                <w:b/>
+                <w:bCs/>
+                <w:sz w:val="24"/>
+                <w:szCs w:val="24"/>
+              </w:rPr>
+              <w:t>Stock</w:t>
+            </w:r>
+          </w:p>
+        </w:tc>
+        <w:tc>
+          <w:tcPr>
+            <w:tcW w:w="1418" w:type="dxa"/>
+            <w:vAlign w:val="center"/>
+          </w:tcPr>
+          <w:p>
+            <w:pPr>
+              <w:bidi w:val="0"/>
+              <w:jc w:val="both"/>
+              <w:rPr>
+                <w:rFonts w:ascii="Calibri" w:hAnsi="Calibri" w:cs="Calibri"/>
+                <w:b/>
+                <w:bCs/>
+                <w:sz w:val="24"/>
+                <w:szCs w:val="24"/>
+              </w:rPr>
+            </w:pPr>
+            <w:r>
+              <w:rPr>
+                <w:rFonts w:ascii="Calibri" w:hAnsi="Calibri" w:cs="Calibri"/>
+                <w:b/>
+                <w:bCs/>
+                <w:sz w:val="24"/>
+                <w:szCs w:val="24"/>
+              </w:rPr>
+              <w:t>Unit/</w:t>
+            </w:r>
+            <w:r>
+              <w:rPr>
+                <w:rFonts w:ascii="Calibri" w:hAnsi="Calibri" w:cs="Calibri"/>
+                <w:b/>
+                <w:bCs/>
+                <w:sz w:val="24"/>
+                <w:szCs w:val="24"/>
+              </w:rPr>
+              <w:t>Value</w:t>
+            </w:r>
+          </w:p>
+        </w:tc>
+        <w:tc>
+          <w:tcPr>
+            <w:tcW w:w="6095" w:type="dxa"/>
+            <w:vAlign w:val="center"/>
+          </w:tcPr>
+          <w:p>
+            <w:pPr>
+              <w:bidi w:val="0"/>
+              <w:jc w:val="both"/>
+              <w:rPr>
+                <w:rFonts w:ascii="Calibri" w:hAnsi="Calibri" w:cs="Calibri"/>
+                <w:b/>
+                <w:bCs/>
+                <w:sz w:val="24"/>
+                <w:szCs w:val="24"/>
+              </w:rPr>
+            </w:pPr>
+            <w:r>
+              <w:rPr>
+                <w:rFonts w:ascii="Calibri" w:hAnsi="Calibri" w:cs="Calibri"/>
+                <w:b/>
+                <w:bCs/>
+                <w:sz w:val="24"/>
+                <w:szCs w:val="24"/>
+              </w:rPr>
+              <w:t>Description</w:t>
+            </w:r>
+          </w:p>
+        </w:tc>
+      </w:tr>
+      <w:tr>
+        <w:trPr>
+          <w:trHeight w:val="794"/>
+          <w:jc w:val="center"/>
+        </w:trPr>
+        <w:tc>
+          <w:tcPr>
+            <w:tcW w:w="1696" w:type="dxa"/>
+            <w:vAlign w:val="center"/>
+          </w:tcPr>
+          <w:p>
+            <w:pPr>
+              <w:bidi w:val="0"/>
+              <w:rPr>
+                <w:rFonts w:ascii="Calibri" w:hAnsi="Calibri" w:cs="Calibri"/>
+                <w:sz w:val="24"/>
+                <w:szCs w:val="24"/>
+              </w:rPr>
+            </w:pPr>
+            <w:r>
+              <w:rPr>
+                <w:rFonts w:ascii="Calibri" w:hAnsi="Calibri" w:cs="Calibri"/>
+                <w:sz w:val="24"/>
+                <w:szCs w:val="24"/>
+              </w:rPr>
+              <w:t>H2_store</w:t>
+            </w:r>
+          </w:p>
+        </w:tc>
+        <w:tc>
+          <w:tcPr>
+            <w:tcW w:w="1418" w:type="dxa"/>
+            <w:vAlign w:val="center"/>
+          </w:tcPr>
+          <w:p>
+            <w:pPr>
+              <w:bidi w:val="0"/>
+              <w:rPr>
+                <w:rFonts w:ascii="Calibri" w:hAnsi="Calibri" w:cs="Calibri"/>
+                <w:sz w:val="24"/>
+                <w:szCs w:val="24"/>
+              </w:rPr>
+            </w:pPr>
+            <w:r>
+              <w:rPr>
+                <w:rFonts w:ascii="Calibri" w:hAnsi="Calibri" w:cs="Calibri"/>
+                <w:sz w:val="24"/>
+                <w:szCs w:val="24"/>
+              </w:rPr>
+              <w:t>mol</w:t>
+            </w:r>
+          </w:p>
+        </w:tc>
+        <w:tc>
+          <w:tcPr>
+            <w:tcW w:w="6095" w:type="dxa"/>
+            <w:vAlign w:val="center"/>
+          </w:tcPr>
+          <w:p>
+            <w:pPr>
+              <w:bidi w:val="0"/>
+              <w:rPr>
+                <w:rFonts w:ascii="Calibri" w:hAnsi="Calibri" w:cs="Calibri"/>
+                <w:sz w:val="24"/>
+                <w:szCs w:val="24"/>
+              </w:rPr>
+            </w:pPr>
+            <w:r>
+              <w:rPr>
+                <w:rFonts w:ascii="Calibri" w:hAnsi="Calibri" w:cs="Calibri"/>
+                <w:sz w:val="24"/>
+                <w:szCs w:val="24"/>
+              </w:rPr>
+              <w:t>R</w:t>
+            </w:r>
+            <w:r>
+              <w:rPr>
+                <w:rFonts w:ascii="Calibri" w:hAnsi="Calibri" w:cs="Calibri"/>
+                <w:sz w:val="24"/>
+                <w:szCs w:val="24"/>
+              </w:rPr>
+              <w:t xml:space="preserve">epresents </w:t>
+            </w:r>
+            <w:r>
+              <w:rPr>
+                <w:rFonts w:ascii="Calibri" w:hAnsi="Calibri" w:cs="Calibri"/>
+                <w:sz w:val="24"/>
+                <w:szCs w:val="24"/>
+              </w:rPr>
+              <w:t xml:space="preserve">the </w:t>
+            </w:r>
+            <w:r>
+              <w:rPr>
+                <w:rFonts w:ascii="Calibri" w:hAnsi="Calibri" w:cs="Calibri"/>
+                <w:sz w:val="24"/>
+                <w:szCs w:val="24"/>
+              </w:rPr>
+              <w:t>produced hydrogen</w:t>
+            </w:r>
+            <w:r>
+              <w:rPr>
+                <w:rFonts w:ascii="Calibri" w:hAnsi="Calibri" w:cs="Calibri"/>
+                <w:sz w:val="24"/>
+                <w:szCs w:val="24"/>
+              </w:rPr>
+              <w:t xml:space="preserve"> </w:t>
+            </w:r>
+          </w:p>
+        </w:tc>
+      </w:tr>
+      <w:tr>
+        <w:trPr>
+          <w:trHeight w:val="680"/>
+          <w:jc w:val="center"/>
+        </w:trPr>
+        <w:tc>
+          <w:tcPr>
+            <w:tcW w:w="1696" w:type="dxa"/>
+            <w:vAlign w:val="center"/>
+          </w:tcPr>
+          <w:p>
+            <w:pPr>
+              <w:bidi w:val="0"/>
+              <w:rPr>
+                <w:rFonts w:ascii="Calibri" w:hAnsi="Calibri" w:cs="Calibri"/>
+                <w:sz w:val="24"/>
+                <w:szCs w:val="24"/>
+              </w:rPr>
+            </w:pPr>
+          </w:p>
+        </w:tc>
+        <w:tc>
+          <w:tcPr>
+            <w:tcW w:w="1418" w:type="dxa"/>
+            <w:vAlign w:val="center"/>
+          </w:tcPr>
+          <w:p>
+            <w:pPr>
+              <w:bidi w:val="0"/>
+              <w:rPr>
+                <w:rFonts w:ascii="Calibri" w:hAnsi="Calibri" w:cs="Calibri"/>
+                <w:sz w:val="24"/>
+                <w:szCs w:val="24"/>
+              </w:rPr>
+            </w:pPr>
+          </w:p>
+        </w:tc>
+        <w:tc>
+          <w:tcPr>
+            <w:tcW w:w="6095" w:type="dxa"/>
+            <w:vAlign w:val="center"/>
+          </w:tcPr>
+          <w:p>
+            <w:pPr>
+              <w:bidi w:val="0"/>
+              <w:rPr>
+                <w:rFonts w:ascii="Calibri" w:hAnsi="Calibri" w:cs="Calibri"/>
+                <w:sz w:val="24"/>
+                <w:szCs w:val="24"/>
+              </w:rPr>
+            </w:pPr>
+          </w:p>
+        </w:tc>
+      </w:tr>
+      <w:tr>
+        <w:trPr>
+          <w:trHeight w:val="680"/>
+          <w:jc w:val="center"/>
+        </w:trPr>
+        <w:tc>
+          <w:tcPr>
+            <w:tcW w:w="1696" w:type="dxa"/>
+            <w:vAlign w:val="center"/>
+          </w:tcPr>
+          <w:p>
+            <w:pPr>
+              <w:bidi w:val="0"/>
+              <w:rPr>
+                <w:rFonts w:ascii="Calibri" w:hAnsi="Calibri" w:cs="Calibri"/>
+                <w:sz w:val="24"/>
+                <w:szCs w:val="24"/>
+              </w:rPr>
+            </w:pPr>
+          </w:p>
+        </w:tc>
+        <w:tc>
+          <w:tcPr>
+            <w:tcW w:w="1418" w:type="dxa"/>
+            <w:vAlign w:val="center"/>
+          </w:tcPr>
+          <w:p>
+            <w:pPr>
+              <w:bidi w:val="0"/>
+              <w:rPr>
+                <w:rFonts w:ascii="Calibri" w:hAnsi="Calibri" w:cs="Calibri"/>
+                <w:sz w:val="24"/>
+                <w:szCs w:val="24"/>
+              </w:rPr>
+            </w:pPr>
+          </w:p>
+        </w:tc>
+        <w:tc>
+          <w:tcPr>
+            <w:tcW w:w="6095" w:type="dxa"/>
+            <w:vAlign w:val="center"/>
+          </w:tcPr>
+          <w:p>
+            <w:pPr>
+              <w:bidi w:val="0"/>
+              <w:rPr>
+                <w:rFonts w:ascii="Calibri" w:hAnsi="Calibri" w:cs="Calibri"/>
+                <w:sz w:val="24"/>
+                <w:szCs w:val="24"/>
+              </w:rPr>
+            </w:pPr>
+          </w:p>
+        </w:tc>
+      </w:tr>
+      <w:tr>
+        <w:trPr>
+          <w:trHeight w:val="680"/>
+          <w:jc w:val="center"/>
+        </w:trPr>
+        <w:tc>
+          <w:tcPr>
+            <w:tcW w:w="1696" w:type="dxa"/>
+            <w:vAlign w:val="center"/>
+          </w:tcPr>
+          <w:p>
+            <w:pPr>
+              <w:bidi w:val="0"/>
+              <w:rPr>
+                <w:rFonts w:ascii="Calibri" w:hAnsi="Calibri" w:cs="Calibri"/>
+                <w:sz w:val="24"/>
+                <w:szCs w:val="24"/>
+              </w:rPr>
+            </w:pPr>
+          </w:p>
+        </w:tc>
+        <w:tc>
+          <w:tcPr>
+            <w:tcW w:w="1418" w:type="dxa"/>
+            <w:vAlign w:val="center"/>
+          </w:tcPr>
+          <w:p>
+            <w:pPr>
+              <w:bidi w:val="0"/>
+              <w:rPr>
+                <w:rFonts w:ascii="Calibri" w:hAnsi="Calibri" w:cs="Calibri"/>
+                <w:sz w:val="24"/>
+                <w:szCs w:val="24"/>
+              </w:rPr>
+            </w:pPr>
+          </w:p>
+        </w:tc>
+        <w:tc>
+          <w:tcPr>
+            <w:tcW w:w="6095" w:type="dxa"/>
+            <w:vAlign w:val="center"/>
+          </w:tcPr>
+          <w:p>
+            <w:pPr>
+              <w:bidi w:val="0"/>
+              <w:rPr>
+                <w:rFonts w:ascii="Calibri" w:hAnsi="Calibri" w:cs="Calibri"/>
+                <w:sz w:val="24"/>
+                <w:szCs w:val="24"/>
+              </w:rPr>
+            </w:pPr>
+          </w:p>
+        </w:tc>
+      </w:tr>
+      <w:tr>
+        <w:trPr>
+          <w:trHeight w:val="680"/>
+          <w:jc w:val="center"/>
+        </w:trPr>
+        <w:tc>
+          <w:tcPr>
+            <w:tcW w:w="1696" w:type="dxa"/>
+            <w:vAlign w:val="center"/>
+          </w:tcPr>
+          <w:p>
+            <w:pPr>
+              <w:bidi w:val="0"/>
+              <w:rPr>
+                <w:rFonts w:ascii="Calibri" w:hAnsi="Calibri" w:cs="Calibri"/>
+                <w:sz w:val="24"/>
+                <w:szCs w:val="24"/>
+              </w:rPr>
+            </w:pPr>
+          </w:p>
+        </w:tc>
+        <w:tc>
+          <w:tcPr>
+            <w:tcW w:w="1418" w:type="dxa"/>
+            <w:vAlign w:val="center"/>
+          </w:tcPr>
+          <w:p>
+            <w:pPr>
+              <w:bidi w:val="0"/>
+              <w:rPr>
+                <w:rFonts w:ascii="Calibri" w:hAnsi="Calibri" w:cs="Calibri"/>
+                <w:sz w:val="24"/>
+                <w:szCs w:val="24"/>
+              </w:rPr>
+            </w:pPr>
+          </w:p>
+        </w:tc>
+        <w:tc>
+          <w:tcPr>
+            <w:tcW w:w="6095" w:type="dxa"/>
+            <w:vAlign w:val="center"/>
+          </w:tcPr>
+          <w:p>
+            <w:pPr>
+              <w:bidi w:val="0"/>
+              <w:rPr>
+                <w:rFonts w:ascii="Calibri" w:hAnsi="Calibri" w:cs="Calibri"/>
+                <w:sz w:val="24"/>
+                <w:szCs w:val="24"/>
+              </w:rPr>
+            </w:pPr>
+          </w:p>
+        </w:tc>
+      </w:tr>
+    </w:tbl>
+    <w:p>
+      <w:pPr>
+        <w:bidi w:val="0"/>
+        <w:jc w:val="both"/>
+        <w:rPr>
+          <w:rFonts w:ascii="Calibri" w:hAnsi="Calibri" w:cs="Calibri"/>
+          <w:sz w:val="24"/>
+          <w:szCs w:val="24"/>
+        </w:rPr>
+      </w:pPr>
+    </w:p>
+    <w:tbl>
+      <w:tblPr>
+        <w:tblStyle w:val="Tabellenraster"/>
+        <w:tblW w:w="9209" w:type="dxa"/>
+        <w:jc w:val="center"/>
+        <w:tblLayout w:type="fixed"/>
+        <w:tblLook w:val="04A0" w:firstRow="1" w:lastRow="0" w:firstColumn="1" w:lastColumn="0" w:noHBand="0" w:noVBand="1"/>
+      </w:tblPr>
+      <w:tblGrid>
+        <w:gridCol w:w="1696"/>
+        <w:gridCol w:w="1418"/>
+        <w:gridCol w:w="6095"/>
+      </w:tblGrid>
+      <w:tr>
+        <w:trPr>
+          <w:jc w:val="center"/>
+        </w:trPr>
+        <w:tc>
+          <w:tcPr>
+            <w:tcW w:w="1696" w:type="dxa"/>
+            <w:vAlign w:val="center"/>
+          </w:tcPr>
+          <w:p>
+            <w:pPr>
+              <w:bidi w:val="0"/>
+              <w:jc w:val="both"/>
+              <w:rPr>
+                <w:rFonts w:ascii="Calibri" w:hAnsi="Calibri" w:cs="Calibri"/>
+                <w:b/>
+                <w:bCs/>
+                <w:sz w:val="24"/>
+                <w:szCs w:val="24"/>
+              </w:rPr>
+            </w:pPr>
+            <w:r>
+              <w:rPr>
+                <w:rFonts w:ascii="Calibri" w:hAnsi="Calibri" w:cs="Calibri"/>
+                <w:b/>
+                <w:bCs/>
+                <w:sz w:val="24"/>
+                <w:szCs w:val="24"/>
+              </w:rPr>
+              <w:t>Flow</w:t>
+            </w:r>
+          </w:p>
+        </w:tc>
+        <w:tc>
+          <w:tcPr>
+            <w:tcW w:w="1418" w:type="dxa"/>
+            <w:vAlign w:val="center"/>
+          </w:tcPr>
+          <w:p>
+            <w:pPr>
+              <w:bidi w:val="0"/>
+              <w:jc w:val="both"/>
+              <w:rPr>
+                <w:rFonts w:ascii="Calibri" w:hAnsi="Calibri" w:cs="Calibri"/>
+                <w:b/>
+                <w:bCs/>
+                <w:sz w:val="24"/>
+                <w:szCs w:val="24"/>
+              </w:rPr>
+            </w:pPr>
+            <w:r>
+              <w:rPr>
+                <w:rFonts w:ascii="Calibri" w:hAnsi="Calibri" w:cs="Calibri"/>
+                <w:b/>
+                <w:bCs/>
+                <w:sz w:val="24"/>
+                <w:szCs w:val="24"/>
+              </w:rPr>
+              <w:t>Unit/</w:t>
+            </w:r>
+            <w:r>
+              <w:rPr>
+                <w:rFonts w:ascii="Calibri" w:hAnsi="Calibri" w:cs="Calibri"/>
+                <w:b/>
+                <w:bCs/>
+                <w:sz w:val="24"/>
+                <w:szCs w:val="24"/>
+              </w:rPr>
+              <w:t>Value</w:t>
+            </w:r>
+          </w:p>
+        </w:tc>
+        <w:tc>
+          <w:tcPr>
+            <w:tcW w:w="6095" w:type="dxa"/>
+            <w:vAlign w:val="center"/>
+          </w:tcPr>
+          <w:p>
+            <w:pPr>
+              <w:bidi w:val="0"/>
+              <w:jc w:val="both"/>
+              <w:rPr>
+                <w:rFonts w:ascii="Calibri" w:hAnsi="Calibri" w:cs="Calibri"/>
+                <w:b/>
+                <w:bCs/>
+                <w:sz w:val="24"/>
+                <w:szCs w:val="24"/>
+              </w:rPr>
+            </w:pPr>
+            <w:r>
+              <w:rPr>
+                <w:rFonts w:ascii="Calibri" w:hAnsi="Calibri" w:cs="Calibri"/>
+                <w:b/>
+                <w:bCs/>
+                <w:sz w:val="24"/>
+                <w:szCs w:val="24"/>
+              </w:rPr>
+              <w:t>Description</w:t>
+            </w:r>
+          </w:p>
+        </w:tc>
+      </w:tr>
+      <w:tr>
+        <w:trPr>
+          <w:trHeight w:val="794"/>
+          <w:jc w:val="center"/>
+        </w:trPr>
+        <w:tc>
+          <w:tcPr>
+            <w:tcW w:w="1696" w:type="dxa"/>
+            <w:vAlign w:val="center"/>
+          </w:tcPr>
+          <w:p>
+            <w:pPr>
+              <w:bidi w:val="0"/>
+              <w:rPr>
+                <w:rFonts w:ascii="Calibri" w:hAnsi="Calibri" w:cs="Calibri"/>
+                <w:sz w:val="24"/>
+                <w:szCs w:val="24"/>
+              </w:rPr>
+            </w:pPr>
+            <w:r>
+              <w:rPr>
+                <w:rFonts w:ascii="Calibri" w:hAnsi="Calibri" w:cs="Calibri"/>
+                <w:sz w:val="24"/>
+                <w:szCs w:val="24"/>
+              </w:rPr>
+              <w:t>H2_flow</w:t>
+            </w:r>
+          </w:p>
+        </w:tc>
+        <w:tc>
+          <w:tcPr>
+            <w:tcW w:w="1418" w:type="dxa"/>
+            <w:vAlign w:val="center"/>
+          </w:tcPr>
+          <w:p>
+            <w:pPr>
+              <w:bidi w:val="0"/>
+              <w:rPr>
+                <w:rFonts w:ascii="Calibri" w:hAnsi="Calibri" w:cs="Calibri"/>
+                <w:sz w:val="24"/>
+                <w:szCs w:val="24"/>
+              </w:rPr>
+            </w:pPr>
+            <w:r>
+              <w:rPr>
+                <w:rFonts w:ascii="Calibri" w:hAnsi="Calibri" w:cs="Calibri"/>
+                <w:sz w:val="24"/>
+                <w:szCs w:val="24"/>
+              </w:rPr>
+              <w:t>variable</w:t>
+            </w:r>
+          </w:p>
+        </w:tc>
+        <w:tc>
+          <w:tcPr>
+            <w:tcW w:w="6095" w:type="dxa"/>
+            <w:vAlign w:val="center"/>
+          </w:tcPr>
+          <w:p>
+            <w:pPr>
+              <w:bidi w:val="0"/>
+              <w:rPr>
+                <w:rFonts w:ascii="Calibri" w:hAnsi="Calibri" w:cs="Calibri"/>
+                <w:sz w:val="24"/>
+                <w:szCs w:val="24"/>
+              </w:rPr>
+            </w:pPr>
+            <w:r>
+              <w:rPr>
+                <w:rFonts w:ascii="Calibri" w:hAnsi="Calibri" w:cs="Calibri"/>
+                <w:sz w:val="24"/>
+                <w:szCs w:val="24"/>
+              </w:rPr>
+              <w:t>R</w:t>
+            </w:r>
+            <w:r>
+              <w:rPr>
+                <w:rFonts w:ascii="Calibri" w:hAnsi="Calibri" w:cs="Calibri"/>
+                <w:sz w:val="24"/>
+                <w:szCs w:val="24"/>
+              </w:rPr>
+              <w:t xml:space="preserve">epresents </w:t>
+            </w:r>
+            <w:r>
+              <w:rPr>
+                <w:rFonts w:ascii="Calibri" w:hAnsi="Calibri" w:cs="Calibri"/>
+                <w:sz w:val="24"/>
+                <w:szCs w:val="24"/>
+              </w:rPr>
+              <w:t xml:space="preserve">the power </w:t>
+            </w:r>
+            <w:proofErr w:type="spellStart"/>
+            <w:r>
+              <w:rPr>
+                <w:rFonts w:ascii="Calibri" w:hAnsi="Calibri" w:cs="Calibri"/>
+                <w:sz w:val="24"/>
+                <w:szCs w:val="24"/>
+              </w:rPr>
+              <w:t>intput</w:t>
+            </w:r>
+            <w:proofErr w:type="spellEnd"/>
+            <w:r>
+              <w:rPr>
+                <w:rFonts w:ascii="Calibri" w:hAnsi="Calibri" w:cs="Calibri"/>
+                <w:sz w:val="24"/>
+                <w:szCs w:val="24"/>
+              </w:rPr>
+              <w:t xml:space="preserve"> 2.5 MW industrial pilot scale</w:t>
+            </w:r>
+            <w:r>
+              <w:rPr>
+                <w:rFonts w:ascii="Calibri" w:hAnsi="Calibri" w:cs="Calibri"/>
+                <w:sz w:val="24"/>
+                <w:szCs w:val="24"/>
+              </w:rPr>
+              <w:t xml:space="preserve"> PEM </w:t>
+            </w:r>
+            <w:proofErr w:type="spellStart"/>
+            <w:r>
+              <w:rPr>
+                <w:rFonts w:ascii="Calibri" w:hAnsi="Calibri" w:cs="Calibri"/>
+                <w:sz w:val="24"/>
+                <w:szCs w:val="24"/>
+              </w:rPr>
+              <w:t>electrolyzer</w:t>
+            </w:r>
+            <w:proofErr w:type="spellEnd"/>
+            <w:r>
+              <w:rPr>
+                <w:rFonts w:ascii="Calibri" w:hAnsi="Calibri" w:cs="Calibri"/>
+                <w:sz w:val="24"/>
+                <w:szCs w:val="24"/>
+              </w:rPr>
+              <w:t xml:space="preserve"> plant. </w:t>
+            </w:r>
+            <w:r>
+              <w:rPr>
+                <w:rFonts w:ascii="Calibri" w:hAnsi="Calibri" w:cs="Calibri"/>
+                <w:sz w:val="24"/>
+                <w:szCs w:val="24"/>
+              </w:rPr>
+              <w:fldChar w:fldCharType="begin"/>
+            </w:r>
+            <w:r>
+              <w:rPr>
+                <w:rFonts w:ascii="Calibri" w:hAnsi="Calibri" w:cs="Calibri"/>
+                <w:sz w:val="24"/>
+                <w:szCs w:val="24"/>
+              </w:rPr>
+              <w:instrText xml:space="preserve"> ADDIN ZOTERO_ITEM CSL_CITATION {"citationID":"kVQ6rlnq","properties":{"formattedCitation":"[3]","plainCitation":"[3]","noteIndex":0},"citationItems":[{"id":343,"uris":["http://zotero.org/groups/6447497/items/SRB46M8K"],"itemData":{"id":343,"type":"post-weblog","language":"en-GB","title":"Haeolus – Hydrogen-Aeolic Energy with Optimised eLectrolysers Upstream of Substation","URL":"https://haeolus.eu/","accessed":{"date-parts":[["2026",3,6]]},"issued":{"date-parts":[["2024",1,8]]}}}],"schema":"https://github.com/citation-style-language/schema/raw/master/csl-citation.json"} </w:instrText>
+            </w:r>
+            <w:r>
+              <w:rPr>
+                <w:rFonts w:ascii="Calibri" w:hAnsi="Calibri" w:cs="Calibri"/>
+                <w:sz w:val="24"/>
+                <w:szCs w:val="24"/>
+              </w:rPr>
+              <w:fldChar w:fldCharType="separate"/>
+            </w:r>
+            <w:r>
+              <w:rPr>
+                <w:rFonts w:ascii="Calibri" w:hAnsi="Calibri" w:cs="Calibri"/>
+                <w:sz w:val="24"/>
+              </w:rPr>
+              <w:t>[3]</w:t>
+            </w:r>
+            <w:r>
+              <w:rPr>
+                <w:rFonts w:ascii="Calibri" w:hAnsi="Calibri" w:cs="Calibri"/>
+                <w:sz w:val="24"/>
+                <w:szCs w:val="24"/>
+              </w:rPr>
+              <w:fldChar w:fldCharType="end"/>
+            </w:r>
+          </w:p>
+        </w:tc>
+      </w:tr>
+      <w:tr>
+        <w:trPr>
+          <w:trHeight w:val="680"/>
+          <w:jc w:val="center"/>
+        </w:trPr>
+        <w:tc>
+          <w:tcPr>
+            <w:tcW w:w="1696" w:type="dxa"/>
+            <w:vAlign w:val="center"/>
+          </w:tcPr>
+          <w:p>
+            <w:pPr>
+              <w:bidi w:val="0"/>
+              <w:rPr>
+                <w:rFonts w:ascii="Calibri" w:hAnsi="Calibri" w:cs="Calibri"/>
+                <w:sz w:val="24"/>
+                <w:szCs w:val="24"/>
+              </w:rPr>
+            </w:pPr>
+          </w:p>
+        </w:tc>
+        <w:tc>
+          <w:tcPr>
+            <w:tcW w:w="1418" w:type="dxa"/>
+            <w:vAlign w:val="center"/>
+          </w:tcPr>
+          <w:p>
+            <w:pPr>
+              <w:bidi w:val="0"/>
+              <w:rPr>
+                <w:rFonts w:ascii="Calibri" w:hAnsi="Calibri" w:cs="Calibri"/>
+                <w:sz w:val="24"/>
+                <w:szCs w:val="24"/>
+              </w:rPr>
+            </w:pPr>
+          </w:p>
+        </w:tc>
+        <w:tc>
+          <w:tcPr>
+            <w:tcW w:w="6095" w:type="dxa"/>
+            <w:vAlign w:val="center"/>
+          </w:tcPr>
+          <w:p>
+            <w:pPr>
+              <w:bidi w:val="0"/>
+              <w:rPr>
+                <w:rFonts w:ascii="Calibri" w:hAnsi="Calibri" w:cs="Calibri"/>
+                <w:sz w:val="24"/>
+                <w:szCs w:val="24"/>
+              </w:rPr>
+            </w:pPr>
+          </w:p>
+        </w:tc>
+      </w:tr>
+      <w:tr>
+        <w:trPr>
+          <w:trHeight w:val="680"/>
+          <w:jc w:val="center"/>
+        </w:trPr>
+        <w:tc>
+          <w:tcPr>
+            <w:tcW w:w="1696" w:type="dxa"/>
+            <w:vAlign w:val="center"/>
+          </w:tcPr>
+          <w:p>
+            <w:pPr>
+              <w:bidi w:val="0"/>
+              <w:rPr>
+                <w:rFonts w:ascii="Calibri" w:hAnsi="Calibri" w:cs="Calibri"/>
+                <w:sz w:val="24"/>
+                <w:szCs w:val="24"/>
+              </w:rPr>
+            </w:pPr>
+          </w:p>
+        </w:tc>
+        <w:tc>
+          <w:tcPr>
+            <w:tcW w:w="1418" w:type="dxa"/>
+            <w:vAlign w:val="center"/>
+          </w:tcPr>
+          <w:p>
+            <w:pPr>
+              <w:bidi w:val="0"/>
+              <w:rPr>
+                <w:rFonts w:ascii="Calibri" w:hAnsi="Calibri" w:cs="Calibri"/>
+                <w:sz w:val="24"/>
+                <w:szCs w:val="24"/>
+              </w:rPr>
+            </w:pPr>
+          </w:p>
+        </w:tc>
+        <w:tc>
+          <w:tcPr>
+            <w:tcW w:w="6095" w:type="dxa"/>
+            <w:vAlign w:val="center"/>
+          </w:tcPr>
+          <w:p>
+            <w:pPr>
+              <w:bidi w:val="0"/>
+              <w:rPr>
+                <w:rFonts w:ascii="Calibri" w:hAnsi="Calibri" w:cs="Calibri"/>
+                <w:sz w:val="24"/>
+                <w:szCs w:val="24"/>
+              </w:rPr>
+            </w:pPr>
+          </w:p>
+        </w:tc>
+      </w:tr>
+      <w:tr>
+        <w:trPr>
+          <w:trHeight w:val="680"/>
+          <w:jc w:val="center"/>
+        </w:trPr>
+        <w:tc>
+          <w:tcPr>
+            <w:tcW w:w="1696" w:type="dxa"/>
+            <w:vAlign w:val="center"/>
+          </w:tcPr>
+          <w:p>
+            <w:pPr>
+              <w:bidi w:val="0"/>
+              <w:rPr>
+                <w:rFonts w:ascii="Calibri" w:hAnsi="Calibri" w:cs="Calibri"/>
+                <w:sz w:val="24"/>
+                <w:szCs w:val="24"/>
+              </w:rPr>
+            </w:pPr>
+          </w:p>
+        </w:tc>
+        <w:tc>
+          <w:tcPr>
+            <w:tcW w:w="1418" w:type="dxa"/>
+            <w:vAlign w:val="center"/>
+          </w:tcPr>
+          <w:p>
+            <w:pPr>
+              <w:bidi w:val="0"/>
+              <w:rPr>
+                <w:rFonts w:ascii="Calibri" w:hAnsi="Calibri" w:cs="Calibri"/>
+                <w:sz w:val="24"/>
+                <w:szCs w:val="24"/>
+              </w:rPr>
+            </w:pPr>
+          </w:p>
+        </w:tc>
+        <w:tc>
+          <w:tcPr>
+            <w:tcW w:w="6095" w:type="dxa"/>
+            <w:vAlign w:val="center"/>
+          </w:tcPr>
+          <w:p>
+            <w:pPr>
+              <w:bidi w:val="0"/>
+              <w:rPr>
+                <w:rFonts w:ascii="Calibri" w:hAnsi="Calibri" w:cs="Calibri"/>
+                <w:sz w:val="24"/>
+                <w:szCs w:val="24"/>
+              </w:rPr>
+            </w:pPr>
+          </w:p>
+        </w:tc>
+      </w:tr>
+      <w:tr>
+        <w:trPr>
+          <w:trHeight w:val="680"/>
+          <w:jc w:val="center"/>
+        </w:trPr>
+        <w:tc>
+          <w:tcPr>
+            <w:tcW w:w="1696" w:type="dxa"/>
+            <w:vAlign w:val="center"/>
+          </w:tcPr>
+          <w:p>
+            <w:pPr>
+              <w:bidi w:val="0"/>
+              <w:rPr>
+                <w:rFonts w:ascii="Calibri" w:hAnsi="Calibri" w:cs="Calibri"/>
+                <w:sz w:val="24"/>
+                <w:szCs w:val="24"/>
+              </w:rPr>
+            </w:pPr>
+          </w:p>
+        </w:tc>
+        <w:tc>
+          <w:tcPr>
+            <w:tcW w:w="1418" w:type="dxa"/>
+            <w:vAlign w:val="center"/>
+          </w:tcPr>
+          <w:p>
+            <w:pPr>
+              <w:bidi w:val="0"/>
+              <w:rPr>
+                <w:rFonts w:ascii="Calibri" w:hAnsi="Calibri" w:cs="Calibri"/>
+                <w:sz w:val="24"/>
+                <w:szCs w:val="24"/>
+              </w:rPr>
+            </w:pPr>
+          </w:p>
+        </w:tc>
+        <w:tc>
+          <w:tcPr>
+            <w:tcW w:w="6095" w:type="dxa"/>
+            <w:vAlign w:val="center"/>
+          </w:tcPr>
+          <w:p>
+            <w:pPr>
+              <w:bidi w:val="0"/>
+              <w:rPr>
+                <w:rFonts w:ascii="Calibri" w:hAnsi="Calibri" w:cs="Calibri"/>
+                <w:sz w:val="24"/>
+                <w:szCs w:val="24"/>
+              </w:rPr>
+            </w:pPr>
           </w:p>
         </w:tc>
       </w:tr>
@@ -861,15 +2097,7 @@
             <w:sz w:val="24"/>
             <w:szCs w:val="24"/>
           </w:rPr>
-          <m:t>=</m:t>
-        </m:r>
-        <m:r>
-          <w:rPr>
-            <w:rFonts w:ascii="Cambria Math" w:hAnsi="Cambria Math" w:cs="Calibri"/>
-            <w:sz w:val="24"/>
-            <w:szCs w:val="24"/>
-          </w:rPr>
-          <m:t>0.7</m:t>
+          <m:t>=0.7</m:t>
         </m:r>
       </m:oMath>
     </w:p>
@@ -881,7 +2109,7 @@
           <w:rFonts w:ascii="Calibri" w:hAnsi="Calibri" w:cs="Calibri"/>
           <w:sz w:val="24"/>
           <w:szCs w:val="24"/>
-          <w:lang w:val="de-DE"/>
+          <w:lang w:val="en-GB"/>
         </w:rPr>
       </w:pPr>
       <w:r>
@@ -889,7 +2117,7 @@
           <w:rFonts w:ascii="Calibri" w:hAnsi="Calibri" w:cs="Calibri"/>
           <w:sz w:val="24"/>
           <w:szCs w:val="24"/>
-          <w:lang w:val="de-DE"/>
+          <w:lang w:val="en-GB"/>
         </w:rPr>
         <w:t xml:space="preserve">Formation </w:t>
       </w:r>
@@ -907,18 +2135,9 @@
           <w:rFonts w:ascii="Calibri" w:hAnsi="Calibri" w:cs="Calibri"/>
           <w:sz w:val="24"/>
           <w:szCs w:val="24"/>
-          <w:lang w:val="de-DE"/>
+          <w:lang w:val="en-GB"/>
         </w:rPr>
-        <w:t xml:space="preserve"> =</w:t>
-      </w:r>
-      <w:r>
-        <w:rPr>
-          <w:rFonts w:ascii="Calibri" w:hAnsi="Calibri" w:cs="Calibri"/>
-          <w:sz w:val="24"/>
-          <w:szCs w:val="24"/>
-          <w:lang w:val="de-DE"/>
-        </w:rPr>
-        <w:t xml:space="preserve"> </w:t>
+        <w:t xml:space="preserve"> = </w:t>
       </w:r>
       <m:oMath>
         <m:r>
@@ -926,7 +2145,7 @@
             <w:rFonts w:ascii="Cambria Math" w:hAnsi="Cambria Math" w:cs="Calibri"/>
             <w:sz w:val="24"/>
             <w:szCs w:val="24"/>
-            <w:lang w:val="de-DE"/>
+            <w:lang w:val="en-GB"/>
           </w:rPr>
           <m:t>∆</m:t>
         </m:r>
@@ -943,7 +2162,7 @@
             <w:rFonts w:ascii="Cambria Math" w:eastAsiaTheme="minorEastAsia" w:hAnsi="Cambria Math" w:cs="Calibri"/>
             <w:sz w:val="24"/>
             <w:szCs w:val="24"/>
-            <w:lang w:val="de-DE"/>
+            <w:lang w:val="en-GB"/>
           </w:rPr>
           <m:t>=</m:t>
         </m:r>
@@ -952,7 +2171,7 @@
             <w:rFonts w:ascii="Cambria Math" w:hAnsi="Cambria Math" w:cs="Calibri"/>
             <w:sz w:val="24"/>
             <w:szCs w:val="24"/>
-            <w:lang w:val="de-DE"/>
+            <w:lang w:val="en-GB"/>
           </w:rPr>
           <m:t xml:space="preserve">285 840 </m:t>
         </m:r>
@@ -969,7 +2188,7 @@
             <w:rFonts w:ascii="Cambria Math" w:hAnsi="Cambria Math" w:cs="Calibri"/>
             <w:sz w:val="24"/>
             <w:szCs w:val="24"/>
-            <w:lang w:val="de-DE"/>
+            <w:lang w:val="en-GB"/>
           </w:rPr>
           <m:t>/</m:t>
         </m:r>
@@ -1051,6 +2270,9 @@
         </w:rPr>
       </w:pPr>
       <m:oMathPara>
+        <m:oMathParaPr>
+          <m:jc m:val="center"/>
+        </m:oMathParaPr>
         <m:oMath>
           <m:sSub>
             <m:sSubPr>
@@ -1397,7 +2619,7 @@
     <w:p>
       <w:pPr>
         <w:bidi w:val="0"/>
-        <w:jc w:val="both"/>
+        <w:jc w:val="center"/>
         <w:rPr>
           <w:rFonts w:ascii="Calibri" w:hAnsi="Calibri" w:cs="Calibri"/>
           <w:b/>
@@ -1409,10 +2631,8 @@
     </w:p>
     <w:p>
       <w:pPr>
-        <w:pStyle w:val="Listenabsatz"/>
         <w:bidi w:val="0"/>
-        <w:ind w:left="1440"/>
-        <w:jc w:val="both"/>
+        <w:jc w:val="center"/>
         <w:rPr>
           <w:rFonts w:ascii="Calibri" w:hAnsi="Calibri" w:cs="Calibri"/>
           <w:sz w:val="24"/>
@@ -1420,6 +2640,9 @@
         </w:rPr>
       </w:pPr>
       <m:oMathPara>
+        <m:oMathParaPr>
+          <m:jc m:val="center"/>
+        </m:oMathParaPr>
         <m:oMath>
           <m:sSub>
             <m:sSubPr>
@@ -1730,12 +2953,35 @@
         </w:rPr>
         <w:t>provides the basis temperature change in greenhouse</w:t>
       </w:r>
+      <w:r>
+        <w:rPr>
+          <w:rFonts w:ascii="Calibri" w:eastAsiaTheme="minorEastAsia" w:hAnsi="Calibri" w:cs="Calibri"/>
+          <w:bCs/>
+          <w:sz w:val="24"/>
+          <w:szCs w:val="24"/>
+          <w:lang w:val="en-GB"/>
+        </w:rPr>
+        <w:t>.</w:t>
+      </w:r>
     </w:p>
     <w:p>
       <w:pPr>
         <w:pStyle w:val="Listenabsatz"/>
         <w:bidi w:val="0"/>
         <w:ind w:left="1440"/>
+        <w:rPr>
+          <w:rFonts w:ascii="Calibri" w:eastAsiaTheme="minorEastAsia" w:hAnsi="Calibri" w:cs="Calibri"/>
+          <w:bCs/>
+          <w:sz w:val="24"/>
+          <w:szCs w:val="24"/>
+          <w:lang w:val="en-GB"/>
+        </w:rPr>
+      </w:pPr>
+    </w:p>
+    <w:p>
+      <w:pPr>
+        <w:pStyle w:val="Listenabsatz"/>
+        <w:ind w:left="7200" w:firstLine="720"/>
         <w:jc w:val="both"/>
         <w:rPr>
           <w:rFonts w:ascii="Calibri" w:eastAsiaTheme="minorEastAsia" w:hAnsi="Calibri" w:cs="Calibri"/>
@@ -1745,28 +2991,17 @@
           <w:lang w:val="en-GB"/>
         </w:rPr>
       </w:pPr>
-    </w:p>
-    <w:p>
-      <w:pPr>
-        <w:pStyle w:val="Listenabsatz"/>
-        <w:ind w:left="1440"/>
-        <w:jc w:val="both"/>
-        <w:rPr>
-          <w:rFonts w:ascii="Calibri" w:eastAsiaTheme="minorEastAsia" w:hAnsi="Calibri" w:cs="Calibri"/>
-          <w:b/>
-          <w:sz w:val="24"/>
-          <w:szCs w:val="24"/>
-          <w:lang w:val="en-GB"/>
-        </w:rPr>
-      </w:pPr>
       <m:oMathPara>
+        <m:oMathParaPr>
+          <m:jc m:val="center"/>
+        </m:oMathParaPr>
         <m:oMath>
           <m:f>
             <m:fPr>
               <m:ctrlPr>
                 <w:rPr>
                   <w:rFonts w:ascii="Cambria Math" w:eastAsiaTheme="minorEastAsia" w:hAnsi="Cambria Math" w:cs="Calibri"/>
-                  <w:b/>
+                  <w:bCs/>
                   <w:i/>
                   <w:sz w:val="24"/>
                   <w:szCs w:val="24"/>
@@ -1776,9 +3011,6 @@
             </m:fPr>
             <m:num>
               <m:r>
-                <m:rPr>
-                  <m:sty m:val="bi"/>
-                </m:rPr>
                 <w:rPr>
                   <w:rFonts w:ascii="Cambria Math" w:eastAsiaTheme="minorEastAsia" w:hAnsi="Cambria Math" w:cs="Calibri"/>
                   <w:sz w:val="24"/>
@@ -1792,7 +3024,7 @@
                   <m:ctrlPr>
                     <w:rPr>
                       <w:rFonts w:ascii="Cambria Math" w:eastAsiaTheme="minorEastAsia" w:hAnsi="Cambria Math" w:cs="Calibri"/>
-                      <w:b/>
+                      <w:bCs/>
                       <w:i/>
                       <w:sz w:val="24"/>
                       <w:szCs w:val="24"/>
@@ -1802,9 +3034,6 @@
                 </m:sSubPr>
                 <m:e>
                   <m:r>
-                    <m:rPr>
-                      <m:sty m:val="bi"/>
-                    </m:rPr>
                     <w:rPr>
                       <w:rFonts w:ascii="Cambria Math" w:eastAsiaTheme="minorEastAsia" w:hAnsi="Cambria Math" w:cs="Calibri"/>
                       <w:sz w:val="24"/>
@@ -1816,9 +3045,6 @@
                 </m:e>
                 <m:sub>
                   <m:r>
-                    <m:rPr>
-                      <m:sty m:val="bi"/>
-                    </m:rPr>
                     <w:rPr>
                       <w:rFonts w:ascii="Cambria Math" w:eastAsiaTheme="minorEastAsia" w:hAnsi="Cambria Math" w:cs="Calibri"/>
                       <w:sz w:val="24"/>
@@ -1830,9 +3056,6 @@
                 </m:sub>
               </m:sSub>
               <m:r>
-                <m:rPr>
-                  <m:sty m:val="bi"/>
-                </m:rPr>
                 <w:rPr>
                   <w:rFonts w:ascii="Cambria Math" w:eastAsiaTheme="minorEastAsia" w:hAnsi="Cambria Math" w:cs="Calibri"/>
                   <w:sz w:val="24"/>
@@ -1846,7 +3069,7 @@
                   <m:ctrlPr>
                     <w:rPr>
                       <w:rFonts w:ascii="Cambria Math" w:eastAsiaTheme="minorEastAsia" w:hAnsi="Cambria Math" w:cs="Calibri"/>
-                      <w:b/>
+                      <w:bCs/>
                       <w:i/>
                       <w:sz w:val="24"/>
                       <w:szCs w:val="24"/>
@@ -1856,9 +3079,6 @@
                 </m:sSubPr>
                 <m:e>
                   <m:r>
-                    <m:rPr>
-                      <m:sty m:val="bi"/>
-                    </m:rPr>
                     <w:rPr>
                       <w:rFonts w:ascii="Cambria Math" w:eastAsiaTheme="minorEastAsia" w:hAnsi="Cambria Math" w:cs="Calibri"/>
                       <w:sz w:val="24"/>
@@ -1870,9 +3090,6 @@
                 </m:e>
                 <m:sub>
                   <m:r>
-                    <m:rPr>
-                      <m:sty m:val="bi"/>
-                    </m:rPr>
                     <w:rPr>
                       <w:rFonts w:ascii="Cambria Math" w:eastAsiaTheme="minorEastAsia" w:hAnsi="Cambria Math" w:cs="Calibri"/>
                       <w:sz w:val="24"/>
@@ -1890,7 +3107,7 @@
                   <m:ctrlPr>
                     <w:rPr>
                       <w:rFonts w:ascii="Cambria Math" w:eastAsiaTheme="minorEastAsia" w:hAnsi="Cambria Math" w:cs="Calibri"/>
-                      <w:b/>
+                      <w:bCs/>
                       <w:i/>
                       <w:sz w:val="24"/>
                       <w:szCs w:val="24"/>
@@ -1900,9 +3117,6 @@
                 </m:sSubPr>
                 <m:e>
                   <m:r>
-                    <m:rPr>
-                      <m:sty m:val="bi"/>
-                    </m:rPr>
                     <w:rPr>
                       <w:rFonts w:ascii="Cambria Math" w:eastAsiaTheme="minorEastAsia" w:hAnsi="Cambria Math" w:cs="Calibri"/>
                       <w:sz w:val="24"/>
@@ -1914,9 +3128,6 @@
                 </m:e>
                 <m:sub>
                   <m:r>
-                    <m:rPr>
-                      <m:sty m:val="bi"/>
-                    </m:rPr>
                     <w:rPr>
                       <w:rFonts w:ascii="Cambria Math" w:eastAsiaTheme="minorEastAsia" w:hAnsi="Cambria Math" w:cs="Calibri"/>
                       <w:sz w:val="24"/>
@@ -1928,9 +3139,6 @@
                 </m:sub>
               </m:sSub>
               <m:r>
-                <m:rPr>
-                  <m:sty m:val="bi"/>
-                </m:rPr>
                 <w:rPr>
                   <w:rFonts w:ascii="Cambria Math" w:eastAsiaTheme="minorEastAsia" w:hAnsi="Cambria Math" w:cs="Calibri"/>
                   <w:sz w:val="24"/>
@@ -1944,7 +3152,7 @@
                   <m:ctrlPr>
                     <w:rPr>
                       <w:rFonts w:ascii="Cambria Math" w:eastAsiaTheme="minorEastAsia" w:hAnsi="Cambria Math" w:cs="Calibri"/>
-                      <w:b/>
+                      <w:bCs/>
                       <w:i/>
                       <w:sz w:val="24"/>
                       <w:szCs w:val="24"/>
@@ -1954,9 +3162,6 @@
                 </m:sSubPr>
                 <m:e>
                   <m:r>
-                    <m:rPr>
-                      <m:sty m:val="bi"/>
-                    </m:rPr>
                     <w:rPr>
                       <w:rFonts w:ascii="Cambria Math" w:eastAsiaTheme="minorEastAsia" w:hAnsi="Cambria Math" w:cs="Calibri"/>
                       <w:sz w:val="24"/>
@@ -1968,9 +3173,6 @@
                 </m:e>
                 <m:sub>
                   <m:r>
-                    <m:rPr>
-                      <m:sty m:val="bi"/>
-                    </m:rPr>
                     <w:rPr>
                       <w:rFonts w:ascii="Cambria Math" w:eastAsiaTheme="minorEastAsia" w:hAnsi="Cambria Math" w:cs="Calibri"/>
                       <w:sz w:val="24"/>
@@ -1991,20 +3193,10 @@
         <w:bidi w:val="0"/>
         <w:jc w:val="both"/>
         <w:rPr>
-          <w:rFonts w:ascii="Calibri" w:hAnsi="Calibri" w:cs="Calibri"/>
-          <w:b/>
-          <w:bCs/>
-          <w:sz w:val="24"/>
-          <w:szCs w:val="24"/>
-        </w:rPr>
-      </w:pPr>
-      <w:r>
-        <w:rPr>
           <w:b/>
           <w:bCs/>
         </w:rPr>
-        <w:tab/>
-      </w:r>
+      </w:pPr>
     </w:p>
     <w:sectPr>
       <w:pgSz w:w="11906" w:h="16838"/>
@@ -2673,6 +3865,118 @@
       </w:rPr>
     </w:lvl>
   </w:abstractNum>
+  <w:abstractNum w:abstractNumId="6" w15:restartNumberingAfterBreak="0">
+    <w:nsid w:val="64A85805"/>
+    <w:multiLevelType w:val="hybridMultilevel"/>
+    <w:tmpl w:val="B350782C"/>
+    <w:lvl w:ilvl="0" w:tplc="3250A328">
+      <w:numFmt w:val="bullet"/>
+      <w:lvlText w:val="-"/>
+      <w:lvlJc w:val="left"/>
+      <w:pPr>
+        <w:ind w:left="720" w:hanging="360"/>
+      </w:pPr>
+      <w:rPr>
+        <w:rFonts w:ascii="Aptos" w:eastAsiaTheme="minorHAnsi" w:hAnsi="Aptos" w:cstheme="minorBidi" w:hint="default"/>
+      </w:rPr>
+    </w:lvl>
+    <w:lvl w:ilvl="1" w:tplc="04070003" w:tentative="1">
+      <w:start w:val="1"/>
+      <w:numFmt w:val="bullet"/>
+      <w:lvlText w:val="o"/>
+      <w:lvlJc w:val="left"/>
+      <w:pPr>
+        <w:ind w:left="1440" w:hanging="360"/>
+      </w:pPr>
+      <w:rPr>
+        <w:rFonts w:ascii="Courier New" w:hAnsi="Courier New" w:cs="Courier New" w:hint="default"/>
+      </w:rPr>
+    </w:lvl>
+    <w:lvl w:ilvl="2" w:tplc="04070005" w:tentative="1">
+      <w:start w:val="1"/>
+      <w:numFmt w:val="bullet"/>
+      <w:lvlText w:val=""/>
+      <w:lvlJc w:val="left"/>
+      <w:pPr>
+        <w:ind w:left="2160" w:hanging="360"/>
+      </w:pPr>
+      <w:rPr>
+        <w:rFonts w:ascii="Wingdings" w:hAnsi="Wingdings" w:hint="default"/>
+      </w:rPr>
+    </w:lvl>
+    <w:lvl w:ilvl="3" w:tplc="04070001" w:tentative="1">
+      <w:start w:val="1"/>
+      <w:numFmt w:val="bullet"/>
+      <w:lvlText w:val=""/>
+      <w:lvlJc w:val="left"/>
+      <w:pPr>
+        <w:ind w:left="2880" w:hanging="360"/>
+      </w:pPr>
+      <w:rPr>
+        <w:rFonts w:ascii="Symbol" w:hAnsi="Symbol" w:hint="default"/>
+      </w:rPr>
+    </w:lvl>
+    <w:lvl w:ilvl="4" w:tplc="04070003" w:tentative="1">
+      <w:start w:val="1"/>
+      <w:numFmt w:val="bullet"/>
+      <w:lvlText w:val="o"/>
+      <w:lvlJc w:val="left"/>
+      <w:pPr>
+        <w:ind w:left="3600" w:hanging="360"/>
+      </w:pPr>
+      <w:rPr>
+        <w:rFonts w:ascii="Courier New" w:hAnsi="Courier New" w:cs="Courier New" w:hint="default"/>
+      </w:rPr>
+    </w:lvl>
+    <w:lvl w:ilvl="5" w:tplc="04070005" w:tentative="1">
+      <w:start w:val="1"/>
+      <w:numFmt w:val="bullet"/>
+      <w:lvlText w:val=""/>
+      <w:lvlJc w:val="left"/>
+      <w:pPr>
+        <w:ind w:left="4320" w:hanging="360"/>
+      </w:pPr>
+      <w:rPr>
+        <w:rFonts w:ascii="Wingdings" w:hAnsi="Wingdings" w:hint="default"/>
+      </w:rPr>
+    </w:lvl>
+    <w:lvl w:ilvl="6" w:tplc="04070001" w:tentative="1">
+      <w:start w:val="1"/>
+      <w:numFmt w:val="bullet"/>
+      <w:lvlText w:val=""/>
+      <w:lvlJc w:val="left"/>
+      <w:pPr>
+        <w:ind w:left="5040" w:hanging="360"/>
+      </w:pPr>
+      <w:rPr>
+        <w:rFonts w:ascii="Symbol" w:hAnsi="Symbol" w:hint="default"/>
+      </w:rPr>
+    </w:lvl>
+    <w:lvl w:ilvl="7" w:tplc="04070003" w:tentative="1">
+      <w:start w:val="1"/>
+      <w:numFmt w:val="bullet"/>
+      <w:lvlText w:val="o"/>
+      <w:lvlJc w:val="left"/>
+      <w:pPr>
+        <w:ind w:left="5760" w:hanging="360"/>
+      </w:pPr>
+      <w:rPr>
+        <w:rFonts w:ascii="Courier New" w:hAnsi="Courier New" w:cs="Courier New" w:hint="default"/>
+      </w:rPr>
+    </w:lvl>
+    <w:lvl w:ilvl="8" w:tplc="04070005" w:tentative="1">
+      <w:start w:val="1"/>
+      <w:numFmt w:val="bullet"/>
+      <w:lvlText w:val=""/>
+      <w:lvlJc w:val="left"/>
+      <w:pPr>
+        <w:ind w:left="6480" w:hanging="360"/>
+      </w:pPr>
+      <w:rPr>
+        <w:rFonts w:ascii="Wingdings" w:hAnsi="Wingdings" w:hint="default"/>
+      </w:rPr>
+    </w:lvl>
+  </w:abstractNum>
   <w:num w:numId="1" w16cid:durableId="166100337">
     <w:abstractNumId w:val="0"/>
   </w:num>
@@ -2690,6 +3994,9 @@
   </w:num>
   <w:num w:numId="6" w16cid:durableId="1710568512">
     <w:abstractNumId w:val="3"/>
+  </w:num>
+  <w:num w:numId="7" w16cid:durableId="1540243774">
+    <w:abstractNumId w:val="6"/>
   </w:num>
 </w:numbering>
 </file>
@@ -3094,6 +4401,7 @@
   <w:style w:type="paragraph" w:default="1" w:styleId="Standard">
     <w:name w:val="Normal"/>
     <w:qFormat/>
+    <w:rsid w:val="00BB2C51"/>
     <w:pPr>
       <w:bidi/>
     </w:pPr>
@@ -3299,7 +4607,6 @@
   <w:style w:type="character" w:default="1" w:styleId="Absatz-Standardschriftart">
     <w:name w:val="Default Paragraph Font"/>
     <w:uiPriority w:val="1"/>
-    <w:semiHidden/>
     <w:unhideWhenUsed/>
   </w:style>
   <w:style w:type="table" w:default="1" w:styleId="NormaleTabelle">
@@ -3690,6 +4997,14 @@
       <w:shd w:val="clear" w:color="auto" w:fill="E1DFDD"/>
     </w:rPr>
   </w:style>
+  <w:style w:type="paragraph" w:styleId="Literaturverzeichnis">
+    <w:name w:val="Bibliography"/>
+    <w:basedOn w:val="Standard"/>
+    <w:next w:val="Standard"/>
+    <w:uiPriority w:val="37"/>
+    <w:unhideWhenUsed/>
+    <w:rsid w:val="00BB2C51"/>
+  </w:style>
 </w:styles>
 </file>
 

</xml_diff>

<commit_message>
Fish farm scaled to power input
calculated size of fish farm over oxygen production (by electrolyzer) and oxygen consumption (by fish)
</commit_message>
<xml_diff>
--- a/Key Parameters.docx
+++ b/Key Parameters.docx
@@ -5,7 +5,6 @@
     <w:p>
       <w:pPr>
         <w:pStyle w:val="berschrift2"/>
-        <w:bidi w:val="0"/>
         <w:jc w:val="both"/>
       </w:pPr>
       <w:r>
@@ -14,7 +13,6 @@
     </w:p>
     <w:p>
       <w:pPr>
-        <w:bidi w:val="0"/>
         <w:jc w:val="both"/>
       </w:pPr>
       <w:r>
@@ -35,6 +33,25 @@
       <w:proofErr w:type="spellEnd"/>
       <w:r>
         <w:t xml:space="preserve"> is very large compared with the oxygen output. Therefore, the fish farm is sized first, based on the oxygen output, and the greenhouse is sized based on the heat remaining after the fish farm demand has been calculated.  </w:t>
+      </w:r>
+    </w:p>
+    <w:p>
+      <w:pPr>
+        <w:rPr>
+          <w:rStyle w:val="Fett"/>
+        </w:rPr>
+      </w:pPr>
+      <w:r>
+        <w:rPr>
+          <w:rStyle w:val="Fett"/>
+        </w:rPr>
+        <w:t>Fish Farm</w:t>
+      </w:r>
+      <w:r>
+        <w:rPr>
+          <w:rStyle w:val="Fett"/>
+        </w:rPr>
+        <w:t xml:space="preserve"> Design</w:t>
       </w:r>
     </w:p>
     <w:p>
@@ -44,7 +61,6 @@
           <w:ilvl w:val="0"/>
           <w:numId w:val="7"/>
         </w:numPr>
-        <w:bidi w:val="0"/>
       </w:pPr>
       <w:r>
         <w:t xml:space="preserve">The </w:t>
@@ -57,14 +73,16 @@
       <w:r>
         <w:t xml:space="preserve"> plant has a capacity of </w:t>
       </w:r>
-      <w:r>
-        <w:t>2.5</w:t>
-      </w:r>
+      <m:oMath>
+        <m:r>
+          <w:rPr>
+            <w:rFonts w:ascii="Cambria Math" w:hAnsi="Cambria Math"/>
+          </w:rPr>
+          <m:t>2.5 MW</m:t>
+        </m:r>
+      </m:oMath>
       <w:r>
         <w:t xml:space="preserve"> </w:t>
-      </w:r>
-      <w:r>
-        <w:t xml:space="preserve">MW </w:t>
       </w:r>
     </w:p>
     <w:p>
@@ -74,7 +92,6 @@
           <w:ilvl w:val="0"/>
           <w:numId w:val="7"/>
         </w:numPr>
-        <w:bidi w:val="0"/>
       </w:pPr>
       <w:r>
         <w:t xml:space="preserve">The wind farm has a </w:t>
@@ -83,15 +100,29 @@
         <w:t>capacity</w:t>
       </w:r>
       <w:r>
-        <w:t xml:space="preserve"> of 2.9 MW (scaled from the 175 MW </w:t>
-      </w:r>
-      <w:proofErr w:type="spellStart"/>
-      <w:r>
-        <w:t>electrolyzer</w:t>
-      </w:r>
-      <w:proofErr w:type="spellEnd"/>
-      <w:r>
-        <w:t xml:space="preserve"> project in </w:t>
+        <w:t xml:space="preserve"> of </w:t>
+      </w:r>
+      <m:oMath>
+        <m:r>
+          <w:rPr>
+            <w:rFonts w:ascii="Cambria Math" w:hAnsi="Cambria Math"/>
+          </w:rPr>
+          <m:t>2.9 MW</m:t>
+        </m:r>
+      </m:oMath>
+      <w:r>
+        <w:t xml:space="preserve"> (scaled from the </w:t>
+      </w:r>
+      <m:oMath>
+        <m:r>
+          <w:rPr>
+            <w:rFonts w:ascii="Cambria Math" w:hAnsi="Cambria Math"/>
+          </w:rPr>
+          <m:t>175 MW</m:t>
+        </m:r>
+      </m:oMath>
+      <w:r>
+        <w:t xml:space="preserve"> electrolyzer project in </w:t>
       </w:r>
       <w:r>
         <w:fldChar w:fldCharType="begin"/>
@@ -122,10 +153,55 @@
           <w:ilvl w:val="0"/>
           <w:numId w:val="7"/>
         </w:numPr>
-        <w:bidi w:val="0"/>
-      </w:pPr>
-      <w:r>
-        <w:t xml:space="preserve">The wind farm has a capacity factor of 40% (this is rounded down from the 45% listed in </w:t>
+      </w:pPr>
+      <w:r>
+        <w:t xml:space="preserve">The wind farm has a capacity factor of </w:t>
+      </w:r>
+      <m:oMath>
+        <m:r>
+          <w:rPr>
+            <w:rFonts w:ascii="Cambria Math" w:hAnsi="Cambria Math"/>
+          </w:rPr>
+          <m:t>40</m:t>
+        </m:r>
+        <m:r>
+          <w:rPr>
+            <w:rFonts w:ascii="Cambria Math" w:hAnsi="Cambria Math"/>
+          </w:rPr>
+          <m:t xml:space="preserve"> </m:t>
+        </m:r>
+        <m:r>
+          <w:rPr>
+            <w:rFonts w:ascii="Cambria Math" w:hAnsi="Cambria Math"/>
+          </w:rPr>
+          <m:t>%</m:t>
+        </m:r>
+      </m:oMath>
+      <w:r>
+        <w:t xml:space="preserve"> (this is rounded down from the </w:t>
+      </w:r>
+      <m:oMath>
+        <m:r>
+          <w:rPr>
+            <w:rFonts w:ascii="Cambria Math" w:hAnsi="Cambria Math"/>
+          </w:rPr>
+          <m:t>45</m:t>
+        </m:r>
+        <m:r>
+          <w:rPr>
+            <w:rFonts w:ascii="Cambria Math" w:hAnsi="Cambria Math"/>
+          </w:rPr>
+          <m:t xml:space="preserve"> </m:t>
+        </m:r>
+        <m:r>
+          <w:rPr>
+            <w:rFonts w:ascii="Cambria Math" w:hAnsi="Cambria Math"/>
+          </w:rPr>
+          <m:t>%</m:t>
+        </m:r>
+      </m:oMath>
+      <w:r>
+        <w:t xml:space="preserve"> listed in </w:t>
       </w:r>
       <w:r>
         <w:fldChar w:fldCharType="begin"/>
@@ -146,13 +222,11 @@
         <w:fldChar w:fldCharType="end"/>
       </w:r>
       <w:r>
-        <w:t xml:space="preserve">, due to the reliance of both the fishtank and the greenhouse on the </w:t>
-      </w:r>
-      <w:proofErr w:type="spellStart"/>
-      <w:r>
-        <w:t>electrolyzer</w:t>
-      </w:r>
-      <w:proofErr w:type="spellEnd"/>
+        <w:t xml:space="preserve">, </w:t>
+      </w:r>
+      <w:r>
+        <w:t>as a safety</w:t>
+      </w:r>
       <w:r>
         <w:t>)</w:t>
       </w:r>
@@ -164,16 +238,56 @@
           <w:ilvl w:val="0"/>
           <w:numId w:val="7"/>
         </w:numPr>
-        <w:bidi w:val="0"/>
-      </w:pPr>
-      <w:r>
-        <w:t>Fish are assumed to consume 350 mg O_2/kg/</w:t>
-      </w:r>
-      <w:proofErr w:type="spellStart"/>
-      <w:r>
-        <w:t>hr</w:t>
-      </w:r>
-      <w:proofErr w:type="spellEnd"/>
+      </w:pPr>
+      <w:r>
+        <w:t xml:space="preserve">Fish are assumed to consume </w:t>
+      </w:r>
+      <m:oMath>
+        <m:r>
+          <w:rPr>
+            <w:rFonts w:ascii="Cambria Math" w:hAnsi="Cambria Math"/>
+          </w:rPr>
+          <m:t xml:space="preserve">350 mg </m:t>
+        </m:r>
+        <m:sSub>
+          <m:sSubPr>
+            <m:ctrlPr>
+              <w:rPr>
+                <w:rFonts w:ascii="Cambria Math" w:hAnsi="Cambria Math"/>
+                <w:i/>
+              </w:rPr>
+            </m:ctrlPr>
+          </m:sSubPr>
+          <m:e>
+            <m:r>
+              <w:rPr>
+                <w:rFonts w:ascii="Cambria Math" w:hAnsi="Cambria Math"/>
+              </w:rPr>
+              <m:t>O</m:t>
+            </m:r>
+          </m:e>
+          <m:sub>
+            <m:r>
+              <w:rPr>
+                <w:rFonts w:ascii="Cambria Math" w:hAnsi="Cambria Math"/>
+              </w:rPr>
+              <m:t>2</m:t>
+            </m:r>
+          </m:sub>
+        </m:sSub>
+        <m:r>
+          <w:rPr>
+            <w:rFonts w:ascii="Cambria Math" w:hAnsi="Cambria Math"/>
+          </w:rPr>
+          <m:t>/kg/hr</m:t>
+        </m:r>
+        <m:r>
+          <w:rPr>
+            <w:rFonts w:ascii="Cambria Math" w:hAnsi="Cambria Math"/>
+          </w:rPr>
+          <m:t xml:space="preserve"> </m:t>
+        </m:r>
+      </m:oMath>
       <w:r>
         <w:t xml:space="preserve"> </w:t>
       </w:r>
@@ -206,18 +320,772 @@
           <w:ilvl w:val="0"/>
           <w:numId w:val="7"/>
         </w:numPr>
-        <w:bidi w:val="0"/>
-      </w:pPr>
+      </w:pPr>
+      <w:r>
+        <w:t xml:space="preserve">The biomass content of the fish farm is considered to be </w:t>
+      </w:r>
+      <m:oMath>
+        <m:r>
+          <w:rPr>
+            <w:rFonts w:ascii="Cambria Math" w:hAnsi="Cambria Math"/>
+          </w:rPr>
+          <m:t>2.5</m:t>
+        </m:r>
+        <m:r>
+          <w:rPr>
+            <w:rFonts w:ascii="Cambria Math" w:hAnsi="Cambria Math"/>
+          </w:rPr>
+          <m:t xml:space="preserve"> </m:t>
+        </m:r>
+        <m:r>
+          <w:rPr>
+            <w:rFonts w:ascii="Cambria Math" w:hAnsi="Cambria Math"/>
+          </w:rPr>
+          <m:t>%</m:t>
+        </m:r>
+      </m:oMath>
+      <w:r>
+        <w:t xml:space="preserve"> </w:t>
+      </w:r>
+      <w:r>
+        <w:fldChar w:fldCharType="begin"/>
+      </w:r>
+      <w:r>
+        <w:instrText xml:space="preserve"> ADDIN ZOTERO_ITEM CSL_CITATION {"citationID":"kHqLTQgV","properties":{"formattedCitation":"[3]","plainCitation":"[3]","noteIndex":0},"citationItems":[{"id":348,"uris":["http://zotero.org/groups/6447497/items/N4356IC4"],"itemData":{"id":348,"type":"webpage","abstract":"The pens provide space for the fish in our farms to thrive, grow healthy and express normal patterns of behavior.","title":"Fish density on our farms","URL":"https://griegseafood.com/our-impact-fish-density-on-our-farms","accessed":{"date-parts":[["2026",3,7]]}}}],"schema":"https://github.com/citation-style-language/schema/raw/master/csl-citation.json"} </w:instrText>
+      </w:r>
+      <w:r>
+        <w:fldChar w:fldCharType="separate"/>
+      </w:r>
+      <w:r>
+        <w:rPr>
+          <w:rFonts w:ascii="Aptos" w:hAnsi="Aptos"/>
+        </w:rPr>
+        <w:t>[3]</w:t>
+      </w:r>
+      <w:r>
+        <w:fldChar w:fldCharType="end"/>
+      </w:r>
     </w:p>
     <w:p>
-      <w:pPr>
-        <w:bidi w:val="0"/>
-      </w:pPr>
+      <w:r>
+        <w:t xml:space="preserve">To calculate the size of the fish tank, the </w:t>
+      </w:r>
+      <w:r>
+        <w:t xml:space="preserve">average </w:t>
+      </w:r>
+      <w:r>
+        <w:t xml:space="preserve">production of oxygen </w:t>
+      </w:r>
+      <w:r>
+        <w:t>per hour</w:t>
+      </w:r>
+      <w:r>
+        <w:t>, based on the wind farm capacity and the capacity factor</w:t>
+      </w:r>
+      <w:r>
+        <w:t xml:space="preserve"> is used</w:t>
+      </w:r>
+      <w:r>
+        <w:t>:</w:t>
+      </w:r>
     </w:p>
     <w:p>
       <w:pPr>
+        <w:jc w:val="center"/>
+        <w:rPr>
+          <w:rFonts w:eastAsiaTheme="minorEastAsia"/>
+        </w:rPr>
+      </w:pPr>
+      <m:oMathPara>
+        <m:oMath>
+          <m:r>
+            <w:rPr>
+              <w:rFonts w:ascii="Cambria Math" w:hAnsi="Cambria Math"/>
+            </w:rPr>
+            <m:t>c</m:t>
+          </m:r>
+          <m:r>
+            <w:rPr>
+              <w:rFonts w:ascii="Cambria Math" w:hAnsi="Cambria Math"/>
+            </w:rPr>
+            <m:t>apacityFactor*</m:t>
+          </m:r>
+          <m:r>
+            <w:rPr>
+              <w:rFonts w:ascii="Cambria Math" w:hAnsi="Cambria Math"/>
+            </w:rPr>
+            <m:t>1</m:t>
+          </m:r>
+          <m:r>
+            <w:rPr>
+              <w:rFonts w:ascii="Cambria Math" w:hAnsi="Cambria Math"/>
+            </w:rPr>
+            <m:t>hr*capacity=</m:t>
+          </m:r>
+          <m:sSub>
+            <m:sSubPr>
+              <m:ctrlPr>
+                <w:rPr>
+                  <w:rFonts w:ascii="Cambria Math" w:hAnsi="Cambria Math"/>
+                  <w:i/>
+                </w:rPr>
+              </m:ctrlPr>
+            </m:sSubPr>
+            <m:e>
+              <m:r>
+                <w:rPr>
+                  <w:rFonts w:ascii="Cambria Math" w:hAnsi="Cambria Math"/>
+                </w:rPr>
+                <m:t>E</m:t>
+              </m:r>
+            </m:e>
+            <m:sub>
+              <m:r>
+                <w:rPr>
+                  <w:rFonts w:ascii="Cambria Math" w:hAnsi="Cambria Math"/>
+                </w:rPr>
+                <m:t>prod</m:t>
+              </m:r>
+            </m:sub>
+          </m:sSub>
+          <m:r>
+            <w:rPr>
+              <w:rFonts w:ascii="Cambria Math" w:eastAsiaTheme="minorEastAsia" w:hAnsi="Cambria Math"/>
+            </w:rPr>
+            <m:t>=</m:t>
+          </m:r>
+          <m:r>
+            <w:rPr>
+              <w:rFonts w:ascii="Cambria Math" w:eastAsiaTheme="minorEastAsia" w:hAnsi="Cambria Math"/>
+            </w:rPr>
+            <m:t>1.16</m:t>
+          </m:r>
+          <m:r>
+            <w:rPr>
+              <w:rFonts w:ascii="Cambria Math" w:eastAsiaTheme="minorEastAsia" w:hAnsi="Cambria Math"/>
+            </w:rPr>
+            <m:t xml:space="preserve"> MWh</m:t>
+          </m:r>
+          <m:r>
+            <w:rPr>
+              <w:rFonts w:ascii="Cambria Math" w:eastAsiaTheme="minorEastAsia" w:hAnsi="Cambria Math"/>
+            </w:rPr>
+            <m:t>/hr</m:t>
+          </m:r>
+          <m:r>
+            <w:rPr>
+              <w:rFonts w:ascii="Cambria Math" w:eastAsiaTheme="minorEastAsia" w:hAnsi="Cambria Math"/>
+            </w:rPr>
+            <m:t>=</m:t>
+          </m:r>
+          <m:r>
+            <w:rPr>
+              <w:rFonts w:ascii="Cambria Math" w:eastAsiaTheme="minorEastAsia" w:hAnsi="Cambria Math"/>
+            </w:rPr>
+            <m:t>4.18</m:t>
+          </m:r>
+          <m:r>
+            <w:rPr>
+              <w:rFonts w:ascii="Cambria Math" w:eastAsiaTheme="minorEastAsia" w:hAnsi="Cambria Math"/>
+            </w:rPr>
+            <m:t xml:space="preserve"> GJ</m:t>
+          </m:r>
+          <m:r>
+            <w:rPr>
+              <w:rFonts w:ascii="Cambria Math" w:eastAsiaTheme="minorEastAsia" w:hAnsi="Cambria Math"/>
+            </w:rPr>
+            <m:t>/hr</m:t>
+          </m:r>
+        </m:oMath>
+      </m:oMathPara>
+    </w:p>
+    <w:p>
+      <w:pPr>
+        <w:rPr>
+          <w:rFonts w:eastAsiaTheme="minorEastAsia"/>
+        </w:rPr>
+      </w:pPr>
+      <w:r>
+        <w:rPr>
+          <w:rFonts w:eastAsiaTheme="minorEastAsia"/>
+        </w:rPr>
+        <w:t>The energy produced</w:t>
+      </w:r>
+      <w:r>
+        <w:rPr>
+          <w:rFonts w:eastAsiaTheme="minorEastAsia"/>
+        </w:rPr>
+        <w:t xml:space="preserve"> per hour</w:t>
+      </w:r>
+      <w:r>
+        <w:rPr>
+          <w:rFonts w:eastAsiaTheme="minorEastAsia"/>
+        </w:rPr>
+        <w:t xml:space="preserve"> can be </w:t>
+      </w:r>
+      <w:r>
+        <w:rPr>
+          <w:rFonts w:eastAsiaTheme="minorEastAsia"/>
+        </w:rPr>
+        <w:t xml:space="preserve">divided by the formation enthalpy of one mol of hydrogen and multiplied by a factor of 0.5 to give the amount of oxygen produced </w:t>
+      </w:r>
+      <w:r>
+        <w:rPr>
+          <w:rFonts w:eastAsiaTheme="minorEastAsia"/>
+        </w:rPr>
+        <w:t>per hour i</w:t>
+      </w:r>
+      <w:r>
+        <w:rPr>
+          <w:rFonts w:eastAsiaTheme="minorEastAsia"/>
+        </w:rPr>
+        <w:t>n mol:</w:t>
+      </w:r>
+    </w:p>
+    <w:p>
+      <w:pPr>
+        <w:rPr>
+          <w:rFonts w:eastAsiaTheme="minorEastAsia"/>
+        </w:rPr>
+      </w:pPr>
+      <m:oMathPara>
+        <m:oMath>
+          <m:f>
+            <m:fPr>
+              <m:ctrlPr>
+                <w:rPr>
+                  <w:rFonts w:ascii="Cambria Math" w:eastAsiaTheme="minorEastAsia" w:hAnsi="Cambria Math"/>
+                  <w:i/>
+                </w:rPr>
+              </m:ctrlPr>
+            </m:fPr>
+            <m:num>
+              <m:sSub>
+                <m:sSubPr>
+                  <m:ctrlPr>
+                    <w:rPr>
+                      <w:rFonts w:ascii="Cambria Math" w:eastAsiaTheme="minorEastAsia" w:hAnsi="Cambria Math"/>
+                      <w:i/>
+                    </w:rPr>
+                  </m:ctrlPr>
+                </m:sSubPr>
+                <m:e>
+                  <m:r>
+                    <w:rPr>
+                      <w:rFonts w:ascii="Cambria Math" w:eastAsiaTheme="minorEastAsia" w:hAnsi="Cambria Math"/>
+                    </w:rPr>
+                    <m:t>E</m:t>
+                  </m:r>
+                </m:e>
+                <m:sub>
+                  <m:r>
+                    <w:rPr>
+                      <w:rFonts w:ascii="Cambria Math" w:eastAsiaTheme="minorEastAsia" w:hAnsi="Cambria Math"/>
+                    </w:rPr>
+                    <m:t>prod</m:t>
+                  </m:r>
+                </m:sub>
+              </m:sSub>
+            </m:num>
+            <m:den>
+              <m:r>
+                <w:rPr>
+                  <w:rFonts w:ascii="Cambria Math" w:hAnsi="Cambria Math" w:cs="Calibri"/>
+                  <w:sz w:val="24"/>
+                  <w:szCs w:val="24"/>
+                  <w:lang w:val="en-GB"/>
+                </w:rPr>
+                <m:t>∆</m:t>
+              </m:r>
+              <m:r>
+                <w:rPr>
+                  <w:rFonts w:ascii="Cambria Math" w:hAnsi="Cambria Math" w:cs="Calibri"/>
+                  <w:sz w:val="24"/>
+                  <w:szCs w:val="24"/>
+                </w:rPr>
+                <m:t>H</m:t>
+              </m:r>
+            </m:den>
+          </m:f>
+          <m:r>
+            <w:rPr>
+              <w:rFonts w:ascii="Cambria Math" w:eastAsiaTheme="minorEastAsia" w:hAnsi="Cambria Math"/>
+            </w:rPr>
+            <m:t>*0.5=</m:t>
+          </m:r>
+          <m:sSub>
+            <m:sSubPr>
+              <m:ctrlPr>
+                <w:rPr>
+                  <w:rFonts w:ascii="Cambria Math" w:eastAsiaTheme="minorEastAsia" w:hAnsi="Cambria Math"/>
+                  <w:i/>
+                </w:rPr>
+              </m:ctrlPr>
+            </m:sSubPr>
+            <m:e>
+              <m:sSub>
+                <m:sSubPr>
+                  <m:ctrlPr>
+                    <w:rPr>
+                      <w:rFonts w:ascii="Cambria Math" w:eastAsiaTheme="minorEastAsia" w:hAnsi="Cambria Math"/>
+                      <w:i/>
+                    </w:rPr>
+                  </m:ctrlPr>
+                </m:sSubPr>
+                <m:e>
+                  <m:r>
+                    <w:rPr>
+                      <w:rFonts w:ascii="Cambria Math" w:eastAsiaTheme="minorEastAsia" w:hAnsi="Cambria Math"/>
+                    </w:rPr>
+                    <m:t>O</m:t>
+                  </m:r>
+                </m:e>
+                <m:sub>
+                  <m:r>
+                    <w:rPr>
+                      <w:rFonts w:ascii="Cambria Math" w:eastAsiaTheme="minorEastAsia" w:hAnsi="Cambria Math"/>
+                    </w:rPr>
+                    <m:t>2</m:t>
+                  </m:r>
+                </m:sub>
+              </m:sSub>
+            </m:e>
+            <m:sub>
+              <m:r>
+                <w:rPr>
+                  <w:rFonts w:ascii="Cambria Math" w:eastAsiaTheme="minorEastAsia" w:hAnsi="Cambria Math"/>
+                </w:rPr>
+                <m:t>prod</m:t>
+              </m:r>
+            </m:sub>
+          </m:sSub>
+          <m:r>
+            <w:rPr>
+              <w:rFonts w:ascii="Cambria Math" w:eastAsiaTheme="minorEastAsia" w:hAnsi="Cambria Math"/>
+            </w:rPr>
+            <m:t>=</m:t>
+          </m:r>
+          <m:r>
+            <w:rPr>
+              <w:rFonts w:ascii="Cambria Math" w:eastAsiaTheme="minorEastAsia" w:hAnsi="Cambria Math"/>
+            </w:rPr>
+            <m:t>8891</m:t>
+          </m:r>
+          <m:r>
+            <w:rPr>
+              <w:rFonts w:ascii="Cambria Math" w:eastAsiaTheme="minorEastAsia" w:hAnsi="Cambria Math"/>
+            </w:rPr>
+            <m:t>.</m:t>
+          </m:r>
+          <m:r>
+            <w:rPr>
+              <w:rFonts w:ascii="Cambria Math" w:eastAsiaTheme="minorEastAsia" w:hAnsi="Cambria Math"/>
+            </w:rPr>
+            <m:t>92</m:t>
+          </m:r>
+          <m:r>
+            <w:rPr>
+              <w:rFonts w:ascii="Cambria Math" w:eastAsiaTheme="minorEastAsia" w:hAnsi="Cambria Math"/>
+            </w:rPr>
+            <m:t xml:space="preserve"> mol</m:t>
+          </m:r>
+          <m:r>
+            <w:rPr>
+              <w:rFonts w:ascii="Cambria Math" w:eastAsiaTheme="minorEastAsia" w:hAnsi="Cambria Math"/>
+            </w:rPr>
+            <m:t>/hr</m:t>
+          </m:r>
+          <m:r>
+            <w:rPr>
+              <w:rFonts w:ascii="Cambria Math" w:eastAsiaTheme="minorEastAsia" w:hAnsi="Cambria Math"/>
+            </w:rPr>
+            <m:t>=17.93 kg</m:t>
+          </m:r>
+          <m:r>
+            <w:rPr>
+              <w:rFonts w:ascii="Cambria Math" w:eastAsiaTheme="minorEastAsia" w:hAnsi="Cambria Math"/>
+            </w:rPr>
+            <m:t>/hr</m:t>
+          </m:r>
+          <m:r>
+            <w:rPr>
+              <w:rFonts w:ascii="Cambria Math" w:eastAsiaTheme="minorEastAsia" w:hAnsi="Cambria Math"/>
+            </w:rPr>
+            <m:t xml:space="preserve"> </m:t>
+          </m:r>
+        </m:oMath>
+      </m:oMathPara>
+    </w:p>
+    <w:p>
+      <w:pPr>
+        <w:rPr>
+          <w:rFonts w:eastAsiaTheme="minorEastAsia"/>
+        </w:rPr>
+      </w:pPr>
+      <w:r>
+        <w:rPr>
+          <w:rFonts w:eastAsiaTheme="minorEastAsia"/>
+        </w:rPr>
+        <w:t xml:space="preserve">The amount of oxygen produced </w:t>
+      </w:r>
+      <w:r>
+        <w:rPr>
+          <w:rFonts w:eastAsiaTheme="minorEastAsia"/>
+        </w:rPr>
+        <w:t xml:space="preserve">per hour </w:t>
+      </w:r>
+      <w:r>
+        <w:rPr>
+          <w:rFonts w:eastAsiaTheme="minorEastAsia"/>
+        </w:rPr>
+        <w:t xml:space="preserve">can be divided by the amount </w:t>
+      </w:r>
+      <w:r>
+        <w:rPr>
+          <w:rFonts w:eastAsiaTheme="minorEastAsia"/>
+        </w:rPr>
+        <w:t>of oxygen required by the fish per kilogram per hour</w:t>
+      </w:r>
+      <w:r>
+        <w:rPr>
+          <w:rFonts w:eastAsiaTheme="minorEastAsia"/>
+        </w:rPr>
+        <w:t xml:space="preserve"> to give the amount of fish in kilograms</w:t>
+      </w:r>
+      <w:r>
+        <w:rPr>
+          <w:rFonts w:eastAsiaTheme="minorEastAsia"/>
+        </w:rPr>
+        <w:t>:</w:t>
+      </w:r>
+    </w:p>
+    <w:p>
+      <w:pPr>
+        <w:jc w:val="center"/>
+        <w:rPr>
+          <w:rFonts w:eastAsiaTheme="minorEastAsia"/>
+        </w:rPr>
+      </w:pPr>
+      <m:oMathPara>
+        <m:oMath>
+          <m:f>
+            <m:fPr>
+              <m:ctrlPr>
+                <w:rPr>
+                  <w:rFonts w:ascii="Cambria Math" w:eastAsiaTheme="minorEastAsia" w:hAnsi="Cambria Math"/>
+                  <w:i/>
+                </w:rPr>
+              </m:ctrlPr>
+            </m:fPr>
+            <m:num>
+              <m:sSub>
+                <m:sSubPr>
+                  <m:ctrlPr>
+                    <w:rPr>
+                      <w:rFonts w:ascii="Cambria Math" w:eastAsiaTheme="minorEastAsia" w:hAnsi="Cambria Math"/>
+                      <w:i/>
+                    </w:rPr>
+                  </m:ctrlPr>
+                </m:sSubPr>
+                <m:e>
+                  <m:sSub>
+                    <m:sSubPr>
+                      <m:ctrlPr>
+                        <w:rPr>
+                          <w:rFonts w:ascii="Cambria Math" w:eastAsiaTheme="minorEastAsia" w:hAnsi="Cambria Math"/>
+                          <w:i/>
+                        </w:rPr>
+                      </m:ctrlPr>
+                    </m:sSubPr>
+                    <m:e>
+                      <m:r>
+                        <w:rPr>
+                          <w:rFonts w:ascii="Cambria Math" w:eastAsiaTheme="minorEastAsia" w:hAnsi="Cambria Math"/>
+                        </w:rPr>
+                        <m:t>O</m:t>
+                      </m:r>
+                    </m:e>
+                    <m:sub>
+                      <m:r>
+                        <w:rPr>
+                          <w:rFonts w:ascii="Cambria Math" w:eastAsiaTheme="minorEastAsia" w:hAnsi="Cambria Math"/>
+                        </w:rPr>
+                        <m:t>2</m:t>
+                      </m:r>
+                    </m:sub>
+                  </m:sSub>
+                </m:e>
+                <m:sub>
+                  <m:r>
+                    <w:rPr>
+                      <w:rFonts w:ascii="Cambria Math" w:eastAsiaTheme="minorEastAsia" w:hAnsi="Cambria Math"/>
+                    </w:rPr>
+                    <m:t>prod</m:t>
+                  </m:r>
+                </m:sub>
+              </m:sSub>
+            </m:num>
+            <m:den>
+              <m:sSub>
+                <m:sSubPr>
+                  <m:ctrlPr>
+                    <w:rPr>
+                      <w:rFonts w:ascii="Cambria Math" w:eastAsiaTheme="minorEastAsia" w:hAnsi="Cambria Math"/>
+                      <w:i/>
+                    </w:rPr>
+                  </m:ctrlPr>
+                </m:sSubPr>
+                <m:e>
+                  <m:sSub>
+                    <m:sSubPr>
+                      <m:ctrlPr>
+                        <w:rPr>
+                          <w:rFonts w:ascii="Cambria Math" w:eastAsiaTheme="minorEastAsia" w:hAnsi="Cambria Math"/>
+                          <w:i/>
+                        </w:rPr>
+                      </m:ctrlPr>
+                    </m:sSubPr>
+                    <m:e>
+                      <m:r>
+                        <w:rPr>
+                          <w:rFonts w:ascii="Cambria Math" w:eastAsiaTheme="minorEastAsia" w:hAnsi="Cambria Math"/>
+                        </w:rPr>
+                        <m:t>O</m:t>
+                      </m:r>
+                    </m:e>
+                    <m:sub>
+                      <m:r>
+                        <w:rPr>
+                          <w:rFonts w:ascii="Cambria Math" w:eastAsiaTheme="minorEastAsia" w:hAnsi="Cambria Math"/>
+                        </w:rPr>
+                        <m:t>2</m:t>
+                      </m:r>
+                    </m:sub>
+                  </m:sSub>
+                </m:e>
+                <m:sub>
+                  <m:r>
+                    <w:rPr>
+                      <w:rFonts w:ascii="Cambria Math" w:eastAsiaTheme="minorEastAsia" w:hAnsi="Cambria Math"/>
+                    </w:rPr>
+                    <m:t>consum</m:t>
+                  </m:r>
+                </m:sub>
+              </m:sSub>
+            </m:den>
+          </m:f>
+          <m:r>
+            <w:rPr>
+              <w:rFonts w:ascii="Cambria Math" w:eastAsiaTheme="minorEastAsia" w:hAnsi="Cambria Math"/>
+            </w:rPr>
+            <m:t>=</m:t>
+          </m:r>
+          <m:sSub>
+            <m:sSubPr>
+              <m:ctrlPr>
+                <w:rPr>
+                  <w:rFonts w:ascii="Cambria Math" w:eastAsiaTheme="minorEastAsia" w:hAnsi="Cambria Math"/>
+                  <w:i/>
+                </w:rPr>
+              </m:ctrlPr>
+            </m:sSubPr>
+            <m:e>
+              <m:r>
+                <w:rPr>
+                  <w:rFonts w:ascii="Cambria Math" w:eastAsiaTheme="minorEastAsia" w:hAnsi="Cambria Math"/>
+                </w:rPr>
+                <m:t>m</m:t>
+              </m:r>
+            </m:e>
+            <m:sub>
+              <m:r>
+                <w:rPr>
+                  <w:rFonts w:ascii="Cambria Math" w:eastAsiaTheme="minorEastAsia" w:hAnsi="Cambria Math"/>
+                </w:rPr>
+                <m:t>fish</m:t>
+              </m:r>
+            </m:sub>
+          </m:sSub>
+          <m:r>
+            <w:rPr>
+              <w:rFonts w:ascii="Cambria Math" w:eastAsiaTheme="minorEastAsia" w:hAnsi="Cambria Math"/>
+            </w:rPr>
+            <m:t>=51217.47 kg=51.22 t</m:t>
+          </m:r>
+        </m:oMath>
+      </m:oMathPara>
+    </w:p>
+    <w:p>
+      <w:pPr>
+        <w:rPr>
+          <w:rFonts w:eastAsiaTheme="minorEastAsia"/>
+        </w:rPr>
+      </w:pPr>
+      <w:r>
+        <w:rPr>
+          <w:rFonts w:eastAsiaTheme="minorEastAsia"/>
+        </w:rPr>
+        <w:t>This value can be used to calculate the total volume of the fish tank using the biomass content:</w:t>
+      </w:r>
+    </w:p>
+    <w:p>
+      <w:pPr>
+        <w:jc w:val="center"/>
+        <w:rPr>
+          <w:rFonts w:eastAsiaTheme="minorEastAsia"/>
+        </w:rPr>
+      </w:pPr>
+      <m:oMathPara>
+        <m:oMath>
+          <m:f>
+            <m:fPr>
+              <m:ctrlPr>
+                <w:rPr>
+                  <w:rFonts w:ascii="Cambria Math" w:eastAsiaTheme="minorEastAsia" w:hAnsi="Cambria Math"/>
+                  <w:i/>
+                </w:rPr>
+              </m:ctrlPr>
+            </m:fPr>
+            <m:num>
+              <m:sSub>
+                <m:sSubPr>
+                  <m:ctrlPr>
+                    <w:rPr>
+                      <w:rFonts w:ascii="Cambria Math" w:eastAsiaTheme="minorEastAsia" w:hAnsi="Cambria Math"/>
+                      <w:i/>
+                    </w:rPr>
+                  </m:ctrlPr>
+                </m:sSubPr>
+                <m:e>
+                  <m:r>
+                    <w:rPr>
+                      <w:rFonts w:ascii="Cambria Math" w:eastAsiaTheme="minorEastAsia" w:hAnsi="Cambria Math"/>
+                    </w:rPr>
+                    <m:t>m</m:t>
+                  </m:r>
+                </m:e>
+                <m:sub>
+                  <m:r>
+                    <w:rPr>
+                      <w:rFonts w:ascii="Cambria Math" w:eastAsiaTheme="minorEastAsia" w:hAnsi="Cambria Math"/>
+                    </w:rPr>
+                    <m:t>fish</m:t>
+                  </m:r>
+                </m:sub>
+              </m:sSub>
+            </m:num>
+            <m:den>
+              <m:r>
+                <w:rPr>
+                  <w:rFonts w:ascii="Cambria Math" w:eastAsiaTheme="minorEastAsia" w:hAnsi="Cambria Math"/>
+                </w:rPr>
+                <m:t>biomassContent</m:t>
+              </m:r>
+            </m:den>
+          </m:f>
+          <m:r>
+            <w:rPr>
+              <w:rFonts w:ascii="Cambria Math" w:eastAsiaTheme="minorEastAsia" w:hAnsi="Cambria Math"/>
+            </w:rPr>
+            <m:t>*100=</m:t>
+          </m:r>
+          <m:sSub>
+            <m:sSubPr>
+              <m:ctrlPr>
+                <w:rPr>
+                  <w:rFonts w:ascii="Cambria Math" w:eastAsiaTheme="minorEastAsia" w:hAnsi="Cambria Math"/>
+                  <w:i/>
+                </w:rPr>
+              </m:ctrlPr>
+            </m:sSubPr>
+            <m:e>
+              <m:r>
+                <w:rPr>
+                  <w:rFonts w:ascii="Cambria Math" w:eastAsiaTheme="minorEastAsia" w:hAnsi="Cambria Math"/>
+                </w:rPr>
+                <m:t>m</m:t>
+              </m:r>
+            </m:e>
+            <m:sub>
+              <m:r>
+                <w:rPr>
+                  <w:rFonts w:ascii="Cambria Math" w:eastAsiaTheme="minorEastAsia" w:hAnsi="Cambria Math"/>
+                </w:rPr>
+                <m:t>tank</m:t>
+              </m:r>
+            </m:sub>
+          </m:sSub>
+          <m:r>
+            <w:rPr>
+              <w:rFonts w:ascii="Cambria Math" w:eastAsiaTheme="minorEastAsia" w:hAnsi="Cambria Math"/>
+            </w:rPr>
+            <m:t>=</m:t>
+          </m:r>
+          <m:sSub>
+            <m:sSubPr>
+              <m:ctrlPr>
+                <w:rPr>
+                  <w:rFonts w:ascii="Cambria Math" w:eastAsiaTheme="minorEastAsia" w:hAnsi="Cambria Math"/>
+                  <w:i/>
+                </w:rPr>
+              </m:ctrlPr>
+            </m:sSubPr>
+            <m:e>
+              <m:r>
+                <w:rPr>
+                  <w:rFonts w:ascii="Cambria Math" w:eastAsiaTheme="minorEastAsia" w:hAnsi="Cambria Math"/>
+                </w:rPr>
+                <m:t>V</m:t>
+              </m:r>
+            </m:e>
+            <m:sub>
+              <m:r>
+                <w:rPr>
+                  <w:rFonts w:ascii="Cambria Math" w:eastAsiaTheme="minorEastAsia" w:hAnsi="Cambria Math"/>
+                </w:rPr>
+                <m:t>tank</m:t>
+              </m:r>
+            </m:sub>
+          </m:sSub>
+          <m:r>
+            <w:rPr>
+              <w:rFonts w:ascii="Cambria Math" w:eastAsiaTheme="minorEastAsia" w:hAnsi="Cambria Math"/>
+            </w:rPr>
+            <m:t xml:space="preserve">=2048.70 </m:t>
+          </m:r>
+          <m:sSup>
+            <m:sSupPr>
+              <m:ctrlPr>
+                <w:rPr>
+                  <w:rFonts w:ascii="Cambria Math" w:eastAsiaTheme="minorEastAsia" w:hAnsi="Cambria Math"/>
+                  <w:i/>
+                </w:rPr>
+              </m:ctrlPr>
+            </m:sSupPr>
+            <m:e>
+              <m:r>
+                <w:rPr>
+                  <w:rFonts w:ascii="Cambria Math" w:eastAsiaTheme="minorEastAsia" w:hAnsi="Cambria Math"/>
+                </w:rPr>
+                <m:t>m</m:t>
+              </m:r>
+            </m:e>
+            <m:sup>
+              <m:r>
+                <w:rPr>
+                  <w:rFonts w:ascii="Cambria Math" w:eastAsiaTheme="minorEastAsia" w:hAnsi="Cambria Math"/>
+                </w:rPr>
+                <m:t>3</m:t>
+              </m:r>
+            </m:sup>
+          </m:sSup>
+        </m:oMath>
+      </m:oMathPara>
+    </w:p>
+    <w:p/>
+    <w:p>
+      <w:pPr>
         <w:pStyle w:val="berschrift2"/>
-        <w:bidi w:val="0"/>
       </w:pPr>
       <w:r>
         <w:t>Parameters</w:t>
@@ -250,7 +1118,6 @@
           </w:tcPr>
           <w:p>
             <w:pPr>
-              <w:bidi w:val="0"/>
               <w:jc w:val="both"/>
               <w:rPr>
                 <w:rFonts w:ascii="Calibri" w:hAnsi="Calibri" w:cs="Calibri"/>
@@ -279,7 +1146,6 @@
           </w:tcPr>
           <w:p>
             <w:pPr>
-              <w:bidi w:val="0"/>
               <w:jc w:val="both"/>
               <w:rPr>
                 <w:rFonts w:ascii="Calibri" w:hAnsi="Calibri" w:cs="Calibri"/>
@@ -318,7 +1184,6 @@
           </w:tcPr>
           <w:p>
             <w:pPr>
-              <w:bidi w:val="0"/>
               <w:jc w:val="both"/>
               <w:rPr>
                 <w:rFonts w:ascii="Calibri" w:hAnsi="Calibri" w:cs="Calibri"/>
@@ -353,7 +1218,6 @@
           </w:tcPr>
           <w:p>
             <w:pPr>
-              <w:bidi w:val="0"/>
               <w:rPr>
                 <w:rFonts w:ascii="Calibri" w:hAnsi="Calibri" w:cs="Calibri"/>
                 <w:sz w:val="24"/>
@@ -379,7 +1243,6 @@
           </w:tcPr>
           <w:p>
             <w:pPr>
-              <w:bidi w:val="0"/>
               <w:rPr>
                 <w:rFonts w:ascii="Calibri" w:hAnsi="Calibri" w:cs="Calibri"/>
                 <w:sz w:val="24"/>
@@ -403,7 +1266,6 @@
           </w:tcPr>
           <w:p>
             <w:pPr>
-              <w:bidi w:val="0"/>
               <w:rPr>
                 <w:rFonts w:ascii="Calibri" w:hAnsi="Calibri" w:cs="Calibri"/>
                 <w:sz w:val="24"/>
@@ -482,7 +1344,7 @@
                 <w:sz w:val="24"/>
                 <w:szCs w:val="24"/>
               </w:rPr>
-              <w:instrText xml:space="preserve"> ADDIN ZOTERO_ITEM CSL_CITATION {"citationID":"DSsI2lzZ","properties":{"formattedCitation":"[3]","plainCitation":"[3]","noteIndex":0},"citationItems":[{"id":343,"uris":["http://zotero.org/groups/6447497/items/SRB46M8K"],"itemData":{"id":343,"type":"post-weblog","language":"en-GB","title":"Haeolus – Hydrogen-Aeolic Energy with Optimised eLectrolysers Upstream of Substation","URL":"https://haeolus.eu/","accessed":{"date-parts":[["2026",3,6]]},"issued":{"date-parts":[["2024",1,8]]}}}],"schema":"https://github.com/citation-style-language/schema/raw/master/csl-citation.json"} </w:instrText>
+              <w:instrText xml:space="preserve"> ADDIN ZOTERO_ITEM CSL_CITATION {"citationID":"DSsI2lzZ","properties":{"formattedCitation":"[4]","plainCitation":"[4]","noteIndex":0},"citationItems":[{"id":343,"uris":["http://zotero.org/groups/6447497/items/SRB46M8K"],"itemData":{"id":343,"type":"post-weblog","language":"en-GB","title":"Haeolus – Hydrogen-Aeolic Energy with Optimised eLectrolysers Upstream of Substation","URL":"https://haeolus.eu/","accessed":{"date-parts":[["2026",3,6]]},"issued":{"date-parts":[["2024",1,8]]}}}],"schema":"https://github.com/citation-style-language/schema/raw/master/csl-citation.json"} </w:instrText>
             </w:r>
             <w:r>
               <w:rPr>
@@ -497,7 +1359,7 @@
                 <w:rFonts w:ascii="Calibri" w:hAnsi="Calibri" w:cs="Calibri"/>
                 <w:sz w:val="24"/>
               </w:rPr>
-              <w:t>[3]</w:t>
+              <w:t>[4]</w:t>
             </w:r>
             <w:r>
               <w:rPr>
@@ -522,7 +1384,6 @@
           </w:tcPr>
           <w:p>
             <w:pPr>
-              <w:bidi w:val="0"/>
               <w:rPr>
                 <w:rFonts w:ascii="Calibri" w:hAnsi="Calibri" w:cs="Calibri"/>
                 <w:sz w:val="24"/>
@@ -548,7 +1409,6 @@
           </w:tcPr>
           <w:p>
             <w:pPr>
-              <w:bidi w:val="0"/>
               <w:rPr>
                 <w:rFonts w:ascii="Calibri" w:hAnsi="Calibri" w:cs="Calibri"/>
                 <w:sz w:val="24"/>
@@ -572,7 +1432,6 @@
           </w:tcPr>
           <w:p>
             <w:pPr>
-              <w:bidi w:val="0"/>
               <w:rPr>
                 <w:rFonts w:ascii="Calibri" w:hAnsi="Calibri" w:cs="Calibri"/>
                 <w:sz w:val="24"/>
@@ -620,7 +1479,6 @@
           </w:tcPr>
           <w:p>
             <w:pPr>
-              <w:bidi w:val="0"/>
               <w:rPr>
                 <w:rFonts w:ascii="Calibri" w:hAnsi="Calibri" w:cs="Calibri"/>
                 <w:sz w:val="24"/>
@@ -634,6 +1492,7 @@
                 <w:sz w:val="24"/>
                 <w:szCs w:val="24"/>
               </w:rPr>
+              <w:lastRenderedPageBreak/>
               <w:t>Delta_h</w:t>
             </w:r>
             <w:proofErr w:type="spellEnd"/>
@@ -646,7 +1505,6 @@
           </w:tcPr>
           <w:p>
             <w:pPr>
-              <w:bidi w:val="0"/>
               <w:rPr>
                 <w:rFonts w:ascii="Calibri" w:hAnsi="Calibri" w:cs="Calibri"/>
                 <w:sz w:val="24"/>
@@ -684,7 +1542,6 @@
           </w:p>
           <w:p>
             <w:pPr>
-              <w:bidi w:val="0"/>
               <w:rPr>
                 <w:rFonts w:ascii="Calibri" w:hAnsi="Calibri" w:cs="Calibri"/>
                 <w:sz w:val="24"/>
@@ -708,7 +1565,6 @@
           </w:tcPr>
           <w:p>
             <w:pPr>
-              <w:bidi w:val="0"/>
               <w:rPr>
                 <w:rFonts w:ascii="Calibri" w:hAnsi="Calibri" w:cs="Calibri"/>
                 <w:sz w:val="24"/>
@@ -726,7 +1582,6 @@
           </w:p>
           <w:p>
             <w:pPr>
-              <w:bidi w:val="0"/>
               <w:rPr>
                 <w:rFonts w:ascii="Calibri" w:hAnsi="Calibri" w:cs="Calibri"/>
                 <w:sz w:val="24"/>
@@ -767,7 +1622,6 @@
           </w:tcPr>
           <w:p>
             <w:pPr>
-              <w:bidi w:val="0"/>
               <w:rPr>
                 <w:rFonts w:ascii="Calibri" w:hAnsi="Calibri" w:cs="Calibri"/>
                 <w:sz w:val="24"/>
@@ -793,7 +1647,6 @@
           </w:tcPr>
           <w:p>
             <w:pPr>
-              <w:bidi w:val="0"/>
               <w:rPr>
                 <w:rFonts w:ascii="Calibri" w:hAnsi="Calibri" w:cs="Calibri"/>
                 <w:sz w:val="24"/>
@@ -811,7 +1664,6 @@
           </w:p>
           <w:p>
             <w:pPr>
-              <w:bidi w:val="0"/>
               <w:rPr>
                 <w:rFonts w:ascii="Calibri" w:hAnsi="Calibri" w:cs="Calibri"/>
                 <w:sz w:val="24"/>
@@ -835,7 +1687,6 @@
           </w:tcPr>
           <w:p>
             <w:pPr>
-              <w:bidi w:val="0"/>
               <w:rPr>
                 <w:rFonts w:ascii="Calibri" w:hAnsi="Calibri" w:cs="Calibri"/>
                 <w:sz w:val="24"/>
@@ -865,7 +1716,6 @@
           </w:tcPr>
           <w:p>
             <w:pPr>
-              <w:bidi w:val="0"/>
               <w:rPr>
                 <w:rFonts w:ascii="Calibri" w:hAnsi="Calibri" w:cs="Calibri"/>
                 <w:sz w:val="24"/>
@@ -891,7 +1741,6 @@
           </w:tcPr>
           <w:p>
             <w:pPr>
-              <w:bidi w:val="0"/>
               <w:rPr>
                 <w:rFonts w:ascii="Calibri" w:hAnsi="Calibri" w:cs="Calibri"/>
                 <w:sz w:val="24"/>
@@ -909,7 +1758,6 @@
           </w:p>
           <w:p>
             <w:pPr>
-              <w:bidi w:val="0"/>
               <w:rPr>
                 <w:rFonts w:ascii="Calibri" w:hAnsi="Calibri" w:cs="Calibri"/>
                 <w:sz w:val="24"/>
@@ -925,6 +1773,7 @@
               <w:t>kJ/(</w:t>
             </w:r>
             <w:proofErr w:type="spellStart"/>
+            <w:proofErr w:type="gramStart"/>
             <w:r>
               <w:rPr>
                 <w:rFonts w:ascii="Calibri" w:hAnsi="Calibri" w:cs="Calibri"/>
@@ -934,6 +1783,7 @@
               <w:t>kg.K</w:t>
             </w:r>
             <w:proofErr w:type="spellEnd"/>
+            <w:proofErr w:type="gramEnd"/>
             <w:r>
               <w:rPr>
                 <w:rFonts w:ascii="Calibri" w:hAnsi="Calibri" w:cs="Calibri"/>
@@ -951,7 +1801,6 @@
           </w:tcPr>
           <w:p>
             <w:pPr>
-              <w:bidi w:val="0"/>
               <w:rPr>
                 <w:rFonts w:ascii="Calibri" w:hAnsi="Calibri" w:cs="Calibri"/>
                 <w:sz w:val="24"/>
@@ -972,7 +1821,6 @@
     </w:tbl>
     <w:p>
       <w:pPr>
-        <w:bidi w:val="0"/>
         <w:jc w:val="both"/>
         <w:rPr>
           <w:rFonts w:ascii="Calibri" w:hAnsi="Calibri" w:cs="Calibri"/>
@@ -1005,7 +1853,6 @@
           </w:tcPr>
           <w:p>
             <w:pPr>
-              <w:bidi w:val="0"/>
               <w:jc w:val="both"/>
               <w:rPr>
                 <w:rFonts w:ascii="Calibri" w:hAnsi="Calibri" w:cs="Calibri"/>
@@ -1034,7 +1881,6 @@
           </w:tcPr>
           <w:p>
             <w:pPr>
-              <w:bidi w:val="0"/>
               <w:jc w:val="both"/>
               <w:rPr>
                 <w:rFonts w:ascii="Calibri" w:hAnsi="Calibri" w:cs="Calibri"/>
@@ -1073,7 +1919,6 @@
           </w:tcPr>
           <w:p>
             <w:pPr>
-              <w:bidi w:val="0"/>
               <w:jc w:val="both"/>
               <w:rPr>
                 <w:rFonts w:ascii="Calibri" w:hAnsi="Calibri" w:cs="Calibri"/>
@@ -1108,7 +1953,6 @@
           </w:tcPr>
           <w:p>
             <w:pPr>
-              <w:bidi w:val="0"/>
               <w:rPr>
                 <w:rFonts w:ascii="Calibri" w:hAnsi="Calibri" w:cs="Calibri"/>
                 <w:sz w:val="24"/>
@@ -1132,7 +1976,6 @@
           </w:tcPr>
           <w:p>
             <w:pPr>
-              <w:bidi w:val="0"/>
               <w:rPr>
                 <w:rFonts w:ascii="Calibri" w:hAnsi="Calibri" w:cs="Calibri"/>
                 <w:sz w:val="24"/>
@@ -1156,7 +1999,6 @@
           </w:tcPr>
           <w:p>
             <w:pPr>
-              <w:bidi w:val="0"/>
               <w:rPr>
                 <w:rFonts w:ascii="Calibri" w:hAnsi="Calibri" w:cs="Calibri"/>
                 <w:sz w:val="24"/>
@@ -1218,7 +2060,6 @@
           </w:tcPr>
           <w:p>
             <w:pPr>
-              <w:bidi w:val="0"/>
               <w:rPr>
                 <w:rFonts w:ascii="Calibri" w:hAnsi="Calibri" w:cs="Calibri"/>
                 <w:sz w:val="24"/>
@@ -1234,7 +2075,6 @@
           </w:tcPr>
           <w:p>
             <w:pPr>
-              <w:bidi w:val="0"/>
               <w:rPr>
                 <w:rFonts w:ascii="Calibri" w:hAnsi="Calibri" w:cs="Calibri"/>
                 <w:sz w:val="24"/>
@@ -1250,7 +2090,6 @@
           </w:tcPr>
           <w:p>
             <w:pPr>
-              <w:bidi w:val="0"/>
               <w:rPr>
                 <w:rFonts w:ascii="Calibri" w:hAnsi="Calibri" w:cs="Calibri"/>
                 <w:sz w:val="24"/>
@@ -1272,7 +2111,6 @@
           </w:tcPr>
           <w:p>
             <w:pPr>
-              <w:bidi w:val="0"/>
               <w:rPr>
                 <w:rFonts w:ascii="Calibri" w:hAnsi="Calibri" w:cs="Calibri"/>
                 <w:sz w:val="24"/>
@@ -1288,7 +2126,6 @@
           </w:tcPr>
           <w:p>
             <w:pPr>
-              <w:bidi w:val="0"/>
               <w:rPr>
                 <w:rFonts w:ascii="Calibri" w:hAnsi="Calibri" w:cs="Calibri"/>
                 <w:sz w:val="24"/>
@@ -1304,7 +2141,6 @@
           </w:tcPr>
           <w:p>
             <w:pPr>
-              <w:bidi w:val="0"/>
               <w:rPr>
                 <w:rFonts w:ascii="Calibri" w:hAnsi="Calibri" w:cs="Calibri"/>
                 <w:sz w:val="24"/>
@@ -1326,7 +2162,6 @@
           </w:tcPr>
           <w:p>
             <w:pPr>
-              <w:bidi w:val="0"/>
               <w:rPr>
                 <w:rFonts w:ascii="Calibri" w:hAnsi="Calibri" w:cs="Calibri"/>
                 <w:sz w:val="24"/>
@@ -1342,7 +2177,6 @@
           </w:tcPr>
           <w:p>
             <w:pPr>
-              <w:bidi w:val="0"/>
               <w:rPr>
                 <w:rFonts w:ascii="Calibri" w:hAnsi="Calibri" w:cs="Calibri"/>
                 <w:sz w:val="24"/>
@@ -1358,7 +2192,6 @@
           </w:tcPr>
           <w:p>
             <w:pPr>
-              <w:bidi w:val="0"/>
               <w:rPr>
                 <w:rFonts w:ascii="Calibri" w:hAnsi="Calibri" w:cs="Calibri"/>
                 <w:sz w:val="24"/>
@@ -1380,7 +2213,6 @@
           </w:tcPr>
           <w:p>
             <w:pPr>
-              <w:bidi w:val="0"/>
               <w:rPr>
                 <w:rFonts w:ascii="Calibri" w:hAnsi="Calibri" w:cs="Calibri"/>
                 <w:sz w:val="24"/>
@@ -1396,7 +2228,6 @@
           </w:tcPr>
           <w:p>
             <w:pPr>
-              <w:bidi w:val="0"/>
               <w:rPr>
                 <w:rFonts w:ascii="Calibri" w:hAnsi="Calibri" w:cs="Calibri"/>
                 <w:sz w:val="24"/>
@@ -1412,7 +2243,6 @@
           </w:tcPr>
           <w:p>
             <w:pPr>
-              <w:bidi w:val="0"/>
               <w:rPr>
                 <w:rFonts w:ascii="Calibri" w:hAnsi="Calibri" w:cs="Calibri"/>
                 <w:sz w:val="24"/>
@@ -1425,7 +2255,6 @@
     </w:tbl>
     <w:p>
       <w:pPr>
-        <w:bidi w:val="0"/>
         <w:jc w:val="both"/>
         <w:rPr>
           <w:rFonts w:ascii="Calibri" w:hAnsi="Calibri" w:cs="Calibri"/>
@@ -1458,7 +2287,6 @@
           </w:tcPr>
           <w:p>
             <w:pPr>
-              <w:bidi w:val="0"/>
               <w:jc w:val="both"/>
               <w:rPr>
                 <w:rFonts w:ascii="Calibri" w:hAnsi="Calibri" w:cs="Calibri"/>
@@ -1487,7 +2315,6 @@
           </w:tcPr>
           <w:p>
             <w:pPr>
-              <w:bidi w:val="0"/>
               <w:jc w:val="both"/>
               <w:rPr>
                 <w:rFonts w:ascii="Calibri" w:hAnsi="Calibri" w:cs="Calibri"/>
@@ -1526,7 +2353,6 @@
           </w:tcPr>
           <w:p>
             <w:pPr>
-              <w:bidi w:val="0"/>
               <w:jc w:val="both"/>
               <w:rPr>
                 <w:rFonts w:ascii="Calibri" w:hAnsi="Calibri" w:cs="Calibri"/>
@@ -1561,7 +2387,6 @@
           </w:tcPr>
           <w:p>
             <w:pPr>
-              <w:bidi w:val="0"/>
               <w:rPr>
                 <w:rFonts w:ascii="Calibri" w:hAnsi="Calibri" w:cs="Calibri"/>
                 <w:sz w:val="24"/>
@@ -1585,7 +2410,6 @@
           </w:tcPr>
           <w:p>
             <w:pPr>
-              <w:bidi w:val="0"/>
               <w:rPr>
                 <w:rFonts w:ascii="Calibri" w:hAnsi="Calibri" w:cs="Calibri"/>
                 <w:sz w:val="24"/>
@@ -1609,7 +2433,6 @@
           </w:tcPr>
           <w:p>
             <w:pPr>
-              <w:bidi w:val="0"/>
               <w:rPr>
                 <w:rFonts w:ascii="Calibri" w:hAnsi="Calibri" w:cs="Calibri"/>
                 <w:sz w:val="24"/>
@@ -1698,7 +2521,7 @@
                 <w:sz w:val="24"/>
                 <w:szCs w:val="24"/>
               </w:rPr>
-              <w:instrText xml:space="preserve"> ADDIN ZOTERO_ITEM CSL_CITATION {"citationID":"kVQ6rlnq","properties":{"formattedCitation":"[3]","plainCitation":"[3]","noteIndex":0},"citationItems":[{"id":343,"uris":["http://zotero.org/groups/6447497/items/SRB46M8K"],"itemData":{"id":343,"type":"post-weblog","language":"en-GB","title":"Haeolus – Hydrogen-Aeolic Energy with Optimised eLectrolysers Upstream of Substation","URL":"https://haeolus.eu/","accessed":{"date-parts":[["2026",3,6]]},"issued":{"date-parts":[["2024",1,8]]}}}],"schema":"https://github.com/citation-style-language/schema/raw/master/csl-citation.json"} </w:instrText>
+              <w:instrText xml:space="preserve"> ADDIN ZOTERO_ITEM CSL_CITATION {"citationID":"kVQ6rlnq","properties":{"formattedCitation":"[4]","plainCitation":"[4]","noteIndex":0},"citationItems":[{"id":343,"uris":["http://zotero.org/groups/6447497/items/SRB46M8K"],"itemData":{"id":343,"type":"post-weblog","language":"en-GB","title":"Haeolus – Hydrogen-Aeolic Energy with Optimised eLectrolysers Upstream of Substation","URL":"https://haeolus.eu/","accessed":{"date-parts":[["2026",3,6]]},"issued":{"date-parts":[["2024",1,8]]}}}],"schema":"https://github.com/citation-style-language/schema/raw/master/csl-citation.json"} </w:instrText>
             </w:r>
             <w:r>
               <w:rPr>
@@ -1713,7 +2536,7 @@
                 <w:rFonts w:ascii="Calibri" w:hAnsi="Calibri" w:cs="Calibri"/>
                 <w:sz w:val="24"/>
               </w:rPr>
-              <w:t>[3]</w:t>
+              <w:t>[4]</w:t>
             </w:r>
             <w:r>
               <w:rPr>
@@ -1738,7 +2561,6 @@
           </w:tcPr>
           <w:p>
             <w:pPr>
-              <w:bidi w:val="0"/>
               <w:rPr>
                 <w:rFonts w:ascii="Calibri" w:hAnsi="Calibri" w:cs="Calibri"/>
                 <w:sz w:val="24"/>
@@ -1754,7 +2576,6 @@
           </w:tcPr>
           <w:p>
             <w:pPr>
-              <w:bidi w:val="0"/>
               <w:rPr>
                 <w:rFonts w:ascii="Calibri" w:hAnsi="Calibri" w:cs="Calibri"/>
                 <w:sz w:val="24"/>
@@ -1770,7 +2591,6 @@
           </w:tcPr>
           <w:p>
             <w:pPr>
-              <w:bidi w:val="0"/>
               <w:rPr>
                 <w:rFonts w:ascii="Calibri" w:hAnsi="Calibri" w:cs="Calibri"/>
                 <w:sz w:val="24"/>
@@ -1792,7 +2612,6 @@
           </w:tcPr>
           <w:p>
             <w:pPr>
-              <w:bidi w:val="0"/>
               <w:rPr>
                 <w:rFonts w:ascii="Calibri" w:hAnsi="Calibri" w:cs="Calibri"/>
                 <w:sz w:val="24"/>
@@ -1808,7 +2627,6 @@
           </w:tcPr>
           <w:p>
             <w:pPr>
-              <w:bidi w:val="0"/>
               <w:rPr>
                 <w:rFonts w:ascii="Calibri" w:hAnsi="Calibri" w:cs="Calibri"/>
                 <w:sz w:val="24"/>
@@ -1824,7 +2642,6 @@
           </w:tcPr>
           <w:p>
             <w:pPr>
-              <w:bidi w:val="0"/>
               <w:rPr>
                 <w:rFonts w:ascii="Calibri" w:hAnsi="Calibri" w:cs="Calibri"/>
                 <w:sz w:val="24"/>
@@ -1846,7 +2663,6 @@
           </w:tcPr>
           <w:p>
             <w:pPr>
-              <w:bidi w:val="0"/>
               <w:rPr>
                 <w:rFonts w:ascii="Calibri" w:hAnsi="Calibri" w:cs="Calibri"/>
                 <w:sz w:val="24"/>
@@ -1862,7 +2678,6 @@
           </w:tcPr>
           <w:p>
             <w:pPr>
-              <w:bidi w:val="0"/>
               <w:rPr>
                 <w:rFonts w:ascii="Calibri" w:hAnsi="Calibri" w:cs="Calibri"/>
                 <w:sz w:val="24"/>
@@ -1878,7 +2693,6 @@
           </w:tcPr>
           <w:p>
             <w:pPr>
-              <w:bidi w:val="0"/>
               <w:rPr>
                 <w:rFonts w:ascii="Calibri" w:hAnsi="Calibri" w:cs="Calibri"/>
                 <w:sz w:val="24"/>
@@ -1900,7 +2714,6 @@
           </w:tcPr>
           <w:p>
             <w:pPr>
-              <w:bidi w:val="0"/>
               <w:rPr>
                 <w:rFonts w:ascii="Calibri" w:hAnsi="Calibri" w:cs="Calibri"/>
                 <w:sz w:val="24"/>
@@ -1916,7 +2729,6 @@
           </w:tcPr>
           <w:p>
             <w:pPr>
-              <w:bidi w:val="0"/>
               <w:rPr>
                 <w:rFonts w:ascii="Calibri" w:hAnsi="Calibri" w:cs="Calibri"/>
                 <w:sz w:val="24"/>
@@ -1932,7 +2744,6 @@
           </w:tcPr>
           <w:p>
             <w:pPr>
-              <w:bidi w:val="0"/>
               <w:rPr>
                 <w:rFonts w:ascii="Calibri" w:hAnsi="Calibri" w:cs="Calibri"/>
                 <w:sz w:val="24"/>
@@ -1945,7 +2756,6 @@
     </w:tbl>
     <w:p>
       <w:pPr>
-        <w:bidi w:val="0"/>
         <w:jc w:val="both"/>
         <w:rPr>
           <w:rFonts w:ascii="Calibri" w:hAnsi="Calibri" w:cs="Calibri"/>
@@ -1957,7 +2767,6 @@
     <w:p>
       <w:pPr>
         <w:pStyle w:val="berschrift2"/>
-        <w:bidi w:val="0"/>
       </w:pPr>
       <w:r>
         <w:t>Equations</w:t>
@@ -1965,7 +2774,6 @@
     </w:p>
     <w:p>
       <w:pPr>
-        <w:bidi w:val="0"/>
         <w:rPr>
           <w:b/>
           <w:bCs/>
@@ -1981,7 +2789,6 @@
     </w:p>
     <w:p>
       <w:pPr>
-        <w:bidi w:val="0"/>
         <w:jc w:val="both"/>
         <w:rPr>
           <w:rFonts w:ascii="Calibri" w:eastAsiaTheme="minorEastAsia" w:hAnsi="Calibri" w:cs="Calibri"/>
@@ -2034,7 +2841,6 @@
     </w:p>
     <w:p>
       <w:pPr>
-        <w:bidi w:val="0"/>
         <w:jc w:val="both"/>
         <w:rPr>
           <w:rFonts w:ascii="Calibri" w:hAnsi="Calibri" w:cs="Calibri"/>
@@ -2048,6 +2854,7 @@
           <w:sz w:val="24"/>
           <w:szCs w:val="24"/>
         </w:rPr>
+        <w:lastRenderedPageBreak/>
         <w:t xml:space="preserve">Efficiency = </w:t>
       </w:r>
       <m:oMath>
@@ -2103,7 +2910,6 @@
     </w:p>
     <w:p>
       <w:pPr>
-        <w:bidi w:val="0"/>
         <w:jc w:val="both"/>
         <w:rPr>
           <w:rFonts w:ascii="Calibri" w:hAnsi="Calibri" w:cs="Calibri"/>
@@ -2204,7 +3010,6 @@
     </w:p>
     <w:p>
       <w:pPr>
-        <w:bidi w:val="0"/>
         <w:jc w:val="both"/>
         <w:rPr>
           <w:rFonts w:ascii="Calibri" w:hAnsi="Calibri" w:cs="Calibri"/>
@@ -2227,7 +3032,6 @@
     </w:p>
     <w:p>
       <w:pPr>
-        <w:bidi w:val="0"/>
         <w:jc w:val="both"/>
         <w:rPr>
           <w:rFonts w:ascii="Calibri" w:hAnsi="Calibri" w:cs="Calibri"/>
@@ -2246,7 +3050,6 @@
     </w:p>
     <w:p>
       <w:pPr>
-        <w:bidi w:val="0"/>
         <w:jc w:val="both"/>
         <w:rPr>
           <w:rFonts w:ascii="Calibri" w:hAnsi="Calibri" w:cs="Calibri"/>
@@ -2259,7 +3062,6 @@
     </w:p>
     <w:p>
       <w:pPr>
-        <w:bidi w:val="0"/>
         <w:jc w:val="both"/>
         <w:rPr>
           <w:rFonts w:ascii="Calibri" w:hAnsi="Calibri" w:cs="Calibri"/>
@@ -2464,7 +3266,6 @@
     <w:p>
       <w:pPr>
         <w:pStyle w:val="Listenabsatz"/>
-        <w:bidi w:val="0"/>
         <w:jc w:val="both"/>
         <w:rPr>
           <w:rFonts w:ascii="Calibri" w:hAnsi="Calibri" w:cs="Calibri"/>
@@ -2475,7 +3276,6 @@
     </w:p>
     <w:p>
       <w:pPr>
-        <w:bidi w:val="0"/>
         <w:jc w:val="both"/>
         <w:rPr>
           <w:rFonts w:ascii="Calibri" w:hAnsi="Calibri" w:cs="Calibri"/>
@@ -2498,7 +3298,6 @@
     </w:p>
     <w:p>
       <w:pPr>
-        <w:bidi w:val="0"/>
         <w:jc w:val="both"/>
         <w:rPr>
           <w:rFonts w:ascii="Calibri" w:hAnsi="Calibri" w:cs="Calibri"/>
@@ -2618,7 +3417,6 @@
     </w:p>
     <w:p>
       <w:pPr>
-        <w:bidi w:val="0"/>
         <w:jc w:val="center"/>
         <w:rPr>
           <w:rFonts w:ascii="Calibri" w:hAnsi="Calibri" w:cs="Calibri"/>
@@ -2631,7 +3429,6 @@
     </w:p>
     <w:p>
       <w:pPr>
-        <w:bidi w:val="0"/>
         <w:jc w:val="center"/>
         <w:rPr>
           <w:rFonts w:ascii="Calibri" w:hAnsi="Calibri" w:cs="Calibri"/>
@@ -2777,7 +3574,6 @@
     </w:p>
     <w:p>
       <w:pPr>
-        <w:bidi w:val="0"/>
         <w:jc w:val="both"/>
         <w:rPr>
           <w:rFonts w:ascii="Calibri" w:hAnsi="Calibri" w:cs="Calibri"/>
@@ -2795,7 +3591,6 @@
           <w:sz w:val="24"/>
           <w:szCs w:val="24"/>
         </w:rPr>
-        <w:lastRenderedPageBreak/>
         <w:t>Greenhouse Temperature</w:t>
       </w:r>
       <w:r>
@@ -2811,7 +3606,6 @@
     </w:p>
     <w:p>
       <w:pPr>
-        <w:bidi w:val="0"/>
         <w:jc w:val="both"/>
         <w:rPr>
           <w:rFonts w:ascii="Calibri" w:hAnsi="Calibri" w:cs="Calibri"/>
@@ -2967,7 +3761,6 @@
     <w:p>
       <w:pPr>
         <w:pStyle w:val="Listenabsatz"/>
-        <w:bidi w:val="0"/>
         <w:ind w:left="1440"/>
         <w:rPr>
           <w:rFonts w:ascii="Calibri" w:eastAsiaTheme="minorEastAsia" w:hAnsi="Calibri" w:cs="Calibri"/>
@@ -2992,9 +3785,6 @@
         </w:rPr>
       </w:pPr>
       <m:oMathPara>
-        <m:oMathParaPr>
-          <m:jc m:val="center"/>
-        </m:oMathParaPr>
         <m:oMath>
           <m:f>
             <m:fPr>
@@ -3190,13 +3980,221 @@
     </w:p>
     <w:p>
       <w:pPr>
-        <w:bidi w:val="0"/>
-        <w:jc w:val="both"/>
-        <w:rPr>
-          <w:b/>
-          <w:bCs/>
-        </w:rPr>
-      </w:pPr>
+        <w:rPr>
+          <w:rFonts w:ascii="Calibri" w:eastAsiaTheme="minorEastAsia" w:hAnsi="Calibri" w:cs="Calibri"/>
+          <w:sz w:val="24"/>
+          <w:szCs w:val="24"/>
+          <w:lang w:val="en-GB"/>
+        </w:rPr>
+      </w:pPr>
+      <w:r>
+        <w:rPr>
+          <w:rFonts w:ascii="Calibri" w:eastAsiaTheme="minorEastAsia" w:hAnsi="Calibri" w:cs="Calibri"/>
+          <w:sz w:val="24"/>
+          <w:szCs w:val="24"/>
+          <w:lang w:val="en-GB"/>
+        </w:rPr>
+        <w:br w:type="page"/>
+      </w:r>
+    </w:p>
+    <w:p>
+      <w:pPr>
+        <w:pStyle w:val="berschrift2"/>
+        <w:rPr>
+          <w:rFonts w:eastAsiaTheme="minorEastAsia"/>
+          <w:lang w:val="en-GB"/>
+        </w:rPr>
+      </w:pPr>
+      <w:r>
+        <w:rPr>
+          <w:rFonts w:eastAsiaTheme="minorEastAsia"/>
+          <w:lang w:val="en-GB"/>
+        </w:rPr>
+        <w:lastRenderedPageBreak/>
+        <w:t>Bibliography</w:t>
+      </w:r>
+    </w:p>
+    <w:p>
+      <w:pPr>
+        <w:pStyle w:val="Literaturverzeichnis"/>
+        <w:rPr>
+          <w:rFonts w:ascii="Aptos" w:hAnsi="Aptos"/>
+        </w:rPr>
+      </w:pPr>
+      <w:r>
+        <w:fldChar w:fldCharType="begin"/>
+      </w:r>
+      <w:r>
+        <w:instrText xml:space="preserve"> ADDIN ZOTERO_BIBL {"uncited":[],"omitted":[],"custom":[]} CSL_BIBLIOGRAPHY </w:instrText>
+      </w:r>
+      <w:r>
+        <w:fldChar w:fldCharType="separate"/>
+      </w:r>
+      <w:r>
+        <w:rPr>
+          <w:rFonts w:ascii="Aptos" w:hAnsi="Aptos"/>
+        </w:rPr>
+        <w:t>[1</w:t>
+      </w:r>
+      <w:proofErr w:type="gramStart"/>
+      <w:r>
+        <w:rPr>
+          <w:rFonts w:ascii="Aptos" w:hAnsi="Aptos"/>
+        </w:rPr>
+        <w:t>]</w:t>
+      </w:r>
+      <w:r>
+        <w:rPr>
+          <w:rFonts w:ascii="Aptos" w:hAnsi="Aptos"/>
+        </w:rPr>
+        <w:tab/>
+        <w:t>‘</w:t>
+      </w:r>
+      <w:proofErr w:type="gramEnd"/>
+      <w:r>
+        <w:rPr>
+          <w:rFonts w:ascii="Aptos" w:hAnsi="Aptos"/>
+        </w:rPr>
+        <w:t>PowerPoint Presentation’. Accessed: Mar. 06, 2026. [Online]. Available: https://www.hydrogen.no/files/documents/medlemsmoter/h2carrier.pdf</w:t>
+      </w:r>
+    </w:p>
+    <w:p>
+      <w:pPr>
+        <w:pStyle w:val="Literaturverzeichnis"/>
+        <w:rPr>
+          <w:rFonts w:ascii="Aptos" w:hAnsi="Aptos"/>
+        </w:rPr>
+      </w:pPr>
+      <w:r>
+        <w:rPr>
+          <w:rFonts w:ascii="Aptos" w:hAnsi="Aptos"/>
+        </w:rPr>
+        <w:t>[2</w:t>
+      </w:r>
+      <w:proofErr w:type="gramStart"/>
+      <w:r>
+        <w:rPr>
+          <w:rFonts w:ascii="Aptos" w:hAnsi="Aptos"/>
+        </w:rPr>
+        <w:t>]</w:t>
+      </w:r>
+      <w:r>
+        <w:rPr>
+          <w:rFonts w:ascii="Aptos" w:hAnsi="Aptos"/>
+        </w:rPr>
+        <w:tab/>
+        <w:t>‘</w:t>
+      </w:r>
+      <w:proofErr w:type="gramEnd"/>
+      <w:r>
+        <w:rPr>
+          <w:rFonts w:ascii="Aptos" w:hAnsi="Aptos"/>
+        </w:rPr>
+        <w:t>Dissolved oxygen requirements in aquatic animal respiration - Responsible Seafood Advocate’, Global Seafood Alliance. Accessed: Mar. 06, 2026. [Online]. Available: https://www.globalseafood.org/advocate/dissolved-oxygen-requirements-in-aquatic-animal-respiration/</w:t>
+      </w:r>
+    </w:p>
+    <w:p>
+      <w:pPr>
+        <w:pStyle w:val="Literaturverzeichnis"/>
+        <w:rPr>
+          <w:rFonts w:ascii="Aptos" w:hAnsi="Aptos"/>
+        </w:rPr>
+      </w:pPr>
+      <w:r>
+        <w:rPr>
+          <w:rFonts w:ascii="Aptos" w:hAnsi="Aptos"/>
+        </w:rPr>
+        <w:t>[3</w:t>
+      </w:r>
+      <w:proofErr w:type="gramStart"/>
+      <w:r>
+        <w:rPr>
+          <w:rFonts w:ascii="Aptos" w:hAnsi="Aptos"/>
+        </w:rPr>
+        <w:t>]</w:t>
+      </w:r>
+      <w:r>
+        <w:rPr>
+          <w:rFonts w:ascii="Aptos" w:hAnsi="Aptos"/>
+        </w:rPr>
+        <w:tab/>
+        <w:t>‘</w:t>
+      </w:r>
+      <w:proofErr w:type="gramEnd"/>
+      <w:r>
+        <w:rPr>
+          <w:rFonts w:ascii="Aptos" w:hAnsi="Aptos"/>
+        </w:rPr>
+        <w:t>Fish density on our farms’. Accessed: Mar. 07, 2026. [Online]. Available: https://griegseafood.com/our-impact-fish-density-on-our-farms</w:t>
+      </w:r>
+    </w:p>
+    <w:p>
+      <w:pPr>
+        <w:pStyle w:val="Literaturverzeichnis"/>
+        <w:rPr>
+          <w:rFonts w:ascii="Aptos" w:hAnsi="Aptos"/>
+        </w:rPr>
+      </w:pPr>
+      <w:r>
+        <w:rPr>
+          <w:rFonts w:ascii="Aptos" w:hAnsi="Aptos"/>
+        </w:rPr>
+        <w:t>[4]</w:t>
+      </w:r>
+      <w:r>
+        <w:rPr>
+          <w:rFonts w:ascii="Aptos" w:hAnsi="Aptos"/>
+        </w:rPr>
+        <w:tab/>
+        <w:t>‘</w:t>
+      </w:r>
+      <w:proofErr w:type="spellStart"/>
+      <w:r>
+        <w:rPr>
+          <w:rFonts w:ascii="Aptos" w:hAnsi="Aptos"/>
+        </w:rPr>
+        <w:t>Haeolus</w:t>
+      </w:r>
+      <w:proofErr w:type="spellEnd"/>
+      <w:r>
+        <w:rPr>
+          <w:rFonts w:ascii="Aptos" w:hAnsi="Aptos"/>
+        </w:rPr>
+        <w:t xml:space="preserve"> – Hydrogen-Aeolic Energy with </w:t>
+      </w:r>
+      <w:proofErr w:type="spellStart"/>
+      <w:r>
+        <w:rPr>
+          <w:rFonts w:ascii="Aptos" w:hAnsi="Aptos"/>
+        </w:rPr>
+        <w:t>Optimised</w:t>
+      </w:r>
+      <w:proofErr w:type="spellEnd"/>
+      <w:r>
+        <w:rPr>
+          <w:rFonts w:ascii="Aptos" w:hAnsi="Aptos"/>
+        </w:rPr>
+        <w:t xml:space="preserve"> </w:t>
+      </w:r>
+      <w:proofErr w:type="spellStart"/>
+      <w:r>
+        <w:rPr>
+          <w:rFonts w:ascii="Aptos" w:hAnsi="Aptos"/>
+        </w:rPr>
+        <w:t>eLectrolysers</w:t>
+      </w:r>
+      <w:proofErr w:type="spellEnd"/>
+      <w:r>
+        <w:rPr>
+          <w:rFonts w:ascii="Aptos" w:hAnsi="Aptos"/>
+        </w:rPr>
+        <w:t xml:space="preserve"> Upstream of Substation’. Accessed: Mar. 06, 2026. [Online]. Available: https://haeolus.eu/</w:t>
+      </w:r>
+    </w:p>
+    <w:p>
+      <w:r>
+        <w:fldChar w:fldCharType="end"/>
+      </w:r>
     </w:p>
     <w:sectPr>
       <w:pgSz w:w="11906" w:h="16838"/>
@@ -4401,10 +5399,7 @@
   <w:style w:type="paragraph" w:default="1" w:styleId="Standard">
     <w:name w:val="Normal"/>
     <w:qFormat/>
-    <w:rsid w:val="00BB2C51"/>
-    <w:pPr>
-      <w:bidi/>
-    </w:pPr>
+    <w:rsid w:val="00296F3F"/>
   </w:style>
   <w:style w:type="paragraph" w:styleId="berschrift1">
     <w:name w:val="heading 1"/>
@@ -4455,7 +5450,6 @@
     <w:next w:val="Standard"/>
     <w:link w:val="berschrift3Zchn"/>
     <w:uiPriority w:val="9"/>
-    <w:semiHidden/>
     <w:unhideWhenUsed/>
     <w:qFormat/>
     <w:rsid w:val="00035159"/>
@@ -4643,7 +5637,6 @@
         <w:tab w:val="left" w:pos="960"/>
         <w:tab w:val="right" w:leader="dot" w:pos="9016"/>
       </w:tabs>
-      <w:bidi w:val="0"/>
       <w:spacing w:after="0" w:line="480" w:lineRule="auto"/>
       <w:jc w:val="both"/>
     </w:pPr>
@@ -4687,7 +5680,6 @@
     <w:basedOn w:val="Absatz-Standardschriftart"/>
     <w:link w:val="berschrift3"/>
     <w:uiPriority w:val="9"/>
-    <w:semiHidden/>
     <w:rsid w:val="00035159"/>
     <w:rPr>
       <w:rFonts w:eastAsiaTheme="majorEastAsia" w:cstheme="majorBidi"/>
@@ -5005,6 +5997,17 @@
     <w:unhideWhenUsed/>
     <w:rsid w:val="00BB2C51"/>
   </w:style>
+  <w:style w:type="character" w:styleId="Fett">
+    <w:name w:val="Strong"/>
+    <w:basedOn w:val="Absatz-Standardschriftart"/>
+    <w:uiPriority w:val="22"/>
+    <w:qFormat/>
+    <w:rsid w:val="0033026A"/>
+    <w:rPr>
+      <w:b/>
+      <w:bCs/>
+    </w:rPr>
+  </w:style>
 </w:styles>
 </file>
 

</xml_diff>

<commit_message>
Power output wind farm explanation and file added
Sanaz created an excel file for wind farm data and wrote an explanation for that. I added this to the documentation and placed the excel file in the repo. The file will need to be tidied a little before it can be read by the program.
</commit_message>
<xml_diff>
--- a/Key Parameters.docx
+++ b/Key Parameters.docx
@@ -16,23 +16,477 @@
         <w:jc w:val="both"/>
       </w:pPr>
       <w:r>
-        <w:t xml:space="preserve">The model is of a hypothetical hydrogen plant with PEM </w:t>
-      </w:r>
-      <w:proofErr w:type="spellStart"/>
-      <w:r>
-        <w:t>electrolyzers</w:t>
-      </w:r>
-      <w:proofErr w:type="spellEnd"/>
-      <w:r>
-        <w:t xml:space="preserve">. The power for plant operation comes from an islanded wind farm with a similar capacity. It is assumed that the heat output of the </w:t>
-      </w:r>
-      <w:proofErr w:type="spellStart"/>
-      <w:r>
-        <w:t>electrolyzer</w:t>
-      </w:r>
-      <w:proofErr w:type="spellEnd"/>
-      <w:r>
-        <w:t xml:space="preserve"> is very large compared with the oxygen output. Therefore, the fish farm is sized first, based on the oxygen output, and the greenhouse is sized based on the heat remaining after the fish farm demand has been calculated.  </w:t>
+        <w:t xml:space="preserve">The model is of a hypothetical hydrogen plant with PEM electrolyzers. The power for plant operation comes from an islanded wind farm with a similar capacity. It is assumed that the heat output of the electrolyzer is very large compared with the oxygen output. Therefore, the fish farm is sized first, based on the oxygen output, and the greenhouse is sized based on the heat remaining after the fish farm demand has been calculated.  </w:t>
+      </w:r>
+    </w:p>
+    <w:p>
+      <w:pPr>
+        <w:jc w:val="both"/>
+        <w:rPr>
+          <w:b/>
+          <w:bCs/>
+        </w:rPr>
+      </w:pPr>
+      <w:r>
+        <w:rPr>
+          <w:b/>
+          <w:bCs/>
+        </w:rPr>
+        <w:t>Wind Farm (P_electrolyzer)</w:t>
+      </w:r>
+    </w:p>
+    <w:p>
+      <w:pPr>
+        <w:jc w:val="both"/>
+        <w:rPr>
+          <w:rFonts w:cs="Calibri"/>
+        </w:rPr>
+      </w:pPr>
+      <w:r>
+        <w:rPr>
+          <w:rFonts w:cs="Calibri"/>
+        </w:rPr>
+        <w:t xml:space="preserve">The power capacity of the wind farm for the simulation was scaled from proposed projects in Norway </w:t>
+      </w:r>
+      <w:r>
+        <w:rPr>
+          <w:rFonts w:cs="Calibri"/>
+        </w:rPr>
+        <w:fldChar w:fldCharType="begin"/>
+      </w:r>
+      <w:r>
+        <w:rPr>
+          <w:rFonts w:cs="Calibri"/>
+        </w:rPr>
+        <w:instrText xml:space="preserve"> ADDIN ZOTERO_ITEM CSL_CITATION {"citationID":"96GCyNoF","properties":{"formattedCitation":"[1]","plainCitation":"[1]","noteIndex":0},"citationItems":[{"id":345,"uris":["http://zotero.org/groups/6447497/items/QHKRSVM4"],"itemData":{"id":345,"type":"document","title":"PowerPoint Presentation","URL":"https://www.hydrogen.no/files/documents/medlemsmoter/h2carrier.pdf","accessed":{"date-parts":[["2026",3,6]]}}}],"schema":"https://github.com/citation-style-language/schema/raw/master/csl-citation.json"} </w:instrText>
+      </w:r>
+      <w:r>
+        <w:rPr>
+          <w:rFonts w:cs="Calibri"/>
+        </w:rPr>
+        <w:fldChar w:fldCharType="separate"/>
+      </w:r>
+      <w:r>
+        <w:rPr>
+          <w:rFonts w:ascii="Aptos" w:hAnsi="Aptos"/>
+        </w:rPr>
+        <w:t>[1]</w:t>
+      </w:r>
+      <w:r>
+        <w:rPr>
+          <w:rFonts w:cs="Calibri"/>
+        </w:rPr>
+        <w:fldChar w:fldCharType="end"/>
+      </w:r>
+      <w:r>
+        <w:rPr>
+          <w:rFonts w:cs="Calibri"/>
+        </w:rPr>
+        <w:t xml:space="preserve">. The capacity factor was taken from the same source and the power output over 24 hours was scaled to data from Fingrid </w:t>
+      </w:r>
+      <w:r>
+        <w:rPr>
+          <w:rFonts w:cs="Calibri"/>
+        </w:rPr>
+        <w:fldChar w:fldCharType="begin"/>
+      </w:r>
+      <w:r>
+        <w:rPr>
+          <w:rFonts w:cs="Calibri"/>
+        </w:rPr>
+        <w:instrText xml:space="preserve"> ADDIN ZOTERO_ITEM CSL_CITATION {"citationID":"XfvlAsyt","properties":{"formattedCitation":"[2]","plainCitation":"[2]","noteIndex":0},"citationItems":[{"id":356,"uris":["http://zotero.org/groups/6447497/items/9ELM3ZNS"],"itemData":{"id":356,"type":"webpage","title":"Download datasets","URL":"https://data.fingrid.fi/en/data?datasets=181","accessed":{"date-parts":[["2026",3,9]]}}}],"schema":"https://github.com/citation-style-language/schema/raw/master/csl-citation.json"} </w:instrText>
+      </w:r>
+      <w:r>
+        <w:rPr>
+          <w:rFonts w:cs="Calibri"/>
+        </w:rPr>
+        <w:fldChar w:fldCharType="separate"/>
+      </w:r>
+      <w:r>
+        <w:rPr>
+          <w:rFonts w:ascii="Aptos" w:hAnsi="Aptos"/>
+        </w:rPr>
+        <w:t>[2]</w:t>
+      </w:r>
+      <w:r>
+        <w:rPr>
+          <w:rFonts w:cs="Calibri"/>
+        </w:rPr>
+        <w:fldChar w:fldCharType="end"/>
+      </w:r>
+      <w:r>
+        <w:rPr>
+          <w:rFonts w:cs="Calibri"/>
+        </w:rPr>
+        <w:t xml:space="preserve">. </w:t>
+      </w:r>
+      <w:r>
+        <w:rPr>
+          <w:rFonts w:cs="Calibri"/>
+        </w:rPr>
+        <w:t xml:space="preserve">Although </w:t>
+      </w:r>
+      <w:r>
+        <w:rPr>
+          <w:rFonts w:cs="Calibri"/>
+        </w:rPr>
+        <w:t>Fingrid</w:t>
+      </w:r>
+      <w:r>
+        <w:rPr>
+          <w:rFonts w:cs="Calibri"/>
+        </w:rPr>
+        <w:t xml:space="preserve"> </w:t>
+      </w:r>
+      <w:r>
+        <w:rPr>
+          <w:rFonts w:cs="Calibri"/>
+        </w:rPr>
+        <w:t>data</w:t>
+      </w:r>
+      <w:r>
+        <w:rPr>
+          <w:rFonts w:cs="Calibri"/>
+        </w:rPr>
+        <w:t xml:space="preserve"> </w:t>
+      </w:r>
+      <w:r>
+        <w:rPr>
+          <w:rFonts w:cs="Calibri"/>
+        </w:rPr>
+        <w:t>is</w:t>
+      </w:r>
+      <w:r>
+        <w:rPr>
+          <w:rFonts w:cs="Calibri"/>
+        </w:rPr>
+        <w:t xml:space="preserve"> for </w:t>
+      </w:r>
+      <w:r>
+        <w:rPr>
+          <w:rFonts w:cs="Calibri"/>
+        </w:rPr>
+        <w:t>all</w:t>
+      </w:r>
+      <w:r>
+        <w:rPr>
+          <w:rFonts w:cs="Calibri"/>
+        </w:rPr>
+        <w:t xml:space="preserve"> of Finland</w:t>
+      </w:r>
+      <w:r>
+        <w:rPr>
+          <w:rFonts w:cs="Calibri"/>
+        </w:rPr>
+        <w:t>,</w:t>
+      </w:r>
+      <w:r>
+        <w:rPr>
+          <w:rFonts w:cs="Calibri"/>
+        </w:rPr>
+        <w:t xml:space="preserve"> </w:t>
+      </w:r>
+      <w:r>
+        <w:rPr>
+          <w:rFonts w:cs="Calibri"/>
+        </w:rPr>
+        <w:t xml:space="preserve">data for specific wind farms is not easily found. Therefore, </w:t>
+      </w:r>
+      <w:r>
+        <w:rPr>
+          <w:rFonts w:cs="Calibri"/>
+        </w:rPr>
+        <w:t>the profile is the best approximation for our project.</w:t>
+      </w:r>
+      <w:r>
+        <w:rPr>
+          <w:rFonts w:cs="Calibri"/>
+        </w:rPr>
+        <w:t xml:space="preserve"> The power output was scaled as follows:</w:t>
+      </w:r>
+    </w:p>
+    <w:p>
+      <w:pPr>
+        <w:pStyle w:val="StandardWeb"/>
+        <w:numPr>
+          <w:ilvl w:val="0"/>
+          <w:numId w:val="9"/>
+        </w:numPr>
+        <w:rPr>
+          <w:rFonts w:asciiTheme="minorHAnsi" w:hAnsiTheme="minorHAnsi" w:cs="Calibri"/>
+          <w:sz w:val="22"/>
+          <w:szCs w:val="22"/>
+        </w:rPr>
+      </w:pPr>
+      <w:r>
+        <w:rPr>
+          <w:rFonts w:asciiTheme="minorHAnsi" w:hAnsiTheme="minorHAnsi" w:cs="Calibri"/>
+          <w:sz w:val="22"/>
+          <w:szCs w:val="22"/>
+        </w:rPr>
+        <w:t>Hourly Averaging: The raw 3-minute real-time production data from Fingrid (March 6th-7th) was aggregated into hourly mean values to provide a consistent daily profile.</w:t>
+      </w:r>
+    </w:p>
+    <w:p>
+      <w:pPr>
+        <w:pStyle w:val="StandardWeb"/>
+        <w:numPr>
+          <w:ilvl w:val="0"/>
+          <w:numId w:val="9"/>
+        </w:numPr>
+        <w:rPr>
+          <w:rFonts w:asciiTheme="minorHAnsi" w:hAnsiTheme="minorHAnsi" w:cs="Calibri"/>
+          <w:sz w:val="22"/>
+          <w:szCs w:val="22"/>
+        </w:rPr>
+      </w:pPr>
+      <w:r>
+        <w:rPr>
+          <w:rFonts w:asciiTheme="minorHAnsi" w:hAnsiTheme="minorHAnsi" w:cs="Calibri"/>
+          <w:sz w:val="22"/>
+          <w:szCs w:val="22"/>
+        </w:rPr>
+        <w:t>Normalization: Each hourly mean was divided by the total national wind capacity (</w:t>
+      </w:r>
+      <m:oMath>
+        <m:r>
+          <w:rPr>
+            <w:rFonts w:ascii="Cambria Math" w:hAnsi="Cambria Math" w:cs="Calibri"/>
+            <w:sz w:val="22"/>
+            <w:szCs w:val="22"/>
+          </w:rPr>
+          <m:t>9,394 MW</m:t>
+        </m:r>
+      </m:oMath>
+      <w:r>
+        <w:rPr>
+          <w:rFonts w:asciiTheme="minorHAnsi" w:hAnsiTheme="minorHAnsi" w:cs="Calibri"/>
+          <w:sz w:val="22"/>
+          <w:szCs w:val="22"/>
+        </w:rPr>
+        <w:t>) to derive the dimensionless 'k-factor' representing the regional wind volatility.</w:t>
+      </w:r>
+    </w:p>
+    <w:p>
+      <w:pPr>
+        <w:pStyle w:val="StandardWeb"/>
+        <w:numPr>
+          <w:ilvl w:val="0"/>
+          <w:numId w:val="9"/>
+        </w:numPr>
+        <w:rPr>
+          <w:rFonts w:asciiTheme="minorHAnsi" w:hAnsiTheme="minorHAnsi" w:cs="Calibri"/>
+          <w:sz w:val="22"/>
+          <w:szCs w:val="22"/>
+        </w:rPr>
+      </w:pPr>
+      <w:r>
+        <w:rPr>
+          <w:rFonts w:asciiTheme="minorHAnsi" w:hAnsiTheme="minorHAnsi" w:cs="Calibri"/>
+          <w:sz w:val="22"/>
+          <w:szCs w:val="22"/>
+        </w:rPr>
+        <w:t xml:space="preserve">Calibration: Since the raw mean was </w:t>
+      </w:r>
+      <m:oMath>
+        <m:r>
+          <w:rPr>
+            <w:rFonts w:ascii="Cambria Math" w:hAnsi="Cambria Math" w:cs="Calibri"/>
+            <w:sz w:val="22"/>
+            <w:szCs w:val="22"/>
+          </w:rPr>
+          <m:t>38.5</m:t>
+        </m:r>
+        <m:r>
+          <w:rPr>
+            <w:rFonts w:ascii="Cambria Math" w:hAnsi="Cambria Math" w:cs="Calibri"/>
+            <w:sz w:val="22"/>
+            <w:szCs w:val="22"/>
+          </w:rPr>
+          <m:t xml:space="preserve"> </m:t>
+        </m:r>
+        <m:r>
+          <w:rPr>
+            <w:rFonts w:ascii="Cambria Math" w:hAnsi="Cambria Math" w:cs="Calibri"/>
+            <w:sz w:val="22"/>
+            <w:szCs w:val="22"/>
+          </w:rPr>
+          <m:t>%</m:t>
+        </m:r>
+      </m:oMath>
+      <w:r>
+        <w:rPr>
+          <w:rFonts w:asciiTheme="minorHAnsi" w:hAnsiTheme="minorHAnsi" w:cs="Calibri"/>
+          <w:sz w:val="22"/>
+          <w:szCs w:val="22"/>
+        </w:rPr>
+        <w:t xml:space="preserve">, a multiplier of </w:t>
+      </w:r>
+      <m:oMath>
+        <m:r>
+          <w:rPr>
+            <w:rFonts w:ascii="Cambria Math" w:hAnsi="Cambria Math" w:cs="Calibri"/>
+            <w:sz w:val="22"/>
+            <w:szCs w:val="22"/>
+          </w:rPr>
+          <m:t>1.16739</m:t>
+        </m:r>
+      </m:oMath>
+      <w:r>
+        <w:rPr>
+          <w:rFonts w:asciiTheme="minorHAnsi" w:hAnsiTheme="minorHAnsi" w:cs="Calibri"/>
+          <w:sz w:val="22"/>
+          <w:szCs w:val="22"/>
+        </w:rPr>
+        <w:t xml:space="preserve"> was applied to scale the daily average to our target </w:t>
+      </w:r>
+      <m:oMath>
+        <m:r>
+          <w:rPr>
+            <w:rFonts w:ascii="Cambria Math" w:hAnsi="Cambria Math" w:cs="Calibri"/>
+            <w:sz w:val="22"/>
+            <w:szCs w:val="22"/>
+          </w:rPr>
+          <m:t>45 %</m:t>
+        </m:r>
+      </m:oMath>
+      <w:r>
+        <w:rPr>
+          <w:rFonts w:asciiTheme="minorHAnsi" w:hAnsiTheme="minorHAnsi" w:cs="Calibri"/>
+          <w:sz w:val="22"/>
+          <w:szCs w:val="22"/>
+        </w:rPr>
+        <w:t xml:space="preserve"> Capacity Factor.</w:t>
+      </w:r>
+    </w:p>
+    <w:p>
+      <w:pPr>
+        <w:pStyle w:val="StandardWeb"/>
+        <w:numPr>
+          <w:ilvl w:val="0"/>
+          <w:numId w:val="9"/>
+        </w:numPr>
+        <w:rPr>
+          <w:rFonts w:asciiTheme="minorHAnsi" w:hAnsiTheme="minorHAnsi" w:cs="Calibri"/>
+          <w:sz w:val="22"/>
+          <w:szCs w:val="22"/>
+        </w:rPr>
+      </w:pPr>
+      <w:r>
+        <w:rPr>
+          <w:rFonts w:asciiTheme="minorHAnsi" w:hAnsiTheme="minorHAnsi" w:cs="Calibri"/>
+          <w:sz w:val="22"/>
+          <w:szCs w:val="22"/>
+        </w:rPr>
+        <w:t>Energy Scaling: The calibrated factors were multiplied by the farm capacity (</w:t>
+      </w:r>
+      <m:oMath>
+        <m:r>
+          <w:rPr>
+            <w:rFonts w:ascii="Cambria Math" w:hAnsi="Cambria Math" w:cs="Calibri"/>
+            <w:sz w:val="22"/>
+            <w:szCs w:val="22"/>
+          </w:rPr>
+          <m:t>2.9 MW</m:t>
+        </m:r>
+      </m:oMath>
+      <w:r>
+        <w:rPr>
+          <w:rFonts w:asciiTheme="minorHAnsi" w:hAnsiTheme="minorHAnsi" w:cs="Calibri"/>
+          <w:sz w:val="22"/>
+          <w:szCs w:val="22"/>
+        </w:rPr>
+        <w:t>) to generate the final hourly energy output (MWh).</w:t>
+      </w:r>
+    </w:p>
+    <w:p>
+      <w:pPr>
+        <w:pStyle w:val="StandardWeb"/>
+        <w:rPr>
+          <w:rFonts w:asciiTheme="minorHAnsi" w:hAnsiTheme="minorHAnsi" w:cs="Calibri"/>
+          <w:sz w:val="22"/>
+          <w:szCs w:val="22"/>
+        </w:rPr>
+      </w:pPr>
+      <w:r>
+        <w:rPr>
+          <w:rFonts w:asciiTheme="minorHAnsi" w:hAnsiTheme="minorHAnsi" w:cs="Calibri"/>
+          <w:sz w:val="22"/>
+          <w:szCs w:val="22"/>
+        </w:rPr>
+        <w:t>The resulting profile ensures the total energy output over 24 hours is exactly</w:t>
+      </w:r>
+      <w:r>
+        <w:rPr>
+          <w:rStyle w:val="math-inline"/>
+          <w:rFonts w:asciiTheme="minorHAnsi" w:eastAsiaTheme="majorEastAsia" w:hAnsiTheme="minorHAnsi" w:cs="Calibri"/>
+          <w:sz w:val="22"/>
+          <w:szCs w:val="22"/>
+        </w:rPr>
+        <w:t xml:space="preserve"> </w:t>
+      </w:r>
+      <m:oMath>
+        <m:r>
+          <w:rPr>
+            <w:rStyle w:val="math-inline"/>
+            <w:rFonts w:ascii="Cambria Math" w:eastAsiaTheme="majorEastAsia" w:hAnsi="Cambria Math" w:cs="Calibri"/>
+            <w:sz w:val="22"/>
+            <w:szCs w:val="22"/>
+          </w:rPr>
+          <m:t>2.9 MW*0.45*24</m:t>
+        </m:r>
+        <m:r>
+          <w:rPr>
+            <w:rStyle w:val="math-inline"/>
+            <w:rFonts w:ascii="Cambria Math" w:eastAsiaTheme="majorEastAsia" w:hAnsi="Cambria Math" w:cs="Calibri"/>
+            <w:sz w:val="22"/>
+            <w:szCs w:val="22"/>
+          </w:rPr>
+          <m:t xml:space="preserve"> </m:t>
+        </m:r>
+        <m:r>
+          <w:rPr>
+            <w:rStyle w:val="math-inline"/>
+            <w:rFonts w:ascii="Cambria Math" w:eastAsiaTheme="majorEastAsia" w:hAnsi="Cambria Math" w:cs="Calibri"/>
+            <w:sz w:val="22"/>
+            <w:szCs w:val="22"/>
+          </w:rPr>
+          <m:t>hr</m:t>
+        </m:r>
+      </m:oMath>
+      <w:r>
+        <w:rPr>
+          <w:rFonts w:asciiTheme="minorHAnsi" w:hAnsiTheme="minorHAnsi" w:cs="Calibri"/>
+          <w:sz w:val="22"/>
+          <w:szCs w:val="22"/>
+        </w:rPr>
+        <w:t xml:space="preserve">, with no hourly peak exceeding the </w:t>
+      </w:r>
+      <m:oMath>
+        <m:r>
+          <w:rPr>
+            <w:rFonts w:ascii="Cambria Math" w:hAnsi="Cambria Math" w:cs="Calibri"/>
+            <w:sz w:val="22"/>
+            <w:szCs w:val="22"/>
+          </w:rPr>
+          <m:t>2.9 M</m:t>
+        </m:r>
+        <m:r>
+          <w:rPr>
+            <w:rFonts w:ascii="Cambria Math" w:hAnsi="Cambria Math" w:cs="Calibri"/>
+            <w:sz w:val="22"/>
+            <w:szCs w:val="22"/>
+          </w:rPr>
+          <m:t>W</m:t>
+        </m:r>
+      </m:oMath>
+      <w:r>
+        <w:rPr>
+          <w:rFonts w:asciiTheme="minorHAnsi" w:hAnsiTheme="minorHAnsi" w:cs="Calibri"/>
+          <w:sz w:val="22"/>
+          <w:szCs w:val="22"/>
+        </w:rPr>
+        <w:t>.</w:t>
       </w:r>
     </w:p>
     <w:p>
@@ -63,15 +517,7 @@
         </w:numPr>
       </w:pPr>
       <w:r>
-        <w:t xml:space="preserve">The </w:t>
-      </w:r>
-      <w:proofErr w:type="spellStart"/>
-      <w:r>
-        <w:t>electrolyzer</w:t>
-      </w:r>
-      <w:proofErr w:type="spellEnd"/>
-      <w:r>
-        <w:t xml:space="preserve"> plant has a capacity of </w:t>
+        <w:t xml:space="preserve">The electrolyzer plant has a capacity of </w:t>
       </w:r>
       <m:oMath>
         <m:r>
@@ -96,21 +542,13 @@
         </m:r>
       </m:oMath>
       <w:r>
-        <w:t xml:space="preserve"> </w:t>
-      </w:r>
-      <w:proofErr w:type="spellStart"/>
-      <w:r>
-        <w:t>Berlevag</w:t>
-      </w:r>
-      <w:proofErr w:type="spellEnd"/>
-      <w:r>
-        <w:t xml:space="preserve"> project </w:t>
+        <w:t xml:space="preserve"> Berlevag project </w:t>
       </w:r>
       <w:r>
         <w:fldChar w:fldCharType="begin"/>
       </w:r>
       <w:r>
-        <w:instrText xml:space="preserve"> ADDIN ZOTERO_ITEM CSL_CITATION {"citationID":"Bpri0Alh","properties":{"formattedCitation":"[1], [2]","plainCitation":"[1], [2]","noteIndex":0},"citationItems":[{"id":350,"uris":["http://zotero.org/groups/6447497/items/IWK8SNRJ"],"itemData":{"id":350,"type":"webpage","abstract":"NIB has signed a seven-year loan agreement with Norwegian utility company Varanger Kraft to upgrade their hydrogen facility for commercial operations and improve the electricity distribution network…","container-title":"Nordic Investment Bank","language":"en","title":"NIB lends to Varanger Kraft´s hydrogen and power grid projects","URL":"https://www.nib.int/news/nib-lends-to-varanger-krafts-hydrogen-and-power-grid-projects/","accessed":{"date-parts":[["2026",3,8]]}}},{"id":354,"uris":["http://zotero.org/groups/6447497/items/XLXEC6E7"],"itemData":{"id":354,"type":"webpage","abstract":"Latest report summary","container-title":"CORDIS | European Commission","language":"en","title":"Hydrogen-Aeolic Energy with Optimised eLectrolysers Upstream of Substation | H2020","URL":"https://cordis.europa.eu/project/id/779469/reporting","accessed":{"date-parts":[["2026",3,8]]}}}],"schema":"https://github.com/citation-style-language/schema/raw/master/csl-citation.json"} </w:instrText>
+        <w:instrText xml:space="preserve"> ADDIN ZOTERO_ITEM CSL_CITATION {"citationID":"Bpri0Alh","properties":{"formattedCitation":"[3], [4]","plainCitation":"[3], [4]","noteIndex":0},"citationItems":[{"id":350,"uris":["http://zotero.org/groups/6447497/items/IWK8SNRJ"],"itemData":{"id":350,"type":"webpage","abstract":"NIB has signed a seven-year loan agreement with Norwegian utility company Varanger Kraft to upgrade their hydrogen facility for commercial operations and improve the electricity distribution network…","container-title":"Nordic Investment Bank","language":"en","title":"NIB lends to Varanger Kraft´s hydrogen and power grid projects","URL":"https://www.nib.int/news/nib-lends-to-varanger-krafts-hydrogen-and-power-grid-projects/","accessed":{"date-parts":[["2026",3,8]]}}},{"id":354,"uris":["http://zotero.org/groups/6447497/items/XLXEC6E7"],"itemData":{"id":354,"type":"webpage","abstract":"Latest report summary","container-title":"CORDIS | European Commission","language":"en","title":"Hydrogen-Aeolic Energy with Optimised eLectrolysers Upstream of Substation | H2020","URL":"https://cordis.europa.eu/project/id/779469/reporting","accessed":{"date-parts":[["2026",3,8]]}}}],"schema":"https://github.com/citation-style-language/schema/raw/master/csl-citation.json"} </w:instrText>
       </w:r>
       <w:r>
         <w:fldChar w:fldCharType="separate"/>
@@ -119,7 +557,7 @@
         <w:rPr>
           <w:rFonts w:ascii="Aptos" w:hAnsi="Aptos"/>
         </w:rPr>
-        <w:t>[1], [2]</w:t>
+        <w:t>[3], [4]</w:t>
       </w:r>
       <w:r>
         <w:fldChar w:fldCharType="end"/>
@@ -134,15 +572,7 @@
         </w:numPr>
       </w:pPr>
       <w:r>
-        <w:t xml:space="preserve">The </w:t>
-      </w:r>
-      <w:proofErr w:type="spellStart"/>
-      <w:r>
-        <w:t>electrolyzer</w:t>
-      </w:r>
-      <w:proofErr w:type="spellEnd"/>
-      <w:r>
-        <w:t xml:space="preserve"> plant is PEM, with an efficiency of </w:t>
+        <w:t xml:space="preserve">The electrolyzer plant is PEM, with an efficiency of </w:t>
       </w:r>
       <m:oMath>
         <m:r>
@@ -211,7 +641,7 @@
         <w:fldChar w:fldCharType="begin"/>
       </w:r>
       <w:r>
-        <w:instrText xml:space="preserve"> ADDIN ZOTERO_ITEM CSL_CITATION {"citationID":"h8ABuPI3","properties":{"formattedCitation":"[3]","plainCitation":"[3]","noteIndex":0},"citationItems":[{"id":345,"uris":["http://zotero.org/groups/6447497/items/QHKRSVM4"],"itemData":{"id":345,"type":"document","title":"PowerPoint Presentation","URL":"https://www.hydrogen.no/files/documents/medlemsmoter/h2carrier.pdf","accessed":{"date-parts":[["2026",3,6]]}}}],"schema":"https://github.com/citation-style-language/schema/raw/master/csl-citation.json"} </w:instrText>
+        <w:instrText xml:space="preserve"> ADDIN ZOTERO_ITEM CSL_CITATION {"citationID":"h8ABuPI3","properties":{"formattedCitation":"[1]","plainCitation":"[1]","noteIndex":0},"citationItems":[{"id":345,"uris":["http://zotero.org/groups/6447497/items/QHKRSVM4"],"itemData":{"id":345,"type":"document","title":"PowerPoint Presentation","URL":"https://www.hydrogen.no/files/documents/medlemsmoter/h2carrier.pdf","accessed":{"date-parts":[["2026",3,6]]}}}],"schema":"https://github.com/citation-style-language/schema/raw/master/csl-citation.json"} </w:instrText>
       </w:r>
       <w:r>
         <w:fldChar w:fldCharType="separate"/>
@@ -220,7 +650,7 @@
         <w:rPr>
           <w:rFonts w:ascii="Aptos" w:hAnsi="Aptos"/>
         </w:rPr>
-        <w:t>[3]</w:t>
+        <w:t>[1]</w:t>
       </w:r>
       <w:r>
         <w:fldChar w:fldCharType="end"/>
@@ -273,7 +703,7 @@
         <w:fldChar w:fldCharType="begin"/>
       </w:r>
       <w:r>
-        <w:instrText xml:space="preserve"> ADDIN ZOTERO_ITEM CSL_CITATION {"citationID":"iMCWyHp0","properties":{"formattedCitation":"[3]","plainCitation":"[3]","noteIndex":0},"citationItems":[{"id":345,"uris":["http://zotero.org/groups/6447497/items/QHKRSVM4"],"itemData":{"id":345,"type":"document","title":"PowerPoint Presentation","URL":"https://www.hydrogen.no/files/documents/medlemsmoter/h2carrier.pdf","accessed":{"date-parts":[["2026",3,6]]}}}],"schema":"https://github.com/citation-style-language/schema/raw/master/csl-citation.json"} </w:instrText>
+        <w:instrText xml:space="preserve"> ADDIN ZOTERO_ITEM CSL_CITATION {"citationID":"iMCWyHp0","properties":{"formattedCitation":"[1]","plainCitation":"[1]","noteIndex":0},"citationItems":[{"id":345,"uris":["http://zotero.org/groups/6447497/items/QHKRSVM4"],"itemData":{"id":345,"type":"document","title":"PowerPoint Presentation","URL":"https://www.hydrogen.no/files/documents/medlemsmoter/h2carrier.pdf","accessed":{"date-parts":[["2026",3,6]]}}}],"schema":"https://github.com/citation-style-language/schema/raw/master/csl-citation.json"} </w:instrText>
       </w:r>
       <w:r>
         <w:fldChar w:fldCharType="separate"/>
@@ -282,7 +712,7 @@
         <w:rPr>
           <w:rFonts w:ascii="Aptos" w:hAnsi="Aptos"/>
         </w:rPr>
-        <w:t>[3]</w:t>
+        <w:t>[1]</w:t>
       </w:r>
       <w:r>
         <w:fldChar w:fldCharType="end"/>
@@ -376,7 +806,7 @@
         <w:fldChar w:fldCharType="begin"/>
       </w:r>
       <w:r>
-        <w:instrText xml:space="preserve"> ADDIN ZOTERO_ITEM CSL_CITATION {"citationID":"BHx8jqpG","properties":{"formattedCitation":"[4]","plainCitation":"[4]","noteIndex":0},"citationItems":[{"id":346,"uris":["http://zotero.org/groups/6447497/items/FZ4WD9MC"],"itemData":{"id":346,"type":"post-weblog","abstract":"In aquatic animals, blood hemo-globin unloads oxygen to the tissue fluids. Coldwater species have higher dissolved-oxygen concentration requirements than warmwater species do.","container-title":"Global Seafood Alliance","language":"en-US","title":"Dissolved oxygen requirements in aquatic animal respiration - Responsible Seafood Advocate","URL":"https://www.globalseafood.org/advocate/dissolved-oxygen-requirements-in-aquatic-animal-respiration/","accessed":{"date-parts":[["2026",3,6]]},"issued":{"date-parts":[["2011",11,1]]}}}],"schema":"https://github.com/citation-style-language/schema/raw/master/csl-citation.json"} </w:instrText>
+        <w:instrText xml:space="preserve"> ADDIN ZOTERO_ITEM CSL_CITATION {"citationID":"BHx8jqpG","properties":{"formattedCitation":"[5]","plainCitation":"[5]","noteIndex":0},"citationItems":[{"id":346,"uris":["http://zotero.org/groups/6447497/items/FZ4WD9MC"],"itemData":{"id":346,"type":"post-weblog","abstract":"In aquatic animals, blood hemo-globin unloads oxygen to the tissue fluids. Coldwater species have higher dissolved-oxygen concentration requirements than warmwater species do.","container-title":"Global Seafood Alliance","language":"en-US","title":"Dissolved oxygen requirements in aquatic animal respiration - Responsible Seafood Advocate","URL":"https://www.globalseafood.org/advocate/dissolved-oxygen-requirements-in-aquatic-animal-respiration/","accessed":{"date-parts":[["2026",3,6]]},"issued":{"date-parts":[["2011",11,1]]}}}],"schema":"https://github.com/citation-style-language/schema/raw/master/csl-citation.json"} </w:instrText>
       </w:r>
       <w:r>
         <w:fldChar w:fldCharType="separate"/>
@@ -385,7 +815,7 @@
         <w:rPr>
           <w:rFonts w:ascii="Aptos" w:hAnsi="Aptos"/>
         </w:rPr>
-        <w:t>[4]</w:t>
+        <w:t>[5]</w:t>
       </w:r>
       <w:r>
         <w:fldChar w:fldCharType="end"/>
@@ -432,7 +862,7 @@
         <w:fldChar w:fldCharType="begin"/>
       </w:r>
       <w:r>
-        <w:instrText xml:space="preserve"> ADDIN ZOTERO_ITEM CSL_CITATION {"citationID":"kHqLTQgV","properties":{"formattedCitation":"[5]","plainCitation":"[5]","noteIndex":0},"citationItems":[{"id":348,"uris":["http://zotero.org/groups/6447497/items/N4356IC4"],"itemData":{"id":348,"type":"webpage","abstract":"The pens provide space for the fish in our farms to thrive, grow healthy and express normal patterns of behavior.","title":"Fish density on our farms","URL":"https://griegseafood.com/our-impact-fish-density-on-our-farms","accessed":{"date-parts":[["2026",3,7]]}}}],"schema":"https://github.com/citation-style-language/schema/raw/master/csl-citation.json"} </w:instrText>
+        <w:instrText xml:space="preserve"> ADDIN ZOTERO_ITEM CSL_CITATION {"citationID":"kHqLTQgV","properties":{"formattedCitation":"[6]","plainCitation":"[6]","noteIndex":0},"citationItems":[{"id":348,"uris":["http://zotero.org/groups/6447497/items/N4356IC4"],"itemData":{"id":348,"type":"webpage","abstract":"The pens provide space for the fish in our farms to thrive, grow healthy and express normal patterns of behavior.","title":"Fish density on our farms","URL":"https://griegseafood.com/our-impact-fish-density-on-our-farms","accessed":{"date-parts":[["2026",3,7]]}}}],"schema":"https://github.com/citation-style-language/schema/raw/master/csl-citation.json"} </w:instrText>
       </w:r>
       <w:r>
         <w:fldChar w:fldCharType="separate"/>
@@ -441,7 +871,7 @@
         <w:rPr>
           <w:rFonts w:ascii="Aptos" w:hAnsi="Aptos"/>
         </w:rPr>
-        <w:t>[5]</w:t>
+        <w:t>[6]</w:t>
       </w:r>
       <w:r>
         <w:fldChar w:fldCharType="end"/>
@@ -613,6 +1043,7 @@
         <w:rPr>
           <w:rFonts w:eastAsiaTheme="minorEastAsia"/>
         </w:rPr>
+        <w:lastRenderedPageBreak/>
         <w:t>The energy produced</w:t>
       </w:r>
       <w:r>
@@ -1427,7 +1858,6 @@
                 <w:szCs w:val="24"/>
               </w:rPr>
             </w:pPr>
-            <w:proofErr w:type="spellStart"/>
             <w:r>
               <w:rPr>
                 <w:rFonts w:ascii="Calibri" w:hAnsi="Calibri" w:cs="Calibri"/>
@@ -1436,7 +1866,6 @@
               </w:rPr>
               <w:t>P_Electrolyzer</w:t>
             </w:r>
-            <w:proofErr w:type="spellEnd"/>
           </w:p>
         </w:tc>
         <w:tc>
@@ -1497,7 +1926,7 @@
                 <w:sz w:val="24"/>
                 <w:szCs w:val="24"/>
               </w:rPr>
-              <w:t>the power uptake of a</w:t>
+              <w:t xml:space="preserve">the power </w:t>
             </w:r>
             <w:r>
               <w:rPr>
@@ -1505,7 +1934,25 @@
                 <w:sz w:val="24"/>
                 <w:szCs w:val="24"/>
               </w:rPr>
-              <w:t xml:space="preserve"> 2.5 MW industrial pilot scale</w:t>
+              <w:t xml:space="preserve">output of a </w:t>
+            </w:r>
+            <m:oMath>
+              <m:r>
+                <w:rPr>
+                  <w:rFonts w:ascii="Cambria Math" w:hAnsi="Cambria Math" w:cs="Calibri"/>
+                  <w:sz w:val="24"/>
+                  <w:szCs w:val="24"/>
+                </w:rPr>
+                <m:t>2.9 MW</m:t>
+              </m:r>
+            </m:oMath>
+            <w:r>
+              <w:rPr>
+                <w:rFonts w:ascii="Calibri" w:hAnsi="Calibri" w:cs="Calibri"/>
+                <w:sz w:val="24"/>
+                <w:szCs w:val="24"/>
+              </w:rPr>
+              <w:t xml:space="preserve"> </w:t>
             </w:r>
             <w:r>
               <w:rPr>
@@ -1513,25 +1960,49 @@
                 <w:sz w:val="24"/>
                 <w:szCs w:val="24"/>
               </w:rPr>
-              <w:t xml:space="preserve"> PEM </w:t>
+              <w:t>wind farm for</w:t>
             </w:r>
-            <w:proofErr w:type="spellStart"/>
             <w:r>
               <w:rPr>
                 <w:rFonts w:ascii="Calibri" w:hAnsi="Calibri" w:cs="Calibri"/>
                 <w:sz w:val="24"/>
                 <w:szCs w:val="24"/>
               </w:rPr>
-              <w:t>electrolyzer</w:t>
+              <w:t xml:space="preserve"> a</w:t>
             </w:r>
-            <w:proofErr w:type="spellEnd"/>
             <w:r>
               <w:rPr>
                 <w:rFonts w:ascii="Calibri" w:hAnsi="Calibri" w:cs="Calibri"/>
                 <w:sz w:val="24"/>
                 <w:szCs w:val="24"/>
               </w:rPr>
-              <w:t xml:space="preserve"> plant. </w:t>
+              <w:t xml:space="preserve"> </w:t>
+            </w:r>
+            <m:oMath>
+              <m:r>
+                <w:rPr>
+                  <w:rFonts w:ascii="Cambria Math" w:hAnsi="Cambria Math" w:cs="Calibri"/>
+                  <w:sz w:val="24"/>
+                  <w:szCs w:val="24"/>
+                </w:rPr>
+                <m:t>2.5 MW</m:t>
+              </m:r>
+            </m:oMath>
+            <w:r>
+              <w:rPr>
+                <w:rFonts w:ascii="Calibri" w:hAnsi="Calibri" w:cs="Calibri"/>
+                <w:sz w:val="24"/>
+                <w:szCs w:val="24"/>
+              </w:rPr>
+              <w:t xml:space="preserve"> industrial pilot scale</w:t>
+            </w:r>
+            <w:r>
+              <w:rPr>
+                <w:rFonts w:ascii="Calibri" w:hAnsi="Calibri" w:cs="Calibri"/>
+                <w:sz w:val="24"/>
+                <w:szCs w:val="24"/>
+              </w:rPr>
+              <w:t xml:space="preserve"> PEM electrolyzer plant. </w:t>
             </w:r>
             <w:r>
               <w:rPr>
@@ -1547,7 +2018,7 @@
                 <w:sz w:val="24"/>
                 <w:szCs w:val="24"/>
               </w:rPr>
-              <w:instrText xml:space="preserve"> ADDIN ZOTERO_ITEM CSL_CITATION {"citationID":"DSsI2lzZ","properties":{"formattedCitation":"[6]","plainCitation":"[6]","noteIndex":0},"citationItems":[{"id":343,"uris":["http://zotero.org/groups/6447497/items/SRB46M8K"],"itemData":{"id":343,"type":"post-weblog","language":"en-GB","title":"Haeolus – Hydrogen-Aeolic Energy with Optimised eLectrolysers Upstream of Substation","URL":"https://haeolus.eu/","accessed":{"date-parts":[["2026",3,6]]},"issued":{"date-parts":[["2024",1,8]]}}}],"schema":"https://github.com/citation-style-language/schema/raw/master/csl-citation.json"} </w:instrText>
+              <w:instrText xml:space="preserve"> ADDIN ZOTERO_ITEM CSL_CITATION {"citationID":"DSsI2lzZ","properties":{"formattedCitation":"[7]","plainCitation":"[7]","noteIndex":0},"citationItems":[{"id":343,"uris":["http://zotero.org/groups/6447497/items/SRB46M8K"],"itemData":{"id":343,"type":"post-weblog","language":"en-GB","title":"Haeolus – Hydrogen-Aeolic Energy with Optimised eLectrolysers Upstream of Substation","URL":"https://haeolus.eu/","accessed":{"date-parts":[["2026",3,6]]},"issued":{"date-parts":[["2024",1,8]]}}}],"schema":"https://github.com/citation-style-language/schema/raw/master/csl-citation.json"} </w:instrText>
             </w:r>
             <w:r>
               <w:rPr>
@@ -1562,7 +2033,7 @@
                 <w:rFonts w:ascii="Calibri" w:hAnsi="Calibri" w:cs="Calibri"/>
                 <w:sz w:val="24"/>
               </w:rPr>
-              <w:t>[6]</w:t>
+              <w:t>[7]</w:t>
             </w:r>
             <w:r>
               <w:rPr>
@@ -1593,17 +2064,14 @@
                 <w:szCs w:val="24"/>
               </w:rPr>
             </w:pPr>
-            <w:proofErr w:type="spellStart"/>
             <w:r>
               <w:rPr>
                 <w:rFonts w:ascii="Calibri" w:hAnsi="Calibri" w:cs="Calibri"/>
                 <w:sz w:val="24"/>
                 <w:szCs w:val="24"/>
               </w:rPr>
-              <w:lastRenderedPageBreak/>
               <w:t>Eff_Electrolyzer</w:t>
             </w:r>
-            <w:proofErr w:type="spellEnd"/>
           </w:p>
         </w:tc>
         <w:tc>
@@ -1648,25 +2116,7 @@
                 <w:sz w:val="24"/>
                 <w:szCs w:val="24"/>
               </w:rPr>
-              <w:t xml:space="preserve">Standard efficiency for modern alkaline or PEM </w:t>
-            </w:r>
-            <w:proofErr w:type="spellStart"/>
-            <w:r>
-              <w:rPr>
-                <w:rFonts w:ascii="Calibri" w:hAnsi="Calibri" w:cs="Calibri"/>
-                <w:sz w:val="24"/>
-                <w:szCs w:val="24"/>
-              </w:rPr>
-              <w:t>electrolyzers</w:t>
-            </w:r>
-            <w:proofErr w:type="spellEnd"/>
-            <w:r>
-              <w:rPr>
-                <w:rFonts w:ascii="Calibri" w:hAnsi="Calibri" w:cs="Calibri"/>
-                <w:sz w:val="24"/>
-                <w:szCs w:val="24"/>
-              </w:rPr>
-              <w:t>. The remaining 30% is lost as heat, which we capture.</w:t>
+              <w:t>Standard efficiency for modern alkaline or PEM electrolyzers. The remaining 30% is lost as heat, which we capture.</w:t>
             </w:r>
           </w:p>
         </w:tc>
@@ -1689,7 +2139,6 @@
                 <w:szCs w:val="24"/>
               </w:rPr>
             </w:pPr>
-            <w:proofErr w:type="spellStart"/>
             <w:r>
               <w:rPr>
                 <w:rFonts w:ascii="Calibri" w:hAnsi="Calibri" w:cs="Calibri"/>
@@ -1698,7 +2147,6 @@
               </w:rPr>
               <w:t>Delta_h</w:t>
             </w:r>
-            <w:proofErr w:type="spellEnd"/>
           </w:p>
         </w:tc>
         <w:tc>
@@ -1849,7 +2297,6 @@
                 <w:szCs w:val="24"/>
               </w:rPr>
             </w:pPr>
-            <w:proofErr w:type="spellStart"/>
             <w:r>
               <w:rPr>
                 <w:rFonts w:ascii="Calibri" w:hAnsi="Calibri" w:cs="Calibri"/>
@@ -1858,7 +2305,6 @@
               </w:rPr>
               <w:t>M_Storage</w:t>
             </w:r>
-            <w:proofErr w:type="spellEnd"/>
           </w:p>
         </w:tc>
         <w:tc>
@@ -1943,7 +2389,6 @@
                 <w:szCs w:val="24"/>
               </w:rPr>
             </w:pPr>
-            <w:proofErr w:type="spellStart"/>
             <w:r>
               <w:rPr>
                 <w:rFonts w:ascii="Calibri" w:hAnsi="Calibri" w:cs="Calibri"/>
@@ -1952,7 +2397,6 @@
               </w:rPr>
               <w:t>CP_Water</w:t>
             </w:r>
-            <w:proofErr w:type="spellEnd"/>
           </w:p>
         </w:tc>
         <w:tc>
@@ -1993,7 +2437,6 @@
               </w:rPr>
               <w:t>kJ/(</w:t>
             </w:r>
-            <w:proofErr w:type="spellStart"/>
             <w:proofErr w:type="gramStart"/>
             <w:r>
               <w:rPr>
@@ -2003,7 +2446,6 @@
               </w:rPr>
               <w:t>kg.K</w:t>
             </w:r>
-            <w:proofErr w:type="spellEnd"/>
             <w:proofErr w:type="gramEnd"/>
             <w:r>
               <w:rPr>
@@ -2682,18 +3124,8 @@
                 <w:sz w:val="24"/>
                 <w:szCs w:val="24"/>
               </w:rPr>
-              <w:t xml:space="preserve">the power </w:t>
+              <w:t>the power intput</w:t>
             </w:r>
-            <w:proofErr w:type="spellStart"/>
-            <w:r>
-              <w:rPr>
-                <w:rFonts w:ascii="Calibri" w:hAnsi="Calibri" w:cs="Calibri"/>
-                <w:sz w:val="24"/>
-                <w:szCs w:val="24"/>
-              </w:rPr>
-              <w:t>intput</w:t>
-            </w:r>
-            <w:proofErr w:type="spellEnd"/>
             <w:r>
               <w:rPr>
                 <w:rFonts w:ascii="Calibri" w:hAnsi="Calibri" w:cs="Calibri"/>
@@ -2708,25 +3140,7 @@
                 <w:sz w:val="24"/>
                 <w:szCs w:val="24"/>
               </w:rPr>
-              <w:t xml:space="preserve"> PEM </w:t>
-            </w:r>
-            <w:proofErr w:type="spellStart"/>
-            <w:r>
-              <w:rPr>
-                <w:rFonts w:ascii="Calibri" w:hAnsi="Calibri" w:cs="Calibri"/>
-                <w:sz w:val="24"/>
-                <w:szCs w:val="24"/>
-              </w:rPr>
-              <w:t>electrolyzer</w:t>
-            </w:r>
-            <w:proofErr w:type="spellEnd"/>
-            <w:r>
-              <w:rPr>
-                <w:rFonts w:ascii="Calibri" w:hAnsi="Calibri" w:cs="Calibri"/>
-                <w:sz w:val="24"/>
-                <w:szCs w:val="24"/>
-              </w:rPr>
-              <w:t xml:space="preserve"> plant. </w:t>
+              <w:t xml:space="preserve"> PEM electrolyzer plant. </w:t>
             </w:r>
             <w:r>
               <w:rPr>
@@ -2742,7 +3156,7 @@
                 <w:sz w:val="24"/>
                 <w:szCs w:val="24"/>
               </w:rPr>
-              <w:instrText xml:space="preserve"> ADDIN ZOTERO_ITEM CSL_CITATION {"citationID":"kVQ6rlnq","properties":{"formattedCitation":"[6]","plainCitation":"[6]","noteIndex":0},"citationItems":[{"id":343,"uris":["http://zotero.org/groups/6447497/items/SRB46M8K"],"itemData":{"id":343,"type":"post-weblog","language":"en-GB","title":"Haeolus – Hydrogen-Aeolic Energy with Optimised eLectrolysers Upstream of Substation","URL":"https://haeolus.eu/","accessed":{"date-parts":[["2026",3,6]]},"issued":{"date-parts":[["2024",1,8]]}}}],"schema":"https://github.com/citation-style-language/schema/raw/master/csl-citation.json"} </w:instrText>
+              <w:instrText xml:space="preserve"> ADDIN ZOTERO_ITEM CSL_CITATION {"citationID":"kVQ6rlnq","properties":{"formattedCitation":"[7]","plainCitation":"[7]","noteIndex":0},"citationItems":[{"id":343,"uris":["http://zotero.org/groups/6447497/items/SRB46M8K"],"itemData":{"id":343,"type":"post-weblog","language":"en-GB","title":"Haeolus – Hydrogen-Aeolic Energy with Optimised eLectrolysers Upstream of Substation","URL":"https://haeolus.eu/","accessed":{"date-parts":[["2026",3,6]]},"issued":{"date-parts":[["2024",1,8]]}}}],"schema":"https://github.com/citation-style-language/schema/raw/master/csl-citation.json"} </w:instrText>
             </w:r>
             <w:r>
               <w:rPr>
@@ -2757,7 +3171,7 @@
                 <w:rFonts w:ascii="Calibri" w:hAnsi="Calibri" w:cs="Calibri"/>
                 <w:sz w:val="24"/>
               </w:rPr>
-              <w:t>[6]</w:t>
+              <w:t>[7]</w:t>
             </w:r>
             <w:r>
               <w:rPr>
@@ -2990,7 +3404,6 @@
         <w:pStyle w:val="berschrift2"/>
       </w:pPr>
       <w:r>
-        <w:lastRenderedPageBreak/>
         <w:t>Equations</w:t>
       </w:r>
     </w:p>
@@ -3840,6 +4253,7 @@
           <w:sz w:val="24"/>
           <w:szCs w:val="24"/>
         </w:rPr>
+        <w:lastRenderedPageBreak/>
         <w:t>Description: It determines the temperature change in the greenhouse (</w:t>
       </w:r>
       <m:oMath>
@@ -4276,21 +4690,7 @@
         <w:rPr>
           <w:rFonts w:ascii="Aptos" w:hAnsi="Aptos"/>
         </w:rPr>
-        <w:t xml:space="preserve">NIB lends to </w:t>
-      </w:r>
-      <w:proofErr w:type="spellStart"/>
-      <w:r>
-        <w:rPr>
-          <w:rFonts w:ascii="Aptos" w:hAnsi="Aptos"/>
-        </w:rPr>
-        <w:t>Varanger</w:t>
-      </w:r>
-      <w:proofErr w:type="spellEnd"/>
-      <w:r>
-        <w:rPr>
-          <w:rFonts w:ascii="Aptos" w:hAnsi="Aptos"/>
-        </w:rPr>
-        <w:t xml:space="preserve"> Kraft´s hydrogen and power grid projects’, Nordic Investment Bank. Accessed: Mar. 08, 2026. [Online]. Available: https://www.nib.int/news/nib-lends-to-varanger-krafts-hydrogen-and-power-grid-projects/</w:t>
+        <w:t>PowerPoint Presentation’. Accessed: Mar. 06, 2026. [Online]. Available: https://www.hydrogen.no/files/documents/medlemsmoter/h2carrier.pdf</w:t>
       </w:r>
     </w:p>
     <w:p>
@@ -4304,42 +4704,42 @@
         <w:rPr>
           <w:rFonts w:ascii="Aptos" w:hAnsi="Aptos"/>
         </w:rPr>
-        <w:t>[2]</w:t>
-      </w:r>
+        <w:t>[2</w:t>
+      </w:r>
+      <w:proofErr w:type="gramStart"/>
       <w:r>
         <w:rPr>
           <w:rFonts w:ascii="Aptos" w:hAnsi="Aptos"/>
         </w:rPr>
+        <w:t>]</w:t>
+      </w:r>
+      <w:r>
+        <w:rPr>
+          <w:rFonts w:ascii="Aptos" w:hAnsi="Aptos"/>
+        </w:rPr>
         <w:tab/>
-        <w:t xml:space="preserve">‘Hydrogen-Aeolic Energy with </w:t>
-      </w:r>
-      <w:proofErr w:type="spellStart"/>
+        <w:t>‘</w:t>
+      </w:r>
+      <w:proofErr w:type="gramEnd"/>
       <w:r>
         <w:rPr>
           <w:rFonts w:ascii="Aptos" w:hAnsi="Aptos"/>
         </w:rPr>
-        <w:t>Optimised</w:t>
-      </w:r>
-      <w:proofErr w:type="spellEnd"/>
+        <w:t xml:space="preserve">Download </w:t>
+      </w:r>
+      <w:proofErr w:type="gramStart"/>
       <w:r>
         <w:rPr>
           <w:rFonts w:ascii="Aptos" w:hAnsi="Aptos"/>
         </w:rPr>
-        <w:t xml:space="preserve"> </w:t>
-      </w:r>
-      <w:proofErr w:type="spellStart"/>
+        <w:t>datasets’</w:t>
+      </w:r>
+      <w:proofErr w:type="gramEnd"/>
       <w:r>
         <w:rPr>
           <w:rFonts w:ascii="Aptos" w:hAnsi="Aptos"/>
         </w:rPr>
-        <w:t>eLectrolysers</w:t>
-      </w:r>
-      <w:proofErr w:type="spellEnd"/>
-      <w:r>
-        <w:rPr>
-          <w:rFonts w:ascii="Aptos" w:hAnsi="Aptos"/>
-        </w:rPr>
-        <w:t xml:space="preserve"> Upstream of Substation | H2020’, CORDIS | European Commission. Accessed: Mar. 08, 2026. [Online]. Available: https://cordis.europa.eu/project/id/779469/reporting</w:t>
+        <w:t>. Accessed: Mar. 09, 2026. [Online]. Available: https://data.fingrid.fi/en/data?datasets=181</w:t>
       </w:r>
     </w:p>
     <w:p>
@@ -4374,7 +4774,7 @@
         <w:rPr>
           <w:rFonts w:ascii="Aptos" w:hAnsi="Aptos"/>
         </w:rPr>
-        <w:t>PowerPoint Presentation’. Accessed: Mar. 06, 2026. [Online]. Available: https://www.hydrogen.no/files/documents/medlemsmoter/h2carrier.pdf</w:t>
+        <w:t>NIB lends to Varanger Kraft´s hydrogen and power grid projects’, Nordic Investment Bank. Accessed: Mar. 08, 2026. [Online]. Available: https://www.nib.int/news/nib-lends-to-varanger-krafts-hydrogen-and-power-grid-projects/</w:t>
       </w:r>
     </w:p>
     <w:p>
@@ -4409,7 +4809,7 @@
         <w:rPr>
           <w:rFonts w:ascii="Aptos" w:hAnsi="Aptos"/>
         </w:rPr>
-        <w:t>Dissolved oxygen requirements in aquatic animal respiration - Responsible Seafood Advocate’, Global Seafood Alliance. Accessed: Mar. 06, 2026. [Online]. Available: https://www.globalseafood.org/advocate/dissolved-oxygen-requirements-in-aquatic-animal-respiration/</w:t>
+        <w:t>Hydrogen-Aeolic Energy with Optimised eLectrolysers Upstream of Substation | H2020’, CORDIS | European Commission. Accessed: Mar. 08, 2026. [Online]. Available: https://cordis.europa.eu/project/id/779469/reporting</w:t>
       </w:r>
     </w:p>
     <w:p>
@@ -4444,7 +4844,7 @@
         <w:rPr>
           <w:rFonts w:ascii="Aptos" w:hAnsi="Aptos"/>
         </w:rPr>
-        <w:t>Fish density on our farms’. Accessed: Mar. 07, 2026. [Online]. Available: https://griegseafood.com/our-impact-fish-density-on-our-farms</w:t>
+        <w:t>Dissolved oxygen requirements in aquatic animal respiration - Responsible Seafood Advocate’, Global Seafood Alliance. Accessed: Mar. 06, 2026. [Online]. Available: https://www.globalseafood.org/advocate/dissolved-oxygen-requirements-in-aquatic-animal-respiration/</w:t>
       </w:r>
     </w:p>
     <w:p>
@@ -4458,7 +4858,14 @@
         <w:rPr>
           <w:rFonts w:ascii="Aptos" w:hAnsi="Aptos"/>
         </w:rPr>
-        <w:t>[6]</w:t>
+        <w:t>[6</w:t>
+      </w:r>
+      <w:proofErr w:type="gramStart"/>
+      <w:r>
+        <w:rPr>
+          <w:rFonts w:ascii="Aptos" w:hAnsi="Aptos"/>
+        </w:rPr>
+        <w:t>]</w:t>
       </w:r>
       <w:r>
         <w:rPr>
@@ -4467,47 +4874,33 @@
         <w:tab/>
         <w:t>‘</w:t>
       </w:r>
-      <w:proofErr w:type="spellStart"/>
+      <w:proofErr w:type="gramEnd"/>
       <w:r>
         <w:rPr>
           <w:rFonts w:ascii="Aptos" w:hAnsi="Aptos"/>
         </w:rPr>
-        <w:t>Haeolus</w:t>
-      </w:r>
-      <w:proofErr w:type="spellEnd"/>
-      <w:r>
+        <w:t>Fish density on our farms’. Accessed: Mar. 07, 2026. [Online]. Available: https://griegseafood.com/our-impact-fish-density-on-our-farms</w:t>
+      </w:r>
+    </w:p>
+    <w:p>
+      <w:pPr>
+        <w:pStyle w:val="Literaturverzeichnis"/>
         <w:rPr>
           <w:rFonts w:ascii="Aptos" w:hAnsi="Aptos"/>
         </w:rPr>
-        <w:t xml:space="preserve"> – Hydrogen-Aeolic Energy with </w:t>
-      </w:r>
-      <w:proofErr w:type="spellStart"/>
+      </w:pPr>
       <w:r>
         <w:rPr>
           <w:rFonts w:ascii="Aptos" w:hAnsi="Aptos"/>
         </w:rPr>
-        <w:t>Optimised</w:t>
-      </w:r>
-      <w:proofErr w:type="spellEnd"/>
+        <w:t>[7]</w:t>
+      </w:r>
       <w:r>
         <w:rPr>
           <w:rFonts w:ascii="Aptos" w:hAnsi="Aptos"/>
         </w:rPr>
-        <w:t xml:space="preserve"> </w:t>
-      </w:r>
-      <w:proofErr w:type="spellStart"/>
-      <w:r>
-        <w:rPr>
-          <w:rFonts w:ascii="Aptos" w:hAnsi="Aptos"/>
-        </w:rPr>
-        <w:t>eLectrolysers</w:t>
-      </w:r>
-      <w:proofErr w:type="spellEnd"/>
-      <w:r>
-        <w:rPr>
-          <w:rFonts w:ascii="Aptos" w:hAnsi="Aptos"/>
-        </w:rPr>
-        <w:t xml:space="preserve"> Upstream of Substation’. Accessed: Mar. 06, 2026. [Online]. Available: https://haeolus.eu/</w:t>
+        <w:tab/>
+        <w:t>‘Haeolus – Hydrogen-Aeolic Energy with Optimised eLectrolysers Upstream of Substation’. Accessed: Mar. 06, 2026. [Online]. Available: https://haeolus.eu/</w:t>
       </w:r>
     </w:p>
     <w:p>
@@ -4732,6 +5125,119 @@
     </w:lvl>
   </w:abstractNum>
   <w:abstractNum w:abstractNumId="2" w15:restartNumberingAfterBreak="0">
+    <w:nsid w:val="167118E9"/>
+    <w:multiLevelType w:val="multilevel"/>
+    <w:tmpl w:val="C512D956"/>
+    <w:lvl w:ilvl="0">
+      <w:start w:val="1"/>
+      <w:numFmt w:val="decimal"/>
+      <w:lvlText w:val="%1."/>
+      <w:lvlJc w:val="left"/>
+      <w:pPr>
+        <w:tabs>
+          <w:tab w:val="num" w:pos="720"/>
+        </w:tabs>
+        <w:ind w:left="720" w:hanging="360"/>
+      </w:pPr>
+    </w:lvl>
+    <w:lvl w:ilvl="1" w:tentative="1">
+      <w:start w:val="1"/>
+      <w:numFmt w:val="decimal"/>
+      <w:lvlText w:val="%2."/>
+      <w:lvlJc w:val="left"/>
+      <w:pPr>
+        <w:tabs>
+          <w:tab w:val="num" w:pos="1440"/>
+        </w:tabs>
+        <w:ind w:left="1440" w:hanging="360"/>
+      </w:pPr>
+    </w:lvl>
+    <w:lvl w:ilvl="2" w:tentative="1">
+      <w:start w:val="1"/>
+      <w:numFmt w:val="decimal"/>
+      <w:lvlText w:val="%3."/>
+      <w:lvlJc w:val="left"/>
+      <w:pPr>
+        <w:tabs>
+          <w:tab w:val="num" w:pos="2160"/>
+        </w:tabs>
+        <w:ind w:left="2160" w:hanging="360"/>
+      </w:pPr>
+    </w:lvl>
+    <w:lvl w:ilvl="3" w:tentative="1">
+      <w:start w:val="1"/>
+      <w:numFmt w:val="decimal"/>
+      <w:lvlText w:val="%4."/>
+      <w:lvlJc w:val="left"/>
+      <w:pPr>
+        <w:tabs>
+          <w:tab w:val="num" w:pos="2880"/>
+        </w:tabs>
+        <w:ind w:left="2880" w:hanging="360"/>
+      </w:pPr>
+    </w:lvl>
+    <w:lvl w:ilvl="4" w:tentative="1">
+      <w:start w:val="1"/>
+      <w:numFmt w:val="decimal"/>
+      <w:lvlText w:val="%5."/>
+      <w:lvlJc w:val="left"/>
+      <w:pPr>
+        <w:tabs>
+          <w:tab w:val="num" w:pos="3600"/>
+        </w:tabs>
+        <w:ind w:left="3600" w:hanging="360"/>
+      </w:pPr>
+    </w:lvl>
+    <w:lvl w:ilvl="5" w:tentative="1">
+      <w:start w:val="1"/>
+      <w:numFmt w:val="decimal"/>
+      <w:lvlText w:val="%6."/>
+      <w:lvlJc w:val="left"/>
+      <w:pPr>
+        <w:tabs>
+          <w:tab w:val="num" w:pos="4320"/>
+        </w:tabs>
+        <w:ind w:left="4320" w:hanging="360"/>
+      </w:pPr>
+    </w:lvl>
+    <w:lvl w:ilvl="6" w:tentative="1">
+      <w:start w:val="1"/>
+      <w:numFmt w:val="decimal"/>
+      <w:lvlText w:val="%7."/>
+      <w:lvlJc w:val="left"/>
+      <w:pPr>
+        <w:tabs>
+          <w:tab w:val="num" w:pos="5040"/>
+        </w:tabs>
+        <w:ind w:left="5040" w:hanging="360"/>
+      </w:pPr>
+    </w:lvl>
+    <w:lvl w:ilvl="7" w:tentative="1">
+      <w:start w:val="1"/>
+      <w:numFmt w:val="decimal"/>
+      <w:lvlText w:val="%8."/>
+      <w:lvlJc w:val="left"/>
+      <w:pPr>
+        <w:tabs>
+          <w:tab w:val="num" w:pos="5760"/>
+        </w:tabs>
+        <w:ind w:left="5760" w:hanging="360"/>
+      </w:pPr>
+    </w:lvl>
+    <w:lvl w:ilvl="8" w:tentative="1">
+      <w:start w:val="1"/>
+      <w:numFmt w:val="decimal"/>
+      <w:lvlText w:val="%9."/>
+      <w:lvlJc w:val="left"/>
+      <w:pPr>
+        <w:tabs>
+          <w:tab w:val="num" w:pos="6480"/>
+        </w:tabs>
+        <w:ind w:left="6480" w:hanging="360"/>
+      </w:pPr>
+    </w:lvl>
+  </w:abstractNum>
+  <w:abstractNum w:abstractNumId="3" w15:restartNumberingAfterBreak="0">
     <w:nsid w:val="1B8B611A"/>
     <w:multiLevelType w:val="hybridMultilevel"/>
     <w:tmpl w:val="4E604F52"/>
@@ -4843,7 +5349,7 @@
       </w:rPr>
     </w:lvl>
   </w:abstractNum>
-  <w:abstractNum w:abstractNumId="3" w15:restartNumberingAfterBreak="0">
+  <w:abstractNum w:abstractNumId="4" w15:restartNumberingAfterBreak="0">
     <w:nsid w:val="440714F5"/>
     <w:multiLevelType w:val="hybridMultilevel"/>
     <w:tmpl w:val="68028FCE"/>
@@ -4956,7 +5462,7 @@
       </w:rPr>
     </w:lvl>
   </w:abstractNum>
-  <w:abstractNum w:abstractNumId="4" w15:restartNumberingAfterBreak="0">
+  <w:abstractNum w:abstractNumId="5" w15:restartNumberingAfterBreak="0">
     <w:nsid w:val="4BEB4CDE"/>
     <w:multiLevelType w:val="hybridMultilevel"/>
     <w:tmpl w:val="53A44D1A"/>
@@ -5069,7 +5575,120 @@
       </w:rPr>
     </w:lvl>
   </w:abstractNum>
-  <w:abstractNum w:abstractNumId="5" w15:restartNumberingAfterBreak="0">
+  <w:abstractNum w:abstractNumId="6" w15:restartNumberingAfterBreak="0">
+    <w:nsid w:val="4F76293B"/>
+    <w:multiLevelType w:val="hybridMultilevel"/>
+    <w:tmpl w:val="3B129D7A"/>
+    <w:lvl w:ilvl="0" w:tplc="56C4EDAA">
+      <w:start w:val="285"/>
+      <w:numFmt w:val="bullet"/>
+      <w:lvlText w:val="-"/>
+      <w:lvlJc w:val="left"/>
+      <w:pPr>
+        <w:ind w:left="720" w:hanging="360"/>
+      </w:pPr>
+      <w:rPr>
+        <w:rFonts w:ascii="Aptos" w:eastAsia="Times New Roman" w:hAnsi="Aptos" w:cs="Calibri" w:hint="default"/>
+      </w:rPr>
+    </w:lvl>
+    <w:lvl w:ilvl="1" w:tplc="04070003" w:tentative="1">
+      <w:start w:val="1"/>
+      <w:numFmt w:val="bullet"/>
+      <w:lvlText w:val="o"/>
+      <w:lvlJc w:val="left"/>
+      <w:pPr>
+        <w:ind w:left="1440" w:hanging="360"/>
+      </w:pPr>
+      <w:rPr>
+        <w:rFonts w:ascii="Courier New" w:hAnsi="Courier New" w:cs="Courier New" w:hint="default"/>
+      </w:rPr>
+    </w:lvl>
+    <w:lvl w:ilvl="2" w:tplc="04070005" w:tentative="1">
+      <w:start w:val="1"/>
+      <w:numFmt w:val="bullet"/>
+      <w:lvlText w:val=""/>
+      <w:lvlJc w:val="left"/>
+      <w:pPr>
+        <w:ind w:left="2160" w:hanging="360"/>
+      </w:pPr>
+      <w:rPr>
+        <w:rFonts w:ascii="Wingdings" w:hAnsi="Wingdings" w:hint="default"/>
+      </w:rPr>
+    </w:lvl>
+    <w:lvl w:ilvl="3" w:tplc="04070001" w:tentative="1">
+      <w:start w:val="1"/>
+      <w:numFmt w:val="bullet"/>
+      <w:lvlText w:val=""/>
+      <w:lvlJc w:val="left"/>
+      <w:pPr>
+        <w:ind w:left="2880" w:hanging="360"/>
+      </w:pPr>
+      <w:rPr>
+        <w:rFonts w:ascii="Symbol" w:hAnsi="Symbol" w:hint="default"/>
+      </w:rPr>
+    </w:lvl>
+    <w:lvl w:ilvl="4" w:tplc="04070003" w:tentative="1">
+      <w:start w:val="1"/>
+      <w:numFmt w:val="bullet"/>
+      <w:lvlText w:val="o"/>
+      <w:lvlJc w:val="left"/>
+      <w:pPr>
+        <w:ind w:left="3600" w:hanging="360"/>
+      </w:pPr>
+      <w:rPr>
+        <w:rFonts w:ascii="Courier New" w:hAnsi="Courier New" w:cs="Courier New" w:hint="default"/>
+      </w:rPr>
+    </w:lvl>
+    <w:lvl w:ilvl="5" w:tplc="04070005" w:tentative="1">
+      <w:start w:val="1"/>
+      <w:numFmt w:val="bullet"/>
+      <w:lvlText w:val=""/>
+      <w:lvlJc w:val="left"/>
+      <w:pPr>
+        <w:ind w:left="4320" w:hanging="360"/>
+      </w:pPr>
+      <w:rPr>
+        <w:rFonts w:ascii="Wingdings" w:hAnsi="Wingdings" w:hint="default"/>
+      </w:rPr>
+    </w:lvl>
+    <w:lvl w:ilvl="6" w:tplc="04070001" w:tentative="1">
+      <w:start w:val="1"/>
+      <w:numFmt w:val="bullet"/>
+      <w:lvlText w:val=""/>
+      <w:lvlJc w:val="left"/>
+      <w:pPr>
+        <w:ind w:left="5040" w:hanging="360"/>
+      </w:pPr>
+      <w:rPr>
+        <w:rFonts w:ascii="Symbol" w:hAnsi="Symbol" w:hint="default"/>
+      </w:rPr>
+    </w:lvl>
+    <w:lvl w:ilvl="7" w:tplc="04070003" w:tentative="1">
+      <w:start w:val="1"/>
+      <w:numFmt w:val="bullet"/>
+      <w:lvlText w:val="o"/>
+      <w:lvlJc w:val="left"/>
+      <w:pPr>
+        <w:ind w:left="5760" w:hanging="360"/>
+      </w:pPr>
+      <w:rPr>
+        <w:rFonts w:ascii="Courier New" w:hAnsi="Courier New" w:cs="Courier New" w:hint="default"/>
+      </w:rPr>
+    </w:lvl>
+    <w:lvl w:ilvl="8" w:tplc="04070005" w:tentative="1">
+      <w:start w:val="1"/>
+      <w:numFmt w:val="bullet"/>
+      <w:lvlText w:val=""/>
+      <w:lvlJc w:val="left"/>
+      <w:pPr>
+        <w:ind w:left="6480" w:hanging="360"/>
+      </w:pPr>
+      <w:rPr>
+        <w:rFonts w:ascii="Wingdings" w:hAnsi="Wingdings" w:hint="default"/>
+      </w:rPr>
+    </w:lvl>
+  </w:abstractNum>
+  <w:abstractNum w:abstractNumId="7" w15:restartNumberingAfterBreak="0">
     <w:nsid w:val="62134925"/>
     <w:multiLevelType w:val="hybridMultilevel"/>
     <w:tmpl w:val="48267200"/>
@@ -5182,7 +5801,7 @@
       </w:rPr>
     </w:lvl>
   </w:abstractNum>
-  <w:abstractNum w:abstractNumId="6" w15:restartNumberingAfterBreak="0">
+  <w:abstractNum w:abstractNumId="8" w15:restartNumberingAfterBreak="0">
     <w:nsid w:val="64A85805"/>
     <w:multiLevelType w:val="hybridMultilevel"/>
     <w:tmpl w:val="B350782C"/>
@@ -5301,18 +5920,24 @@
     <w:abstractNumId w:val="1"/>
   </w:num>
   <w:num w:numId="3" w16cid:durableId="747849293">
+    <w:abstractNumId w:val="5"/>
+  </w:num>
+  <w:num w:numId="4" w16cid:durableId="1199511822">
+    <w:abstractNumId w:val="7"/>
+  </w:num>
+  <w:num w:numId="5" w16cid:durableId="294020813">
+    <w:abstractNumId w:val="3"/>
+  </w:num>
+  <w:num w:numId="6" w16cid:durableId="1710568512">
     <w:abstractNumId w:val="4"/>
   </w:num>
-  <w:num w:numId="4" w16cid:durableId="1199511822">
-    <w:abstractNumId w:val="5"/>
+  <w:num w:numId="7" w16cid:durableId="1540243774">
+    <w:abstractNumId w:val="8"/>
   </w:num>
-  <w:num w:numId="5" w16cid:durableId="294020813">
+  <w:num w:numId="8" w16cid:durableId="2060936850">
     <w:abstractNumId w:val="2"/>
   </w:num>
-  <w:num w:numId="6" w16cid:durableId="1710568512">
-    <w:abstractNumId w:val="3"/>
-  </w:num>
-  <w:num w:numId="7" w16cid:durableId="1540243774">
+  <w:num w:numId="9" w16cid:durableId="754596691">
     <w:abstractNumId w:val="6"/>
   </w:num>
 </w:numbering>
@@ -6327,6 +6952,41 @@
       <w:bCs/>
     </w:rPr>
   </w:style>
+  <w:style w:type="paragraph" w:styleId="StandardWeb">
+    <w:name w:val="Normal (Web)"/>
+    <w:basedOn w:val="Standard"/>
+    <w:uiPriority w:val="99"/>
+    <w:unhideWhenUsed/>
+    <w:rsid w:val="003B0F19"/>
+    <w:pPr>
+      <w:spacing w:before="100" w:beforeAutospacing="1" w:after="100" w:afterAutospacing="1" w:line="240" w:lineRule="auto"/>
+    </w:pPr>
+    <w:rPr>
+      <w:rFonts w:ascii="Times New Roman" w:eastAsia="Times New Roman" w:hAnsi="Times New Roman" w:cs="Times New Roman"/>
+      <w:kern w:val="0"/>
+      <w:sz w:val="24"/>
+      <w:szCs w:val="24"/>
+      <w:lang w:bidi="ar-SA"/>
+      <w14:ligatures w14:val="none"/>
+    </w:rPr>
+  </w:style>
+  <w:style w:type="character" w:customStyle="1" w:styleId="math-inline">
+    <w:name w:val="math-inline"/>
+    <w:basedOn w:val="Absatz-Standardschriftart"/>
+    <w:rsid w:val="003B0F19"/>
+  </w:style>
+  <w:style w:type="character" w:styleId="BesuchterLink">
+    <w:name w:val="FollowedHyperlink"/>
+    <w:basedOn w:val="Absatz-Standardschriftart"/>
+    <w:uiPriority w:val="99"/>
+    <w:semiHidden/>
+    <w:unhideWhenUsed/>
+    <w:rsid w:val="003B0F19"/>
+    <w:rPr>
+      <w:color w:val="96607D" w:themeColor="followedHyperlink"/>
+      <w:u w:val="single"/>
+    </w:rPr>
+  </w:style>
 </w:styles>
 </file>
 

</xml_diff>

<commit_message>
Added in black box diagram
original plan for the model added. Must be altered to match model and then digitalized.
</commit_message>
<xml_diff>
--- a/Key Parameters.docx
+++ b/Key Parameters.docx
@@ -16,7 +16,23 @@
         <w:jc w:val="both"/>
       </w:pPr>
       <w:r>
-        <w:t xml:space="preserve">The model is of a hypothetical hydrogen plant with PEM electrolyzers. The power for plant operation comes from an islanded wind farm with a similar capacity. It is assumed that the heat output of the electrolyzer is very large compared with the oxygen output. Therefore, the fish farm is sized first, based on the oxygen output, and the greenhouse is sized based on the heat remaining after the fish farm demand has been calculated.  </w:t>
+        <w:t xml:space="preserve">The model is of a hypothetical hydrogen plant with PEM </w:t>
+      </w:r>
+      <w:proofErr w:type="spellStart"/>
+      <w:r>
+        <w:t>electrolyzers</w:t>
+      </w:r>
+      <w:proofErr w:type="spellEnd"/>
+      <w:r>
+        <w:t xml:space="preserve">. The power for plant operation comes from an islanded wind farm with a similar capacity. It is assumed that the heat output of the </w:t>
+      </w:r>
+      <w:proofErr w:type="spellStart"/>
+      <w:r>
+        <w:t>electrolyzer</w:t>
+      </w:r>
+      <w:proofErr w:type="spellEnd"/>
+      <w:r>
+        <w:t xml:space="preserve"> is very large compared with the oxygen output. Therefore, the fish farm is sized first, based on the oxygen output, and the greenhouse is sized based on the heat remaining after the fish farm demand has been calculated.  </w:t>
       </w:r>
     </w:p>
     <w:p>
@@ -32,7 +48,23 @@
           <w:b/>
           <w:bCs/>
         </w:rPr>
-        <w:t>Wind Farm (P_electrolyzer)</w:t>
+        <w:t>Wind Farm (</w:t>
+      </w:r>
+      <w:proofErr w:type="spellStart"/>
+      <w:r>
+        <w:rPr>
+          <w:b/>
+          <w:bCs/>
+        </w:rPr>
+        <w:t>P_electrolyzer</w:t>
+      </w:r>
+      <w:proofErr w:type="spellEnd"/>
+      <w:r>
+        <w:rPr>
+          <w:b/>
+          <w:bCs/>
+        </w:rPr>
+        <w:t>)</w:t>
       </w:r>
     </w:p>
     <w:p>
@@ -82,12 +114,26 @@
         <w:rPr>
           <w:rFonts w:cs="Calibri"/>
         </w:rPr>
-        <w:t xml:space="preserve">. The capacity factor was taken from the same source and the power output over 24 hours was scaled to data from Fingrid </w:t>
-      </w:r>
+        <w:t xml:space="preserve">. The capacity factor was taken from the same source and the power output over 24 hours was scaled to data from </w:t>
+      </w:r>
+      <w:proofErr w:type="spellStart"/>
       <w:r>
         <w:rPr>
           <w:rFonts w:cs="Calibri"/>
         </w:rPr>
+        <w:t>Fingrid</w:t>
+      </w:r>
+      <w:proofErr w:type="spellEnd"/>
+      <w:r>
+        <w:rPr>
+          <w:rFonts w:cs="Calibri"/>
+        </w:rPr>
+        <w:t xml:space="preserve"> </w:t>
+      </w:r>
+      <w:r>
+        <w:rPr>
+          <w:rFonts w:cs="Calibri"/>
+        </w:rPr>
         <w:fldChar w:fldCharType="begin"/>
       </w:r>
       <w:r>
@@ -126,12 +172,14 @@
         </w:rPr>
         <w:t xml:space="preserve">Although </w:t>
       </w:r>
+      <w:proofErr w:type="spellStart"/>
       <w:r>
         <w:rPr>
           <w:rFonts w:cs="Calibri"/>
         </w:rPr>
         <w:t>Fingrid</w:t>
       </w:r>
+      <w:proofErr w:type="spellEnd"/>
       <w:r>
         <w:rPr>
           <w:rFonts w:cs="Calibri"/>
@@ -224,7 +272,25 @@
           <w:sz w:val="22"/>
           <w:szCs w:val="22"/>
         </w:rPr>
-        <w:t>Hourly Averaging: The raw 3-minute real-time production data from Fingrid (March 6th-7th) was aggregated into hourly mean values to provide a consistent daily profile.</w:t>
+        <w:t xml:space="preserve">Hourly Averaging: The raw 3-minute real-time production data from </w:t>
+      </w:r>
+      <w:proofErr w:type="spellStart"/>
+      <w:r>
+        <w:rPr>
+          <w:rFonts w:asciiTheme="minorHAnsi" w:hAnsiTheme="minorHAnsi" w:cs="Calibri"/>
+          <w:sz w:val="22"/>
+          <w:szCs w:val="22"/>
+        </w:rPr>
+        <w:t>Fingrid</w:t>
+      </w:r>
+      <w:proofErr w:type="spellEnd"/>
+      <w:r>
+        <w:rPr>
+          <w:rFonts w:asciiTheme="minorHAnsi" w:hAnsiTheme="minorHAnsi" w:cs="Calibri"/>
+          <w:sz w:val="22"/>
+          <w:szCs w:val="22"/>
+        </w:rPr>
+        <w:t xml:space="preserve"> (March 6th-7th) was aggregated into hourly mean values to provide a consistent daily profile.</w:t>
       </w:r>
     </w:p>
     <w:p>
@@ -484,7 +550,15 @@
         </w:numPr>
       </w:pPr>
       <w:r>
-        <w:t xml:space="preserve">The electrolyzer plant has a capacity of </w:t>
+        <w:t xml:space="preserve">The </w:t>
+      </w:r>
+      <w:proofErr w:type="spellStart"/>
+      <w:r>
+        <w:t>electrolyzer</w:t>
+      </w:r>
+      <w:proofErr w:type="spellEnd"/>
+      <w:r>
+        <w:t xml:space="preserve"> plant has a capacity of </w:t>
       </w:r>
       <m:oMath>
         <m:r>
@@ -539,7 +613,15 @@
         </w:numPr>
       </w:pPr>
       <w:r>
-        <w:t xml:space="preserve">The electrolyzer plant is PEM, with an efficiency of </w:t>
+        <w:t xml:space="preserve">The </w:t>
+      </w:r>
+      <w:proofErr w:type="spellStart"/>
+      <w:r>
+        <w:t>electrolyzer</w:t>
+      </w:r>
+      <w:proofErr w:type="spellEnd"/>
+      <w:r>
+        <w:t xml:space="preserve"> plant is PEM, with an efficiency of </w:t>
       </w:r>
       <m:oMath>
         <m:r>
@@ -1573,6 +1655,7 @@
                 <w:szCs w:val="24"/>
               </w:rPr>
             </w:pPr>
+            <w:proofErr w:type="spellStart"/>
             <w:r>
               <w:rPr>
                 <w:rFonts w:ascii="Calibri" w:hAnsi="Calibri" w:cs="Calibri"/>
@@ -1581,6 +1664,7 @@
               </w:rPr>
               <w:t>P_Electrolyzer</w:t>
             </w:r>
+            <w:proofErr w:type="spellEnd"/>
           </w:p>
         </w:tc>
         <w:tc>
@@ -1709,7 +1793,25 @@
                 <w:sz w:val="24"/>
                 <w:szCs w:val="24"/>
               </w:rPr>
-              <w:t xml:space="preserve"> PEM electrolyzer plant. </w:t>
+              <w:t xml:space="preserve"> PEM </w:t>
+            </w:r>
+            <w:proofErr w:type="spellStart"/>
+            <w:r>
+              <w:rPr>
+                <w:rFonts w:ascii="Calibri" w:hAnsi="Calibri" w:cs="Calibri"/>
+                <w:sz w:val="24"/>
+                <w:szCs w:val="24"/>
+              </w:rPr>
+              <w:t>electrolyzer</w:t>
+            </w:r>
+            <w:proofErr w:type="spellEnd"/>
+            <w:r>
+              <w:rPr>
+                <w:rFonts w:ascii="Calibri" w:hAnsi="Calibri" w:cs="Calibri"/>
+                <w:sz w:val="24"/>
+                <w:szCs w:val="24"/>
+              </w:rPr>
+              <w:t xml:space="preserve"> plant. </w:t>
             </w:r>
             <w:r>
               <w:rPr>
@@ -1771,6 +1873,7 @@
                 <w:szCs w:val="24"/>
               </w:rPr>
             </w:pPr>
+            <w:proofErr w:type="spellStart"/>
             <w:r>
               <w:rPr>
                 <w:rFonts w:ascii="Calibri" w:hAnsi="Calibri" w:cs="Calibri"/>
@@ -1779,6 +1882,7 @@
               </w:rPr>
               <w:t>Eff_Electrolyzer</w:t>
             </w:r>
+            <w:proofErr w:type="spellEnd"/>
           </w:p>
         </w:tc>
         <w:tc>
@@ -1851,8 +1955,18 @@
                 <w:sz w:val="24"/>
                 <w:szCs w:val="24"/>
               </w:rPr>
-              <w:t xml:space="preserve"> alkaline or PEM electrolyzers</w:t>
+              <w:t xml:space="preserve"> alkaline or PEM </w:t>
             </w:r>
+            <w:proofErr w:type="spellStart"/>
+            <w:r>
+              <w:rPr>
+                <w:rFonts w:ascii="Calibri" w:hAnsi="Calibri" w:cs="Calibri"/>
+                <w:sz w:val="24"/>
+                <w:szCs w:val="24"/>
+              </w:rPr>
+              <w:t>electrolyzers</w:t>
+            </w:r>
+            <w:proofErr w:type="spellEnd"/>
             <w:r>
               <w:rPr>
                 <w:rFonts w:ascii="Calibri" w:hAnsi="Calibri" w:cs="Calibri"/>
@@ -1921,6 +2035,7 @@
                 <w:szCs w:val="24"/>
               </w:rPr>
             </w:pPr>
+            <w:proofErr w:type="spellStart"/>
             <w:r>
               <w:rPr>
                 <w:rFonts w:ascii="Calibri" w:hAnsi="Calibri" w:cs="Calibri"/>
@@ -1929,6 +2044,7 @@
               </w:rPr>
               <w:t>Delta_h</w:t>
             </w:r>
+            <w:proofErr w:type="spellEnd"/>
           </w:p>
         </w:tc>
         <w:tc>
@@ -2213,6 +2329,7 @@
                 <w:szCs w:val="24"/>
               </w:rPr>
             </w:pPr>
+            <w:proofErr w:type="spellStart"/>
             <w:r>
               <w:rPr>
                 <w:rFonts w:ascii="Calibri" w:hAnsi="Calibri" w:cs="Calibri"/>
@@ -2221,6 +2338,7 @@
               </w:rPr>
               <w:t>V_tank</w:t>
             </w:r>
+            <w:proofErr w:type="spellEnd"/>
           </w:p>
         </w:tc>
         <w:tc>
@@ -2324,6 +2442,7 @@
                 <w:szCs w:val="24"/>
               </w:rPr>
             </w:pPr>
+            <w:proofErr w:type="spellStart"/>
             <w:r>
               <w:rPr>
                 <w:rFonts w:ascii="Calibri" w:hAnsi="Calibri" w:cs="Calibri"/>
@@ -2332,6 +2451,7 @@
               </w:rPr>
               <w:t>V_greenhouse</w:t>
             </w:r>
+            <w:proofErr w:type="spellEnd"/>
           </w:p>
         </w:tc>
         <w:tc>
@@ -2389,13 +2509,14 @@
                 <w:szCs w:val="24"/>
               </w:rPr>
             </w:pPr>
+            <w:proofErr w:type="spellStart"/>
             <w:r>
               <w:rPr>
                 <w:rFonts w:ascii="Calibri" w:hAnsi="Calibri" w:cs="Calibri"/>
                 <w:sz w:val="24"/>
                 <w:szCs w:val="24"/>
               </w:rPr>
-              <w:t>C</w:t>
+              <w:t>c</w:t>
             </w:r>
             <w:r>
               <w:rPr>
@@ -2429,6 +2550,7 @@
               </w:rPr>
               <w:t>ater</w:t>
             </w:r>
+            <w:proofErr w:type="spellEnd"/>
           </w:p>
         </w:tc>
         <w:tc>
@@ -2556,14 +2678,24 @@
                 <w:szCs w:val="24"/>
               </w:rPr>
             </w:pPr>
+            <w:proofErr w:type="spellStart"/>
             <w:r>
               <w:rPr>
                 <w:rFonts w:ascii="Calibri" w:hAnsi="Calibri" w:cs="Calibri"/>
                 <w:sz w:val="24"/>
                 <w:szCs w:val="24"/>
               </w:rPr>
-              <w:t>Cp_air</w:t>
+              <w:t>c</w:t>
             </w:r>
+            <w:r>
+              <w:rPr>
+                <w:rFonts w:ascii="Calibri" w:hAnsi="Calibri" w:cs="Calibri"/>
+                <w:sz w:val="24"/>
+                <w:szCs w:val="24"/>
+              </w:rPr>
+              <w:t>p_air</w:t>
+            </w:r>
+            <w:proofErr w:type="spellEnd"/>
           </w:p>
         </w:tc>
         <w:tc>
@@ -2794,6 +2926,7 @@
                 <w:szCs w:val="24"/>
               </w:rPr>
             </w:pPr>
+            <w:proofErr w:type="spellStart"/>
             <w:r>
               <w:rPr>
                 <w:rFonts w:ascii="Calibri" w:hAnsi="Calibri" w:cs="Calibri"/>
@@ -2802,6 +2935,7 @@
               </w:rPr>
               <w:t>rho_air</w:t>
             </w:r>
+            <w:proofErr w:type="spellEnd"/>
           </w:p>
         </w:tc>
         <w:tc>
@@ -2929,6 +3063,7 @@
                 <w:szCs w:val="24"/>
               </w:rPr>
             </w:pPr>
+            <w:proofErr w:type="spellStart"/>
             <w:r>
               <w:rPr>
                 <w:rFonts w:ascii="Calibri" w:hAnsi="Calibri" w:cs="Calibri"/>
@@ -2937,6 +3072,7 @@
               </w:rPr>
               <w:t>rho_water</w:t>
             </w:r>
+            <w:proofErr w:type="spellEnd"/>
           </w:p>
         </w:tc>
         <w:tc>
@@ -3491,6 +3627,7 @@
                 <w:szCs w:val="24"/>
               </w:rPr>
             </w:pPr>
+            <w:proofErr w:type="spellStart"/>
             <w:r>
               <w:rPr>
                 <w:rFonts w:ascii="Calibri" w:hAnsi="Calibri" w:cs="Calibri"/>
@@ -3499,6 +3636,7 @@
               </w:rPr>
               <w:t>Q_store</w:t>
             </w:r>
+            <w:proofErr w:type="spellEnd"/>
           </w:p>
         </w:tc>
         <w:tc>
@@ -3570,6 +3708,7 @@
                 <w:szCs w:val="24"/>
               </w:rPr>
             </w:pPr>
+            <w:proofErr w:type="spellStart"/>
             <w:r>
               <w:rPr>
                 <w:rFonts w:ascii="Calibri" w:hAnsi="Calibri" w:cs="Calibri"/>
@@ -3578,6 +3717,7 @@
               </w:rPr>
               <w:t>T_tank</w:t>
             </w:r>
+            <w:proofErr w:type="spellEnd"/>
           </w:p>
         </w:tc>
         <w:tc>
@@ -3649,6 +3789,7 @@
                 <w:szCs w:val="24"/>
               </w:rPr>
             </w:pPr>
+            <w:proofErr w:type="spellStart"/>
             <w:r>
               <w:rPr>
                 <w:rFonts w:ascii="Calibri" w:hAnsi="Calibri" w:cs="Calibri"/>
@@ -3657,6 +3798,7 @@
               </w:rPr>
               <w:t>T_greenhouse</w:t>
             </w:r>
+            <w:proofErr w:type="spellEnd"/>
           </w:p>
         </w:tc>
         <w:tc>
@@ -4174,6 +4316,7 @@
                 <w:szCs w:val="24"/>
               </w:rPr>
             </w:pPr>
+            <w:proofErr w:type="spellStart"/>
             <w:r>
               <w:rPr>
                 <w:rFonts w:ascii="Calibri" w:hAnsi="Calibri" w:cs="Calibri"/>
@@ -4182,6 +4325,7 @@
               </w:rPr>
               <w:t>Q_diss_greenhouse</w:t>
             </w:r>
+            <w:proofErr w:type="spellEnd"/>
           </w:p>
         </w:tc>
         <w:tc>
@@ -4277,6 +4421,7 @@
                 <w:szCs w:val="24"/>
               </w:rPr>
             </w:pPr>
+            <w:proofErr w:type="spellStart"/>
             <w:r>
               <w:rPr>
                 <w:rFonts w:ascii="Calibri" w:hAnsi="Calibri" w:cs="Calibri"/>
@@ -4285,6 +4430,7 @@
               </w:rPr>
               <w:t>Q_diss_tank</w:t>
             </w:r>
+            <w:proofErr w:type="spellEnd"/>
           </w:p>
         </w:tc>
         <w:tc>
@@ -4388,6 +4534,7 @@
                 <w:szCs w:val="24"/>
               </w:rPr>
             </w:pPr>
+            <w:proofErr w:type="spellStart"/>
             <w:r>
               <w:rPr>
                 <w:rFonts w:ascii="Calibri" w:hAnsi="Calibri" w:cs="Calibri"/>
@@ -4396,6 +4543,7 @@
               </w:rPr>
               <w:t>Q_greenhouse_in</w:t>
             </w:r>
+            <w:proofErr w:type="spellEnd"/>
           </w:p>
         </w:tc>
         <w:tc>
@@ -4491,6 +4639,7 @@
                 <w:szCs w:val="24"/>
               </w:rPr>
             </w:pPr>
+            <w:proofErr w:type="spellStart"/>
             <w:r>
               <w:rPr>
                 <w:rFonts w:ascii="Calibri" w:hAnsi="Calibri" w:cs="Calibri"/>
@@ -4499,6 +4648,7 @@
               </w:rPr>
               <w:t>Q_tank_in</w:t>
             </w:r>
+            <w:proofErr w:type="spellEnd"/>
           </w:p>
         </w:tc>
         <w:tc>
@@ -4594,6 +4744,7 @@
                 <w:szCs w:val="24"/>
               </w:rPr>
             </w:pPr>
+            <w:proofErr w:type="spellStart"/>
             <w:r>
               <w:rPr>
                 <w:rFonts w:ascii="Calibri" w:hAnsi="Calibri" w:cs="Calibri"/>
@@ -4602,6 +4753,7 @@
               </w:rPr>
               <w:t>Q_prod</w:t>
             </w:r>
+            <w:proofErr w:type="spellEnd"/>
           </w:p>
         </w:tc>
         <w:tc>
@@ -4700,15 +4852,75 @@
         </w:rPr>
       </w:pPr>
       <w:r>
-        <w:br w:type="page"/>
+        <w:rPr>
+          <w:rFonts w:asciiTheme="majorHAnsi" w:eastAsiaTheme="majorEastAsia" w:hAnsiTheme="majorHAnsi" w:cstheme="majorBidi"/>
+          <w:noProof/>
+          <w:color w:val="0F4761" w:themeColor="accent1" w:themeShade="BF"/>
+          <w:sz w:val="32"/>
+          <w:szCs w:val="32"/>
+        </w:rPr>
+        <w:lastRenderedPageBreak/>
+        <w:drawing>
+          <wp:inline distT="0" distB="0" distL="0" distR="0" wp14:anchorId="0414FD02" wp14:editId="6C32776C">
+            <wp:extent cx="5731510" cy="6144260"/>
+            <wp:effectExtent l="0" t="0" r="2540" b="8890"/>
+            <wp:docPr id="222683927" name="Grafik 2"/>
+            <wp:cNvGraphicFramePr>
+              <a:graphicFrameLocks xmlns:a="http://schemas.openxmlformats.org/drawingml/2006/main" noChangeAspect="1"/>
+            </wp:cNvGraphicFramePr>
+            <a:graphic xmlns:a="http://schemas.openxmlformats.org/drawingml/2006/main">
+              <a:graphicData uri="http://schemas.openxmlformats.org/drawingml/2006/picture">
+                <pic:pic xmlns:pic="http://schemas.openxmlformats.org/drawingml/2006/picture">
+                  <pic:nvPicPr>
+                    <pic:cNvPr id="222683927" name="Grafik 222683927"/>
+                    <pic:cNvPicPr/>
+                  </pic:nvPicPr>
+                  <pic:blipFill>
+                    <a:blip r:embed="rId5">
+                      <a:extLst>
+                        <a:ext uri="{28A0092B-C50C-407E-A947-70E740481C1C}">
+                          <a14:useLocalDpi xmlns:a14="http://schemas.microsoft.com/office/drawing/2010/main" val="0"/>
+                        </a:ext>
+                      </a:extLst>
+                    </a:blip>
+                    <a:stretch>
+                      <a:fillRect/>
+                    </a:stretch>
+                  </pic:blipFill>
+                  <pic:spPr>
+                    <a:xfrm>
+                      <a:off x="0" y="0"/>
+                      <a:ext cx="5731510" cy="6144260"/>
+                    </a:xfrm>
+                    <a:prstGeom prst="rect">
+                      <a:avLst/>
+                    </a:prstGeom>
+                  </pic:spPr>
+                </pic:pic>
+              </a:graphicData>
+            </a:graphic>
+          </wp:inline>
+        </w:drawing>
       </w:r>
     </w:p>
     <w:p>
+      <w:r>
+        <w:t xml:space="preserve">This obviously needs to be digitalized, </w:t>
+      </w:r>
+      <w:proofErr w:type="spellStart"/>
+      <w:r>
+        <w:t>its</w:t>
+      </w:r>
+      <w:proofErr w:type="spellEnd"/>
+      <w:r>
+        <w:t xml:space="preserve"> just preliminary. It’s the original idea. </w:t>
+      </w:r>
+    </w:p>
+    <w:p>
       <w:pPr>
         <w:pStyle w:val="berschrift2"/>
       </w:pPr>
       <w:r>
-        <w:lastRenderedPageBreak/>
         <w:t xml:space="preserve">Key </w:t>
       </w:r>
       <w:r>
@@ -6830,7 +7042,25 @@
           <w:sz w:val="24"/>
           <w:szCs w:val="24"/>
         </w:rPr>
-        <w:t xml:space="preserve"> the efficiency of the electrolyzer. Assumption is that all the electrical energy not used for hydrolysis becomes usable waste heat.</w:t>
+        <w:t xml:space="preserve"> the efficiency of the </w:t>
+      </w:r>
+      <w:proofErr w:type="spellStart"/>
+      <w:r>
+        <w:rPr>
+          <w:rFonts w:ascii="Calibri" w:hAnsi="Calibri" w:cs="Calibri"/>
+          <w:sz w:val="24"/>
+          <w:szCs w:val="24"/>
+        </w:rPr>
+        <w:t>electrolyzer</w:t>
+      </w:r>
+      <w:proofErr w:type="spellEnd"/>
+      <w:r>
+        <w:rPr>
+          <w:rFonts w:ascii="Calibri" w:hAnsi="Calibri" w:cs="Calibri"/>
+          <w:sz w:val="24"/>
+          <w:szCs w:val="24"/>
+        </w:rPr>
+        <w:t>. Assumption is that all the electrical energy not used for hydrolysis becomes usable waste heat.</w:t>
       </w:r>
     </w:p>
     <w:p>
@@ -7745,7 +7975,6 @@
           <w:szCs w:val="24"/>
           <w:lang w:val="en-GB"/>
         </w:rPr>
-        <w:lastRenderedPageBreak/>
         <w:br w:type="page"/>
       </w:r>
     </w:p>
@@ -7835,7 +8064,21 @@
           <w:rFonts w:ascii="Aptos" w:hAnsi="Aptos"/>
         </w:rPr>
         <w:tab/>
-        <w:t>‘NIB lends to Varanger Kraft´s hydrogen and power grid projects’, Nordic Investment Bank. Accessed: Mar. 08, 2026. [Online]. Available: https://www.nib.int/news/nib-lends-to-varanger-krafts-hydrogen-and-power-grid-projects/</w:t>
+        <w:t xml:space="preserve">‘NIB lends to </w:t>
+      </w:r>
+      <w:proofErr w:type="spellStart"/>
+      <w:r>
+        <w:rPr>
+          <w:rFonts w:ascii="Aptos" w:hAnsi="Aptos"/>
+        </w:rPr>
+        <w:t>Varanger</w:t>
+      </w:r>
+      <w:proofErr w:type="spellEnd"/>
+      <w:r>
+        <w:rPr>
+          <w:rFonts w:ascii="Aptos" w:hAnsi="Aptos"/>
+        </w:rPr>
+        <w:t xml:space="preserve"> Kraft´s hydrogen and power grid projects’, Nordic Investment Bank. Accessed: Mar. 08, 2026. [Online]. Available: https://www.nib.int/news/nib-lends-to-varanger-krafts-hydrogen-and-power-grid-projects/</w:t>
       </w:r>
     </w:p>
     <w:p>
@@ -7856,7 +8099,35 @@
           <w:rFonts w:ascii="Aptos" w:hAnsi="Aptos"/>
         </w:rPr>
         <w:tab/>
-        <w:t>‘Hydrogen-Aeolic Energy with Optimised eLectrolysers Upstream of Substation | H2020’, CORDIS | European Commission. Accessed: Mar. 08, 2026. [Online]. Available: https://cordis.europa.eu/project/id/779469/reporting</w:t>
+        <w:t xml:space="preserve">‘Hydrogen-Aeolic Energy with </w:t>
+      </w:r>
+      <w:proofErr w:type="spellStart"/>
+      <w:r>
+        <w:rPr>
+          <w:rFonts w:ascii="Aptos" w:hAnsi="Aptos"/>
+        </w:rPr>
+        <w:t>Optimised</w:t>
+      </w:r>
+      <w:proofErr w:type="spellEnd"/>
+      <w:r>
+        <w:rPr>
+          <w:rFonts w:ascii="Aptos" w:hAnsi="Aptos"/>
+        </w:rPr>
+        <w:t xml:space="preserve"> </w:t>
+      </w:r>
+      <w:proofErr w:type="spellStart"/>
+      <w:r>
+        <w:rPr>
+          <w:rFonts w:ascii="Aptos" w:hAnsi="Aptos"/>
+        </w:rPr>
+        <w:t>eLectrolysers</w:t>
+      </w:r>
+      <w:proofErr w:type="spellEnd"/>
+      <w:r>
+        <w:rPr>
+          <w:rFonts w:ascii="Aptos" w:hAnsi="Aptos"/>
+        </w:rPr>
+        <w:t xml:space="preserve"> Upstream of Substation | H2020’, CORDIS | European Commission. Accessed: Mar. 08, 2026. [Online]. Available: https://cordis.europa.eu/project/id/779469/reporting</w:t>
       </w:r>
     </w:p>
     <w:p>
@@ -7919,7 +8190,49 @@
           <w:rFonts w:ascii="Aptos" w:hAnsi="Aptos"/>
         </w:rPr>
         <w:tab/>
-        <w:t>‘Haeolus – Hydrogen-Aeolic Energy with Optimised eLectrolysers Upstream of Substation’. Accessed: Mar. 06, 2026. [Online]. Available: https://haeolus.eu/</w:t>
+        <w:t>‘</w:t>
+      </w:r>
+      <w:proofErr w:type="spellStart"/>
+      <w:r>
+        <w:rPr>
+          <w:rFonts w:ascii="Aptos" w:hAnsi="Aptos"/>
+        </w:rPr>
+        <w:t>Haeolus</w:t>
+      </w:r>
+      <w:proofErr w:type="spellEnd"/>
+      <w:r>
+        <w:rPr>
+          <w:rFonts w:ascii="Aptos" w:hAnsi="Aptos"/>
+        </w:rPr>
+        <w:t xml:space="preserve"> – Hydrogen-Aeolic Energy with </w:t>
+      </w:r>
+      <w:proofErr w:type="spellStart"/>
+      <w:r>
+        <w:rPr>
+          <w:rFonts w:ascii="Aptos" w:hAnsi="Aptos"/>
+        </w:rPr>
+        <w:t>Optimised</w:t>
+      </w:r>
+      <w:proofErr w:type="spellEnd"/>
+      <w:r>
+        <w:rPr>
+          <w:rFonts w:ascii="Aptos" w:hAnsi="Aptos"/>
+        </w:rPr>
+        <w:t xml:space="preserve"> </w:t>
+      </w:r>
+      <w:proofErr w:type="spellStart"/>
+      <w:r>
+        <w:rPr>
+          <w:rFonts w:ascii="Aptos" w:hAnsi="Aptos"/>
+        </w:rPr>
+        <w:t>eLectrolysers</w:t>
+      </w:r>
+      <w:proofErr w:type="spellEnd"/>
+      <w:r>
+        <w:rPr>
+          <w:rFonts w:ascii="Aptos" w:hAnsi="Aptos"/>
+        </w:rPr>
+        <w:t xml:space="preserve"> Upstream of Substation’. Accessed: Mar. 06, 2026. [Online]. Available: https://haeolus.eu/</w:t>
       </w:r>
     </w:p>
     <w:p>
@@ -7940,7 +8253,49 @@
           <w:rFonts w:ascii="Aptos" w:hAnsi="Aptos"/>
         </w:rPr>
         <w:tab/>
-        <w:t xml:space="preserve">D. Virah-Sawmy, F. J. Beck, and B. Sturmberg, ‘Ignore variability, overestimate hydrogen production – Quantifying the effects of electrolyzer efficiency curves on hydrogen production from renewable energy sources’, </w:t>
+        <w:t xml:space="preserve">D. </w:t>
+      </w:r>
+      <w:proofErr w:type="spellStart"/>
+      <w:r>
+        <w:rPr>
+          <w:rFonts w:ascii="Aptos" w:hAnsi="Aptos"/>
+        </w:rPr>
+        <w:t>Virah</w:t>
+      </w:r>
+      <w:proofErr w:type="spellEnd"/>
+      <w:r>
+        <w:rPr>
+          <w:rFonts w:ascii="Aptos" w:hAnsi="Aptos"/>
+        </w:rPr>
+        <w:t xml:space="preserve">-Sawmy, F. J. Beck, and B. </w:t>
+      </w:r>
+      <w:proofErr w:type="spellStart"/>
+      <w:r>
+        <w:rPr>
+          <w:rFonts w:ascii="Aptos" w:hAnsi="Aptos"/>
+        </w:rPr>
+        <w:t>Sturmberg</w:t>
+      </w:r>
+      <w:proofErr w:type="spellEnd"/>
+      <w:r>
+        <w:rPr>
+          <w:rFonts w:ascii="Aptos" w:hAnsi="Aptos"/>
+        </w:rPr>
+        <w:t xml:space="preserve">, ‘Ignore variability, overestimate hydrogen production – Quantifying the effects of </w:t>
+      </w:r>
+      <w:proofErr w:type="spellStart"/>
+      <w:r>
+        <w:rPr>
+          <w:rFonts w:ascii="Aptos" w:hAnsi="Aptos"/>
+        </w:rPr>
+        <w:t>electrolyzer</w:t>
+      </w:r>
+      <w:proofErr w:type="spellEnd"/>
+      <w:r>
+        <w:rPr>
+          <w:rFonts w:ascii="Aptos" w:hAnsi="Aptos"/>
+        </w:rPr>
+        <w:t xml:space="preserve"> efficiency curves on hydrogen production from renewable energy sources’, </w:t>
       </w:r>
       <w:r>
         <w:rPr>
@@ -7948,13 +8303,45 @@
           <w:i/>
           <w:iCs/>
         </w:rPr>
-        <w:t>Int. J. Hydrog. Energy</w:t>
-      </w:r>
+        <w:t xml:space="preserve">Int. J. </w:t>
+      </w:r>
+      <w:proofErr w:type="spellStart"/>
       <w:r>
         <w:rPr>
           <w:rFonts w:ascii="Aptos" w:hAnsi="Aptos"/>
-        </w:rPr>
-        <w:t>, vol. 72, pp. 49–59, Jun. 2024, doi: 10.1016/j.ijhydene.2024.05.360.</w:t>
+          <w:i/>
+          <w:iCs/>
+        </w:rPr>
+        <w:t>Hydrog</w:t>
+      </w:r>
+      <w:proofErr w:type="spellEnd"/>
+      <w:r>
+        <w:rPr>
+          <w:rFonts w:ascii="Aptos" w:hAnsi="Aptos"/>
+          <w:i/>
+          <w:iCs/>
+        </w:rPr>
+        <w:t>. Energy</w:t>
+      </w:r>
+      <w:r>
+        <w:rPr>
+          <w:rFonts w:ascii="Aptos" w:hAnsi="Aptos"/>
+        </w:rPr>
+        <w:t xml:space="preserve">, vol. 72, pp. 49–59, Jun. 2024, </w:t>
+      </w:r>
+      <w:proofErr w:type="spellStart"/>
+      <w:r>
+        <w:rPr>
+          <w:rFonts w:ascii="Aptos" w:hAnsi="Aptos"/>
+        </w:rPr>
+        <w:t>doi</w:t>
+      </w:r>
+      <w:proofErr w:type="spellEnd"/>
+      <w:r>
+        <w:rPr>
+          <w:rFonts w:ascii="Aptos" w:hAnsi="Aptos"/>
+        </w:rPr>
+        <w:t>: 10.1016/j.ijhydene.2024.05.360.</w:t>
       </w:r>
     </w:p>
     <w:p>
@@ -7975,7 +8362,21 @@
           <w:rFonts w:ascii="Aptos" w:hAnsi="Aptos"/>
         </w:rPr>
         <w:tab/>
-        <w:t xml:space="preserve">A. Godula-Jopek, </w:t>
+        <w:t xml:space="preserve">A. </w:t>
+      </w:r>
+      <w:proofErr w:type="spellStart"/>
+      <w:r>
+        <w:rPr>
+          <w:rFonts w:ascii="Aptos" w:hAnsi="Aptos"/>
+        </w:rPr>
+        <w:t>Godula</w:t>
+      </w:r>
+      <w:proofErr w:type="spellEnd"/>
+      <w:r>
+        <w:rPr>
+          <w:rFonts w:ascii="Aptos" w:hAnsi="Aptos"/>
+        </w:rPr>
+        <w:t xml:space="preserve">-Jopek, </w:t>
       </w:r>
       <w:r>
         <w:rPr>

</xml_diff>